<commit_message>
feat(financial-math): add Chapter 2 Valuation of Financial Instruments (07/09-16/09) and standalone formula sheet; persist formula sheet standard
</commit_message>
<xml_diff>
--- a/Financial Mathematics/notes.docx
+++ b/Financial Mathematics/notes.docx
@@ -16936,12 +16936,107 @@
       </w:pPr>
       <m:oMathPara>
         <m:oMath>
+          <m:sSub>
+            <m:sSubPr>
+              <m:ctrlPr>
+                <w:rPr>
+                  <w:rFonts w:ascii="Cambria Math" w:eastAsiaTheme="minorEastAsia" w:hAnsi="Cambria Math"/>
+                </w:rPr>
+              </m:ctrlPr>
+            </m:sSubPr>
+            <m:e>
+              <m:r>
+                <w:rPr>
+                  <w:rFonts w:ascii="Cambria Math" w:eastAsiaTheme="minorEastAsia" w:hAnsi="Cambria Math"/>
+                </w:rPr>
+                <m:t>D</m:t>
+              </m:r>
+            </m:e>
+            <m:sub>
+              <m:r>
+                <w:rPr>
+                  <w:rFonts w:ascii="Cambria Math" w:eastAsiaTheme="minorEastAsia" w:hAnsi="Cambria Math"/>
+                </w:rPr>
+                <m:t>1</m:t>
+              </m:r>
+            </m:sub>
+          </m:sSub>
           <m:r>
             <w:rPr>
               <w:rFonts w:ascii="Cambria Math" w:eastAsiaTheme="minorEastAsia" w:hAnsi="Cambria Math"/>
-              <w:lang w:val="en-US"/>
             </w:rPr>
-            <m:t>D_1 = EPS_1(1-b) = 9(1-0) = Rs.9</m:t>
+            <m:t>=EP</m:t>
+          </m:r>
+          <m:sSub>
+            <m:sSubPr>
+              <m:ctrlPr>
+                <w:rPr>
+                  <w:rFonts w:ascii="Cambria Math" w:eastAsiaTheme="minorEastAsia" w:hAnsi="Cambria Math"/>
+                </w:rPr>
+              </m:ctrlPr>
+            </m:sSubPr>
+            <m:e>
+              <m:r>
+                <w:rPr>
+                  <w:rFonts w:ascii="Cambria Math" w:eastAsiaTheme="minorEastAsia" w:hAnsi="Cambria Math"/>
+                </w:rPr>
+                <m:t>S</m:t>
+              </m:r>
+            </m:e>
+            <m:sub>
+              <m:r>
+                <w:rPr>
+                  <w:rFonts w:ascii="Cambria Math" w:eastAsiaTheme="minorEastAsia" w:hAnsi="Cambria Math"/>
+                </w:rPr>
+                <m:t>1</m:t>
+              </m:r>
+            </m:sub>
+          </m:sSub>
+          <m:d>
+            <m:dPr>
+              <m:ctrlPr>
+                <w:rPr>
+                  <w:rFonts w:ascii="Cambria Math" w:eastAsiaTheme="minorEastAsia" w:hAnsi="Cambria Math"/>
+                </w:rPr>
+              </m:ctrlPr>
+            </m:dPr>
+            <m:e>
+              <m:r>
+                <w:rPr>
+                  <w:rFonts w:ascii="Cambria Math" w:eastAsiaTheme="minorEastAsia" w:hAnsi="Cambria Math"/>
+                </w:rPr>
+                <m:t>1-b</m:t>
+              </m:r>
+            </m:e>
+          </m:d>
+          <m:r>
+            <w:rPr>
+              <w:rFonts w:ascii="Cambria Math" w:eastAsiaTheme="minorEastAsia" w:hAnsi="Cambria Math"/>
+            </w:rPr>
+            <m:t>=9</m:t>
+          </m:r>
+          <m:d>
+            <m:dPr>
+              <m:ctrlPr>
+                <w:rPr>
+                  <w:rFonts w:ascii="Cambria Math" w:eastAsiaTheme="minorEastAsia" w:hAnsi="Cambria Math"/>
+                </w:rPr>
+              </m:ctrlPr>
+            </m:dPr>
+            <m:e>
+              <m:r>
+                <w:rPr>
+                  <w:rFonts w:ascii="Cambria Math" w:eastAsiaTheme="minorEastAsia" w:hAnsi="Cambria Math"/>
+                </w:rPr>
+                <m:t>1-0</m:t>
+              </m:r>
+            </m:e>
+          </m:d>
+          <m:r>
+            <w:rPr>
+              <w:rFonts w:ascii="Cambria Math" w:eastAsiaTheme="minorEastAsia" w:hAnsi="Cambria Math"/>
+            </w:rPr>
+            <m:t>=Rs.9</m:t>
           </m:r>
         </m:oMath>
       </m:oMathPara>
@@ -18899,6 +18994,9 @@
             <m:t>7</m:t>
           </m:r>
           <m:r>
+            <m:rPr>
+              <m:sty m:val="p"/>
+            </m:rPr>
             <w:rPr>
               <w:rFonts w:ascii="Cambria Math" w:hAnsi="Cambria Math"/>
             </w:rPr>
@@ -18913,6 +19011,9 @@
             <m:t>g=br=0.80×0.10=8%</m:t>
           </m:r>
           <m:r>
+            <m:rPr>
+              <m:sty m:val="p"/>
+            </m:rPr>
             <w:rPr>
               <w:rFonts w:ascii="Cambria Math" w:hAnsi="Cambria Math"/>
             </w:rPr>
@@ -19074,6 +19175,9 @@
             <m:t>14</m:t>
           </m:r>
           <m:r>
+            <m:rPr>
+              <m:sty m:val="p"/>
+            </m:rPr>
             <w:rPr>
               <w:rFonts w:eastAsiaTheme="minorEastAsia"/>
             </w:rPr>
@@ -19088,6 +19192,9 @@
             <m:t>g=0.60×0.10=6%</m:t>
           </m:r>
           <m:r>
+            <m:rPr>
+              <m:sty m:val="p"/>
+            </m:rPr>
             <w:rPr>
               <w:rFonts w:eastAsiaTheme="minorEastAsia"/>
             </w:rPr>
@@ -19251,6 +19358,9 @@
             <m:t>24.50</m:t>
           </m:r>
           <m:r>
+            <m:rPr>
+              <m:sty m:val="p"/>
+            </m:rPr>
             <w:rPr>
               <w:rFonts w:eastAsiaTheme="minorEastAsia"/>
             </w:rPr>
@@ -19265,6 +19375,9 @@
             <m:t>g=0.30×0.10=3%</m:t>
           </m:r>
           <m:r>
+            <m:rPr>
+              <m:sty m:val="p"/>
+            </m:rPr>
             <w:rPr>
               <w:rFonts w:eastAsiaTheme="minorEastAsia"/>
             </w:rPr>
@@ -19427,7 +19540,7 @@
     <w:p>
       <w:pPr>
         <w:rPr>
-          <w:rFonts w:eastAsiaTheme="minorEastAsia"/>
+          <w:lang w:val="en-US"/>
         </w:rPr>
       </w:pPr>
       <w:r>
@@ -19437,6 +19550,3457 @@
         </w:rPr>
         <w:br/>
       </w:r>
+      <w:r>
+        <w:rPr>
+          <w:lang w:val="en-US"/>
+        </w:rPr>
+        <w:t>16/09/2026</w:t>
+      </w:r>
+    </w:p>
+    <w:p>
+      <w:pPr>
+        <w:rPr>
+          <w:lang w:val="en-US"/>
+        </w:rPr>
+      </w:pPr>
+    </w:p>
+    <w:p>
+      <w:pPr>
+        <w:rPr>
+          <w:lang w:val="en-US"/>
+        </w:rPr>
+      </w:pPr>
+      <w:r>
+        <w:rPr>
+          <w:lang w:val="en-US"/>
+        </w:rPr>
+        <w:t>Dividends theory:</w:t>
+      </w:r>
+    </w:p>
+    <w:p>
+      <w:pPr>
+        <w:pStyle w:val="ListParagraph"/>
+        <w:numPr>
+          <w:ilvl w:val="0"/>
+          <w:numId w:val="39"/>
+        </w:numPr>
+        <w:rPr>
+          <w:lang w:val="en-US"/>
+        </w:rPr>
+      </w:pPr>
+      <w:r>
+        <w:rPr>
+          <w:lang w:val="en-US"/>
+        </w:rPr>
+        <w:t xml:space="preserve">Theories of relevance – a. gordon’s ; b. walter’s </w:t>
+      </w:r>
+    </w:p>
+    <w:p>
+      <w:pPr>
+        <w:pStyle w:val="ListParagraph"/>
+        <w:numPr>
+          <w:ilvl w:val="0"/>
+          <w:numId w:val="39"/>
+        </w:numPr>
+        <w:rPr>
+          <w:lang w:val="en-US"/>
+        </w:rPr>
+      </w:pPr>
+      <w:r>
+        <w:rPr>
+          <w:lang w:val="en-US"/>
+        </w:rPr>
+        <w:t>Theories of irrelvance – a. modigilani-miller (MM Model)</w:t>
+      </w:r>
+    </w:p>
+    <w:p>
+      <w:pPr>
+        <w:rPr>
+          <w:lang w:val="en-US"/>
+        </w:rPr>
+      </w:pPr>
+    </w:p>
+    <w:p>
+      <w:pPr>
+        <w:rPr>
+          <w:lang w:val="en-US"/>
+        </w:rPr>
+      </w:pPr>
+      <w:r>
+        <w:rPr>
+          <w:lang w:val="en-US"/>
+        </w:rPr>
+        <w:t xml:space="preserve">Prof. E. James Walter argued dividend policy is an active variable that influences share price and also the value of the firm, </w:t>
+      </w:r>
+    </w:p>
+    <w:p>
+      <w:pPr>
+        <w:pStyle w:val="ListParagraph"/>
+        <w:numPr>
+          <w:ilvl w:val="0"/>
+          <w:numId w:val="40"/>
+        </w:numPr>
+        <w:rPr>
+          <w:lang w:val="en-US"/>
+        </w:rPr>
+      </w:pPr>
+      <w:r>
+        <w:rPr>
+          <w:lang w:val="en-US"/>
+        </w:rPr>
+        <w:t xml:space="preserve">inseparable business decision </w:t>
+      </w:r>
+    </w:p>
+    <w:p>
+      <w:pPr>
+        <w:pStyle w:val="ListParagraph"/>
+        <w:numPr>
+          <w:ilvl w:val="0"/>
+          <w:numId w:val="40"/>
+        </w:numPr>
+        <w:rPr>
+          <w:lang w:val="en-US"/>
+        </w:rPr>
+      </w:pPr>
+      <w:r>
+        <w:rPr>
+          <w:lang w:val="en-US"/>
+        </w:rPr>
+        <w:t xml:space="preserve">the relationship between the internal rate of return (r) and cost of capital (k) is crucial </w:t>
+      </w:r>
+    </w:p>
+    <w:p>
+      <w:pPr>
+        <w:pStyle w:val="ListParagraph"/>
+        <w:numPr>
+          <w:ilvl w:val="0"/>
+          <w:numId w:val="40"/>
+        </w:numPr>
+        <w:rPr>
+          <w:lang w:val="en-US"/>
+        </w:rPr>
+      </w:pPr>
+      <w:r>
+        <w:rPr>
+          <w:lang w:val="en-US"/>
+        </w:rPr>
+        <w:t>if r &gt; k: the firm should retain the earnings</w:t>
+      </w:r>
+    </w:p>
+    <w:p>
+      <w:pPr>
+        <w:pStyle w:val="ListParagraph"/>
+        <w:numPr>
+          <w:ilvl w:val="0"/>
+          <w:numId w:val="40"/>
+        </w:numPr>
+        <w:rPr>
+          <w:lang w:val="en-US"/>
+        </w:rPr>
+      </w:pPr>
+      <w:r>
+        <w:rPr>
+          <w:lang w:val="en-US"/>
+        </w:rPr>
+        <w:t>if r &lt; k: should distribute its earnings</w:t>
+      </w:r>
+    </w:p>
+    <w:p>
+      <w:pPr>
+        <w:rPr>
+          <w:lang w:val="en-US"/>
+        </w:rPr>
+      </w:pPr>
+      <w:r>
+        <w:rPr>
+          <w:lang w:val="en-US"/>
+        </w:rPr>
+        <w:t>Assumptions:</w:t>
+      </w:r>
+    </w:p>
+    <w:p>
+      <w:pPr>
+        <w:pStyle w:val="ListParagraph"/>
+        <w:numPr>
+          <w:ilvl w:val="0"/>
+          <w:numId w:val="41"/>
+        </w:numPr>
+        <w:rPr>
+          <w:lang w:val="en-US"/>
+        </w:rPr>
+      </w:pPr>
+      <w:r>
+        <w:rPr>
+          <w:lang w:val="en-US"/>
+        </w:rPr>
+        <w:t xml:space="preserve">retained earnings represents the only sources of financing for the firm </w:t>
+      </w:r>
+    </w:p>
+    <w:p>
+      <w:pPr>
+        <w:pStyle w:val="ListParagraph"/>
+        <w:numPr>
+          <w:ilvl w:val="0"/>
+          <w:numId w:val="41"/>
+        </w:numPr>
+        <w:rPr>
+          <w:lang w:val="en-US"/>
+        </w:rPr>
+      </w:pPr>
+      <w:r>
+        <w:rPr>
+          <w:lang w:val="en-US"/>
+        </w:rPr>
+        <w:t xml:space="preserve">the return on the firms investment remain constant </w:t>
+      </w:r>
+    </w:p>
+    <w:p>
+      <w:pPr>
+        <w:pStyle w:val="ListParagraph"/>
+        <w:numPr>
+          <w:ilvl w:val="0"/>
+          <w:numId w:val="41"/>
+        </w:numPr>
+        <w:rPr>
+          <w:lang w:val="en-US"/>
+        </w:rPr>
+      </w:pPr>
+      <w:r>
+        <w:rPr>
+          <w:lang w:val="en-US"/>
+        </w:rPr>
+        <w:t xml:space="preserve">the cost of capital for the firm remains constant </w:t>
+      </w:r>
+    </w:p>
+    <w:p>
+      <w:pPr>
+        <w:pStyle w:val="ListParagraph"/>
+        <w:numPr>
+          <w:ilvl w:val="0"/>
+          <w:numId w:val="41"/>
+        </w:numPr>
+        <w:rPr>
+          <w:lang w:val="en-US"/>
+        </w:rPr>
+      </w:pPr>
+      <w:r>
+        <w:rPr>
+          <w:lang w:val="en-US"/>
+        </w:rPr>
+        <w:t xml:space="preserve">a firm has an infinite life </w:t>
+      </w:r>
+    </w:p>
+    <w:p>
+      <w:pPr>
+        <w:pStyle w:val="ListParagraph"/>
+        <w:numPr>
+          <w:ilvl w:val="0"/>
+          <w:numId w:val="41"/>
+        </w:numPr>
+        <w:rPr>
+          <w:lang w:val="en-US"/>
+        </w:rPr>
+      </w:pPr>
+      <w:r>
+        <w:rPr>
+          <w:lang w:val="en-US"/>
+        </w:rPr>
+        <w:t xml:space="preserve">all the earnings are distributed or reinvested into the firm </w:t>
+      </w:r>
+    </w:p>
+    <w:p>
+      <w:pPr>
+        <w:pStyle w:val="ListParagraph"/>
+        <w:numPr>
+          <w:ilvl w:val="0"/>
+          <w:numId w:val="41"/>
+        </w:numPr>
+        <w:rPr>
+          <w:lang w:val="en-US"/>
+        </w:rPr>
+      </w:pPr>
+      <w:r>
+        <w:rPr>
+          <w:lang w:val="en-US"/>
+        </w:rPr>
+        <w:t xml:space="preserve">EPS and dividend remain constant in a determining and given value </w:t>
+      </w:r>
+    </w:p>
+    <w:p>
+      <w:pPr>
+        <w:rPr>
+          <w:lang w:val="en-US"/>
+        </w:rPr>
+      </w:pPr>
+    </w:p>
+    <w:p>
+      <w:pPr>
+        <w:rPr>
+          <w:lang w:val="en-US"/>
+        </w:rPr>
+      </w:pPr>
+      <w:r>
+        <w:rPr>
+          <w:lang w:val="en-US"/>
+        </w:rPr>
+        <w:lastRenderedPageBreak/>
+        <w:t>Growth firm – firm has ample investment opportunities, promising higher return than cost of capital (it should retain earnings)</w:t>
+      </w:r>
+    </w:p>
+    <w:p>
+      <w:pPr>
+        <w:rPr>
+          <w:lang w:val="en-US"/>
+        </w:rPr>
+      </w:pPr>
+    </w:p>
+    <w:p>
+      <w:pPr>
+        <w:rPr>
+          <w:lang w:val="en-US"/>
+        </w:rPr>
+      </w:pPr>
+      <w:r>
+        <w:rPr>
+          <w:lang w:val="en-US"/>
+        </w:rPr>
+        <w:t>Normal firm – firms internal rate of return is equal to cost of capital (shareholders are indifferent between retention and distribution of earnings)</w:t>
+      </w:r>
+    </w:p>
+    <w:p>
+      <w:pPr>
+        <w:rPr>
+          <w:lang w:val="en-US"/>
+        </w:rPr>
+      </w:pPr>
+    </w:p>
+    <w:p>
+      <w:pPr>
+        <w:rPr>
+          <w:lang w:val="en-US"/>
+        </w:rPr>
+      </w:pPr>
+      <w:r>
+        <w:rPr>
+          <w:lang w:val="en-US"/>
+        </w:rPr>
+        <w:t xml:space="preserve">Dealing firm – firm lacks in such investment opportunities, assure rate of return high er than the cost of capital (distribute cent – percent distribution of earnings – optimum dividend policy </w:t>
+      </w:r>
+    </w:p>
+    <w:p>
+      <w:pPr>
+        <w:rPr>
+          <w:lang w:val="en-US"/>
+        </w:rPr>
+      </w:pPr>
+    </w:p>
+    <w:p>
+      <w:pPr>
+        <w:rPr>
+          <w:lang w:val="en-US"/>
+        </w:rPr>
+      </w:pPr>
+    </w:p>
+    <w:p>
+      <w:pPr>
+        <w:rPr>
+          <w:lang w:val="en-US"/>
+        </w:rPr>
+      </w:pPr>
+    </w:p>
+    <w:p>
+      <w:pPr>
+        <w:rPr>
+          <w:lang w:val="en-US"/>
+        </w:rPr>
+      </w:pPr>
+      <w:r>
+        <w:rPr>
+          <w:lang w:val="en-US"/>
+        </w:rPr>
+        <w:t>Walter’s formula</w:t>
+      </w:r>
+    </w:p>
+    <w:p>
+      <w:pPr>
+        <w:rPr>
+          <w:lang w:val="en-US"/>
+        </w:rPr>
+      </w:pPr>
+    </w:p>
+    <w:p>
+      <w:pPr>
+        <w:rPr>
+          <w:rFonts w:eastAsiaTheme="minorEastAsia"/>
+          <w:lang w:val="en-US"/>
+        </w:rPr>
+      </w:pPr>
+      <w:r>
+        <w:rPr>
+          <w:lang w:val="en-US"/>
+        </w:rPr>
+        <w:t xml:space="preserve">Market price per share (p) = </w:t>
+      </w:r>
+      <m:oMath>
+        <m:f>
+          <m:fPr>
+            <m:ctrlPr>
+              <w:rPr>
+                <w:rFonts w:ascii="Cambria Math" w:hAnsi="Cambria Math"/>
+                <w:i/>
+                <w:lang w:val="en-US"/>
+              </w:rPr>
+            </m:ctrlPr>
+          </m:fPr>
+          <m:num>
+            <m:r>
+              <w:rPr>
+                <w:rFonts w:ascii="Cambria Math" w:hAnsi="Cambria Math"/>
+                <w:lang w:val="en-US"/>
+              </w:rPr>
+              <m:t xml:space="preserve">D + </m:t>
+            </m:r>
+            <m:f>
+              <m:fPr>
+                <m:ctrlPr>
+                  <w:rPr>
+                    <w:rFonts w:ascii="Cambria Math" w:hAnsi="Cambria Math"/>
+                    <w:i/>
+                    <w:lang w:val="en-US"/>
+                  </w:rPr>
+                </m:ctrlPr>
+              </m:fPr>
+              <m:num>
+                <m:r>
+                  <w:rPr>
+                    <w:rFonts w:ascii="Cambria Math" w:hAnsi="Cambria Math"/>
+                    <w:lang w:val="en-US"/>
+                  </w:rPr>
+                  <m:t>r</m:t>
+                </m:r>
+              </m:num>
+              <m:den>
+                <m:r>
+                  <w:rPr>
+                    <w:rFonts w:ascii="Cambria Math" w:hAnsi="Cambria Math"/>
+                    <w:lang w:val="en-US"/>
+                  </w:rPr>
+                  <m:t>k</m:t>
+                </m:r>
+              </m:den>
+            </m:f>
+            <m:d>
+              <m:dPr>
+                <m:ctrlPr>
+                  <w:rPr>
+                    <w:rFonts w:ascii="Cambria Math" w:hAnsi="Cambria Math"/>
+                    <w:i/>
+                    <w:lang w:val="en-US"/>
+                  </w:rPr>
+                </m:ctrlPr>
+              </m:dPr>
+              <m:e>
+                <m:r>
+                  <w:rPr>
+                    <w:rFonts w:ascii="Cambria Math" w:hAnsi="Cambria Math"/>
+                    <w:lang w:val="en-US"/>
+                  </w:rPr>
+                  <m:t>E-D</m:t>
+                </m:r>
+              </m:e>
+            </m:d>
+          </m:num>
+          <m:den>
+            <m:r>
+              <w:rPr>
+                <w:rFonts w:ascii="Cambria Math" w:hAnsi="Cambria Math"/>
+                <w:lang w:val="en-US"/>
+              </w:rPr>
+              <m:t>k</m:t>
+            </m:r>
+          </m:den>
+        </m:f>
+        <m:r>
+          <w:rPr>
+            <w:rFonts w:ascii="Cambria Math" w:hAnsi="Cambria Math"/>
+            <w:lang w:val="en-US"/>
+          </w:rPr>
+          <w:br/>
+        </m:r>
+      </m:oMath>
+      <w:r>
+        <w:rPr>
+          <w:rFonts w:eastAsiaTheme="minorEastAsia"/>
+          <w:lang w:val="en-US"/>
+        </w:rPr>
+        <w:t>D = dividend per share</w:t>
+      </w:r>
+    </w:p>
+    <w:p>
+      <w:pPr>
+        <w:rPr>
+          <w:rFonts w:eastAsiaTheme="minorEastAsia"/>
+          <w:lang w:val="en-US"/>
+        </w:rPr>
+      </w:pPr>
+      <w:r>
+        <w:rPr>
+          <w:rFonts w:eastAsiaTheme="minorEastAsia"/>
+          <w:lang w:val="en-US"/>
+        </w:rPr>
+        <w:t xml:space="preserve">r = rate of return on investment by firm </w:t>
+      </w:r>
+    </w:p>
+    <w:p>
+      <w:pPr>
+        <w:rPr>
+          <w:rFonts w:eastAsiaTheme="minorEastAsia"/>
+          <w:lang w:val="en-US"/>
+        </w:rPr>
+      </w:pPr>
+      <w:r>
+        <w:rPr>
+          <w:rFonts w:eastAsiaTheme="minorEastAsia"/>
+          <w:lang w:val="en-US"/>
+        </w:rPr>
+        <w:t>k = cost of capital</w:t>
+      </w:r>
+    </w:p>
+    <w:p>
+      <w:pPr>
+        <w:rPr>
+          <w:rFonts w:eastAsiaTheme="minorEastAsia"/>
+          <w:lang w:val="en-US"/>
+        </w:rPr>
+      </w:pPr>
+      <w:r>
+        <w:rPr>
+          <w:rFonts w:eastAsiaTheme="minorEastAsia"/>
+          <w:lang w:val="en-US"/>
+        </w:rPr>
+        <w:t>E = earnings per share</w:t>
+      </w:r>
+    </w:p>
+    <w:p>
+      <w:pPr>
+        <w:rPr>
+          <w:rFonts w:eastAsiaTheme="minorEastAsia"/>
+          <w:lang w:val="en-US"/>
+        </w:rPr>
+      </w:pPr>
+    </w:p>
+    <w:p>
+      <w:pPr>
+        <w:rPr>
+          <w:rFonts w:eastAsiaTheme="minorEastAsia"/>
+          <w:lang w:val="en-US"/>
+        </w:rPr>
+      </w:pPr>
+    </w:p>
+    <w:p>
+      <w:pPr>
+        <w:rPr>
+          <w:b/>
+          <w:bCs/>
+          <w:lang w:val="en-US"/>
+        </w:rPr>
+      </w:pPr>
+      <w:r>
+        <w:rPr>
+          <w:b/>
+          <w:bCs/>
+          <w:lang w:val="en-US"/>
+        </w:rPr>
+        <w:t>Walter’s model (growth firm)</w:t>
+      </w:r>
+    </w:p>
+    <w:p>
+      <w:pPr>
+        <w:rPr>
+          <w:lang w:val="en-US"/>
+        </w:rPr>
+      </w:pPr>
+      <w:r>
+        <w:rPr>
+          <w:lang w:val="en-US"/>
+        </w:rPr>
+        <w:t>Cost of capital and the rate of return on investment of nirmal ltd are 10% and 18% respectively. The company has 5 lakh equity shares of Rs. 10 each, outstanding and earnings per share 20. Compute the market price per share and value of firm in the following situations Use walter model and comment on the results:</w:t>
+      </w:r>
+    </w:p>
+    <w:p>
+      <w:pPr>
+        <w:pStyle w:val="ListParagraph"/>
+        <w:numPr>
+          <w:ilvl w:val="0"/>
+          <w:numId w:val="42"/>
+        </w:numPr>
+        <w:rPr>
+          <w:lang w:val="en-US"/>
+        </w:rPr>
+      </w:pPr>
+      <w:r>
+        <w:rPr>
+          <w:lang w:val="en-US"/>
+        </w:rPr>
+        <w:t>No retention</w:t>
+      </w:r>
+    </w:p>
+    <w:p>
+      <w:pPr>
+        <w:pStyle w:val="ListParagraph"/>
+        <w:numPr>
+          <w:ilvl w:val="0"/>
+          <w:numId w:val="42"/>
+        </w:numPr>
+        <w:rPr>
+          <w:lang w:val="en-US"/>
+        </w:rPr>
+      </w:pPr>
+      <w:r>
+        <w:rPr>
+          <w:lang w:val="en-US"/>
+        </w:rPr>
+        <w:t xml:space="preserve">40% retention </w:t>
+      </w:r>
+    </w:p>
+    <w:p>
+      <w:pPr>
+        <w:pStyle w:val="ListParagraph"/>
+        <w:numPr>
+          <w:ilvl w:val="0"/>
+          <w:numId w:val="42"/>
+        </w:numPr>
+        <w:rPr>
+          <w:lang w:val="en-US"/>
+        </w:rPr>
+      </w:pPr>
+      <w:r>
+        <w:rPr>
+          <w:lang w:val="en-US"/>
+        </w:rPr>
+        <w:t>80% retention</w:t>
+      </w:r>
+    </w:p>
+    <w:p>
+      <w:pPr>
+        <w:rPr>
+          <w:lang w:val="en-US"/>
+        </w:rPr>
+      </w:pPr>
+      <w:r>
+        <w:rPr>
+          <w:lang w:val="en-US"/>
+        </w:rPr>
+        <w:t>Sol:</w:t>
+      </w:r>
+    </w:p>
+    <w:p>
+      <w:pPr>
+        <w:pStyle w:val="ListParagraph"/>
+        <w:numPr>
+          <w:ilvl w:val="0"/>
+          <w:numId w:val="43"/>
+        </w:numPr>
+        <w:rPr>
+          <w:lang w:val="en-US"/>
+        </w:rPr>
+      </w:pPr>
+      <w:r>
+        <w:rPr>
+          <w:lang w:val="en-US"/>
+        </w:rPr>
+        <w:t>0% retention</w:t>
+      </w:r>
+    </w:p>
+    <w:p>
+      <w:pPr>
+        <w:pStyle w:val="ListParagraph"/>
+        <w:rPr>
+          <w:lang w:val="en-US"/>
+        </w:rPr>
+      </w:pPr>
+      <w:r>
+        <w:rPr>
+          <w:lang w:val="en-US"/>
+        </w:rPr>
+        <w:lastRenderedPageBreak/>
+        <w:t>MPS under walter model</w:t>
+      </w:r>
+    </w:p>
+    <w:p>
+      <w:pPr>
+        <w:pStyle w:val="ListParagraph"/>
+        <w:rPr>
+          <w:lang w:val="en-US"/>
+        </w:rPr>
+      </w:pPr>
+      <m:oMathPara>
+        <m:oMath>
+          <m:f>
+            <m:fPr>
+              <m:ctrlPr>
+                <w:rPr>
+                  <w:rFonts w:ascii="Cambria Math" w:hAnsi="Cambria Math"/>
+                  <w:i/>
+                  <w:lang w:val="en-US"/>
+                </w:rPr>
+              </m:ctrlPr>
+            </m:fPr>
+            <m:num>
+              <m:r>
+                <w:rPr>
+                  <w:rFonts w:ascii="Cambria Math" w:hAnsi="Cambria Math"/>
+                  <w:lang w:val="en-US"/>
+                </w:rPr>
+                <m:t xml:space="preserve">D + </m:t>
+              </m:r>
+              <m:f>
+                <m:fPr>
+                  <m:ctrlPr>
+                    <w:rPr>
+                      <w:rFonts w:ascii="Cambria Math" w:hAnsi="Cambria Math"/>
+                      <w:i/>
+                      <w:lang w:val="en-US"/>
+                    </w:rPr>
+                  </m:ctrlPr>
+                </m:fPr>
+                <m:num>
+                  <m:r>
+                    <w:rPr>
+                      <w:rFonts w:ascii="Cambria Math" w:hAnsi="Cambria Math"/>
+                      <w:lang w:val="en-US"/>
+                    </w:rPr>
+                    <m:t>r</m:t>
+                  </m:r>
+                </m:num>
+                <m:den>
+                  <m:r>
+                    <w:rPr>
+                      <w:rFonts w:ascii="Cambria Math" w:hAnsi="Cambria Math"/>
+                      <w:lang w:val="en-US"/>
+                    </w:rPr>
+                    <m:t>k</m:t>
+                  </m:r>
+                </m:den>
+              </m:f>
+              <m:d>
+                <m:dPr>
+                  <m:ctrlPr>
+                    <w:rPr>
+                      <w:rFonts w:ascii="Cambria Math" w:hAnsi="Cambria Math"/>
+                      <w:i/>
+                      <w:lang w:val="en-US"/>
+                    </w:rPr>
+                  </m:ctrlPr>
+                </m:dPr>
+                <m:e>
+                  <m:r>
+                    <w:rPr>
+                      <w:rFonts w:ascii="Cambria Math" w:hAnsi="Cambria Math"/>
+                      <w:lang w:val="en-US"/>
+                    </w:rPr>
+                    <m:t>E-D</m:t>
+                  </m:r>
+                </m:e>
+              </m:d>
+            </m:num>
+            <m:den>
+              <m:r>
+                <w:rPr>
+                  <w:rFonts w:ascii="Cambria Math" w:hAnsi="Cambria Math"/>
+                  <w:lang w:val="en-US"/>
+                </w:rPr>
+                <m:t>k</m:t>
+              </m:r>
+            </m:den>
+          </m:f>
+          <m:r>
+            <w:rPr>
+              <w:rFonts w:ascii="Cambria Math" w:hAnsi="Cambria Math"/>
+              <w:lang w:val="en-US"/>
+            </w:rPr>
+            <w:br/>
+          </m:r>
+        </m:oMath>
+      </m:oMathPara>
+      <w:r>
+        <w:rPr>
+          <w:lang w:val="en-US"/>
+        </w:rPr>
+        <w:t xml:space="preserve">D = dividend per share = EPS * Payout </w:t>
+      </w:r>
+    </w:p>
+    <w:p>
+      <w:pPr>
+        <w:pStyle w:val="ListParagraph"/>
+        <w:rPr>
+          <w:lang w:val="en-US"/>
+        </w:rPr>
+      </w:pPr>
+      <w:r>
+        <w:rPr>
+          <w:lang w:val="en-US"/>
+        </w:rPr>
+        <w:t xml:space="preserve">20 * 100% = Rs. 20 </w:t>
+      </w:r>
+    </w:p>
+    <w:p>
+      <w:pPr>
+        <w:pStyle w:val="ListParagraph"/>
+        <w:rPr>
+          <w:lang w:val="en-US"/>
+        </w:rPr>
+      </w:pPr>
+    </w:p>
+    <w:p>
+      <w:pPr>
+        <w:pStyle w:val="ListParagraph"/>
+        <w:rPr>
+          <w:lang w:val="en-US"/>
+        </w:rPr>
+      </w:pPr>
+      <w:r>
+        <w:rPr>
+          <w:lang w:val="en-US"/>
+        </w:rPr>
+        <w:t>r = rate of return = 18%</w:t>
+      </w:r>
+    </w:p>
+    <w:p>
+      <w:pPr>
+        <w:pStyle w:val="ListParagraph"/>
+        <w:rPr>
+          <w:lang w:val="en-US"/>
+        </w:rPr>
+      </w:pPr>
+      <w:r>
+        <w:rPr>
+          <w:lang w:val="en-US"/>
+        </w:rPr>
+        <w:t>K = cost of capital = 10%</w:t>
+      </w:r>
+    </w:p>
+    <w:p>
+      <w:pPr>
+        <w:pStyle w:val="ListParagraph"/>
+        <w:rPr>
+          <w:lang w:val="en-US"/>
+        </w:rPr>
+      </w:pPr>
+      <w:r>
+        <w:rPr>
+          <w:lang w:val="en-US"/>
+        </w:rPr>
+        <w:t xml:space="preserve">E = earnings per share = Rs. 20 </w:t>
+      </w:r>
+    </w:p>
+    <w:p>
+      <w:pPr>
+        <w:pStyle w:val="ListParagraph"/>
+        <w:rPr>
+          <w:lang w:val="en-US"/>
+        </w:rPr>
+      </w:pPr>
+    </w:p>
+    <w:p>
+      <w:pPr>
+        <w:pStyle w:val="ListParagraph"/>
+        <w:rPr>
+          <w:rFonts w:eastAsiaTheme="minorEastAsia"/>
+          <w:lang w:val="en-US"/>
+        </w:rPr>
+      </w:pPr>
+      <w:r>
+        <w:rPr>
+          <w:lang w:val="en-US"/>
+        </w:rPr>
+        <w:t xml:space="preserve">MPS = </w:t>
+      </w:r>
+      <m:oMath>
+        <m:f>
+          <m:fPr>
+            <m:ctrlPr>
+              <w:rPr>
+                <w:rFonts w:ascii="Cambria Math" w:hAnsi="Cambria Math"/>
+                <w:i/>
+                <w:lang w:val="en-US"/>
+              </w:rPr>
+            </m:ctrlPr>
+          </m:fPr>
+          <m:num>
+            <m:r>
+              <w:rPr>
+                <w:rFonts w:ascii="Cambria Math" w:hAnsi="Cambria Math"/>
+                <w:lang w:val="en-US"/>
+              </w:rPr>
+              <m:t xml:space="preserve">20 + </m:t>
+            </m:r>
+            <m:f>
+              <m:fPr>
+                <m:ctrlPr>
+                  <w:rPr>
+                    <w:rFonts w:ascii="Cambria Math" w:hAnsi="Cambria Math"/>
+                    <w:i/>
+                    <w:lang w:val="en-US"/>
+                  </w:rPr>
+                </m:ctrlPr>
+              </m:fPr>
+              <m:num>
+                <m:r>
+                  <w:rPr>
+                    <w:rFonts w:ascii="Cambria Math" w:hAnsi="Cambria Math"/>
+                    <w:lang w:val="en-US"/>
+                  </w:rPr>
+                  <m:t>0.18</m:t>
+                </m:r>
+              </m:num>
+              <m:den>
+                <m:r>
+                  <w:rPr>
+                    <w:rFonts w:ascii="Cambria Math" w:hAnsi="Cambria Math"/>
+                    <w:lang w:val="en-US"/>
+                  </w:rPr>
+                  <m:t>0.10</m:t>
+                </m:r>
+              </m:den>
+            </m:f>
+            <m:d>
+              <m:dPr>
+                <m:ctrlPr>
+                  <w:rPr>
+                    <w:rFonts w:ascii="Cambria Math" w:hAnsi="Cambria Math"/>
+                    <w:i/>
+                    <w:lang w:val="en-US"/>
+                  </w:rPr>
+                </m:ctrlPr>
+              </m:dPr>
+              <m:e>
+                <m:r>
+                  <w:rPr>
+                    <w:rFonts w:ascii="Cambria Math" w:hAnsi="Cambria Math"/>
+                    <w:lang w:val="en-US"/>
+                  </w:rPr>
+                  <m:t>20-20</m:t>
+                </m:r>
+              </m:e>
+            </m:d>
+          </m:num>
+          <m:den>
+            <m:r>
+              <w:rPr>
+                <w:rFonts w:ascii="Cambria Math" w:hAnsi="Cambria Math"/>
+                <w:lang w:val="en-US"/>
+              </w:rPr>
+              <m:t>0.10</m:t>
+            </m:r>
+          </m:den>
+        </m:f>
+      </m:oMath>
+      <w:r>
+        <w:rPr>
+          <w:rFonts w:eastAsiaTheme="minorEastAsia"/>
+          <w:lang w:val="en-US"/>
+        </w:rPr>
+        <w:t xml:space="preserve"> = 200</w:t>
+      </w:r>
+    </w:p>
+    <w:p>
+      <w:pPr>
+        <w:pStyle w:val="ListParagraph"/>
+        <w:rPr>
+          <w:lang w:val="en-US"/>
+        </w:rPr>
+      </w:pPr>
+      <w:r>
+        <w:rPr>
+          <w:lang w:val="en-US"/>
+        </w:rPr>
+        <w:t>Value of firm: No. of equity share * MPS</w:t>
+      </w:r>
+    </w:p>
+    <w:p>
+      <w:pPr>
+        <w:pStyle w:val="ListParagraph"/>
+        <w:rPr>
+          <w:lang w:val="en-US"/>
+        </w:rPr>
+      </w:pPr>
+      <w:r>
+        <w:rPr>
+          <w:lang w:val="en-US"/>
+        </w:rPr>
+        <w:t>500000 * 200 = 100000000</w:t>
+      </w:r>
+    </w:p>
+    <w:p>
+      <w:pPr>
+        <w:pStyle w:val="ListParagraph"/>
+        <w:rPr>
+          <w:lang w:val="en-US"/>
+        </w:rPr>
+      </w:pPr>
+    </w:p>
+    <w:p>
+      <w:pPr>
+        <w:pStyle w:val="ListParagraph"/>
+        <w:numPr>
+          <w:ilvl w:val="0"/>
+          <w:numId w:val="43"/>
+        </w:numPr>
+        <w:rPr>
+          <w:lang w:val="en-US"/>
+        </w:rPr>
+      </w:pPr>
+      <w:r>
+        <w:rPr>
+          <w:lang w:val="en-US"/>
+        </w:rPr>
+        <w:t>40% retention</w:t>
+      </w:r>
+    </w:p>
+    <w:p>
+      <w:pPr>
+        <w:pStyle w:val="ListParagraph"/>
+        <w:rPr>
+          <w:lang w:val="en-US"/>
+        </w:rPr>
+      </w:pPr>
+      <w:r>
+        <w:rPr>
+          <w:lang w:val="en-US"/>
+        </w:rPr>
+        <w:t>MPS under walter model</w:t>
+      </w:r>
+    </w:p>
+    <w:p>
+      <w:pPr>
+        <w:pStyle w:val="ListParagraph"/>
+        <w:rPr>
+          <w:lang w:val="en-US"/>
+        </w:rPr>
+      </w:pPr>
+      <m:oMathPara>
+        <m:oMath>
+          <m:f>
+            <m:fPr>
+              <m:ctrlPr>
+                <w:rPr>
+                  <w:rFonts w:ascii="Cambria Math" w:hAnsi="Cambria Math"/>
+                  <w:i/>
+                  <w:lang w:val="en-US"/>
+                </w:rPr>
+              </m:ctrlPr>
+            </m:fPr>
+            <m:num>
+              <m:r>
+                <w:rPr>
+                  <w:rFonts w:ascii="Cambria Math" w:hAnsi="Cambria Math"/>
+                  <w:lang w:val="en-US"/>
+                </w:rPr>
+                <m:t xml:space="preserve">D + </m:t>
+              </m:r>
+              <m:f>
+                <m:fPr>
+                  <m:ctrlPr>
+                    <w:rPr>
+                      <w:rFonts w:ascii="Cambria Math" w:hAnsi="Cambria Math"/>
+                      <w:i/>
+                      <w:lang w:val="en-US"/>
+                    </w:rPr>
+                  </m:ctrlPr>
+                </m:fPr>
+                <m:num>
+                  <m:r>
+                    <w:rPr>
+                      <w:rFonts w:ascii="Cambria Math" w:hAnsi="Cambria Math"/>
+                      <w:lang w:val="en-US"/>
+                    </w:rPr>
+                    <m:t>r</m:t>
+                  </m:r>
+                </m:num>
+                <m:den>
+                  <m:r>
+                    <w:rPr>
+                      <w:rFonts w:ascii="Cambria Math" w:hAnsi="Cambria Math"/>
+                      <w:lang w:val="en-US"/>
+                    </w:rPr>
+                    <m:t>k</m:t>
+                  </m:r>
+                </m:den>
+              </m:f>
+              <m:d>
+                <m:dPr>
+                  <m:ctrlPr>
+                    <w:rPr>
+                      <w:rFonts w:ascii="Cambria Math" w:hAnsi="Cambria Math"/>
+                      <w:i/>
+                      <w:lang w:val="en-US"/>
+                    </w:rPr>
+                  </m:ctrlPr>
+                </m:dPr>
+                <m:e>
+                  <m:r>
+                    <w:rPr>
+                      <w:rFonts w:ascii="Cambria Math" w:hAnsi="Cambria Math"/>
+                      <w:lang w:val="en-US"/>
+                    </w:rPr>
+                    <m:t>E-D</m:t>
+                  </m:r>
+                </m:e>
+              </m:d>
+            </m:num>
+            <m:den>
+              <m:r>
+                <w:rPr>
+                  <w:rFonts w:ascii="Cambria Math" w:hAnsi="Cambria Math"/>
+                  <w:lang w:val="en-US"/>
+                </w:rPr>
+                <m:t>k</m:t>
+              </m:r>
+            </m:den>
+          </m:f>
+          <m:r>
+            <w:rPr>
+              <w:rFonts w:ascii="Cambria Math" w:hAnsi="Cambria Math"/>
+              <w:lang w:val="en-US"/>
+            </w:rPr>
+            <w:br/>
+          </m:r>
+        </m:oMath>
+      </m:oMathPara>
+      <w:r>
+        <w:rPr>
+          <w:lang w:val="en-US"/>
+        </w:rPr>
+        <w:t xml:space="preserve">D = dividend per share = EPS * Payout </w:t>
+      </w:r>
+    </w:p>
+    <w:p>
+      <w:pPr>
+        <w:pStyle w:val="ListParagraph"/>
+        <w:rPr>
+          <w:lang w:val="en-US"/>
+        </w:rPr>
+      </w:pPr>
+      <w:r>
+        <w:rPr>
+          <w:lang w:val="en-US"/>
+        </w:rPr>
+        <w:t xml:space="preserve">20 * 60% = Rs. 12 </w:t>
+      </w:r>
+    </w:p>
+    <w:p>
+      <w:pPr>
+        <w:pStyle w:val="ListParagraph"/>
+        <w:rPr>
+          <w:lang w:val="en-US"/>
+        </w:rPr>
+      </w:pPr>
+    </w:p>
+    <w:p>
+      <w:pPr>
+        <w:pStyle w:val="ListParagraph"/>
+        <w:rPr>
+          <w:lang w:val="en-US"/>
+        </w:rPr>
+      </w:pPr>
+      <w:r>
+        <w:rPr>
+          <w:lang w:val="en-US"/>
+        </w:rPr>
+        <w:t>Y = rate of return = 18%</w:t>
+      </w:r>
+    </w:p>
+    <w:p>
+      <w:pPr>
+        <w:pStyle w:val="ListParagraph"/>
+        <w:rPr>
+          <w:lang w:val="en-US"/>
+        </w:rPr>
+      </w:pPr>
+      <w:r>
+        <w:rPr>
+          <w:lang w:val="en-US"/>
+        </w:rPr>
+        <w:t>K = cost of capital = 10%</w:t>
+      </w:r>
+    </w:p>
+    <w:p>
+      <w:pPr>
+        <w:pStyle w:val="ListParagraph"/>
+        <w:rPr>
+          <w:lang w:val="en-US"/>
+        </w:rPr>
+      </w:pPr>
+      <w:r>
+        <w:rPr>
+          <w:lang w:val="en-US"/>
+        </w:rPr>
+        <w:t xml:space="preserve">E = earnings per share = Rs. 20 </w:t>
+      </w:r>
+    </w:p>
+    <w:p>
+      <w:pPr>
+        <w:pStyle w:val="ListParagraph"/>
+        <w:rPr>
+          <w:lang w:val="en-US"/>
+        </w:rPr>
+      </w:pPr>
+    </w:p>
+    <w:p>
+      <w:pPr>
+        <w:pStyle w:val="ListParagraph"/>
+        <w:rPr>
+          <w:rFonts w:eastAsiaTheme="minorEastAsia"/>
+          <w:lang w:val="en-US"/>
+        </w:rPr>
+      </w:pPr>
+      <w:r>
+        <w:rPr>
+          <w:lang w:val="en-US"/>
+        </w:rPr>
+        <w:t xml:space="preserve">MPS = </w:t>
+      </w:r>
+      <m:oMath>
+        <m:f>
+          <m:fPr>
+            <m:ctrlPr>
+              <w:rPr>
+                <w:rFonts w:ascii="Cambria Math" w:hAnsi="Cambria Math"/>
+                <w:i/>
+                <w:lang w:val="en-US"/>
+              </w:rPr>
+            </m:ctrlPr>
+          </m:fPr>
+          <m:num>
+            <m:r>
+              <w:rPr>
+                <w:rFonts w:ascii="Cambria Math" w:hAnsi="Cambria Math"/>
+                <w:lang w:val="en-US"/>
+              </w:rPr>
+              <m:t xml:space="preserve">12 + </m:t>
+            </m:r>
+            <m:f>
+              <m:fPr>
+                <m:ctrlPr>
+                  <w:rPr>
+                    <w:rFonts w:ascii="Cambria Math" w:hAnsi="Cambria Math"/>
+                    <w:i/>
+                    <w:lang w:val="en-US"/>
+                  </w:rPr>
+                </m:ctrlPr>
+              </m:fPr>
+              <m:num>
+                <m:r>
+                  <w:rPr>
+                    <w:rFonts w:ascii="Cambria Math" w:hAnsi="Cambria Math"/>
+                    <w:lang w:val="en-US"/>
+                  </w:rPr>
+                  <m:t>0.18</m:t>
+                </m:r>
+              </m:num>
+              <m:den>
+                <m:r>
+                  <w:rPr>
+                    <w:rFonts w:ascii="Cambria Math" w:hAnsi="Cambria Math"/>
+                    <w:lang w:val="en-US"/>
+                  </w:rPr>
+                  <m:t>0.10</m:t>
+                </m:r>
+              </m:den>
+            </m:f>
+            <m:d>
+              <m:dPr>
+                <m:ctrlPr>
+                  <w:rPr>
+                    <w:rFonts w:ascii="Cambria Math" w:hAnsi="Cambria Math"/>
+                    <w:i/>
+                    <w:lang w:val="en-US"/>
+                  </w:rPr>
+                </m:ctrlPr>
+              </m:dPr>
+              <m:e>
+                <m:r>
+                  <w:rPr>
+                    <w:rFonts w:ascii="Cambria Math" w:hAnsi="Cambria Math"/>
+                    <w:lang w:val="en-US"/>
+                  </w:rPr>
+                  <m:t>20-12</m:t>
+                </m:r>
+              </m:e>
+            </m:d>
+          </m:num>
+          <m:den>
+            <m:r>
+              <w:rPr>
+                <w:rFonts w:ascii="Cambria Math" w:hAnsi="Cambria Math"/>
+                <w:lang w:val="en-US"/>
+              </w:rPr>
+              <m:t>0.10</m:t>
+            </m:r>
+          </m:den>
+        </m:f>
+      </m:oMath>
+      <w:r>
+        <w:rPr>
+          <w:rFonts w:eastAsiaTheme="minorEastAsia"/>
+          <w:lang w:val="en-US"/>
+        </w:rPr>
+        <w:t xml:space="preserve"> = 264</w:t>
+      </w:r>
+    </w:p>
+    <w:p>
+      <w:pPr>
+        <w:pStyle w:val="ListParagraph"/>
+        <w:rPr>
+          <w:lang w:val="en-US"/>
+        </w:rPr>
+      </w:pPr>
+      <w:r>
+        <w:rPr>
+          <w:lang w:val="en-US"/>
+        </w:rPr>
+        <w:t>Value of firm: No. of equity share * MPS</w:t>
+      </w:r>
+    </w:p>
+    <w:p>
+      <w:pPr>
+        <w:pStyle w:val="ListParagraph"/>
+        <w:rPr>
+          <w:lang w:val="en-US"/>
+        </w:rPr>
+      </w:pPr>
+      <w:r>
+        <w:rPr>
+          <w:lang w:val="en-US"/>
+        </w:rPr>
+        <w:t>500000 * 264 = 132000000</w:t>
+      </w:r>
+    </w:p>
+    <w:p>
+      <w:pPr>
+        <w:pStyle w:val="ListParagraph"/>
+        <w:numPr>
+          <w:ilvl w:val="0"/>
+          <w:numId w:val="43"/>
+        </w:numPr>
+        <w:rPr>
+          <w:lang w:val="en-US"/>
+        </w:rPr>
+      </w:pPr>
+      <w:r>
+        <w:rPr>
+          <w:lang w:val="en-US"/>
+        </w:rPr>
+        <w:t>80% retention</w:t>
+      </w:r>
+    </w:p>
+    <w:p>
+      <w:pPr>
+        <w:pStyle w:val="ListParagraph"/>
+        <w:rPr>
+          <w:lang w:val="en-US"/>
+        </w:rPr>
+      </w:pPr>
+      <w:r>
+        <w:rPr>
+          <w:lang w:val="en-US"/>
+        </w:rPr>
+        <w:t>MPS under walter model</w:t>
+      </w:r>
+    </w:p>
+    <w:p>
+      <w:pPr>
+        <w:pStyle w:val="ListParagraph"/>
+        <w:rPr>
+          <w:lang w:val="en-US"/>
+        </w:rPr>
+      </w:pPr>
+      <m:oMathPara>
+        <m:oMath>
+          <m:f>
+            <m:fPr>
+              <m:ctrlPr>
+                <w:rPr>
+                  <w:rFonts w:ascii="Cambria Math" w:hAnsi="Cambria Math"/>
+                  <w:i/>
+                  <w:lang w:val="en-US"/>
+                </w:rPr>
+              </m:ctrlPr>
+            </m:fPr>
+            <m:num>
+              <m:r>
+                <w:rPr>
+                  <w:rFonts w:ascii="Cambria Math" w:hAnsi="Cambria Math"/>
+                  <w:lang w:val="en-US"/>
+                </w:rPr>
+                <m:t xml:space="preserve">D + </m:t>
+              </m:r>
+              <m:f>
+                <m:fPr>
+                  <m:ctrlPr>
+                    <w:rPr>
+                      <w:rFonts w:ascii="Cambria Math" w:hAnsi="Cambria Math"/>
+                      <w:i/>
+                      <w:lang w:val="en-US"/>
+                    </w:rPr>
+                  </m:ctrlPr>
+                </m:fPr>
+                <m:num>
+                  <m:r>
+                    <w:rPr>
+                      <w:rFonts w:ascii="Cambria Math" w:hAnsi="Cambria Math"/>
+                      <w:lang w:val="en-US"/>
+                    </w:rPr>
+                    <m:t>r</m:t>
+                  </m:r>
+                </m:num>
+                <m:den>
+                  <m:r>
+                    <w:rPr>
+                      <w:rFonts w:ascii="Cambria Math" w:hAnsi="Cambria Math"/>
+                      <w:lang w:val="en-US"/>
+                    </w:rPr>
+                    <m:t>k</m:t>
+                  </m:r>
+                </m:den>
+              </m:f>
+              <m:d>
+                <m:dPr>
+                  <m:ctrlPr>
+                    <w:rPr>
+                      <w:rFonts w:ascii="Cambria Math" w:hAnsi="Cambria Math"/>
+                      <w:i/>
+                      <w:lang w:val="en-US"/>
+                    </w:rPr>
+                  </m:ctrlPr>
+                </m:dPr>
+                <m:e>
+                  <m:r>
+                    <w:rPr>
+                      <w:rFonts w:ascii="Cambria Math" w:hAnsi="Cambria Math"/>
+                      <w:lang w:val="en-US"/>
+                    </w:rPr>
+                    <m:t>E-D</m:t>
+                  </m:r>
+                </m:e>
+              </m:d>
+            </m:num>
+            <m:den>
+              <m:r>
+                <w:rPr>
+                  <w:rFonts w:ascii="Cambria Math" w:hAnsi="Cambria Math"/>
+                  <w:lang w:val="en-US"/>
+                </w:rPr>
+                <m:t>k</m:t>
+              </m:r>
+            </m:den>
+          </m:f>
+          <m:r>
+            <w:rPr>
+              <w:rFonts w:ascii="Cambria Math" w:hAnsi="Cambria Math"/>
+              <w:lang w:val="en-US"/>
+            </w:rPr>
+            <w:br/>
+          </m:r>
+        </m:oMath>
+      </m:oMathPara>
+      <w:r>
+        <w:rPr>
+          <w:lang w:val="en-US"/>
+        </w:rPr>
+        <w:t xml:space="preserve">D = dividend per share = EPS * Payout </w:t>
+      </w:r>
+    </w:p>
+    <w:p>
+      <w:pPr>
+        <w:pStyle w:val="ListParagraph"/>
+        <w:rPr>
+          <w:lang w:val="en-US"/>
+        </w:rPr>
+      </w:pPr>
+      <w:r>
+        <w:rPr>
+          <w:lang w:val="en-US"/>
+        </w:rPr>
+        <w:t>20 * 20% = Rs. 4</w:t>
+      </w:r>
+    </w:p>
+    <w:p>
+      <w:pPr>
+        <w:pStyle w:val="ListParagraph"/>
+        <w:rPr>
+          <w:lang w:val="en-US"/>
+        </w:rPr>
+      </w:pPr>
+    </w:p>
+    <w:p>
+      <w:pPr>
+        <w:pStyle w:val="ListParagraph"/>
+        <w:rPr>
+          <w:lang w:val="en-US"/>
+        </w:rPr>
+      </w:pPr>
+      <w:r>
+        <w:rPr>
+          <w:lang w:val="en-US"/>
+        </w:rPr>
+        <w:t>Y = rate of return = 18%</w:t>
+      </w:r>
+    </w:p>
+    <w:p>
+      <w:pPr>
+        <w:pStyle w:val="ListParagraph"/>
+        <w:rPr>
+          <w:lang w:val="en-US"/>
+        </w:rPr>
+      </w:pPr>
+      <w:r>
+        <w:rPr>
+          <w:lang w:val="en-US"/>
+        </w:rPr>
+        <w:t>K = cost of capital = 10%</w:t>
+      </w:r>
+    </w:p>
+    <w:p>
+      <w:pPr>
+        <w:pStyle w:val="ListParagraph"/>
+        <w:rPr>
+          <w:lang w:val="en-US"/>
+        </w:rPr>
+      </w:pPr>
+      <w:r>
+        <w:rPr>
+          <w:lang w:val="en-US"/>
+        </w:rPr>
+        <w:t xml:space="preserve">E = earnings per share = Rs. 20 </w:t>
+      </w:r>
+    </w:p>
+    <w:p>
+      <w:pPr>
+        <w:pStyle w:val="ListParagraph"/>
+        <w:rPr>
+          <w:lang w:val="en-US"/>
+        </w:rPr>
+      </w:pPr>
+    </w:p>
+    <w:p>
+      <w:pPr>
+        <w:pStyle w:val="ListParagraph"/>
+        <w:rPr>
+          <w:rFonts w:eastAsiaTheme="minorEastAsia"/>
+          <w:lang w:val="en-US"/>
+        </w:rPr>
+      </w:pPr>
+      <w:r>
+        <w:rPr>
+          <w:lang w:val="en-US"/>
+        </w:rPr>
+        <w:lastRenderedPageBreak/>
+        <w:t xml:space="preserve">MPS = </w:t>
+      </w:r>
+      <m:oMath>
+        <m:f>
+          <m:fPr>
+            <m:ctrlPr>
+              <w:rPr>
+                <w:rFonts w:ascii="Cambria Math" w:hAnsi="Cambria Math"/>
+                <w:i/>
+                <w:lang w:val="en-US"/>
+              </w:rPr>
+            </m:ctrlPr>
+          </m:fPr>
+          <m:num>
+            <m:r>
+              <w:rPr>
+                <w:rFonts w:ascii="Cambria Math" w:hAnsi="Cambria Math"/>
+                <w:lang w:val="en-US"/>
+              </w:rPr>
+              <m:t xml:space="preserve">4 + </m:t>
+            </m:r>
+            <m:f>
+              <m:fPr>
+                <m:ctrlPr>
+                  <w:rPr>
+                    <w:rFonts w:ascii="Cambria Math" w:hAnsi="Cambria Math"/>
+                    <w:i/>
+                    <w:lang w:val="en-US"/>
+                  </w:rPr>
+                </m:ctrlPr>
+              </m:fPr>
+              <m:num>
+                <m:r>
+                  <w:rPr>
+                    <w:rFonts w:ascii="Cambria Math" w:hAnsi="Cambria Math"/>
+                    <w:lang w:val="en-US"/>
+                  </w:rPr>
+                  <m:t>0.18</m:t>
+                </m:r>
+              </m:num>
+              <m:den>
+                <m:r>
+                  <w:rPr>
+                    <w:rFonts w:ascii="Cambria Math" w:hAnsi="Cambria Math"/>
+                    <w:lang w:val="en-US"/>
+                  </w:rPr>
+                  <m:t>0.10</m:t>
+                </m:r>
+              </m:den>
+            </m:f>
+            <m:d>
+              <m:dPr>
+                <m:ctrlPr>
+                  <w:rPr>
+                    <w:rFonts w:ascii="Cambria Math" w:hAnsi="Cambria Math"/>
+                    <w:i/>
+                    <w:lang w:val="en-US"/>
+                  </w:rPr>
+                </m:ctrlPr>
+              </m:dPr>
+              <m:e>
+                <m:r>
+                  <w:rPr>
+                    <w:rFonts w:ascii="Cambria Math" w:hAnsi="Cambria Math"/>
+                    <w:lang w:val="en-US"/>
+                  </w:rPr>
+                  <m:t>20-4</m:t>
+                </m:r>
+              </m:e>
+            </m:d>
+          </m:num>
+          <m:den>
+            <m:r>
+              <w:rPr>
+                <w:rFonts w:ascii="Cambria Math" w:hAnsi="Cambria Math"/>
+                <w:lang w:val="en-US"/>
+              </w:rPr>
+              <m:t>0.10</m:t>
+            </m:r>
+          </m:den>
+        </m:f>
+      </m:oMath>
+      <w:r>
+        <w:rPr>
+          <w:rFonts w:eastAsiaTheme="minorEastAsia"/>
+          <w:lang w:val="en-US"/>
+        </w:rPr>
+        <w:t xml:space="preserve"> = 328</w:t>
+      </w:r>
+    </w:p>
+    <w:p>
+      <w:pPr>
+        <w:pStyle w:val="ListParagraph"/>
+        <w:rPr>
+          <w:lang w:val="en-US"/>
+        </w:rPr>
+      </w:pPr>
+      <w:r>
+        <w:rPr>
+          <w:lang w:val="en-US"/>
+        </w:rPr>
+        <w:t>Value of firm: No. of equity share * MPS</w:t>
+      </w:r>
+    </w:p>
+    <w:p>
+      <w:pPr>
+        <w:pStyle w:val="ListParagraph"/>
+        <w:rPr>
+          <w:lang w:val="en-US"/>
+        </w:rPr>
+      </w:pPr>
+      <w:r>
+        <w:rPr>
+          <w:lang w:val="en-US"/>
+        </w:rPr>
+        <w:t>500000 * 200 = 164000000</w:t>
+      </w:r>
+    </w:p>
+    <w:p>
+      <w:pPr>
+        <w:pStyle w:val="ListParagraph"/>
+        <w:rPr>
+          <w:lang w:val="en-US"/>
+        </w:rPr>
+      </w:pPr>
+    </w:p>
+    <w:p>
+      <w:pPr>
+        <w:pStyle w:val="ListParagraph"/>
+        <w:rPr>
+          <w:lang w:val="en-US"/>
+        </w:rPr>
+      </w:pPr>
+      <w:r>
+        <w:rPr>
+          <w:lang w:val="en-US"/>
+        </w:rPr>
+        <w:t>Conclusion: Nirmal ltd is a growth firm or greater than k. as payout increases, the value of firm decreases. Ideal payout is 0%</w:t>
+      </w:r>
+    </w:p>
+    <w:p>
+      <w:pPr>
+        <w:rPr>
+          <w:lang w:val="en-US"/>
+        </w:rPr>
+      </w:pPr>
+    </w:p>
+    <w:p>
+      <w:pPr>
+        <w:rPr>
+          <w:lang w:val="en-US"/>
+        </w:rPr>
+      </w:pPr>
+      <w:r>
+        <w:rPr>
+          <w:lang w:val="en-US"/>
+        </w:rPr>
+        <w:t xml:space="preserve">Q. walter model (normal firm): the EPS is Rs 15 and the rate of capitalization applicable to the company is 12% the productivity of earnings, r is 12%. Compute the market value of the firms share if the payout is a) 20% b) 50% c) 70%. Which is the optimum payout </w:t>
+      </w:r>
+    </w:p>
+    <w:p>
+      <w:pPr>
+        <w:rPr>
+          <w:lang w:val="en-US"/>
+        </w:rPr>
+      </w:pPr>
+    </w:p>
+    <w:p>
+      <w:pPr>
+        <w:rPr>
+          <w:lang w:val="en-US"/>
+        </w:rPr>
+      </w:pPr>
+      <w:r>
+        <w:rPr>
+          <w:lang w:val="en-US"/>
+        </w:rPr>
+        <w:t>Sol:</w:t>
+      </w:r>
+    </w:p>
+    <w:p>
+      <w:r>
+        <w:t>Walter model formula:</w:t>
+      </w:r>
+    </w:p>
+    <w:p>
+      <m:oMathPara>
+        <m:oMath>
+          <m:r>
+            <w:rPr>
+              <w:rFonts w:ascii="Cambria Math" w:hAnsi="Cambria Math"/>
+            </w:rPr>
+            <m:t>P=</m:t>
+          </m:r>
+          <m:f>
+            <m:fPr>
+              <m:ctrlPr>
+                <w:rPr>
+                  <w:rFonts w:ascii="Cambria Math" w:hAnsi="Cambria Math"/>
+                </w:rPr>
+              </m:ctrlPr>
+            </m:fPr>
+            <m:num>
+              <m:r>
+                <w:rPr>
+                  <w:rFonts w:ascii="Cambria Math" w:hAnsi="Cambria Math"/>
+                </w:rPr>
+                <m:t>D+</m:t>
+              </m:r>
+              <m:f>
+                <m:fPr>
+                  <m:ctrlPr>
+                    <w:rPr>
+                      <w:rFonts w:ascii="Cambria Math" w:hAnsi="Cambria Math"/>
+                    </w:rPr>
+                  </m:ctrlPr>
+                </m:fPr>
+                <m:num>
+                  <m:r>
+                    <w:rPr>
+                      <w:rFonts w:ascii="Cambria Math" w:hAnsi="Cambria Math"/>
+                    </w:rPr>
+                    <m:t>r</m:t>
+                  </m:r>
+                </m:num>
+                <m:den>
+                  <m:r>
+                    <w:rPr>
+                      <w:rFonts w:ascii="Cambria Math" w:hAnsi="Cambria Math"/>
+                    </w:rPr>
+                    <m:t>k</m:t>
+                  </m:r>
+                </m:den>
+              </m:f>
+              <m:d>
+                <m:dPr>
+                  <m:ctrlPr>
+                    <w:rPr>
+                      <w:rFonts w:ascii="Cambria Math" w:hAnsi="Cambria Math"/>
+                    </w:rPr>
+                  </m:ctrlPr>
+                </m:dPr>
+                <m:e>
+                  <m:r>
+                    <w:rPr>
+                      <w:rFonts w:ascii="Cambria Math" w:hAnsi="Cambria Math"/>
+                    </w:rPr>
+                    <m:t>E-D</m:t>
+                  </m:r>
+                </m:e>
+              </m:d>
+            </m:num>
+            <m:den>
+              <m:r>
+                <w:rPr>
+                  <w:rFonts w:ascii="Cambria Math" w:hAnsi="Cambria Math"/>
+                </w:rPr>
+                <m:t>k</m:t>
+              </m:r>
+            </m:den>
+          </m:f>
+          <m:r>
+            <w:br/>
+          </m:r>
+        </m:oMath>
+      </m:oMathPara>
+    </w:p>
+    <w:p>
+      <w:r>
+        <w:t>Given:</w:t>
+      </w:r>
+    </w:p>
+    <w:p>
+      <w:pPr>
+        <w:numPr>
+          <w:ilvl w:val="0"/>
+          <w:numId w:val="44"/>
+        </w:numPr>
+      </w:pPr>
+      <w:r>
+        <w:t xml:space="preserve">EPS </w:t>
+      </w:r>
+      <m:oMath>
+        <m:d>
+          <m:dPr>
+            <m:ctrlPr>
+              <w:rPr>
+                <w:rFonts w:ascii="Cambria Math" w:hAnsi="Cambria Math"/>
+              </w:rPr>
+            </m:ctrlPr>
+          </m:dPr>
+          <m:e>
+            <m:r>
+              <w:rPr>
+                <w:rFonts w:ascii="Cambria Math" w:hAnsi="Cambria Math"/>
+              </w:rPr>
+              <m:t>E</m:t>
+            </m:r>
+          </m:e>
+        </m:d>
+        <m:r>
+          <w:rPr>
+            <w:rFonts w:ascii="Cambria Math" w:hAnsi="Cambria Math"/>
+          </w:rPr>
+          <m:t>=Rs</m:t>
+        </m:r>
+        <m:r>
+          <m:rPr>
+            <m:nor/>
+          </m:rPr>
+          <m:t> </m:t>
+        </m:r>
+        <m:r>
+          <w:rPr>
+            <w:rFonts w:ascii="Cambria Math" w:hAnsi="Cambria Math"/>
+          </w:rPr>
+          <m:t>15</m:t>
+        </m:r>
+      </m:oMath>
+    </w:p>
+    <w:p>
+      <w:pPr>
+        <w:numPr>
+          <w:ilvl w:val="0"/>
+          <w:numId w:val="44"/>
+        </w:numPr>
+      </w:pPr>
+      <w:r>
+        <w:t xml:space="preserve">Capitalization rate </w:t>
+      </w:r>
+      <m:oMath>
+        <m:d>
+          <m:dPr>
+            <m:ctrlPr>
+              <w:rPr>
+                <w:rFonts w:ascii="Cambria Math" w:hAnsi="Cambria Math"/>
+              </w:rPr>
+            </m:ctrlPr>
+          </m:dPr>
+          <m:e>
+            <m:r>
+              <w:rPr>
+                <w:rFonts w:ascii="Cambria Math" w:hAnsi="Cambria Math"/>
+              </w:rPr>
+              <m:t>k</m:t>
+            </m:r>
+          </m:e>
+        </m:d>
+        <m:r>
+          <w:rPr>
+            <w:rFonts w:ascii="Cambria Math" w:hAnsi="Cambria Math"/>
+          </w:rPr>
+          <m:t>=12%=0.12</m:t>
+        </m:r>
+      </m:oMath>
+    </w:p>
+    <w:p>
+      <w:pPr>
+        <w:numPr>
+          <w:ilvl w:val="0"/>
+          <w:numId w:val="44"/>
+        </w:numPr>
+      </w:pPr>
+      <w:r>
+        <w:t xml:space="preserve">Productivity of earnings </w:t>
+      </w:r>
+      <m:oMath>
+        <m:d>
+          <m:dPr>
+            <m:ctrlPr>
+              <w:rPr>
+                <w:rFonts w:ascii="Cambria Math" w:hAnsi="Cambria Math"/>
+              </w:rPr>
+            </m:ctrlPr>
+          </m:dPr>
+          <m:e>
+            <m:r>
+              <w:rPr>
+                <w:rFonts w:ascii="Cambria Math" w:hAnsi="Cambria Math"/>
+              </w:rPr>
+              <m:t>r</m:t>
+            </m:r>
+          </m:e>
+        </m:d>
+        <m:r>
+          <w:rPr>
+            <w:rFonts w:ascii="Cambria Math" w:hAnsi="Cambria Math"/>
+          </w:rPr>
+          <m:t>=12%=0.12</m:t>
+        </m:r>
+      </m:oMath>
+    </w:p>
+    <w:p>
+      <w:pPr>
+        <w:numPr>
+          <w:ilvl w:val="0"/>
+          <w:numId w:val="44"/>
+        </w:numPr>
+      </w:pPr>
+      <w:r>
+        <w:t xml:space="preserve">Since </w:t>
+      </w:r>
+      <m:oMath>
+        <m:r>
+          <w:rPr>
+            <w:rFonts w:ascii="Cambria Math" w:hAnsi="Cambria Math"/>
+          </w:rPr>
+          <m:t>r=k</m:t>
+        </m:r>
+      </m:oMath>
+      <w:r>
+        <w:t xml:space="preserve">, it is a </w:t>
+      </w:r>
+      <w:r>
+        <w:rPr>
+          <w:b/>
+          <w:bCs/>
+        </w:rPr>
+        <w:t>normal firm</w:t>
+      </w:r>
+      <w:r>
+        <w:t>.</w:t>
+      </w:r>
+    </w:p>
+    <w:p>
+      <w:pPr>
+        <w:rPr>
+          <w:b/>
+          <w:bCs/>
+        </w:rPr>
+      </w:pPr>
+      <w:r>
+        <w:rPr>
+          <w:b/>
+          <w:bCs/>
+        </w:rPr>
+        <w:t>a) Payout = 20%</w:t>
+      </w:r>
+    </w:p>
+    <w:p>
+      <w:pPr>
+        <w:rPr>
+          <w:rFonts w:eastAsiaTheme="minorEastAsia"/>
+          <w:i/>
+        </w:rPr>
+      </w:pPr>
+      <m:oMathPara>
+        <m:oMath>
+          <m:r>
+            <w:rPr>
+              <w:rFonts w:ascii="Cambria Math" w:hAnsi="Cambria Math"/>
+            </w:rPr>
+            <m:t>D=20%×15=Rs</m:t>
+          </m:r>
+          <m:r>
+            <m:rPr>
+              <m:nor/>
+            </m:rPr>
+            <m:t> </m:t>
+          </m:r>
+          <m:r>
+            <w:rPr>
+              <w:rFonts w:ascii="Cambria Math" w:hAnsi="Cambria Math"/>
+            </w:rPr>
+            <m:t>3</m:t>
+          </m:r>
+        </m:oMath>
+      </m:oMathPara>
+    </w:p>
+    <w:p>
+      <w:r>
+        <w:rPr>
+          <w:i/>
+        </w:rPr>
+        <w:br/>
+      </w:r>
+      <m:oMathPara>
+        <m:oMath>
+          <m:r>
+            <w:rPr>
+              <w:rFonts w:ascii="Cambria Math" w:hAnsi="Cambria Math"/>
+            </w:rPr>
+            <m:t>P=</m:t>
+          </m:r>
+          <m:f>
+            <m:fPr>
+              <m:ctrlPr>
+                <w:rPr>
+                  <w:rFonts w:ascii="Cambria Math" w:hAnsi="Cambria Math"/>
+                </w:rPr>
+              </m:ctrlPr>
+            </m:fPr>
+            <m:num>
+              <m:r>
+                <w:rPr>
+                  <w:rFonts w:ascii="Cambria Math" w:hAnsi="Cambria Math"/>
+                </w:rPr>
+                <m:t>3+</m:t>
+              </m:r>
+              <m:f>
+                <m:fPr>
+                  <m:ctrlPr>
+                    <w:rPr>
+                      <w:rFonts w:ascii="Cambria Math" w:hAnsi="Cambria Math"/>
+                    </w:rPr>
+                  </m:ctrlPr>
+                </m:fPr>
+                <m:num>
+                  <m:r>
+                    <w:rPr>
+                      <w:rFonts w:ascii="Cambria Math" w:hAnsi="Cambria Math"/>
+                    </w:rPr>
+                    <m:t>0.12</m:t>
+                  </m:r>
+                </m:num>
+                <m:den>
+                  <m:r>
+                    <w:rPr>
+                      <w:rFonts w:ascii="Cambria Math" w:hAnsi="Cambria Math"/>
+                    </w:rPr>
+                    <m:t>0.12</m:t>
+                  </m:r>
+                </m:den>
+              </m:f>
+              <m:d>
+                <m:dPr>
+                  <m:ctrlPr>
+                    <w:rPr>
+                      <w:rFonts w:ascii="Cambria Math" w:hAnsi="Cambria Math"/>
+                    </w:rPr>
+                  </m:ctrlPr>
+                </m:dPr>
+                <m:e>
+                  <m:r>
+                    <w:rPr>
+                      <w:rFonts w:ascii="Cambria Math" w:hAnsi="Cambria Math"/>
+                    </w:rPr>
+                    <m:t>15-3</m:t>
+                  </m:r>
+                </m:e>
+              </m:d>
+            </m:num>
+            <m:den>
+              <m:r>
+                <w:rPr>
+                  <w:rFonts w:ascii="Cambria Math" w:hAnsi="Cambria Math"/>
+                </w:rPr>
+                <m:t>0.12</m:t>
+              </m:r>
+            </m:den>
+          </m:f>
+          <m:r>
+            <w:rPr>
+              <w:rFonts w:ascii="Cambria Math" w:hAnsi="Cambria Math"/>
+            </w:rPr>
+            <m:t>=</m:t>
+          </m:r>
+          <m:f>
+            <m:fPr>
+              <m:ctrlPr>
+                <w:rPr>
+                  <w:rFonts w:ascii="Cambria Math" w:hAnsi="Cambria Math"/>
+                </w:rPr>
+              </m:ctrlPr>
+            </m:fPr>
+            <m:num>
+              <m:r>
+                <w:rPr>
+                  <w:rFonts w:ascii="Cambria Math" w:hAnsi="Cambria Math"/>
+                </w:rPr>
+                <m:t>3+12</m:t>
+              </m:r>
+            </m:num>
+            <m:den>
+              <m:r>
+                <w:rPr>
+                  <w:rFonts w:ascii="Cambria Math" w:hAnsi="Cambria Math"/>
+                </w:rPr>
+                <m:t>0.12</m:t>
+              </m:r>
+            </m:den>
+          </m:f>
+          <m:r>
+            <w:rPr>
+              <w:rFonts w:ascii="Cambria Math" w:hAnsi="Cambria Math"/>
+            </w:rPr>
+            <m:t>=</m:t>
+          </m:r>
+          <m:f>
+            <m:fPr>
+              <m:ctrlPr>
+                <w:rPr>
+                  <w:rFonts w:ascii="Cambria Math" w:hAnsi="Cambria Math"/>
+                </w:rPr>
+              </m:ctrlPr>
+            </m:fPr>
+            <m:num>
+              <m:r>
+                <w:rPr>
+                  <w:rFonts w:ascii="Cambria Math" w:hAnsi="Cambria Math"/>
+                </w:rPr>
+                <m:t>15</m:t>
+              </m:r>
+            </m:num>
+            <m:den>
+              <m:r>
+                <w:rPr>
+                  <w:rFonts w:ascii="Cambria Math" w:hAnsi="Cambria Math"/>
+                </w:rPr>
+                <m:t>0.12</m:t>
+              </m:r>
+            </m:den>
+          </m:f>
+          <m:r>
+            <w:rPr>
+              <w:rFonts w:ascii="Cambria Math" w:hAnsi="Cambria Math"/>
+            </w:rPr>
+            <m:t>=Rs</m:t>
+          </m:r>
+          <m:r>
+            <m:rPr>
+              <m:nor/>
+            </m:rPr>
+            <m:t> </m:t>
+          </m:r>
+          <m:r>
+            <w:rPr>
+              <w:rFonts w:ascii="Cambria Math" w:hAnsi="Cambria Math"/>
+            </w:rPr>
+            <m:t>125</m:t>
+          </m:r>
+          <m:r>
+            <w:rPr>
+              <w:i/>
+            </w:rPr>
+            <w:br/>
+          </m:r>
+        </m:oMath>
+      </m:oMathPara>
+    </w:p>
+    <w:p>
+      <w:pPr>
+        <w:rPr>
+          <w:b/>
+          <w:bCs/>
+        </w:rPr>
+      </w:pPr>
+      <w:r>
+        <w:rPr>
+          <w:b/>
+          <w:bCs/>
+        </w:rPr>
+        <w:t>b) Payout = 50%</w:t>
+      </w:r>
+    </w:p>
+    <w:p>
+      <w:pPr>
+        <w:rPr>
+          <w:rFonts w:eastAsiaTheme="minorEastAsia"/>
+          <w:i/>
+        </w:rPr>
+      </w:pPr>
+      <m:oMathPara>
+        <m:oMath>
+          <m:r>
+            <w:rPr>
+              <w:rFonts w:ascii="Cambria Math" w:hAnsi="Cambria Math"/>
+            </w:rPr>
+            <m:t>D=50%×15=Rs</m:t>
+          </m:r>
+          <m:r>
+            <m:rPr>
+              <m:nor/>
+            </m:rPr>
+            <m:t> </m:t>
+          </m:r>
+          <m:r>
+            <w:rPr>
+              <w:rFonts w:ascii="Cambria Math" w:hAnsi="Cambria Math"/>
+            </w:rPr>
+            <m:t>7.5</m:t>
+          </m:r>
+        </m:oMath>
+      </m:oMathPara>
+    </w:p>
+    <w:p>
+      <w:r>
+        <w:rPr>
+          <w:i/>
+        </w:rPr>
+        <w:br/>
+      </w:r>
+      <m:oMathPara>
+        <m:oMath>
+          <m:r>
+            <w:rPr>
+              <w:rFonts w:ascii="Cambria Math" w:hAnsi="Cambria Math"/>
+            </w:rPr>
+            <w:lastRenderedPageBreak/>
+            <m:t>P=</m:t>
+          </m:r>
+          <m:f>
+            <m:fPr>
+              <m:ctrlPr>
+                <w:rPr>
+                  <w:rFonts w:ascii="Cambria Math" w:hAnsi="Cambria Math"/>
+                </w:rPr>
+              </m:ctrlPr>
+            </m:fPr>
+            <m:num>
+              <m:r>
+                <w:rPr>
+                  <w:rFonts w:ascii="Cambria Math" w:hAnsi="Cambria Math"/>
+                </w:rPr>
+                <m:t>7.5+7.5</m:t>
+              </m:r>
+            </m:num>
+            <m:den>
+              <m:r>
+                <w:rPr>
+                  <w:rFonts w:ascii="Cambria Math" w:hAnsi="Cambria Math"/>
+                </w:rPr>
+                <m:t>0.12</m:t>
+              </m:r>
+            </m:den>
+          </m:f>
+          <m:r>
+            <w:rPr>
+              <w:rFonts w:ascii="Cambria Math" w:hAnsi="Cambria Math"/>
+            </w:rPr>
+            <m:t>=</m:t>
+          </m:r>
+          <m:f>
+            <m:fPr>
+              <m:ctrlPr>
+                <w:rPr>
+                  <w:rFonts w:ascii="Cambria Math" w:hAnsi="Cambria Math"/>
+                </w:rPr>
+              </m:ctrlPr>
+            </m:fPr>
+            <m:num>
+              <m:r>
+                <w:rPr>
+                  <w:rFonts w:ascii="Cambria Math" w:hAnsi="Cambria Math"/>
+                </w:rPr>
+                <m:t>15</m:t>
+              </m:r>
+            </m:num>
+            <m:den>
+              <m:r>
+                <w:rPr>
+                  <w:rFonts w:ascii="Cambria Math" w:hAnsi="Cambria Math"/>
+                </w:rPr>
+                <m:t>0.12</m:t>
+              </m:r>
+            </m:den>
+          </m:f>
+          <m:r>
+            <w:rPr>
+              <w:rFonts w:ascii="Cambria Math" w:hAnsi="Cambria Math"/>
+            </w:rPr>
+            <m:t>=Rs</m:t>
+          </m:r>
+          <m:r>
+            <m:rPr>
+              <m:nor/>
+            </m:rPr>
+            <m:t> </m:t>
+          </m:r>
+          <m:r>
+            <w:rPr>
+              <w:rFonts w:ascii="Cambria Math" w:hAnsi="Cambria Math"/>
+            </w:rPr>
+            <m:t>125</m:t>
+          </m:r>
+          <m:r>
+            <w:rPr>
+              <w:i/>
+            </w:rPr>
+            <w:br/>
+          </m:r>
+        </m:oMath>
+      </m:oMathPara>
+    </w:p>
+    <w:p>
+      <w:pPr>
+        <w:rPr>
+          <w:b/>
+          <w:bCs/>
+        </w:rPr>
+      </w:pPr>
+      <w:r>
+        <w:rPr>
+          <w:b/>
+          <w:bCs/>
+        </w:rPr>
+        <w:t>c) Payout = 70%</w:t>
+      </w:r>
+    </w:p>
+    <w:p>
+      <w:pPr>
+        <w:rPr>
+          <w:rFonts w:eastAsiaTheme="minorEastAsia"/>
+          <w:i/>
+        </w:rPr>
+      </w:pPr>
+      <m:oMathPara>
+        <m:oMath>
+          <m:r>
+            <w:rPr>
+              <w:rFonts w:ascii="Cambria Math" w:hAnsi="Cambria Math"/>
+            </w:rPr>
+            <m:t>D=70%×15=Rs</m:t>
+          </m:r>
+          <m:r>
+            <m:rPr>
+              <m:nor/>
+            </m:rPr>
+            <m:t> </m:t>
+          </m:r>
+          <m:r>
+            <w:rPr>
+              <w:rFonts w:ascii="Cambria Math" w:hAnsi="Cambria Math"/>
+            </w:rPr>
+            <m:t>10.5</m:t>
+          </m:r>
+        </m:oMath>
+      </m:oMathPara>
+    </w:p>
+    <w:p>
+      <w:pPr>
+        <w:rPr>
+          <w:lang w:val="en-US"/>
+        </w:rPr>
+      </w:pPr>
+      <w:r>
+        <w:rPr>
+          <w:i/>
+        </w:rPr>
+        <w:br/>
+      </w:r>
+      <m:oMathPara>
+        <m:oMath>
+          <m:r>
+            <w:rPr>
+              <w:rFonts w:ascii="Cambria Math" w:hAnsi="Cambria Math"/>
+            </w:rPr>
+            <m:t>P=</m:t>
+          </m:r>
+          <m:f>
+            <m:fPr>
+              <m:ctrlPr>
+                <w:rPr>
+                  <w:rFonts w:ascii="Cambria Math" w:hAnsi="Cambria Math"/>
+                </w:rPr>
+              </m:ctrlPr>
+            </m:fPr>
+            <m:num>
+              <m:r>
+                <w:rPr>
+                  <w:rFonts w:ascii="Cambria Math" w:hAnsi="Cambria Math"/>
+                </w:rPr>
+                <m:t>10.5+4.5</m:t>
+              </m:r>
+            </m:num>
+            <m:den>
+              <m:r>
+                <w:rPr>
+                  <w:rFonts w:ascii="Cambria Math" w:hAnsi="Cambria Math"/>
+                </w:rPr>
+                <m:t>0.12</m:t>
+              </m:r>
+            </m:den>
+          </m:f>
+          <m:r>
+            <w:rPr>
+              <w:rFonts w:ascii="Cambria Math" w:hAnsi="Cambria Math"/>
+            </w:rPr>
+            <m:t>=</m:t>
+          </m:r>
+          <m:f>
+            <m:fPr>
+              <m:ctrlPr>
+                <w:rPr>
+                  <w:rFonts w:ascii="Cambria Math" w:hAnsi="Cambria Math"/>
+                </w:rPr>
+              </m:ctrlPr>
+            </m:fPr>
+            <m:num>
+              <m:r>
+                <w:rPr>
+                  <w:rFonts w:ascii="Cambria Math" w:hAnsi="Cambria Math"/>
+                </w:rPr>
+                <m:t>15</m:t>
+              </m:r>
+            </m:num>
+            <m:den>
+              <m:r>
+                <w:rPr>
+                  <w:rFonts w:ascii="Cambria Math" w:hAnsi="Cambria Math"/>
+                </w:rPr>
+                <m:t>0.12</m:t>
+              </m:r>
+            </m:den>
+          </m:f>
+          <m:r>
+            <w:rPr>
+              <w:rFonts w:ascii="Cambria Math" w:hAnsi="Cambria Math"/>
+            </w:rPr>
+            <m:t>=Rs</m:t>
+          </m:r>
+          <m:r>
+            <m:rPr>
+              <m:nor/>
+            </m:rPr>
+            <m:t> </m:t>
+          </m:r>
+          <m:r>
+            <w:rPr>
+              <w:rFonts w:ascii="Cambria Math" w:hAnsi="Cambria Math"/>
+            </w:rPr>
+            <m:t>125</m:t>
+          </m:r>
+          <m:r>
+            <w:rPr>
+              <w:i/>
+            </w:rPr>
+            <w:br/>
+          </m:r>
+        </m:oMath>
+      </m:oMathPara>
+    </w:p>
+    <w:p>
+      <w:pPr>
+        <w:rPr>
+          <w:lang w:val="en-US"/>
+        </w:rPr>
+      </w:pPr>
+      <w:r>
+        <w:rPr>
+          <w:lang w:val="en-US"/>
+        </w:rPr>
+        <w:t>the firm is a normal firm (r =k) MPS remain the same for all payouts the MPS is same. Hence there is no optimum payout</w:t>
+      </w:r>
+    </w:p>
+    <w:p>
+      <w:pPr>
+        <w:rPr>
+          <w:lang w:val="en-US"/>
+        </w:rPr>
+      </w:pPr>
+    </w:p>
+    <w:p>
+      <w:pPr>
+        <w:rPr>
+          <w:lang w:val="en-US"/>
+        </w:rPr>
+      </w:pPr>
+    </w:p>
+    <w:p>
+      <w:pPr>
+        <w:rPr>
+          <w:lang w:val="en-US"/>
+        </w:rPr>
+      </w:pPr>
+      <w:r>
+        <w:rPr>
+          <w:lang w:val="en-US"/>
+        </w:rPr>
+        <w:t>walter model (declining firm)</w:t>
+      </w:r>
+    </w:p>
+    <w:p>
+      <w:pPr>
+        <w:rPr>
+          <w:lang w:val="en-US"/>
+        </w:rPr>
+      </w:pPr>
+      <w:r>
+        <w:rPr>
+          <w:lang w:val="en-US"/>
+        </w:rPr>
+        <w:t xml:space="preserve">q. the EPS is Rs 12. The rate of capitalization is 15%and the rate of return on investment is 9%. Compute the MPS using walter’s model, if the dividend payout is a) 25% b) 50% c) 100%. Which is the ideal payout </w:t>
+      </w:r>
+    </w:p>
+    <w:p>
+      <w:pPr>
+        <w:rPr>
+          <w:lang w:val="en-US"/>
+        </w:rPr>
+      </w:pPr>
+    </w:p>
+    <w:p>
+      <w:pPr>
+        <w:rPr>
+          <w:lang w:val="en-US"/>
+        </w:rPr>
+      </w:pPr>
+      <w:r>
+        <w:rPr>
+          <w:lang w:val="en-US"/>
+        </w:rPr>
+        <w:t>sol:</w:t>
+      </w:r>
+    </w:p>
+    <w:p>
+      <w:pPr>
+        <w:rPr>
+          <w:lang w:val="en-US"/>
+        </w:rPr>
+      </w:pPr>
+    </w:p>
+    <w:p>
+      <w:r>
+        <w:t>Using Walter’s model:</w:t>
+      </w:r>
+    </w:p>
+    <w:p>
+      <m:oMathPara>
+        <m:oMath>
+          <m:r>
+            <w:rPr>
+              <w:rFonts w:ascii="Cambria Math" w:hAnsi="Cambria Math"/>
+            </w:rPr>
+            <m:t>P=</m:t>
+          </m:r>
+          <m:f>
+            <m:fPr>
+              <m:ctrlPr>
+                <w:rPr>
+                  <w:rFonts w:ascii="Cambria Math" w:hAnsi="Cambria Math"/>
+                </w:rPr>
+              </m:ctrlPr>
+            </m:fPr>
+            <m:num>
+              <m:r>
+                <w:rPr>
+                  <w:rFonts w:ascii="Cambria Math" w:hAnsi="Cambria Math"/>
+                </w:rPr>
+                <m:t>D+</m:t>
+              </m:r>
+              <m:f>
+                <m:fPr>
+                  <m:ctrlPr>
+                    <w:rPr>
+                      <w:rFonts w:ascii="Cambria Math" w:hAnsi="Cambria Math"/>
+                    </w:rPr>
+                  </m:ctrlPr>
+                </m:fPr>
+                <m:num>
+                  <m:r>
+                    <w:rPr>
+                      <w:rFonts w:ascii="Cambria Math" w:hAnsi="Cambria Math"/>
+                    </w:rPr>
+                    <m:t>r</m:t>
+                  </m:r>
+                </m:num>
+                <m:den>
+                  <m:r>
+                    <w:rPr>
+                      <w:rFonts w:ascii="Cambria Math" w:hAnsi="Cambria Math"/>
+                    </w:rPr>
+                    <m:t>k</m:t>
+                  </m:r>
+                </m:den>
+              </m:f>
+              <m:d>
+                <m:dPr>
+                  <m:ctrlPr>
+                    <w:rPr>
+                      <w:rFonts w:ascii="Cambria Math" w:hAnsi="Cambria Math"/>
+                    </w:rPr>
+                  </m:ctrlPr>
+                </m:dPr>
+                <m:e>
+                  <m:r>
+                    <w:rPr>
+                      <w:rFonts w:ascii="Cambria Math" w:hAnsi="Cambria Math"/>
+                    </w:rPr>
+                    <m:t>E-D</m:t>
+                  </m:r>
+                </m:e>
+              </m:d>
+            </m:num>
+            <m:den>
+              <m:r>
+                <w:rPr>
+                  <w:rFonts w:ascii="Cambria Math" w:hAnsi="Cambria Math"/>
+                </w:rPr>
+                <m:t>k</m:t>
+              </m:r>
+            </m:den>
+          </m:f>
+          <m:r>
+            <w:br/>
+          </m:r>
+        </m:oMath>
+      </m:oMathPara>
+    </w:p>
+    <w:p>
+      <w:r>
+        <w:t>Given:</w:t>
+      </w:r>
+    </w:p>
+    <w:p>
+      <w:pPr>
+        <w:numPr>
+          <w:ilvl w:val="0"/>
+          <w:numId w:val="45"/>
+        </w:numPr>
+      </w:pPr>
+      <w:r>
+        <w:t xml:space="preserve">EPS </w:t>
+      </w:r>
+      <m:oMath>
+        <m:d>
+          <m:dPr>
+            <m:ctrlPr>
+              <w:rPr>
+                <w:rFonts w:ascii="Cambria Math" w:hAnsi="Cambria Math"/>
+              </w:rPr>
+            </m:ctrlPr>
+          </m:dPr>
+          <m:e>
+            <m:r>
+              <w:rPr>
+                <w:rFonts w:ascii="Cambria Math" w:hAnsi="Cambria Math"/>
+              </w:rPr>
+              <m:t>E</m:t>
+            </m:r>
+          </m:e>
+        </m:d>
+        <m:r>
+          <w:rPr>
+            <w:rFonts w:ascii="Cambria Math" w:hAnsi="Cambria Math"/>
+          </w:rPr>
+          <m:t>=Rs</m:t>
+        </m:r>
+        <m:r>
+          <m:rPr>
+            <m:nor/>
+          </m:rPr>
+          <m:t> </m:t>
+        </m:r>
+        <m:r>
+          <w:rPr>
+            <w:rFonts w:ascii="Cambria Math" w:hAnsi="Cambria Math"/>
+          </w:rPr>
+          <m:t>12</m:t>
+        </m:r>
+      </m:oMath>
+    </w:p>
+    <w:p>
+      <w:pPr>
+        <w:numPr>
+          <w:ilvl w:val="0"/>
+          <w:numId w:val="45"/>
+        </w:numPr>
+      </w:pPr>
+      <w:r>
+        <w:t xml:space="preserve">Capitalization rate </w:t>
+      </w:r>
+      <m:oMath>
+        <m:d>
+          <m:dPr>
+            <m:ctrlPr>
+              <w:rPr>
+                <w:rFonts w:ascii="Cambria Math" w:hAnsi="Cambria Math"/>
+              </w:rPr>
+            </m:ctrlPr>
+          </m:dPr>
+          <m:e>
+            <m:r>
+              <w:rPr>
+                <w:rFonts w:ascii="Cambria Math" w:hAnsi="Cambria Math"/>
+              </w:rPr>
+              <m:t>k</m:t>
+            </m:r>
+          </m:e>
+        </m:d>
+        <m:r>
+          <w:rPr>
+            <w:rFonts w:ascii="Cambria Math" w:hAnsi="Cambria Math"/>
+          </w:rPr>
+          <m:t>=15%=0.15</m:t>
+        </m:r>
+      </m:oMath>
+    </w:p>
+    <w:p>
+      <w:pPr>
+        <w:numPr>
+          <w:ilvl w:val="0"/>
+          <w:numId w:val="45"/>
+        </w:numPr>
+      </w:pPr>
+      <w:r>
+        <w:t xml:space="preserve">Rate of return </w:t>
+      </w:r>
+      <m:oMath>
+        <m:d>
+          <m:dPr>
+            <m:ctrlPr>
+              <w:rPr>
+                <w:rFonts w:ascii="Cambria Math" w:hAnsi="Cambria Math"/>
+              </w:rPr>
+            </m:ctrlPr>
+          </m:dPr>
+          <m:e>
+            <m:r>
+              <w:rPr>
+                <w:rFonts w:ascii="Cambria Math" w:hAnsi="Cambria Math"/>
+              </w:rPr>
+              <m:t>r</m:t>
+            </m:r>
+          </m:e>
+        </m:d>
+        <m:r>
+          <w:rPr>
+            <w:rFonts w:ascii="Cambria Math" w:hAnsi="Cambria Math"/>
+          </w:rPr>
+          <m:t>=9%=0.09</m:t>
+        </m:r>
+      </m:oMath>
+    </w:p>
+    <w:p>
+      <w:pPr>
+        <w:numPr>
+          <w:ilvl w:val="0"/>
+          <w:numId w:val="45"/>
+        </w:numPr>
+      </w:pPr>
+      <w:r>
+        <w:t xml:space="preserve">So, </w:t>
+      </w:r>
+      <m:oMath>
+        <m:f>
+          <m:fPr>
+            <m:ctrlPr>
+              <w:rPr>
+                <w:rFonts w:ascii="Cambria Math" w:hAnsi="Cambria Math"/>
+              </w:rPr>
+            </m:ctrlPr>
+          </m:fPr>
+          <m:num>
+            <m:r>
+              <w:rPr>
+                <w:rFonts w:ascii="Cambria Math" w:hAnsi="Cambria Math"/>
+              </w:rPr>
+              <m:t>r</m:t>
+            </m:r>
+          </m:num>
+          <m:den>
+            <m:r>
+              <w:rPr>
+                <w:rFonts w:ascii="Cambria Math" w:hAnsi="Cambria Math"/>
+              </w:rPr>
+              <m:t>k</m:t>
+            </m:r>
+          </m:den>
+        </m:f>
+        <m:r>
+          <w:rPr>
+            <w:rFonts w:ascii="Cambria Math" w:hAnsi="Cambria Math"/>
+          </w:rPr>
+          <m:t>=</m:t>
+        </m:r>
+        <m:f>
+          <m:fPr>
+            <m:ctrlPr>
+              <w:rPr>
+                <w:rFonts w:ascii="Cambria Math" w:hAnsi="Cambria Math"/>
+              </w:rPr>
+            </m:ctrlPr>
+          </m:fPr>
+          <m:num>
+            <m:r>
+              <w:rPr>
+                <w:rFonts w:ascii="Cambria Math" w:hAnsi="Cambria Math"/>
+              </w:rPr>
+              <m:t>0.09</m:t>
+            </m:r>
+          </m:num>
+          <m:den>
+            <m:r>
+              <w:rPr>
+                <w:rFonts w:ascii="Cambria Math" w:hAnsi="Cambria Math"/>
+              </w:rPr>
+              <m:t>0.15</m:t>
+            </m:r>
+          </m:den>
+        </m:f>
+        <m:r>
+          <w:rPr>
+            <w:rFonts w:ascii="Cambria Math" w:hAnsi="Cambria Math"/>
+          </w:rPr>
+          <m:t>=0.6</m:t>
+        </m:r>
+      </m:oMath>
+    </w:p>
+    <w:p>
+      <w:r>
+        <w:t xml:space="preserve">Since </w:t>
+      </w:r>
+      <m:oMath>
+        <m:r>
+          <w:rPr>
+            <w:rFonts w:ascii="Cambria Math" w:hAnsi="Cambria Math"/>
+          </w:rPr>
+          <m:t>r&lt;k</m:t>
+        </m:r>
+      </m:oMath>
+      <w:r>
+        <w:t xml:space="preserve">, the firm is a </w:t>
+      </w:r>
+      <w:r>
+        <w:rPr>
+          <w:b/>
+          <w:bCs/>
+        </w:rPr>
+        <w:t>declining firm</w:t>
+      </w:r>
+      <w:r>
+        <w:t xml:space="preserve">, and the optimum payout ratio is </w:t>
+      </w:r>
+      <w:r>
+        <w:rPr>
+          <w:b/>
+          <w:bCs/>
+        </w:rPr>
+        <w:t>100%</w:t>
+      </w:r>
+      <w:r>
+        <w:t>.</w:t>
+      </w:r>
+    </w:p>
+    <w:p>
+      <w:pPr>
+        <w:rPr>
+          <w:b/>
+          <w:bCs/>
+        </w:rPr>
+      </w:pPr>
+      <w:r>
+        <w:rPr>
+          <w:b/>
+          <w:bCs/>
+        </w:rPr>
+        <w:t>a) Payout = 25%</w:t>
+      </w:r>
+    </w:p>
+    <w:p>
+      <w:pPr>
+        <w:rPr>
+          <w:rFonts w:eastAsiaTheme="minorEastAsia"/>
+          <w:i/>
+        </w:rPr>
+      </w:pPr>
+      <m:oMathPara>
+        <m:oMath>
+          <m:r>
+            <w:rPr>
+              <w:rFonts w:ascii="Cambria Math" w:hAnsi="Cambria Math"/>
+            </w:rPr>
+            <m:t>D=25%×12=Rs</m:t>
+          </m:r>
+          <m:r>
+            <m:rPr>
+              <m:nor/>
+            </m:rPr>
+            <m:t> </m:t>
+          </m:r>
+          <m:r>
+            <w:rPr>
+              <w:rFonts w:ascii="Cambria Math" w:hAnsi="Cambria Math"/>
+            </w:rPr>
+            <m:t>3</m:t>
+          </m:r>
+        </m:oMath>
+      </m:oMathPara>
+    </w:p>
+    <w:p>
+      <w:r>
+        <w:rPr>
+          <w:i/>
+        </w:rPr>
+        <w:lastRenderedPageBreak/>
+        <w:br/>
+      </w:r>
+      <m:oMathPara>
+        <m:oMath>
+          <m:r>
+            <w:rPr>
+              <w:rFonts w:ascii="Cambria Math" w:hAnsi="Cambria Math"/>
+            </w:rPr>
+            <m:t>P=</m:t>
+          </m:r>
+          <m:f>
+            <m:fPr>
+              <m:ctrlPr>
+                <w:rPr>
+                  <w:rFonts w:ascii="Cambria Math" w:hAnsi="Cambria Math"/>
+                </w:rPr>
+              </m:ctrlPr>
+            </m:fPr>
+            <m:num>
+              <m:r>
+                <w:rPr>
+                  <w:rFonts w:ascii="Cambria Math" w:hAnsi="Cambria Math"/>
+                </w:rPr>
+                <m:t>3+0.6</m:t>
+              </m:r>
+              <m:d>
+                <m:dPr>
+                  <m:ctrlPr>
+                    <w:rPr>
+                      <w:rFonts w:ascii="Cambria Math" w:hAnsi="Cambria Math"/>
+                    </w:rPr>
+                  </m:ctrlPr>
+                </m:dPr>
+                <m:e>
+                  <m:r>
+                    <w:rPr>
+                      <w:rFonts w:ascii="Cambria Math" w:hAnsi="Cambria Math"/>
+                    </w:rPr>
+                    <m:t>12-3</m:t>
+                  </m:r>
+                </m:e>
+              </m:d>
+            </m:num>
+            <m:den>
+              <m:r>
+                <w:rPr>
+                  <w:rFonts w:ascii="Cambria Math" w:hAnsi="Cambria Math"/>
+                </w:rPr>
+                <m:t>0.15</m:t>
+              </m:r>
+            </m:den>
+          </m:f>
+          <m:r>
+            <w:rPr>
+              <w:rFonts w:ascii="Cambria Math" w:hAnsi="Cambria Math"/>
+            </w:rPr>
+            <m:t>=</m:t>
+          </m:r>
+          <m:f>
+            <m:fPr>
+              <m:ctrlPr>
+                <w:rPr>
+                  <w:rFonts w:ascii="Cambria Math" w:hAnsi="Cambria Math"/>
+                </w:rPr>
+              </m:ctrlPr>
+            </m:fPr>
+            <m:num>
+              <m:r>
+                <w:rPr>
+                  <w:rFonts w:ascii="Cambria Math" w:hAnsi="Cambria Math"/>
+                </w:rPr>
+                <m:t>3+5.4</m:t>
+              </m:r>
+            </m:num>
+            <m:den>
+              <m:r>
+                <w:rPr>
+                  <w:rFonts w:ascii="Cambria Math" w:hAnsi="Cambria Math"/>
+                </w:rPr>
+                <m:t>0.15</m:t>
+              </m:r>
+            </m:den>
+          </m:f>
+          <m:r>
+            <w:rPr>
+              <w:rFonts w:ascii="Cambria Math" w:hAnsi="Cambria Math"/>
+            </w:rPr>
+            <m:t>=</m:t>
+          </m:r>
+          <m:f>
+            <m:fPr>
+              <m:ctrlPr>
+                <w:rPr>
+                  <w:rFonts w:ascii="Cambria Math" w:hAnsi="Cambria Math"/>
+                </w:rPr>
+              </m:ctrlPr>
+            </m:fPr>
+            <m:num>
+              <m:r>
+                <w:rPr>
+                  <w:rFonts w:ascii="Cambria Math" w:hAnsi="Cambria Math"/>
+                </w:rPr>
+                <m:t>8.4</m:t>
+              </m:r>
+            </m:num>
+            <m:den>
+              <m:r>
+                <w:rPr>
+                  <w:rFonts w:ascii="Cambria Math" w:hAnsi="Cambria Math"/>
+                </w:rPr>
+                <m:t>0.15</m:t>
+              </m:r>
+            </m:den>
+          </m:f>
+          <m:r>
+            <w:rPr>
+              <w:rFonts w:ascii="Cambria Math" w:hAnsi="Cambria Math"/>
+            </w:rPr>
+            <m:t>=Rs</m:t>
+          </m:r>
+          <m:r>
+            <m:rPr>
+              <m:nor/>
+            </m:rPr>
+            <m:t> </m:t>
+          </m:r>
+          <m:r>
+            <w:rPr>
+              <w:rFonts w:ascii="Cambria Math" w:hAnsi="Cambria Math"/>
+            </w:rPr>
+            <m:t>56</m:t>
+          </m:r>
+          <m:r>
+            <w:rPr>
+              <w:i/>
+            </w:rPr>
+            <w:br/>
+          </m:r>
+        </m:oMath>
+      </m:oMathPara>
+    </w:p>
+    <w:p>
+      <w:pPr>
+        <w:rPr>
+          <w:b/>
+          <w:bCs/>
+        </w:rPr>
+      </w:pPr>
+      <w:r>
+        <w:rPr>
+          <w:b/>
+          <w:bCs/>
+        </w:rPr>
+        <w:t>b) Payout = 50%</w:t>
+      </w:r>
+    </w:p>
+    <w:p>
+      <w:pPr>
+        <w:rPr>
+          <w:rFonts w:eastAsiaTheme="minorEastAsia"/>
+          <w:i/>
+        </w:rPr>
+      </w:pPr>
+      <m:oMathPara>
+        <m:oMath>
+          <m:r>
+            <w:rPr>
+              <w:rFonts w:ascii="Cambria Math" w:hAnsi="Cambria Math"/>
+            </w:rPr>
+            <m:t>D=50%×12=Rs</m:t>
+          </m:r>
+          <m:r>
+            <m:rPr>
+              <m:nor/>
+            </m:rPr>
+            <m:t> </m:t>
+          </m:r>
+          <m:r>
+            <w:rPr>
+              <w:rFonts w:ascii="Cambria Math" w:hAnsi="Cambria Math"/>
+            </w:rPr>
+            <m:t>6</m:t>
+          </m:r>
+        </m:oMath>
+      </m:oMathPara>
+    </w:p>
+    <w:p>
+      <w:r>
+        <w:rPr>
+          <w:i/>
+        </w:rPr>
+        <w:br/>
+      </w:r>
+      <m:oMathPara>
+        <m:oMath>
+          <m:r>
+            <w:rPr>
+              <w:rFonts w:ascii="Cambria Math" w:hAnsi="Cambria Math"/>
+            </w:rPr>
+            <m:t>P=</m:t>
+          </m:r>
+          <m:f>
+            <m:fPr>
+              <m:ctrlPr>
+                <w:rPr>
+                  <w:rFonts w:ascii="Cambria Math" w:hAnsi="Cambria Math"/>
+                </w:rPr>
+              </m:ctrlPr>
+            </m:fPr>
+            <m:num>
+              <m:r>
+                <w:rPr>
+                  <w:rFonts w:ascii="Cambria Math" w:hAnsi="Cambria Math"/>
+                </w:rPr>
+                <m:t>6+0.6</m:t>
+              </m:r>
+              <m:d>
+                <m:dPr>
+                  <m:ctrlPr>
+                    <w:rPr>
+                      <w:rFonts w:ascii="Cambria Math" w:hAnsi="Cambria Math"/>
+                    </w:rPr>
+                  </m:ctrlPr>
+                </m:dPr>
+                <m:e>
+                  <m:r>
+                    <w:rPr>
+                      <w:rFonts w:ascii="Cambria Math" w:hAnsi="Cambria Math"/>
+                    </w:rPr>
+                    <m:t>12-6</m:t>
+                  </m:r>
+                </m:e>
+              </m:d>
+            </m:num>
+            <m:den>
+              <m:r>
+                <w:rPr>
+                  <w:rFonts w:ascii="Cambria Math" w:hAnsi="Cambria Math"/>
+                </w:rPr>
+                <m:t>0.15</m:t>
+              </m:r>
+            </m:den>
+          </m:f>
+          <m:r>
+            <w:rPr>
+              <w:rFonts w:ascii="Cambria Math" w:hAnsi="Cambria Math"/>
+            </w:rPr>
+            <m:t>=</m:t>
+          </m:r>
+          <m:f>
+            <m:fPr>
+              <m:ctrlPr>
+                <w:rPr>
+                  <w:rFonts w:ascii="Cambria Math" w:hAnsi="Cambria Math"/>
+                </w:rPr>
+              </m:ctrlPr>
+            </m:fPr>
+            <m:num>
+              <m:r>
+                <w:rPr>
+                  <w:rFonts w:ascii="Cambria Math" w:hAnsi="Cambria Math"/>
+                </w:rPr>
+                <m:t>6+3.6</m:t>
+              </m:r>
+            </m:num>
+            <m:den>
+              <m:r>
+                <w:rPr>
+                  <w:rFonts w:ascii="Cambria Math" w:hAnsi="Cambria Math"/>
+                </w:rPr>
+                <m:t>0.15</m:t>
+              </m:r>
+            </m:den>
+          </m:f>
+          <m:r>
+            <w:rPr>
+              <w:rFonts w:ascii="Cambria Math" w:hAnsi="Cambria Math"/>
+            </w:rPr>
+            <m:t>=</m:t>
+          </m:r>
+          <m:f>
+            <m:fPr>
+              <m:ctrlPr>
+                <w:rPr>
+                  <w:rFonts w:ascii="Cambria Math" w:hAnsi="Cambria Math"/>
+                </w:rPr>
+              </m:ctrlPr>
+            </m:fPr>
+            <m:num>
+              <m:r>
+                <w:rPr>
+                  <w:rFonts w:ascii="Cambria Math" w:hAnsi="Cambria Math"/>
+                </w:rPr>
+                <m:t>9.6</m:t>
+              </m:r>
+            </m:num>
+            <m:den>
+              <m:r>
+                <w:rPr>
+                  <w:rFonts w:ascii="Cambria Math" w:hAnsi="Cambria Math"/>
+                </w:rPr>
+                <m:t>0.15</m:t>
+              </m:r>
+            </m:den>
+          </m:f>
+          <m:r>
+            <w:rPr>
+              <w:rFonts w:ascii="Cambria Math" w:hAnsi="Cambria Math"/>
+            </w:rPr>
+            <m:t>=Rs</m:t>
+          </m:r>
+          <m:r>
+            <m:rPr>
+              <m:nor/>
+            </m:rPr>
+            <m:t> </m:t>
+          </m:r>
+          <m:r>
+            <w:rPr>
+              <w:rFonts w:ascii="Cambria Math" w:hAnsi="Cambria Math"/>
+            </w:rPr>
+            <m:t>64</m:t>
+          </m:r>
+          <m:r>
+            <w:rPr>
+              <w:i/>
+            </w:rPr>
+            <w:br/>
+          </m:r>
+        </m:oMath>
+      </m:oMathPara>
+    </w:p>
+    <w:p>
+      <w:pPr>
+        <w:rPr>
+          <w:b/>
+          <w:bCs/>
+        </w:rPr>
+      </w:pPr>
+      <w:r>
+        <w:rPr>
+          <w:b/>
+          <w:bCs/>
+        </w:rPr>
+        <w:t>c) Payout = 100%</w:t>
+      </w:r>
+    </w:p>
+    <w:p>
+      <w:pPr>
+        <w:rPr>
+          <w:rFonts w:eastAsiaTheme="minorEastAsia"/>
+          <w:i/>
+        </w:rPr>
+      </w:pPr>
+      <m:oMathPara>
+        <m:oMath>
+          <m:r>
+            <w:rPr>
+              <w:rFonts w:ascii="Cambria Math" w:hAnsi="Cambria Math"/>
+            </w:rPr>
+            <m:t>D=100%×12=Rs</m:t>
+          </m:r>
+          <m:r>
+            <m:rPr>
+              <m:nor/>
+            </m:rPr>
+            <m:t> </m:t>
+          </m:r>
+          <m:r>
+            <w:rPr>
+              <w:rFonts w:ascii="Cambria Math" w:hAnsi="Cambria Math"/>
+            </w:rPr>
+            <m:t>12</m:t>
+          </m:r>
+        </m:oMath>
+      </m:oMathPara>
+    </w:p>
+    <w:p>
+      <w:pPr>
+        <w:rPr>
+          <w:rFonts w:eastAsiaTheme="minorEastAsia"/>
+          <w:i/>
+        </w:rPr>
+      </w:pPr>
+      <w:r>
+        <w:rPr>
+          <w:i/>
+        </w:rPr>
+        <w:br/>
+      </w:r>
+      <m:oMathPara>
+        <m:oMath>
+          <m:r>
+            <w:rPr>
+              <w:rFonts w:ascii="Cambria Math" w:hAnsi="Cambria Math"/>
+            </w:rPr>
+            <m:t>P=</m:t>
+          </m:r>
+          <m:f>
+            <m:fPr>
+              <m:ctrlPr>
+                <w:rPr>
+                  <w:rFonts w:ascii="Cambria Math" w:hAnsi="Cambria Math"/>
+                </w:rPr>
+              </m:ctrlPr>
+            </m:fPr>
+            <m:num>
+              <m:r>
+                <w:rPr>
+                  <w:rFonts w:ascii="Cambria Math" w:hAnsi="Cambria Math"/>
+                </w:rPr>
+                <m:t>12+0.6</m:t>
+              </m:r>
+              <m:d>
+                <m:dPr>
+                  <m:ctrlPr>
+                    <w:rPr>
+                      <w:rFonts w:ascii="Cambria Math" w:hAnsi="Cambria Math"/>
+                    </w:rPr>
+                  </m:ctrlPr>
+                </m:dPr>
+                <m:e>
+                  <m:r>
+                    <w:rPr>
+                      <w:rFonts w:ascii="Cambria Math" w:hAnsi="Cambria Math"/>
+                    </w:rPr>
+                    <m:t>12-12</m:t>
+                  </m:r>
+                </m:e>
+              </m:d>
+            </m:num>
+            <m:den>
+              <m:r>
+                <w:rPr>
+                  <w:rFonts w:ascii="Cambria Math" w:hAnsi="Cambria Math"/>
+                </w:rPr>
+                <m:t>0.15</m:t>
+              </m:r>
+            </m:den>
+          </m:f>
+          <m:r>
+            <w:rPr>
+              <w:rFonts w:ascii="Cambria Math" w:hAnsi="Cambria Math"/>
+            </w:rPr>
+            <m:t>=</m:t>
+          </m:r>
+          <m:f>
+            <m:fPr>
+              <m:ctrlPr>
+                <w:rPr>
+                  <w:rFonts w:ascii="Cambria Math" w:hAnsi="Cambria Math"/>
+                </w:rPr>
+              </m:ctrlPr>
+            </m:fPr>
+            <m:num>
+              <m:r>
+                <w:rPr>
+                  <w:rFonts w:ascii="Cambria Math" w:hAnsi="Cambria Math"/>
+                </w:rPr>
+                <m:t>12</m:t>
+              </m:r>
+            </m:num>
+            <m:den>
+              <m:r>
+                <w:rPr>
+                  <w:rFonts w:ascii="Cambria Math" w:hAnsi="Cambria Math"/>
+                </w:rPr>
+                <m:t>0.15</m:t>
+              </m:r>
+            </m:den>
+          </m:f>
+          <m:r>
+            <w:rPr>
+              <w:rFonts w:ascii="Cambria Math" w:hAnsi="Cambria Math"/>
+            </w:rPr>
+            <m:t>=Rs</m:t>
+          </m:r>
+          <m:r>
+            <m:rPr>
+              <m:nor/>
+            </m:rPr>
+            <m:t> </m:t>
+          </m:r>
+          <m:r>
+            <w:rPr>
+              <w:rFonts w:ascii="Cambria Math" w:hAnsi="Cambria Math"/>
+            </w:rPr>
+            <m:t>80</m:t>
+          </m:r>
+        </m:oMath>
+      </m:oMathPara>
+    </w:p>
+    <w:p>
+      <w:pPr>
+        <w:rPr>
+          <w:lang w:val="en-US"/>
+        </w:rPr>
+      </w:pPr>
+      <w:r>
+        <w:rPr>
+          <w:rFonts w:eastAsiaTheme="minorEastAsia"/>
+          <w:iCs/>
+        </w:rPr>
+        <w:t>The firm is a declining firm (r &gt; k). MPS is the highest than the payout ratio is 100%. Hence, the ideal payout ratio for the company is 100%.</w:t>
+      </w:r>
+      <w:r>
+        <w:rPr>
+          <w:i/>
+        </w:rPr>
+        <w:br/>
+      </w:r>
+    </w:p>
+    <w:p>
+      <w:pPr>
+        <w:rPr>
+          <w:rFonts w:eastAsiaTheme="minorEastAsia"/>
+        </w:rPr>
+      </w:pPr>
     </w:p>
     <w:sectPr>
       <w:pgSz w:w="11906" w:h="16838"/>
@@ -19537,6 +23101,155 @@
     </w:lvl>
   </w:abstractNum>
   <w:abstractNum w:abstractNumId="1" w15:restartNumberingAfterBreak="0">
+    <w:nsid w:val="04AD21F3"/>
+    <w:multiLevelType w:val="multilevel"/>
+    <w:tmpl w:val="3C4A6AC2"/>
+    <w:lvl w:ilvl="0">
+      <w:start w:val="1"/>
+      <w:numFmt w:val="bullet"/>
+      <w:lvlText w:val=""/>
+      <w:lvlJc w:val="left"/>
+      <w:pPr>
+        <w:tabs>
+          <w:tab w:val="num" w:pos="720"/>
+        </w:tabs>
+        <w:ind w:left="720" w:hanging="360"/>
+      </w:pPr>
+      <w:rPr>
+        <w:rFonts w:ascii="Symbol" w:hAnsi="Symbol" w:hint="default"/>
+        <w:sz w:val="20"/>
+      </w:rPr>
+    </w:lvl>
+    <w:lvl w:ilvl="1" w:tentative="1">
+      <w:start w:val="1"/>
+      <w:numFmt w:val="bullet"/>
+      <w:lvlText w:val="o"/>
+      <w:lvlJc w:val="left"/>
+      <w:pPr>
+        <w:tabs>
+          <w:tab w:val="num" w:pos="1440"/>
+        </w:tabs>
+        <w:ind w:left="1440" w:hanging="360"/>
+      </w:pPr>
+      <w:rPr>
+        <w:rFonts w:ascii="Courier New" w:hAnsi="Courier New" w:hint="default"/>
+        <w:sz w:val="20"/>
+      </w:rPr>
+    </w:lvl>
+    <w:lvl w:ilvl="2" w:tentative="1">
+      <w:start w:val="1"/>
+      <w:numFmt w:val="bullet"/>
+      <w:lvlText w:val=""/>
+      <w:lvlJc w:val="left"/>
+      <w:pPr>
+        <w:tabs>
+          <w:tab w:val="num" w:pos="2160"/>
+        </w:tabs>
+        <w:ind w:left="2160" w:hanging="360"/>
+      </w:pPr>
+      <w:rPr>
+        <w:rFonts w:ascii="Wingdings" w:hAnsi="Wingdings" w:hint="default"/>
+        <w:sz w:val="20"/>
+      </w:rPr>
+    </w:lvl>
+    <w:lvl w:ilvl="3" w:tentative="1">
+      <w:start w:val="1"/>
+      <w:numFmt w:val="bullet"/>
+      <w:lvlText w:val=""/>
+      <w:lvlJc w:val="left"/>
+      <w:pPr>
+        <w:tabs>
+          <w:tab w:val="num" w:pos="2880"/>
+        </w:tabs>
+        <w:ind w:left="2880" w:hanging="360"/>
+      </w:pPr>
+      <w:rPr>
+        <w:rFonts w:ascii="Wingdings" w:hAnsi="Wingdings" w:hint="default"/>
+        <w:sz w:val="20"/>
+      </w:rPr>
+    </w:lvl>
+    <w:lvl w:ilvl="4" w:tentative="1">
+      <w:start w:val="1"/>
+      <w:numFmt w:val="bullet"/>
+      <w:lvlText w:val=""/>
+      <w:lvlJc w:val="left"/>
+      <w:pPr>
+        <w:tabs>
+          <w:tab w:val="num" w:pos="3600"/>
+        </w:tabs>
+        <w:ind w:left="3600" w:hanging="360"/>
+      </w:pPr>
+      <w:rPr>
+        <w:rFonts w:ascii="Wingdings" w:hAnsi="Wingdings" w:hint="default"/>
+        <w:sz w:val="20"/>
+      </w:rPr>
+    </w:lvl>
+    <w:lvl w:ilvl="5" w:tentative="1">
+      <w:start w:val="1"/>
+      <w:numFmt w:val="bullet"/>
+      <w:lvlText w:val=""/>
+      <w:lvlJc w:val="left"/>
+      <w:pPr>
+        <w:tabs>
+          <w:tab w:val="num" w:pos="4320"/>
+        </w:tabs>
+        <w:ind w:left="4320" w:hanging="360"/>
+      </w:pPr>
+      <w:rPr>
+        <w:rFonts w:ascii="Wingdings" w:hAnsi="Wingdings" w:hint="default"/>
+        <w:sz w:val="20"/>
+      </w:rPr>
+    </w:lvl>
+    <w:lvl w:ilvl="6" w:tentative="1">
+      <w:start w:val="1"/>
+      <w:numFmt w:val="bullet"/>
+      <w:lvlText w:val=""/>
+      <w:lvlJc w:val="left"/>
+      <w:pPr>
+        <w:tabs>
+          <w:tab w:val="num" w:pos="5040"/>
+        </w:tabs>
+        <w:ind w:left="5040" w:hanging="360"/>
+      </w:pPr>
+      <w:rPr>
+        <w:rFonts w:ascii="Wingdings" w:hAnsi="Wingdings" w:hint="default"/>
+        <w:sz w:val="20"/>
+      </w:rPr>
+    </w:lvl>
+    <w:lvl w:ilvl="7" w:tentative="1">
+      <w:start w:val="1"/>
+      <w:numFmt w:val="bullet"/>
+      <w:lvlText w:val=""/>
+      <w:lvlJc w:val="left"/>
+      <w:pPr>
+        <w:tabs>
+          <w:tab w:val="num" w:pos="5760"/>
+        </w:tabs>
+        <w:ind w:left="5760" w:hanging="360"/>
+      </w:pPr>
+      <w:rPr>
+        <w:rFonts w:ascii="Wingdings" w:hAnsi="Wingdings" w:hint="default"/>
+        <w:sz w:val="20"/>
+      </w:rPr>
+    </w:lvl>
+    <w:lvl w:ilvl="8" w:tentative="1">
+      <w:start w:val="1"/>
+      <w:numFmt w:val="bullet"/>
+      <w:lvlText w:val=""/>
+      <w:lvlJc w:val="left"/>
+      <w:pPr>
+        <w:tabs>
+          <w:tab w:val="num" w:pos="6480"/>
+        </w:tabs>
+        <w:ind w:left="6480" w:hanging="360"/>
+      </w:pPr>
+      <w:rPr>
+        <w:rFonts w:ascii="Wingdings" w:hAnsi="Wingdings" w:hint="default"/>
+        <w:sz w:val="20"/>
+      </w:rPr>
+    </w:lvl>
+  </w:abstractNum>
+  <w:abstractNum w:abstractNumId="2" w15:restartNumberingAfterBreak="0">
     <w:nsid w:val="06081FF0"/>
     <w:multiLevelType w:val="multilevel"/>
     <w:tmpl w:val="E200ADC2"/>
@@ -19685,7 +23398,7 @@
       </w:rPr>
     </w:lvl>
   </w:abstractNum>
-  <w:abstractNum w:abstractNumId="2" w15:restartNumberingAfterBreak="0">
+  <w:abstractNum w:abstractNumId="3" w15:restartNumberingAfterBreak="0">
     <w:nsid w:val="062C045D"/>
     <w:multiLevelType w:val="multilevel"/>
     <w:tmpl w:val="0930F594"/>
@@ -19834,7 +23547,7 @@
       </w:rPr>
     </w:lvl>
   </w:abstractNum>
-  <w:abstractNum w:abstractNumId="3" w15:restartNumberingAfterBreak="0">
+  <w:abstractNum w:abstractNumId="4" w15:restartNumberingAfterBreak="0">
     <w:nsid w:val="07101095"/>
     <w:multiLevelType w:val="hybridMultilevel"/>
     <w:tmpl w:val="2F70241E"/>
@@ -19920,7 +23633,7 @@
       </w:pPr>
     </w:lvl>
   </w:abstractNum>
-  <w:abstractNum w:abstractNumId="4" w15:restartNumberingAfterBreak="0">
+  <w:abstractNum w:abstractNumId="5" w15:restartNumberingAfterBreak="0">
     <w:nsid w:val="16207B00"/>
     <w:multiLevelType w:val="hybridMultilevel"/>
     <w:tmpl w:val="F0849EE0"/>
@@ -20033,7 +23746,7 @@
       </w:rPr>
     </w:lvl>
   </w:abstractNum>
-  <w:abstractNum w:abstractNumId="5" w15:restartNumberingAfterBreak="0">
+  <w:abstractNum w:abstractNumId="6" w15:restartNumberingAfterBreak="0">
     <w:nsid w:val="16821C01"/>
     <w:multiLevelType w:val="hybridMultilevel"/>
     <w:tmpl w:val="74C2BB6A"/>
@@ -20119,7 +23832,7 @@
       </w:pPr>
     </w:lvl>
   </w:abstractNum>
-  <w:abstractNum w:abstractNumId="6" w15:restartNumberingAfterBreak="0">
+  <w:abstractNum w:abstractNumId="7" w15:restartNumberingAfterBreak="0">
     <w:nsid w:val="19131334"/>
     <w:multiLevelType w:val="hybridMultilevel"/>
     <w:tmpl w:val="DF904310"/>
@@ -20232,7 +23945,7 @@
       </w:rPr>
     </w:lvl>
   </w:abstractNum>
-  <w:abstractNum w:abstractNumId="7" w15:restartNumberingAfterBreak="0">
+  <w:abstractNum w:abstractNumId="8" w15:restartNumberingAfterBreak="0">
     <w:nsid w:val="1F552A06"/>
     <w:multiLevelType w:val="hybridMultilevel"/>
     <w:tmpl w:val="B5F29EA4"/>
@@ -20321,7 +24034,7 @@
       </w:pPr>
     </w:lvl>
   </w:abstractNum>
-  <w:abstractNum w:abstractNumId="8" w15:restartNumberingAfterBreak="0">
+  <w:abstractNum w:abstractNumId="9" w15:restartNumberingAfterBreak="0">
     <w:nsid w:val="1F6519B0"/>
     <w:multiLevelType w:val="hybridMultilevel"/>
     <w:tmpl w:val="C026FB9A"/>
@@ -20410,7 +24123,7 @@
       </w:pPr>
     </w:lvl>
   </w:abstractNum>
-  <w:abstractNum w:abstractNumId="9" w15:restartNumberingAfterBreak="0">
+  <w:abstractNum w:abstractNumId="10" w15:restartNumberingAfterBreak="0">
     <w:nsid w:val="1FF35255"/>
     <w:multiLevelType w:val="hybridMultilevel"/>
     <w:tmpl w:val="0F8E2182"/>
@@ -20496,7 +24209,7 @@
       </w:pPr>
     </w:lvl>
   </w:abstractNum>
-  <w:abstractNum w:abstractNumId="10" w15:restartNumberingAfterBreak="0">
+  <w:abstractNum w:abstractNumId="11" w15:restartNumberingAfterBreak="0">
     <w:nsid w:val="25FE49C2"/>
     <w:multiLevelType w:val="multilevel"/>
     <w:tmpl w:val="B0183B58"/>
@@ -20645,7 +24358,120 @@
       </w:rPr>
     </w:lvl>
   </w:abstractNum>
-  <w:abstractNum w:abstractNumId="11" w15:restartNumberingAfterBreak="0">
+  <w:abstractNum w:abstractNumId="12" w15:restartNumberingAfterBreak="0">
+    <w:nsid w:val="26F55085"/>
+    <w:multiLevelType w:val="hybridMultilevel"/>
+    <w:tmpl w:val="A37C6428"/>
+    <w:lvl w:ilvl="0" w:tplc="40090001">
+      <w:start w:val="1"/>
+      <w:numFmt w:val="bullet"/>
+      <w:lvlText w:val=""/>
+      <w:lvlJc w:val="left"/>
+      <w:pPr>
+        <w:ind w:left="720" w:hanging="360"/>
+      </w:pPr>
+      <w:rPr>
+        <w:rFonts w:ascii="Symbol" w:hAnsi="Symbol" w:hint="default"/>
+      </w:rPr>
+    </w:lvl>
+    <w:lvl w:ilvl="1" w:tplc="40090003" w:tentative="1">
+      <w:start w:val="1"/>
+      <w:numFmt w:val="bullet"/>
+      <w:lvlText w:val="o"/>
+      <w:lvlJc w:val="left"/>
+      <w:pPr>
+        <w:ind w:left="1440" w:hanging="360"/>
+      </w:pPr>
+      <w:rPr>
+        <w:rFonts w:ascii="Courier New" w:hAnsi="Courier New" w:cs="Courier New" w:hint="default"/>
+      </w:rPr>
+    </w:lvl>
+    <w:lvl w:ilvl="2" w:tplc="40090005" w:tentative="1">
+      <w:start w:val="1"/>
+      <w:numFmt w:val="bullet"/>
+      <w:lvlText w:val=""/>
+      <w:lvlJc w:val="left"/>
+      <w:pPr>
+        <w:ind w:left="2160" w:hanging="360"/>
+      </w:pPr>
+      <w:rPr>
+        <w:rFonts w:ascii="Wingdings" w:hAnsi="Wingdings" w:hint="default"/>
+      </w:rPr>
+    </w:lvl>
+    <w:lvl w:ilvl="3" w:tplc="40090001" w:tentative="1">
+      <w:start w:val="1"/>
+      <w:numFmt w:val="bullet"/>
+      <w:lvlText w:val=""/>
+      <w:lvlJc w:val="left"/>
+      <w:pPr>
+        <w:ind w:left="2880" w:hanging="360"/>
+      </w:pPr>
+      <w:rPr>
+        <w:rFonts w:ascii="Symbol" w:hAnsi="Symbol" w:hint="default"/>
+      </w:rPr>
+    </w:lvl>
+    <w:lvl w:ilvl="4" w:tplc="40090003" w:tentative="1">
+      <w:start w:val="1"/>
+      <w:numFmt w:val="bullet"/>
+      <w:lvlText w:val="o"/>
+      <w:lvlJc w:val="left"/>
+      <w:pPr>
+        <w:ind w:left="3600" w:hanging="360"/>
+      </w:pPr>
+      <w:rPr>
+        <w:rFonts w:ascii="Courier New" w:hAnsi="Courier New" w:cs="Courier New" w:hint="default"/>
+      </w:rPr>
+    </w:lvl>
+    <w:lvl w:ilvl="5" w:tplc="40090005" w:tentative="1">
+      <w:start w:val="1"/>
+      <w:numFmt w:val="bullet"/>
+      <w:lvlText w:val=""/>
+      <w:lvlJc w:val="left"/>
+      <w:pPr>
+        <w:ind w:left="4320" w:hanging="360"/>
+      </w:pPr>
+      <w:rPr>
+        <w:rFonts w:ascii="Wingdings" w:hAnsi="Wingdings" w:hint="default"/>
+      </w:rPr>
+    </w:lvl>
+    <w:lvl w:ilvl="6" w:tplc="40090001" w:tentative="1">
+      <w:start w:val="1"/>
+      <w:numFmt w:val="bullet"/>
+      <w:lvlText w:val=""/>
+      <w:lvlJc w:val="left"/>
+      <w:pPr>
+        <w:ind w:left="5040" w:hanging="360"/>
+      </w:pPr>
+      <w:rPr>
+        <w:rFonts w:ascii="Symbol" w:hAnsi="Symbol" w:hint="default"/>
+      </w:rPr>
+    </w:lvl>
+    <w:lvl w:ilvl="7" w:tplc="40090003" w:tentative="1">
+      <w:start w:val="1"/>
+      <w:numFmt w:val="bullet"/>
+      <w:lvlText w:val="o"/>
+      <w:lvlJc w:val="left"/>
+      <w:pPr>
+        <w:ind w:left="5760" w:hanging="360"/>
+      </w:pPr>
+      <w:rPr>
+        <w:rFonts w:ascii="Courier New" w:hAnsi="Courier New" w:cs="Courier New" w:hint="default"/>
+      </w:rPr>
+    </w:lvl>
+    <w:lvl w:ilvl="8" w:tplc="40090005" w:tentative="1">
+      <w:start w:val="1"/>
+      <w:numFmt w:val="bullet"/>
+      <w:lvlText w:val=""/>
+      <w:lvlJc w:val="left"/>
+      <w:pPr>
+        <w:ind w:left="6480" w:hanging="360"/>
+      </w:pPr>
+      <w:rPr>
+        <w:rFonts w:ascii="Wingdings" w:hAnsi="Wingdings" w:hint="default"/>
+      </w:rPr>
+    </w:lvl>
+  </w:abstractNum>
+  <w:abstractNum w:abstractNumId="13" w15:restartNumberingAfterBreak="0">
     <w:nsid w:val="270E03D6"/>
     <w:multiLevelType w:val="hybridMultilevel"/>
     <w:tmpl w:val="21482B92"/>
@@ -20731,7 +24557,7 @@
       </w:pPr>
     </w:lvl>
   </w:abstractNum>
-  <w:abstractNum w:abstractNumId="12" w15:restartNumberingAfterBreak="0">
+  <w:abstractNum w:abstractNumId="14" w15:restartNumberingAfterBreak="0">
     <w:nsid w:val="2B866818"/>
     <w:multiLevelType w:val="hybridMultilevel"/>
     <w:tmpl w:val="21482B92"/>
@@ -20817,7 +24643,7 @@
       </w:pPr>
     </w:lvl>
   </w:abstractNum>
-  <w:abstractNum w:abstractNumId="13" w15:restartNumberingAfterBreak="0">
+  <w:abstractNum w:abstractNumId="15" w15:restartNumberingAfterBreak="0">
     <w:nsid w:val="2E69236A"/>
     <w:multiLevelType w:val="hybridMultilevel"/>
     <w:tmpl w:val="5B2E57F4"/>
@@ -20903,7 +24729,7 @@
       </w:pPr>
     </w:lvl>
   </w:abstractNum>
-  <w:abstractNum w:abstractNumId="14" w15:restartNumberingAfterBreak="0">
+  <w:abstractNum w:abstractNumId="16" w15:restartNumberingAfterBreak="0">
     <w:nsid w:val="342643EF"/>
     <w:multiLevelType w:val="hybridMultilevel"/>
     <w:tmpl w:val="BFEAEC32"/>
@@ -21016,7 +24842,7 @@
       </w:rPr>
     </w:lvl>
   </w:abstractNum>
-  <w:abstractNum w:abstractNumId="15" w15:restartNumberingAfterBreak="0">
+  <w:abstractNum w:abstractNumId="17" w15:restartNumberingAfterBreak="0">
     <w:nsid w:val="35D57A2E"/>
     <w:multiLevelType w:val="hybridMultilevel"/>
     <w:tmpl w:val="0FF6CBF2"/>
@@ -21105,7 +24931,7 @@
       </w:pPr>
     </w:lvl>
   </w:abstractNum>
-  <w:abstractNum w:abstractNumId="16" w15:restartNumberingAfterBreak="0">
+  <w:abstractNum w:abstractNumId="18" w15:restartNumberingAfterBreak="0">
     <w:nsid w:val="3FA677EF"/>
     <w:multiLevelType w:val="hybridMultilevel"/>
     <w:tmpl w:val="F144535C"/>
@@ -21191,7 +25017,7 @@
       </w:pPr>
     </w:lvl>
   </w:abstractNum>
-  <w:abstractNum w:abstractNumId="17" w15:restartNumberingAfterBreak="0">
+  <w:abstractNum w:abstractNumId="19" w15:restartNumberingAfterBreak="0">
     <w:nsid w:val="421F5061"/>
     <w:multiLevelType w:val="hybridMultilevel"/>
     <w:tmpl w:val="C55E3D5E"/>
@@ -21304,7 +25130,93 @@
       </w:rPr>
     </w:lvl>
   </w:abstractNum>
-  <w:abstractNum w:abstractNumId="18" w15:restartNumberingAfterBreak="0">
+  <w:abstractNum w:abstractNumId="20" w15:restartNumberingAfterBreak="0">
+    <w:nsid w:val="470A7CAC"/>
+    <w:multiLevelType w:val="hybridMultilevel"/>
+    <w:tmpl w:val="41B04BBC"/>
+    <w:lvl w:ilvl="0" w:tplc="4009000F">
+      <w:start w:val="1"/>
+      <w:numFmt w:val="decimal"/>
+      <w:lvlText w:val="%1."/>
+      <w:lvlJc w:val="left"/>
+      <w:pPr>
+        <w:ind w:left="720" w:hanging="360"/>
+      </w:pPr>
+    </w:lvl>
+    <w:lvl w:ilvl="1" w:tplc="40090019" w:tentative="1">
+      <w:start w:val="1"/>
+      <w:numFmt w:val="lowerLetter"/>
+      <w:lvlText w:val="%2."/>
+      <w:lvlJc w:val="left"/>
+      <w:pPr>
+        <w:ind w:left="1440" w:hanging="360"/>
+      </w:pPr>
+    </w:lvl>
+    <w:lvl w:ilvl="2" w:tplc="4009001B" w:tentative="1">
+      <w:start w:val="1"/>
+      <w:numFmt w:val="lowerRoman"/>
+      <w:lvlText w:val="%3."/>
+      <w:lvlJc w:val="right"/>
+      <w:pPr>
+        <w:ind w:left="2160" w:hanging="180"/>
+      </w:pPr>
+    </w:lvl>
+    <w:lvl w:ilvl="3" w:tplc="4009000F" w:tentative="1">
+      <w:start w:val="1"/>
+      <w:numFmt w:val="decimal"/>
+      <w:lvlText w:val="%4."/>
+      <w:lvlJc w:val="left"/>
+      <w:pPr>
+        <w:ind w:left="2880" w:hanging="360"/>
+      </w:pPr>
+    </w:lvl>
+    <w:lvl w:ilvl="4" w:tplc="40090019" w:tentative="1">
+      <w:start w:val="1"/>
+      <w:numFmt w:val="lowerLetter"/>
+      <w:lvlText w:val="%5."/>
+      <w:lvlJc w:val="left"/>
+      <w:pPr>
+        <w:ind w:left="3600" w:hanging="360"/>
+      </w:pPr>
+    </w:lvl>
+    <w:lvl w:ilvl="5" w:tplc="4009001B" w:tentative="1">
+      <w:start w:val="1"/>
+      <w:numFmt w:val="lowerRoman"/>
+      <w:lvlText w:val="%6."/>
+      <w:lvlJc w:val="right"/>
+      <w:pPr>
+        <w:ind w:left="4320" w:hanging="180"/>
+      </w:pPr>
+    </w:lvl>
+    <w:lvl w:ilvl="6" w:tplc="4009000F" w:tentative="1">
+      <w:start w:val="1"/>
+      <w:numFmt w:val="decimal"/>
+      <w:lvlText w:val="%7."/>
+      <w:lvlJc w:val="left"/>
+      <w:pPr>
+        <w:ind w:left="5040" w:hanging="360"/>
+      </w:pPr>
+    </w:lvl>
+    <w:lvl w:ilvl="7" w:tplc="40090019" w:tentative="1">
+      <w:start w:val="1"/>
+      <w:numFmt w:val="lowerLetter"/>
+      <w:lvlText w:val="%8."/>
+      <w:lvlJc w:val="left"/>
+      <w:pPr>
+        <w:ind w:left="5760" w:hanging="360"/>
+      </w:pPr>
+    </w:lvl>
+    <w:lvl w:ilvl="8" w:tplc="4009001B" w:tentative="1">
+      <w:start w:val="1"/>
+      <w:numFmt w:val="lowerRoman"/>
+      <w:lvlText w:val="%9."/>
+      <w:lvlJc w:val="right"/>
+      <w:pPr>
+        <w:ind w:left="6480" w:hanging="180"/>
+      </w:pPr>
+    </w:lvl>
+  </w:abstractNum>
+  <w:abstractNum w:abstractNumId="21" w15:restartNumberingAfterBreak="0">
     <w:nsid w:val="471E0E82"/>
     <w:multiLevelType w:val="hybridMultilevel"/>
     <w:tmpl w:val="A0C2BED4"/>
@@ -21417,7 +25329,7 @@
       </w:rPr>
     </w:lvl>
   </w:abstractNum>
-  <w:abstractNum w:abstractNumId="19" w15:restartNumberingAfterBreak="0">
+  <w:abstractNum w:abstractNumId="22" w15:restartNumberingAfterBreak="0">
     <w:nsid w:val="4ACF29D6"/>
     <w:multiLevelType w:val="hybridMultilevel"/>
     <w:tmpl w:val="15BACEE8"/>
@@ -21503,7 +25415,7 @@
       </w:pPr>
     </w:lvl>
   </w:abstractNum>
-  <w:abstractNum w:abstractNumId="20" w15:restartNumberingAfterBreak="0">
+  <w:abstractNum w:abstractNumId="23" w15:restartNumberingAfterBreak="0">
     <w:nsid w:val="4C42378B"/>
     <w:multiLevelType w:val="multilevel"/>
     <w:tmpl w:val="158600B2"/>
@@ -21652,7 +25564,93 @@
       </w:rPr>
     </w:lvl>
   </w:abstractNum>
-  <w:abstractNum w:abstractNumId="21" w15:restartNumberingAfterBreak="0">
+  <w:abstractNum w:abstractNumId="24" w15:restartNumberingAfterBreak="0">
+    <w:nsid w:val="4F286822"/>
+    <w:multiLevelType w:val="hybridMultilevel"/>
+    <w:tmpl w:val="5798F77C"/>
+    <w:lvl w:ilvl="0" w:tplc="4009000F">
+      <w:start w:val="1"/>
+      <w:numFmt w:val="decimal"/>
+      <w:lvlText w:val="%1."/>
+      <w:lvlJc w:val="left"/>
+      <w:pPr>
+        <w:ind w:left="720" w:hanging="360"/>
+      </w:pPr>
+    </w:lvl>
+    <w:lvl w:ilvl="1" w:tplc="40090019" w:tentative="1">
+      <w:start w:val="1"/>
+      <w:numFmt w:val="lowerLetter"/>
+      <w:lvlText w:val="%2."/>
+      <w:lvlJc w:val="left"/>
+      <w:pPr>
+        <w:ind w:left="1440" w:hanging="360"/>
+      </w:pPr>
+    </w:lvl>
+    <w:lvl w:ilvl="2" w:tplc="4009001B" w:tentative="1">
+      <w:start w:val="1"/>
+      <w:numFmt w:val="lowerRoman"/>
+      <w:lvlText w:val="%3."/>
+      <w:lvlJc w:val="right"/>
+      <w:pPr>
+        <w:ind w:left="2160" w:hanging="180"/>
+      </w:pPr>
+    </w:lvl>
+    <w:lvl w:ilvl="3" w:tplc="4009000F" w:tentative="1">
+      <w:start w:val="1"/>
+      <w:numFmt w:val="decimal"/>
+      <w:lvlText w:val="%4."/>
+      <w:lvlJc w:val="left"/>
+      <w:pPr>
+        <w:ind w:left="2880" w:hanging="360"/>
+      </w:pPr>
+    </w:lvl>
+    <w:lvl w:ilvl="4" w:tplc="40090019" w:tentative="1">
+      <w:start w:val="1"/>
+      <w:numFmt w:val="lowerLetter"/>
+      <w:lvlText w:val="%5."/>
+      <w:lvlJc w:val="left"/>
+      <w:pPr>
+        <w:ind w:left="3600" w:hanging="360"/>
+      </w:pPr>
+    </w:lvl>
+    <w:lvl w:ilvl="5" w:tplc="4009001B" w:tentative="1">
+      <w:start w:val="1"/>
+      <w:numFmt w:val="lowerRoman"/>
+      <w:lvlText w:val="%6."/>
+      <w:lvlJc w:val="right"/>
+      <w:pPr>
+        <w:ind w:left="4320" w:hanging="180"/>
+      </w:pPr>
+    </w:lvl>
+    <w:lvl w:ilvl="6" w:tplc="4009000F" w:tentative="1">
+      <w:start w:val="1"/>
+      <w:numFmt w:val="decimal"/>
+      <w:lvlText w:val="%7."/>
+      <w:lvlJc w:val="left"/>
+      <w:pPr>
+        <w:ind w:left="5040" w:hanging="360"/>
+      </w:pPr>
+    </w:lvl>
+    <w:lvl w:ilvl="7" w:tplc="40090019" w:tentative="1">
+      <w:start w:val="1"/>
+      <w:numFmt w:val="lowerLetter"/>
+      <w:lvlText w:val="%8."/>
+      <w:lvlJc w:val="left"/>
+      <w:pPr>
+        <w:ind w:left="5760" w:hanging="360"/>
+      </w:pPr>
+    </w:lvl>
+    <w:lvl w:ilvl="8" w:tplc="4009001B" w:tentative="1">
+      <w:start w:val="1"/>
+      <w:numFmt w:val="lowerRoman"/>
+      <w:lvlText w:val="%9."/>
+      <w:lvlJc w:val="right"/>
+      <w:pPr>
+        <w:ind w:left="6480" w:hanging="180"/>
+      </w:pPr>
+    </w:lvl>
+  </w:abstractNum>
+  <w:abstractNum w:abstractNumId="25" w15:restartNumberingAfterBreak="0">
     <w:nsid w:val="51600570"/>
     <w:multiLevelType w:val="hybridMultilevel"/>
     <w:tmpl w:val="7B98FFEE"/>
@@ -21738,7 +25736,7 @@
       </w:pPr>
     </w:lvl>
   </w:abstractNum>
-  <w:abstractNum w:abstractNumId="22" w15:restartNumberingAfterBreak="0">
+  <w:abstractNum w:abstractNumId="26" w15:restartNumberingAfterBreak="0">
     <w:nsid w:val="51EB6CAA"/>
     <w:multiLevelType w:val="hybridMultilevel"/>
     <w:tmpl w:val="AA3A1986"/>
@@ -21824,7 +25822,93 @@
       </w:pPr>
     </w:lvl>
   </w:abstractNum>
-  <w:abstractNum w:abstractNumId="23" w15:restartNumberingAfterBreak="0">
+  <w:abstractNum w:abstractNumId="27" w15:restartNumberingAfterBreak="0">
+    <w:nsid w:val="54B02AAF"/>
+    <w:multiLevelType w:val="hybridMultilevel"/>
+    <w:tmpl w:val="7C80B1EE"/>
+    <w:lvl w:ilvl="0" w:tplc="4009000F">
+      <w:start w:val="1"/>
+      <w:numFmt w:val="decimal"/>
+      <w:lvlText w:val="%1."/>
+      <w:lvlJc w:val="left"/>
+      <w:pPr>
+        <w:ind w:left="720" w:hanging="360"/>
+      </w:pPr>
+    </w:lvl>
+    <w:lvl w:ilvl="1" w:tplc="40090019" w:tentative="1">
+      <w:start w:val="1"/>
+      <w:numFmt w:val="lowerLetter"/>
+      <w:lvlText w:val="%2."/>
+      <w:lvlJc w:val="left"/>
+      <w:pPr>
+        <w:ind w:left="1440" w:hanging="360"/>
+      </w:pPr>
+    </w:lvl>
+    <w:lvl w:ilvl="2" w:tplc="4009001B" w:tentative="1">
+      <w:start w:val="1"/>
+      <w:numFmt w:val="lowerRoman"/>
+      <w:lvlText w:val="%3."/>
+      <w:lvlJc w:val="right"/>
+      <w:pPr>
+        <w:ind w:left="2160" w:hanging="180"/>
+      </w:pPr>
+    </w:lvl>
+    <w:lvl w:ilvl="3" w:tplc="4009000F" w:tentative="1">
+      <w:start w:val="1"/>
+      <w:numFmt w:val="decimal"/>
+      <w:lvlText w:val="%4."/>
+      <w:lvlJc w:val="left"/>
+      <w:pPr>
+        <w:ind w:left="2880" w:hanging="360"/>
+      </w:pPr>
+    </w:lvl>
+    <w:lvl w:ilvl="4" w:tplc="40090019" w:tentative="1">
+      <w:start w:val="1"/>
+      <w:numFmt w:val="lowerLetter"/>
+      <w:lvlText w:val="%5."/>
+      <w:lvlJc w:val="left"/>
+      <w:pPr>
+        <w:ind w:left="3600" w:hanging="360"/>
+      </w:pPr>
+    </w:lvl>
+    <w:lvl w:ilvl="5" w:tplc="4009001B" w:tentative="1">
+      <w:start w:val="1"/>
+      <w:numFmt w:val="lowerRoman"/>
+      <w:lvlText w:val="%6."/>
+      <w:lvlJc w:val="right"/>
+      <w:pPr>
+        <w:ind w:left="4320" w:hanging="180"/>
+      </w:pPr>
+    </w:lvl>
+    <w:lvl w:ilvl="6" w:tplc="4009000F" w:tentative="1">
+      <w:start w:val="1"/>
+      <w:numFmt w:val="decimal"/>
+      <w:lvlText w:val="%7."/>
+      <w:lvlJc w:val="left"/>
+      <w:pPr>
+        <w:ind w:left="5040" w:hanging="360"/>
+      </w:pPr>
+    </w:lvl>
+    <w:lvl w:ilvl="7" w:tplc="40090019" w:tentative="1">
+      <w:start w:val="1"/>
+      <w:numFmt w:val="lowerLetter"/>
+      <w:lvlText w:val="%8."/>
+      <w:lvlJc w:val="left"/>
+      <w:pPr>
+        <w:ind w:left="5760" w:hanging="360"/>
+      </w:pPr>
+    </w:lvl>
+    <w:lvl w:ilvl="8" w:tplc="4009001B" w:tentative="1">
+      <w:start w:val="1"/>
+      <w:numFmt w:val="lowerRoman"/>
+      <w:lvlText w:val="%9."/>
+      <w:lvlJc w:val="right"/>
+      <w:pPr>
+        <w:ind w:left="6480" w:hanging="180"/>
+      </w:pPr>
+    </w:lvl>
+  </w:abstractNum>
+  <w:abstractNum w:abstractNumId="28" w15:restartNumberingAfterBreak="0">
     <w:nsid w:val="579956AE"/>
     <w:multiLevelType w:val="hybridMultilevel"/>
     <w:tmpl w:val="152C998C"/>
@@ -21913,7 +25997,7 @@
       </w:pPr>
     </w:lvl>
   </w:abstractNum>
-  <w:abstractNum w:abstractNumId="24" w15:restartNumberingAfterBreak="0">
+  <w:abstractNum w:abstractNumId="29" w15:restartNumberingAfterBreak="0">
     <w:nsid w:val="57AA63E2"/>
     <w:multiLevelType w:val="hybridMultilevel"/>
     <w:tmpl w:val="4CD8648E"/>
@@ -21999,7 +26083,7 @@
       </w:pPr>
     </w:lvl>
   </w:abstractNum>
-  <w:abstractNum w:abstractNumId="25" w15:restartNumberingAfterBreak="0">
+  <w:abstractNum w:abstractNumId="30" w15:restartNumberingAfterBreak="0">
     <w:nsid w:val="5B0B6E70"/>
     <w:multiLevelType w:val="hybridMultilevel"/>
     <w:tmpl w:val="639E1D92"/>
@@ -22085,7 +26169,7 @@
       </w:pPr>
     </w:lvl>
   </w:abstractNum>
-  <w:abstractNum w:abstractNumId="26" w15:restartNumberingAfterBreak="0">
+  <w:abstractNum w:abstractNumId="31" w15:restartNumberingAfterBreak="0">
     <w:nsid w:val="5B5059D4"/>
     <w:multiLevelType w:val="hybridMultilevel"/>
     <w:tmpl w:val="4F5CD94C"/>
@@ -22171,7 +26255,7 @@
       </w:pPr>
     </w:lvl>
   </w:abstractNum>
-  <w:abstractNum w:abstractNumId="27" w15:restartNumberingAfterBreak="0">
+  <w:abstractNum w:abstractNumId="32" w15:restartNumberingAfterBreak="0">
     <w:nsid w:val="5CF97DC3"/>
     <w:multiLevelType w:val="hybridMultilevel"/>
     <w:tmpl w:val="5B2C3BD8"/>
@@ -22257,7 +26341,7 @@
       </w:pPr>
     </w:lvl>
   </w:abstractNum>
-  <w:abstractNum w:abstractNumId="28" w15:restartNumberingAfterBreak="0">
+  <w:abstractNum w:abstractNumId="33" w15:restartNumberingAfterBreak="0">
     <w:nsid w:val="5ECF72A1"/>
     <w:multiLevelType w:val="hybridMultilevel"/>
     <w:tmpl w:val="1CF4107C"/>
@@ -22343,7 +26427,7 @@
       </w:pPr>
     </w:lvl>
   </w:abstractNum>
-  <w:abstractNum w:abstractNumId="29" w15:restartNumberingAfterBreak="0">
+  <w:abstractNum w:abstractNumId="34" w15:restartNumberingAfterBreak="0">
     <w:nsid w:val="5FAD400A"/>
     <w:multiLevelType w:val="hybridMultilevel"/>
     <w:tmpl w:val="59F4717E"/>
@@ -22429,7 +26513,7 @@
       </w:pPr>
     </w:lvl>
   </w:abstractNum>
-  <w:abstractNum w:abstractNumId="30" w15:restartNumberingAfterBreak="0">
+  <w:abstractNum w:abstractNumId="35" w15:restartNumberingAfterBreak="0">
     <w:nsid w:val="630F0C4E"/>
     <w:multiLevelType w:val="hybridMultilevel"/>
     <w:tmpl w:val="5802DB30"/>
@@ -22521,7 +26605,7 @@
       </w:pPr>
     </w:lvl>
   </w:abstractNum>
-  <w:abstractNum w:abstractNumId="31" w15:restartNumberingAfterBreak="0">
+  <w:abstractNum w:abstractNumId="36" w15:restartNumberingAfterBreak="0">
     <w:nsid w:val="6A825466"/>
     <w:multiLevelType w:val="hybridMultilevel"/>
     <w:tmpl w:val="D4123C9C"/>
@@ -22607,7 +26691,156 @@
       </w:pPr>
     </w:lvl>
   </w:abstractNum>
-  <w:abstractNum w:abstractNumId="32" w15:restartNumberingAfterBreak="0">
+  <w:abstractNum w:abstractNumId="37" w15:restartNumberingAfterBreak="0">
+    <w:nsid w:val="72C825B8"/>
+    <w:multiLevelType w:val="multilevel"/>
+    <w:tmpl w:val="8D6CDDBA"/>
+    <w:lvl w:ilvl="0">
+      <w:start w:val="1"/>
+      <w:numFmt w:val="bullet"/>
+      <w:lvlText w:val=""/>
+      <w:lvlJc w:val="left"/>
+      <w:pPr>
+        <w:tabs>
+          <w:tab w:val="num" w:pos="720"/>
+        </w:tabs>
+        <w:ind w:left="720" w:hanging="360"/>
+      </w:pPr>
+      <w:rPr>
+        <w:rFonts w:ascii="Symbol" w:hAnsi="Symbol" w:hint="default"/>
+        <w:sz w:val="20"/>
+      </w:rPr>
+    </w:lvl>
+    <w:lvl w:ilvl="1" w:tentative="1">
+      <w:start w:val="1"/>
+      <w:numFmt w:val="bullet"/>
+      <w:lvlText w:val="o"/>
+      <w:lvlJc w:val="left"/>
+      <w:pPr>
+        <w:tabs>
+          <w:tab w:val="num" w:pos="1440"/>
+        </w:tabs>
+        <w:ind w:left="1440" w:hanging="360"/>
+      </w:pPr>
+      <w:rPr>
+        <w:rFonts w:ascii="Courier New" w:hAnsi="Courier New" w:hint="default"/>
+        <w:sz w:val="20"/>
+      </w:rPr>
+    </w:lvl>
+    <w:lvl w:ilvl="2" w:tentative="1">
+      <w:start w:val="1"/>
+      <w:numFmt w:val="bullet"/>
+      <w:lvlText w:val=""/>
+      <w:lvlJc w:val="left"/>
+      <w:pPr>
+        <w:tabs>
+          <w:tab w:val="num" w:pos="2160"/>
+        </w:tabs>
+        <w:ind w:left="2160" w:hanging="360"/>
+      </w:pPr>
+      <w:rPr>
+        <w:rFonts w:ascii="Wingdings" w:hAnsi="Wingdings" w:hint="default"/>
+        <w:sz w:val="20"/>
+      </w:rPr>
+    </w:lvl>
+    <w:lvl w:ilvl="3" w:tentative="1">
+      <w:start w:val="1"/>
+      <w:numFmt w:val="bullet"/>
+      <w:lvlText w:val=""/>
+      <w:lvlJc w:val="left"/>
+      <w:pPr>
+        <w:tabs>
+          <w:tab w:val="num" w:pos="2880"/>
+        </w:tabs>
+        <w:ind w:left="2880" w:hanging="360"/>
+      </w:pPr>
+      <w:rPr>
+        <w:rFonts w:ascii="Wingdings" w:hAnsi="Wingdings" w:hint="default"/>
+        <w:sz w:val="20"/>
+      </w:rPr>
+    </w:lvl>
+    <w:lvl w:ilvl="4" w:tentative="1">
+      <w:start w:val="1"/>
+      <w:numFmt w:val="bullet"/>
+      <w:lvlText w:val=""/>
+      <w:lvlJc w:val="left"/>
+      <w:pPr>
+        <w:tabs>
+          <w:tab w:val="num" w:pos="3600"/>
+        </w:tabs>
+        <w:ind w:left="3600" w:hanging="360"/>
+      </w:pPr>
+      <w:rPr>
+        <w:rFonts w:ascii="Wingdings" w:hAnsi="Wingdings" w:hint="default"/>
+        <w:sz w:val="20"/>
+      </w:rPr>
+    </w:lvl>
+    <w:lvl w:ilvl="5" w:tentative="1">
+      <w:start w:val="1"/>
+      <w:numFmt w:val="bullet"/>
+      <w:lvlText w:val=""/>
+      <w:lvlJc w:val="left"/>
+      <w:pPr>
+        <w:tabs>
+          <w:tab w:val="num" w:pos="4320"/>
+        </w:tabs>
+        <w:ind w:left="4320" w:hanging="360"/>
+      </w:pPr>
+      <w:rPr>
+        <w:rFonts w:ascii="Wingdings" w:hAnsi="Wingdings" w:hint="default"/>
+        <w:sz w:val="20"/>
+      </w:rPr>
+    </w:lvl>
+    <w:lvl w:ilvl="6" w:tentative="1">
+      <w:start w:val="1"/>
+      <w:numFmt w:val="bullet"/>
+      <w:lvlText w:val=""/>
+      <w:lvlJc w:val="left"/>
+      <w:pPr>
+        <w:tabs>
+          <w:tab w:val="num" w:pos="5040"/>
+        </w:tabs>
+        <w:ind w:left="5040" w:hanging="360"/>
+      </w:pPr>
+      <w:rPr>
+        <w:rFonts w:ascii="Wingdings" w:hAnsi="Wingdings" w:hint="default"/>
+        <w:sz w:val="20"/>
+      </w:rPr>
+    </w:lvl>
+    <w:lvl w:ilvl="7" w:tentative="1">
+      <w:start w:val="1"/>
+      <w:numFmt w:val="bullet"/>
+      <w:lvlText w:val=""/>
+      <w:lvlJc w:val="left"/>
+      <w:pPr>
+        <w:tabs>
+          <w:tab w:val="num" w:pos="5760"/>
+        </w:tabs>
+        <w:ind w:left="5760" w:hanging="360"/>
+      </w:pPr>
+      <w:rPr>
+        <w:rFonts w:ascii="Wingdings" w:hAnsi="Wingdings" w:hint="default"/>
+        <w:sz w:val="20"/>
+      </w:rPr>
+    </w:lvl>
+    <w:lvl w:ilvl="8" w:tentative="1">
+      <w:start w:val="1"/>
+      <w:numFmt w:val="bullet"/>
+      <w:lvlText w:val=""/>
+      <w:lvlJc w:val="left"/>
+      <w:pPr>
+        <w:tabs>
+          <w:tab w:val="num" w:pos="6480"/>
+        </w:tabs>
+        <w:ind w:left="6480" w:hanging="360"/>
+      </w:pPr>
+      <w:rPr>
+        <w:rFonts w:ascii="Wingdings" w:hAnsi="Wingdings" w:hint="default"/>
+        <w:sz w:val="20"/>
+      </w:rPr>
+    </w:lvl>
+  </w:abstractNum>
+  <w:abstractNum w:abstractNumId="38" w15:restartNumberingAfterBreak="0">
     <w:nsid w:val="72EA5DBF"/>
     <w:multiLevelType w:val="hybridMultilevel"/>
     <w:tmpl w:val="671AAB8E"/>
@@ -22693,7 +26926,7 @@
       </w:pPr>
     </w:lvl>
   </w:abstractNum>
-  <w:abstractNum w:abstractNumId="33" w15:restartNumberingAfterBreak="0">
+  <w:abstractNum w:abstractNumId="39" w15:restartNumberingAfterBreak="0">
     <w:nsid w:val="72F854A2"/>
     <w:multiLevelType w:val="hybridMultilevel"/>
     <w:tmpl w:val="349CAAFA"/>
@@ -22806,7 +27039,7 @@
       </w:rPr>
     </w:lvl>
   </w:abstractNum>
-  <w:abstractNum w:abstractNumId="34" w15:restartNumberingAfterBreak="0">
+  <w:abstractNum w:abstractNumId="40" w15:restartNumberingAfterBreak="0">
     <w:nsid w:val="768D4843"/>
     <w:multiLevelType w:val="hybridMultilevel"/>
     <w:tmpl w:val="F39A25A6"/>
@@ -22892,7 +27125,7 @@
       </w:pPr>
     </w:lvl>
   </w:abstractNum>
-  <w:abstractNum w:abstractNumId="35" w15:restartNumberingAfterBreak="0">
+  <w:abstractNum w:abstractNumId="41" w15:restartNumberingAfterBreak="0">
     <w:nsid w:val="787D215D"/>
     <w:multiLevelType w:val="hybridMultilevel"/>
     <w:tmpl w:val="6E66E1B4"/>
@@ -22981,7 +27214,120 @@
       </w:pPr>
     </w:lvl>
   </w:abstractNum>
-  <w:abstractNum w:abstractNumId="36" w15:restartNumberingAfterBreak="0">
+  <w:abstractNum w:abstractNumId="42" w15:restartNumberingAfterBreak="0">
+    <w:nsid w:val="7AB25B5B"/>
+    <w:multiLevelType w:val="hybridMultilevel"/>
+    <w:tmpl w:val="E5A0EAA8"/>
+    <w:lvl w:ilvl="0" w:tplc="40090001">
+      <w:start w:val="1"/>
+      <w:numFmt w:val="bullet"/>
+      <w:lvlText w:val=""/>
+      <w:lvlJc w:val="left"/>
+      <w:pPr>
+        <w:ind w:left="720" w:hanging="360"/>
+      </w:pPr>
+      <w:rPr>
+        <w:rFonts w:ascii="Symbol" w:hAnsi="Symbol" w:hint="default"/>
+      </w:rPr>
+    </w:lvl>
+    <w:lvl w:ilvl="1" w:tplc="40090003">
+      <w:start w:val="1"/>
+      <w:numFmt w:val="bullet"/>
+      <w:lvlText w:val="o"/>
+      <w:lvlJc w:val="left"/>
+      <w:pPr>
+        <w:ind w:left="1440" w:hanging="360"/>
+      </w:pPr>
+      <w:rPr>
+        <w:rFonts w:ascii="Courier New" w:hAnsi="Courier New" w:cs="Courier New" w:hint="default"/>
+      </w:rPr>
+    </w:lvl>
+    <w:lvl w:ilvl="2" w:tplc="40090005" w:tentative="1">
+      <w:start w:val="1"/>
+      <w:numFmt w:val="bullet"/>
+      <w:lvlText w:val=""/>
+      <w:lvlJc w:val="left"/>
+      <w:pPr>
+        <w:ind w:left="2160" w:hanging="360"/>
+      </w:pPr>
+      <w:rPr>
+        <w:rFonts w:ascii="Wingdings" w:hAnsi="Wingdings" w:hint="default"/>
+      </w:rPr>
+    </w:lvl>
+    <w:lvl w:ilvl="3" w:tplc="40090001" w:tentative="1">
+      <w:start w:val="1"/>
+      <w:numFmt w:val="bullet"/>
+      <w:lvlText w:val=""/>
+      <w:lvlJc w:val="left"/>
+      <w:pPr>
+        <w:ind w:left="2880" w:hanging="360"/>
+      </w:pPr>
+      <w:rPr>
+        <w:rFonts w:ascii="Symbol" w:hAnsi="Symbol" w:hint="default"/>
+      </w:rPr>
+    </w:lvl>
+    <w:lvl w:ilvl="4" w:tplc="40090003" w:tentative="1">
+      <w:start w:val="1"/>
+      <w:numFmt w:val="bullet"/>
+      <w:lvlText w:val="o"/>
+      <w:lvlJc w:val="left"/>
+      <w:pPr>
+        <w:ind w:left="3600" w:hanging="360"/>
+      </w:pPr>
+      <w:rPr>
+        <w:rFonts w:ascii="Courier New" w:hAnsi="Courier New" w:cs="Courier New" w:hint="default"/>
+      </w:rPr>
+    </w:lvl>
+    <w:lvl w:ilvl="5" w:tplc="40090005" w:tentative="1">
+      <w:start w:val="1"/>
+      <w:numFmt w:val="bullet"/>
+      <w:lvlText w:val=""/>
+      <w:lvlJc w:val="left"/>
+      <w:pPr>
+        <w:ind w:left="4320" w:hanging="360"/>
+      </w:pPr>
+      <w:rPr>
+        <w:rFonts w:ascii="Wingdings" w:hAnsi="Wingdings" w:hint="default"/>
+      </w:rPr>
+    </w:lvl>
+    <w:lvl w:ilvl="6" w:tplc="40090001" w:tentative="1">
+      <w:start w:val="1"/>
+      <w:numFmt w:val="bullet"/>
+      <w:lvlText w:val=""/>
+      <w:lvlJc w:val="left"/>
+      <w:pPr>
+        <w:ind w:left="5040" w:hanging="360"/>
+      </w:pPr>
+      <w:rPr>
+        <w:rFonts w:ascii="Symbol" w:hAnsi="Symbol" w:hint="default"/>
+      </w:rPr>
+    </w:lvl>
+    <w:lvl w:ilvl="7" w:tplc="40090003" w:tentative="1">
+      <w:start w:val="1"/>
+      <w:numFmt w:val="bullet"/>
+      <w:lvlText w:val="o"/>
+      <w:lvlJc w:val="left"/>
+      <w:pPr>
+        <w:ind w:left="5760" w:hanging="360"/>
+      </w:pPr>
+      <w:rPr>
+        <w:rFonts w:ascii="Courier New" w:hAnsi="Courier New" w:cs="Courier New" w:hint="default"/>
+      </w:rPr>
+    </w:lvl>
+    <w:lvl w:ilvl="8" w:tplc="40090005" w:tentative="1">
+      <w:start w:val="1"/>
+      <w:numFmt w:val="bullet"/>
+      <w:lvlText w:val=""/>
+      <w:lvlJc w:val="left"/>
+      <w:pPr>
+        <w:ind w:left="6480" w:hanging="360"/>
+      </w:pPr>
+      <w:rPr>
+        <w:rFonts w:ascii="Wingdings" w:hAnsi="Wingdings" w:hint="default"/>
+      </w:rPr>
+    </w:lvl>
+  </w:abstractNum>
+  <w:abstractNum w:abstractNumId="43" w15:restartNumberingAfterBreak="0">
     <w:nsid w:val="7B8D34CF"/>
     <w:multiLevelType w:val="multilevel"/>
     <w:tmpl w:val="702834C8"/>
@@ -23130,7 +27476,7 @@
       </w:rPr>
     </w:lvl>
   </w:abstractNum>
-  <w:abstractNum w:abstractNumId="37" w15:restartNumberingAfterBreak="0">
+  <w:abstractNum w:abstractNumId="44" w15:restartNumberingAfterBreak="0">
     <w:nsid w:val="7F62291B"/>
     <w:multiLevelType w:val="hybridMultilevel"/>
     <w:tmpl w:val="B71640A2"/>
@@ -23217,118 +27563,139 @@
     </w:lvl>
   </w:abstractNum>
   <w:num w:numId="1" w16cid:durableId="1235513339">
-    <w:abstractNumId w:val="1"/>
+    <w:abstractNumId w:val="2"/>
   </w:num>
   <w:num w:numId="2" w16cid:durableId="288970933">
-    <w:abstractNumId w:val="28"/>
+    <w:abstractNumId w:val="33"/>
   </w:num>
   <w:num w:numId="3" w16cid:durableId="1934975148">
     <w:abstractNumId w:val="0"/>
   </w:num>
   <w:num w:numId="4" w16cid:durableId="284432453">
+    <w:abstractNumId w:val="11"/>
+  </w:num>
+  <w:num w:numId="5" w16cid:durableId="1475290958">
+    <w:abstractNumId w:val="3"/>
+  </w:num>
+  <w:num w:numId="6" w16cid:durableId="674764127">
+    <w:abstractNumId w:val="43"/>
+  </w:num>
+  <w:num w:numId="7" w16cid:durableId="1366904678">
+    <w:abstractNumId w:val="19"/>
+  </w:num>
+  <w:num w:numId="8" w16cid:durableId="67462260">
+    <w:abstractNumId w:val="34"/>
+  </w:num>
+  <w:num w:numId="9" w16cid:durableId="504519595">
+    <w:abstractNumId w:val="30"/>
+  </w:num>
+  <w:num w:numId="10" w16cid:durableId="1046217917">
     <w:abstractNumId w:val="10"/>
   </w:num>
-  <w:num w:numId="5" w16cid:durableId="1475290958">
-    <w:abstractNumId w:val="2"/>
+  <w:num w:numId="11" w16cid:durableId="1482194571">
+    <w:abstractNumId w:val="32"/>
   </w:num>
-  <w:num w:numId="6" w16cid:durableId="674764127">
+  <w:num w:numId="12" w16cid:durableId="1378116358">
+    <w:abstractNumId w:val="17"/>
+  </w:num>
+  <w:num w:numId="13" w16cid:durableId="1622763665">
+    <w:abstractNumId w:val="28"/>
+  </w:num>
+  <w:num w:numId="14" w16cid:durableId="1303314634">
+    <w:abstractNumId w:val="35"/>
+  </w:num>
+  <w:num w:numId="15" w16cid:durableId="9142093">
+    <w:abstractNumId w:val="38"/>
+  </w:num>
+  <w:num w:numId="16" w16cid:durableId="1458911845">
+    <w:abstractNumId w:val="15"/>
+  </w:num>
+  <w:num w:numId="17" w16cid:durableId="2118016731">
+    <w:abstractNumId w:val="6"/>
+  </w:num>
+  <w:num w:numId="18" w16cid:durableId="2101440695">
+    <w:abstractNumId w:val="41"/>
+  </w:num>
+  <w:num w:numId="19" w16cid:durableId="109252585">
+    <w:abstractNumId w:val="9"/>
+  </w:num>
+  <w:num w:numId="20" w16cid:durableId="472599006">
+    <w:abstractNumId w:val="8"/>
+  </w:num>
+  <w:num w:numId="21" w16cid:durableId="1115103356">
+    <w:abstractNumId w:val="31"/>
+  </w:num>
+  <w:num w:numId="22" w16cid:durableId="220681117">
     <w:abstractNumId w:val="36"/>
   </w:num>
-  <w:num w:numId="7" w16cid:durableId="1366904678">
-    <w:abstractNumId w:val="17"/>
+  <w:num w:numId="23" w16cid:durableId="1049376175">
+    <w:abstractNumId w:val="16"/>
   </w:num>
-  <w:num w:numId="8" w16cid:durableId="67462260">
+  <w:num w:numId="24" w16cid:durableId="723523505">
+    <w:abstractNumId w:val="14"/>
+  </w:num>
+  <w:num w:numId="25" w16cid:durableId="1595165128">
+    <w:abstractNumId w:val="13"/>
+  </w:num>
+  <w:num w:numId="26" w16cid:durableId="1168903458">
+    <w:abstractNumId w:val="4"/>
+  </w:num>
+  <w:num w:numId="27" w16cid:durableId="611862714">
+    <w:abstractNumId w:val="18"/>
+  </w:num>
+  <w:num w:numId="28" w16cid:durableId="340668397">
+    <w:abstractNumId w:val="26"/>
+  </w:num>
+  <w:num w:numId="29" w16cid:durableId="87584769">
+    <w:abstractNumId w:val="5"/>
+  </w:num>
+  <w:num w:numId="30" w16cid:durableId="1409889759">
     <w:abstractNumId w:val="29"/>
   </w:num>
-  <w:num w:numId="9" w16cid:durableId="504519595">
+  <w:num w:numId="31" w16cid:durableId="400836092">
+    <w:abstractNumId w:val="7"/>
+  </w:num>
+  <w:num w:numId="32" w16cid:durableId="1819607792">
     <w:abstractNumId w:val="25"/>
   </w:num>
-  <w:num w:numId="10" w16cid:durableId="1046217917">
-    <w:abstractNumId w:val="9"/>
+  <w:num w:numId="33" w16cid:durableId="1637417472">
+    <w:abstractNumId w:val="40"/>
   </w:num>
-  <w:num w:numId="11" w16cid:durableId="1482194571">
+  <w:num w:numId="34" w16cid:durableId="871116235">
+    <w:abstractNumId w:val="39"/>
+  </w:num>
+  <w:num w:numId="35" w16cid:durableId="2009362747">
+    <w:abstractNumId w:val="21"/>
+  </w:num>
+  <w:num w:numId="36" w16cid:durableId="1833788539">
+    <w:abstractNumId w:val="44"/>
+  </w:num>
+  <w:num w:numId="37" w16cid:durableId="846090408">
+    <w:abstractNumId w:val="22"/>
+  </w:num>
+  <w:num w:numId="38" w16cid:durableId="307588129">
+    <w:abstractNumId w:val="23"/>
+  </w:num>
+  <w:num w:numId="39" w16cid:durableId="1618440895">
+    <w:abstractNumId w:val="20"/>
+  </w:num>
+  <w:num w:numId="40" w16cid:durableId="1307668086">
+    <w:abstractNumId w:val="42"/>
+  </w:num>
+  <w:num w:numId="41" w16cid:durableId="69272560">
+    <w:abstractNumId w:val="24"/>
+  </w:num>
+  <w:num w:numId="42" w16cid:durableId="2137329642">
+    <w:abstractNumId w:val="12"/>
+  </w:num>
+  <w:num w:numId="43" w16cid:durableId="2038189983">
     <w:abstractNumId w:val="27"/>
   </w:num>
-  <w:num w:numId="12" w16cid:durableId="1378116358">
-    <w:abstractNumId w:val="15"/>
+  <w:num w:numId="44" w16cid:durableId="9188195">
+    <w:abstractNumId w:val="1"/>
   </w:num>
-  <w:num w:numId="13" w16cid:durableId="1622763665">
-    <w:abstractNumId w:val="23"/>
-  </w:num>
-  <w:num w:numId="14" w16cid:durableId="1303314634">
-    <w:abstractNumId w:val="30"/>
-  </w:num>
-  <w:num w:numId="15" w16cid:durableId="9142093">
-    <w:abstractNumId w:val="32"/>
-  </w:num>
-  <w:num w:numId="16" w16cid:durableId="1458911845">
-    <w:abstractNumId w:val="13"/>
-  </w:num>
-  <w:num w:numId="17" w16cid:durableId="2118016731">
-    <w:abstractNumId w:val="5"/>
-  </w:num>
-  <w:num w:numId="18" w16cid:durableId="2101440695">
-    <w:abstractNumId w:val="35"/>
-  </w:num>
-  <w:num w:numId="19" w16cid:durableId="109252585">
-    <w:abstractNumId w:val="8"/>
-  </w:num>
-  <w:num w:numId="20" w16cid:durableId="472599006">
-    <w:abstractNumId w:val="7"/>
-  </w:num>
-  <w:num w:numId="21" w16cid:durableId="1115103356">
-    <w:abstractNumId w:val="26"/>
-  </w:num>
-  <w:num w:numId="22" w16cid:durableId="220681117">
-    <w:abstractNumId w:val="31"/>
-  </w:num>
-  <w:num w:numId="23" w16cid:durableId="1049376175">
-    <w:abstractNumId w:val="14"/>
-  </w:num>
-  <w:num w:numId="24" w16cid:durableId="723523505">
-    <w:abstractNumId w:val="12"/>
-  </w:num>
-  <w:num w:numId="25" w16cid:durableId="1595165128">
-    <w:abstractNumId w:val="11"/>
-  </w:num>
-  <w:num w:numId="26" w16cid:durableId="1168903458">
-    <w:abstractNumId w:val="3"/>
-  </w:num>
-  <w:num w:numId="27" w16cid:durableId="611862714">
-    <w:abstractNumId w:val="16"/>
-  </w:num>
-  <w:num w:numId="28" w16cid:durableId="340668397">
-    <w:abstractNumId w:val="22"/>
-  </w:num>
-  <w:num w:numId="29" w16cid:durableId="87584769">
-    <w:abstractNumId w:val="4"/>
-  </w:num>
-  <w:num w:numId="30" w16cid:durableId="1409889759">
-    <w:abstractNumId w:val="24"/>
-  </w:num>
-  <w:num w:numId="31" w16cid:durableId="400836092">
-    <w:abstractNumId w:val="6"/>
-  </w:num>
-  <w:num w:numId="32" w16cid:durableId="1819607792">
-    <w:abstractNumId w:val="21"/>
-  </w:num>
-  <w:num w:numId="33" w16cid:durableId="1637417472">
-    <w:abstractNumId w:val="34"/>
-  </w:num>
-  <w:num w:numId="34" w16cid:durableId="871116235">
-    <w:abstractNumId w:val="33"/>
-  </w:num>
-  <w:num w:numId="35" w16cid:durableId="2009362747">
-    <w:abstractNumId w:val="18"/>
-  </w:num>
-  <w:num w:numId="36" w16cid:durableId="1833788539">
+  <w:num w:numId="45" w16cid:durableId="1834445961">
     <w:abstractNumId w:val="37"/>
-  </w:num>
-  <w:num w:numId="37" w16cid:durableId="846090408">
-    <w:abstractNumId w:val="19"/>
-  </w:num>
-  <w:num w:numId="38" w16cid:durableId="307588129">
-    <w:abstractNumId w:val="20"/>
   </w:num>
   <w:numIdMacAtCleanup w:val="38"/>
 </w:numbering>

</xml_diff>

<commit_message>
Update notes: 24-09-2026 19:46
</commit_message>
<xml_diff>
--- a/Financial Mathematics/notes.docx
+++ b/Financial Mathematics/notes.docx
@@ -2216,7 +2216,20 @@
           <w:rFonts w:eastAsiaTheme="minorEastAsia"/>
         </w:rPr>
         <w:tab/>
-        <w:t xml:space="preserve">Where, </w:t>
+      </w:r>
+      <w:proofErr w:type="gramStart"/>
+      <w:r>
+        <w:rPr>
+          <w:rFonts w:eastAsiaTheme="minorEastAsia"/>
+        </w:rPr>
+        <w:t>Where</w:t>
+      </w:r>
+      <w:proofErr w:type="gramEnd"/>
+      <w:r>
+        <w:rPr>
+          <w:rFonts w:eastAsiaTheme="minorEastAsia"/>
+        </w:rPr>
+        <w:t xml:space="preserve">, </w:t>
       </w:r>
     </w:p>
     <w:p>
@@ -2876,11 +2889,19 @@
           <w:rFonts w:eastAsiaTheme="minorEastAsia"/>
         </w:rPr>
       </w:pPr>
-      <w:r>
-        <w:rPr>
-          <w:rFonts w:eastAsiaTheme="minorEastAsia"/>
-        </w:rPr>
-        <w:t xml:space="preserve">Where, </w:t>
+      <w:proofErr w:type="gramStart"/>
+      <w:r>
+        <w:rPr>
+          <w:rFonts w:eastAsiaTheme="minorEastAsia"/>
+        </w:rPr>
+        <w:t>Where</w:t>
+      </w:r>
+      <w:proofErr w:type="gramEnd"/>
+      <w:r>
+        <w:rPr>
+          <w:rFonts w:eastAsiaTheme="minorEastAsia"/>
+        </w:rPr>
+        <w:t xml:space="preserve">, </w:t>
       </w:r>
     </w:p>
     <w:p>
@@ -3625,11 +3646,19 @@
           <w:rFonts w:eastAsiaTheme="minorEastAsia"/>
         </w:rPr>
       </w:pPr>
-      <w:r>
-        <w:rPr>
-          <w:rFonts w:eastAsiaTheme="minorEastAsia"/>
-        </w:rPr>
-        <w:t>Where,</w:t>
+      <w:proofErr w:type="gramStart"/>
+      <w:r>
+        <w:rPr>
+          <w:rFonts w:eastAsiaTheme="minorEastAsia"/>
+        </w:rPr>
+        <w:t>Where</w:t>
+      </w:r>
+      <w:proofErr w:type="gramEnd"/>
+      <w:r>
+        <w:rPr>
+          <w:rFonts w:eastAsiaTheme="minorEastAsia"/>
+        </w:rPr>
+        <w:t>,</w:t>
       </w:r>
     </w:p>
     <w:p>
@@ -3816,11 +3845,19 @@
           <w:rFonts w:eastAsiaTheme="minorEastAsia"/>
         </w:rPr>
       </w:pPr>
-      <w:r>
-        <w:rPr>
-          <w:rFonts w:eastAsiaTheme="minorEastAsia"/>
-        </w:rPr>
-        <w:t xml:space="preserve">Where, </w:t>
+      <w:proofErr w:type="gramStart"/>
+      <w:r>
+        <w:rPr>
+          <w:rFonts w:eastAsiaTheme="minorEastAsia"/>
+        </w:rPr>
+        <w:t>Where</w:t>
+      </w:r>
+      <w:proofErr w:type="gramEnd"/>
+      <w:r>
+        <w:rPr>
+          <w:rFonts w:eastAsiaTheme="minorEastAsia"/>
+        </w:rPr>
+        <w:t xml:space="preserve">, </w:t>
       </w:r>
     </w:p>
     <w:p>
@@ -4118,11 +4155,19 @@
           <w:rFonts w:eastAsiaTheme="minorEastAsia"/>
         </w:rPr>
       </w:pPr>
-      <w:r>
-        <w:rPr>
-          <w:rFonts w:eastAsiaTheme="minorEastAsia"/>
-        </w:rPr>
-        <w:t xml:space="preserve">Where, </w:t>
+      <w:proofErr w:type="gramStart"/>
+      <w:r>
+        <w:rPr>
+          <w:rFonts w:eastAsiaTheme="minorEastAsia"/>
+        </w:rPr>
+        <w:t>Where</w:t>
+      </w:r>
+      <w:proofErr w:type="gramEnd"/>
+      <w:r>
+        <w:rPr>
+          <w:rFonts w:eastAsiaTheme="minorEastAsia"/>
+        </w:rPr>
+        <w:t xml:space="preserve">, </w:t>
       </w:r>
     </w:p>
     <w:p>
@@ -8794,7 +8839,21 @@
         <w:rPr>
           <w:rFonts w:eastAsiaTheme="minorEastAsia"/>
         </w:rPr>
-        <w:t>Present value of Rs 10,000 receivable after 4 years and the rate of interest at 12%. The PV factor in the PV table (12% column and 4 year row) is 0.635.</w:t>
+        <w:t xml:space="preserve">Present value of Rs 10,000 receivable after 4 years and the rate of interest at 12%. The PV factor in the PV table (12% column and </w:t>
+      </w:r>
+      <w:proofErr w:type="gramStart"/>
+      <w:r>
+        <w:rPr>
+          <w:rFonts w:eastAsiaTheme="minorEastAsia"/>
+        </w:rPr>
+        <w:t>4 year</w:t>
+      </w:r>
+      <w:proofErr w:type="gramEnd"/>
+      <w:r>
+        <w:rPr>
+          <w:rFonts w:eastAsiaTheme="minorEastAsia"/>
+        </w:rPr>
+        <w:t xml:space="preserve"> row) is 0.635.</w:t>
       </w:r>
     </w:p>
     <w:p>
@@ -10248,7 +10307,21 @@
         <w:rPr>
           <w:lang w:val="en-US"/>
         </w:rPr>
-        <w:t>Raja has entered into an agreement that will fetch him Rs. 60000 per annum for next 4 years. He want to know the present value for the future cash inflows at 20% discount rate</w:t>
+        <w:t xml:space="preserve">Raja has entered into an agreement that will fetch him Rs. 60000 per annum for next 4 years. He </w:t>
+      </w:r>
+      <w:proofErr w:type="gramStart"/>
+      <w:r>
+        <w:rPr>
+          <w:lang w:val="en-US"/>
+        </w:rPr>
+        <w:t>want</w:t>
+      </w:r>
+      <w:proofErr w:type="gramEnd"/>
+      <w:r>
+        <w:rPr>
+          <w:lang w:val="en-US"/>
+        </w:rPr>
+        <w:t xml:space="preserve"> to know the present value for the future cash inflows at 20% discount rate</w:t>
       </w:r>
     </w:p>
     <w:p>
@@ -12156,11 +12229,19 @@
           <w:rFonts w:eastAsiaTheme="minorEastAsia"/>
         </w:rPr>
       </w:pPr>
-      <w:r>
-        <w:rPr>
-          <w:rFonts w:eastAsiaTheme="minorEastAsia"/>
-        </w:rPr>
-        <w:t xml:space="preserve">Where, </w:t>
+      <w:proofErr w:type="gramStart"/>
+      <w:r>
+        <w:rPr>
+          <w:rFonts w:eastAsiaTheme="minorEastAsia"/>
+        </w:rPr>
+        <w:t>Where</w:t>
+      </w:r>
+      <w:proofErr w:type="gramEnd"/>
+      <w:r>
+        <w:rPr>
+          <w:rFonts w:eastAsiaTheme="minorEastAsia"/>
+        </w:rPr>
+        <w:t xml:space="preserve">, </w:t>
       </w:r>
     </w:p>
     <w:p>
@@ -13361,11 +13442,19 @@
           <w:rFonts w:eastAsiaTheme="minorEastAsia"/>
         </w:rPr>
       </w:pPr>
-      <w:r>
-        <w:rPr>
-          <w:rFonts w:eastAsiaTheme="minorEastAsia"/>
-        </w:rPr>
-        <w:t>So the accumulation factor is </w:t>
+      <w:proofErr w:type="gramStart"/>
+      <w:r>
+        <w:rPr>
+          <w:rFonts w:eastAsiaTheme="minorEastAsia"/>
+        </w:rPr>
+        <w:t>So</w:t>
+      </w:r>
+      <w:proofErr w:type="gramEnd"/>
+      <w:r>
+        <w:rPr>
+          <w:rFonts w:eastAsiaTheme="minorEastAsia"/>
+        </w:rPr>
+        <w:t xml:space="preserve"> the accumulation factor is </w:t>
       </w:r>
       <w:r>
         <w:rPr>
@@ -14261,7 +14350,21 @@
         <w:rPr>
           <w:rFonts w:eastAsiaTheme="minorEastAsia"/>
         </w:rPr>
-        <w:t xml:space="preserve"> ltd are selling for Rs. 50 per share and pays a dividend of Rs 3, what is your expected rate of return if you purchase the security at market price </w:t>
+        <w:t xml:space="preserve"> ltd </w:t>
+      </w:r>
+      <w:proofErr w:type="gramStart"/>
+      <w:r>
+        <w:rPr>
+          <w:rFonts w:eastAsiaTheme="minorEastAsia"/>
+        </w:rPr>
+        <w:t>are</w:t>
+      </w:r>
+      <w:proofErr w:type="gramEnd"/>
+      <w:r>
+        <w:rPr>
+          <w:rFonts w:eastAsiaTheme="minorEastAsia"/>
+        </w:rPr>
+        <w:t xml:space="preserve"> selling for Rs. 50 per share and pays a dividend of Rs 3, what is your expected rate of return if you purchase the security at market price </w:t>
       </w:r>
     </w:p>
     <w:p>
@@ -14895,7 +14998,21 @@
         <w:rPr>
           <w:rFonts w:eastAsiaTheme="minorEastAsia"/>
         </w:rPr>
-        <w:t>Earnings yield is the amount is adjustable as earnings to the shareholders of each shares in proportion to the market price of their share.</w:t>
+        <w:t xml:space="preserve">Earnings yield is the amount is adjustable as earnings to the shareholders of each </w:t>
+      </w:r>
+      <w:proofErr w:type="gramStart"/>
+      <w:r>
+        <w:rPr>
+          <w:rFonts w:eastAsiaTheme="minorEastAsia"/>
+        </w:rPr>
+        <w:t>shares</w:t>
+      </w:r>
+      <w:proofErr w:type="gramEnd"/>
+      <w:r>
+        <w:rPr>
+          <w:rFonts w:eastAsiaTheme="minorEastAsia"/>
+        </w:rPr>
+        <w:t xml:space="preserve"> in proportion to the market price of their share.</w:t>
       </w:r>
     </w:p>
     <w:p>
@@ -15543,11 +15660,19 @@
           <w:rFonts w:eastAsiaTheme="minorEastAsia"/>
         </w:rPr>
       </w:pPr>
-      <w:r>
-        <w:rPr>
-          <w:rFonts w:eastAsiaTheme="minorEastAsia"/>
-        </w:rPr>
-        <w:t>Where,</w:t>
+      <w:proofErr w:type="gramStart"/>
+      <w:r>
+        <w:rPr>
+          <w:rFonts w:eastAsiaTheme="minorEastAsia"/>
+        </w:rPr>
+        <w:t>Where</w:t>
+      </w:r>
+      <w:proofErr w:type="gramEnd"/>
+      <w:r>
+        <w:rPr>
+          <w:rFonts w:eastAsiaTheme="minorEastAsia"/>
+        </w:rPr>
+        <w:t>,</w:t>
       </w:r>
     </w:p>
     <w:p>
@@ -16493,7 +16618,23 @@
           <w:rFonts w:eastAsiaTheme="minorEastAsia"/>
           <w:lang w:val="en-US"/>
         </w:rPr>
-        <w:t>= 12/(0.16-0.03) = 92.30</w:t>
+        <w:t>= 12</w:t>
+      </w:r>
+      <w:proofErr w:type="gramStart"/>
+      <w:r>
+        <w:rPr>
+          <w:rFonts w:eastAsiaTheme="minorEastAsia"/>
+          <w:lang w:val="en-US"/>
+        </w:rPr>
+        <w:t>/(</w:t>
+      </w:r>
+      <w:proofErr w:type="gramEnd"/>
+      <w:r>
+        <w:rPr>
+          <w:rFonts w:eastAsiaTheme="minorEastAsia"/>
+          <w:lang w:val="en-US"/>
+        </w:rPr>
+        <w:t>0.16-0.03) = 92.30</w:t>
       </w:r>
     </w:p>
     <w:p>
@@ -17157,7 +17298,23 @@
           <w:rFonts w:eastAsiaTheme="minorEastAsia"/>
           <w:lang w:val="en-US"/>
         </w:rPr>
-        <w:t xml:space="preserve"> to distribute 60% its earning and to retain to reinvest the remaining 40% of the earnings.&amp;#x20;</w:t>
+        <w:t xml:space="preserve"> to distribute 60% its earning and to retain to reinvest the remaining 40% of the </w:t>
+      </w:r>
+      <w:proofErr w:type="gramStart"/>
+      <w:r>
+        <w:rPr>
+          <w:rFonts w:eastAsiaTheme="minorEastAsia"/>
+          <w:lang w:val="en-US"/>
+        </w:rPr>
+        <w:t>earnings.&amp;</w:t>
+      </w:r>
+      <w:proofErr w:type="gramEnd"/>
+      <w:r>
+        <w:rPr>
+          <w:rFonts w:eastAsiaTheme="minorEastAsia"/>
+          <w:lang w:val="en-US"/>
+        </w:rPr>
+        <w:t>#x20;</w:t>
       </w:r>
     </w:p>
     <w:p>
@@ -17619,11 +17776,19 @@
           <w:rFonts w:eastAsiaTheme="minorEastAsia"/>
         </w:rPr>
       </w:pPr>
-      <w:r>
-        <w:rPr>
-          <w:rFonts w:eastAsiaTheme="minorEastAsia"/>
-        </w:rPr>
-        <w:t>Where,</w:t>
+      <w:proofErr w:type="gramStart"/>
+      <w:r>
+        <w:rPr>
+          <w:rFonts w:eastAsiaTheme="minorEastAsia"/>
+        </w:rPr>
+        <w:t>Where</w:t>
+      </w:r>
+      <w:proofErr w:type="gramEnd"/>
+      <w:r>
+        <w:rPr>
+          <w:rFonts w:eastAsiaTheme="minorEastAsia"/>
+        </w:rPr>
+        <w:t>,</w:t>
       </w:r>
     </w:p>
     <w:p>
@@ -20045,6 +20210,7 @@
         <w:t xml:space="preserve">Theories of relevance – a. </w:t>
       </w:r>
       <w:proofErr w:type="spellStart"/>
+      <w:proofErr w:type="gramStart"/>
       <w:r>
         <w:rPr>
           <w:lang w:val="en-US"/>
@@ -20056,7 +20222,14 @@
         <w:rPr>
           <w:lang w:val="en-US"/>
         </w:rPr>
-        <w:t xml:space="preserve"> ; b. </w:t>
+        <w:t xml:space="preserve"> ;</w:t>
+      </w:r>
+      <w:proofErr w:type="gramEnd"/>
+      <w:r>
+        <w:rPr>
+          <w:lang w:val="en-US"/>
+        </w:rPr>
+        <w:t xml:space="preserve"> b. </w:t>
       </w:r>
       <w:proofErr w:type="spellStart"/>
       <w:r>
@@ -20260,6 +20433,7 @@
         <w:t xml:space="preserve">the return on the </w:t>
       </w:r>
       <w:proofErr w:type="spellStart"/>
+      <w:proofErr w:type="gramStart"/>
       <w:r>
         <w:rPr>
           <w:lang w:val="en-US"/>
@@ -20267,6 +20441,7 @@
         <w:t>firms</w:t>
       </w:r>
       <w:proofErr w:type="spellEnd"/>
+      <w:proofErr w:type="gramEnd"/>
       <w:r>
         <w:rPr>
           <w:lang w:val="en-US"/>
@@ -20384,7 +20559,21 @@
         <w:rPr>
           <w:lang w:val="en-US"/>
         </w:rPr>
-        <w:t>Normal firm – firms internal rate of return is equal to cost of capital (shareholders are indifferent between retention and distribution of earnings)</w:t>
+        <w:t xml:space="preserve">Normal firm – </w:t>
+      </w:r>
+      <w:proofErr w:type="gramStart"/>
+      <w:r>
+        <w:rPr>
+          <w:lang w:val="en-US"/>
+        </w:rPr>
+        <w:t>firms</w:t>
+      </w:r>
+      <w:proofErr w:type="gramEnd"/>
+      <w:r>
+        <w:rPr>
+          <w:lang w:val="en-US"/>
+        </w:rPr>
+        <w:t xml:space="preserve"> internal rate of return is equal to cost of capital (shareholders are indifferent between retention and distribution of earnings)</w:t>
       </w:r>
     </w:p>
     <w:p>
@@ -23630,7 +23819,23 @@
           <w:rFonts w:eastAsiaTheme="minorEastAsia"/>
           <w:iCs/>
         </w:rPr>
-        <w:t>The firm is a declining firm (r &gt; k). MPS is the highest than the payout ratio is 100%. Hence, the ideal payout ratio for the company is 100%.</w:t>
+        <w:t xml:space="preserve">The firm is a declining firm (r &gt; k). MPS is </w:t>
+      </w:r>
+      <w:proofErr w:type="gramStart"/>
+      <w:r>
+        <w:rPr>
+          <w:rFonts w:eastAsiaTheme="minorEastAsia"/>
+          <w:iCs/>
+        </w:rPr>
+        <w:t>the highest</w:t>
+      </w:r>
+      <w:proofErr w:type="gramEnd"/>
+      <w:r>
+        <w:rPr>
+          <w:rFonts w:eastAsiaTheme="minorEastAsia"/>
+          <w:iCs/>
+        </w:rPr>
+        <w:t xml:space="preserve"> than the payout ratio is 100%. Hence, the ideal payout ratio for the company is 100%.</w:t>
       </w:r>
       <w:r>
         <w:rPr>
@@ -24171,11 +24376,19 @@
           <w:rFonts w:eastAsiaTheme="minorEastAsia"/>
         </w:rPr>
       </w:pPr>
-      <w:r>
-        <w:rPr>
-          <w:rFonts w:eastAsiaTheme="minorEastAsia"/>
-        </w:rPr>
-        <w:t xml:space="preserve">Where, </w:t>
+      <w:proofErr w:type="gramStart"/>
+      <w:r>
+        <w:rPr>
+          <w:rFonts w:eastAsiaTheme="minorEastAsia"/>
+        </w:rPr>
+        <w:t>Where</w:t>
+      </w:r>
+      <w:proofErr w:type="gramEnd"/>
+      <w:r>
+        <w:rPr>
+          <w:rFonts w:eastAsiaTheme="minorEastAsia"/>
+        </w:rPr>
+        <w:t xml:space="preserve">, </w:t>
       </w:r>
     </w:p>
     <w:p>
@@ -26993,6 +27206,776 @@
         <w:t xml:space="preserve"> </w:t>
       </w:r>
     </w:p>
+    <w:p>
+      <w:pPr>
+        <w:rPr>
+          <w:rFonts w:eastAsiaTheme="minorEastAsia"/>
+        </w:rPr>
+      </w:pPr>
+    </w:p>
+    <w:p>
+      <w:pPr>
+        <w:rPr>
+          <w:rFonts w:eastAsiaTheme="minorEastAsia"/>
+        </w:rPr>
+      </w:pPr>
+      <w:r>
+        <w:rPr>
+          <w:rFonts w:eastAsiaTheme="minorEastAsia"/>
+        </w:rPr>
+        <w:t>22/09/2026</w:t>
+      </w:r>
+    </w:p>
+    <w:p>
+      <w:pPr>
+        <w:rPr>
+          <w:rFonts w:eastAsiaTheme="minorEastAsia"/>
+        </w:rPr>
+      </w:pPr>
+    </w:p>
+    <w:p>
+      <w:pPr>
+        <w:rPr>
+          <w:rFonts w:eastAsiaTheme="minorEastAsia"/>
+        </w:rPr>
+      </w:pPr>
+      <w:r>
+        <w:rPr>
+          <w:rFonts w:eastAsiaTheme="minorEastAsia"/>
+        </w:rPr>
+        <w:t>Yield to call (YTC)</w:t>
+      </w:r>
+    </w:p>
+    <w:p>
+      <w:pPr>
+        <w:rPr>
+          <w:rFonts w:eastAsiaTheme="minorEastAsia"/>
+        </w:rPr>
+      </w:pPr>
+      <w:r>
+        <w:rPr>
+          <w:rFonts w:eastAsiaTheme="minorEastAsia"/>
+        </w:rPr>
+        <w:t>Eg: bond trading @10% discount to its par value</w:t>
+      </w:r>
+    </w:p>
+    <w:p>
+      <w:pPr>
+        <w:rPr>
+          <w:rFonts w:eastAsiaTheme="minorEastAsia"/>
+        </w:rPr>
+      </w:pPr>
+      <w:r>
+        <w:rPr>
+          <w:rFonts w:eastAsiaTheme="minorEastAsia"/>
+        </w:rPr>
+        <w:t>Par value 1000 USD</w:t>
+      </w:r>
+    </w:p>
+    <w:p>
+      <w:pPr>
+        <w:rPr>
+          <w:rFonts w:eastAsiaTheme="minorEastAsia"/>
+        </w:rPr>
+      </w:pPr>
+      <w:r>
+        <w:rPr>
+          <w:rFonts w:eastAsiaTheme="minorEastAsia"/>
+        </w:rPr>
+        <w:t>Market price 900 USD</w:t>
+      </w:r>
+    </w:p>
+    <w:p>
+      <w:pPr>
+        <w:rPr>
+          <w:rFonts w:eastAsiaTheme="minorEastAsia"/>
+        </w:rPr>
+      </w:pPr>
+      <w:r>
+        <w:rPr>
+          <w:rFonts w:eastAsiaTheme="minorEastAsia"/>
+        </w:rPr>
+        <w:t>Buy date 31.12.2023</w:t>
+      </w:r>
+    </w:p>
+    <w:p>
+      <w:pPr>
+        <w:rPr>
+          <w:rFonts w:eastAsiaTheme="minorEastAsia"/>
+        </w:rPr>
+      </w:pPr>
+      <w:r>
+        <w:rPr>
+          <w:rFonts w:eastAsiaTheme="minorEastAsia"/>
+        </w:rPr>
+        <w:t>Maturity date 31.12.2033</w:t>
+      </w:r>
+    </w:p>
+    <w:p>
+      <w:pPr>
+        <w:rPr>
+          <w:rFonts w:eastAsiaTheme="minorEastAsia"/>
+        </w:rPr>
+      </w:pPr>
+      <w:r>
+        <w:rPr>
+          <w:rFonts w:eastAsiaTheme="minorEastAsia"/>
+        </w:rPr>
+        <w:t>Mature period 10 years</w:t>
+      </w:r>
+    </w:p>
+    <w:p>
+      <w:pPr>
+        <w:rPr>
+          <w:rFonts w:eastAsiaTheme="minorEastAsia"/>
+        </w:rPr>
+      </w:pPr>
+      <w:r>
+        <w:rPr>
+          <w:rFonts w:eastAsiaTheme="minorEastAsia"/>
+        </w:rPr>
+        <w:t>Coupon rate 5%</w:t>
+      </w:r>
+    </w:p>
+    <w:p>
+      <w:pPr>
+        <w:rPr>
+          <w:rFonts w:eastAsiaTheme="minorEastAsia"/>
+        </w:rPr>
+      </w:pPr>
+      <w:r>
+        <w:rPr>
+          <w:rFonts w:eastAsiaTheme="minorEastAsia"/>
+        </w:rPr>
+        <w:t>Company call = repaying it early on 31.12.2027 (4 years after one purchase</w:t>
+      </w:r>
+    </w:p>
+    <w:p>
+      <w:pPr>
+        <w:rPr>
+          <w:rFonts w:eastAsiaTheme="minorEastAsia"/>
+        </w:rPr>
+      </w:pPr>
+      <w:r>
+        <w:rPr>
+          <w:rFonts w:eastAsiaTheme="minorEastAsia"/>
+        </w:rPr>
+        <w:t>Penal</w:t>
+      </w:r>
+      <w:r>
+        <w:rPr>
+          <w:rFonts w:eastAsiaTheme="minorEastAsia"/>
+        </w:rPr>
+        <w:t>t</w:t>
+      </w:r>
+      <w:r>
+        <w:rPr>
+          <w:rFonts w:eastAsiaTheme="minorEastAsia"/>
+        </w:rPr>
+        <w:t xml:space="preserve">y fee </w:t>
+      </w:r>
+      <w:r>
+        <w:rPr>
+          <w:rFonts w:eastAsiaTheme="minorEastAsia"/>
+        </w:rPr>
+        <w:t>= 3%</w:t>
+      </w:r>
+    </w:p>
+    <w:p>
+      <w:pPr>
+        <w:rPr>
+          <w:rFonts w:eastAsiaTheme="minorEastAsia"/>
+        </w:rPr>
+      </w:pPr>
+    </w:p>
+    <w:p>
+      <w:pPr>
+        <w:rPr>
+          <w:rFonts w:eastAsiaTheme="minorEastAsia"/>
+        </w:rPr>
+      </w:pPr>
+      <w:r>
+        <w:rPr>
+          <w:rFonts w:eastAsiaTheme="minorEastAsia"/>
+        </w:rPr>
+        <w:t xml:space="preserve">Yield to call (YTC): of a bond measures annualised return an investor receives if they buy the bond and hold it until the company’s call, it </w:t>
+      </w:r>
+      <w:proofErr w:type="gramStart"/>
+      <w:r>
+        <w:rPr>
+          <w:rFonts w:eastAsiaTheme="minorEastAsia"/>
+        </w:rPr>
+        <w:t>buy</w:t>
+      </w:r>
+      <w:proofErr w:type="gramEnd"/>
+      <w:r>
+        <w:rPr>
+          <w:rFonts w:eastAsiaTheme="minorEastAsia"/>
+        </w:rPr>
+        <w:t xml:space="preserve"> repaying the bond yearly with a penalty attached. </w:t>
+      </w:r>
+    </w:p>
+    <w:p>
+      <w:pPr>
+        <w:rPr>
+          <w:rFonts w:eastAsiaTheme="minorEastAsia"/>
+        </w:rPr>
+      </w:pPr>
+      <w:r>
+        <w:rPr>
+          <w:rFonts w:eastAsiaTheme="minorEastAsia"/>
+        </w:rPr>
+        <w:lastRenderedPageBreak/>
+        <w:t>Difference between YTC and YTM:</w:t>
+      </w:r>
+    </w:p>
+    <w:tbl>
+      <w:tblPr>
+        <w:tblStyle w:val="TableGrid"/>
+        <w:tblW w:w="0" w:type="auto"/>
+        <w:tblLook w:val="04A0" w:firstRow="1" w:lastRow="0" w:firstColumn="1" w:lastColumn="0" w:noHBand="0" w:noVBand="1"/>
+      </w:tblPr>
+      <w:tblGrid>
+        <w:gridCol w:w="4508"/>
+        <w:gridCol w:w="4508"/>
+      </w:tblGrid>
+      <w:tr>
+        <w:tc>
+          <w:tcPr>
+            <w:tcW w:w="4508" w:type="dxa"/>
+          </w:tcPr>
+          <w:p>
+            <w:pPr>
+              <w:rPr>
+                <w:rFonts w:eastAsiaTheme="minorEastAsia"/>
+              </w:rPr>
+            </w:pPr>
+            <w:r>
+              <w:rPr>
+                <w:rFonts w:eastAsiaTheme="minorEastAsia"/>
+              </w:rPr>
+              <w:t>YTM</w:t>
+            </w:r>
+          </w:p>
+        </w:tc>
+        <w:tc>
+          <w:tcPr>
+            <w:tcW w:w="4508" w:type="dxa"/>
+          </w:tcPr>
+          <w:p>
+            <w:pPr>
+              <w:rPr>
+                <w:rFonts w:eastAsiaTheme="minorEastAsia"/>
+              </w:rPr>
+            </w:pPr>
+            <w:r>
+              <w:rPr>
+                <w:rFonts w:eastAsiaTheme="minorEastAsia"/>
+              </w:rPr>
+              <w:t>YTC</w:t>
+            </w:r>
+          </w:p>
+        </w:tc>
+      </w:tr>
+      <w:tr>
+        <w:tc>
+          <w:tcPr>
+            <w:tcW w:w="4508" w:type="dxa"/>
+          </w:tcPr>
+          <w:p>
+            <w:pPr>
+              <w:pStyle w:val="ListParagraph"/>
+              <w:numPr>
+                <w:ilvl w:val="0"/>
+                <w:numId w:val="47"/>
+              </w:numPr>
+              <w:rPr>
+                <w:rFonts w:eastAsiaTheme="minorEastAsia"/>
+              </w:rPr>
+            </w:pPr>
+            <w:r>
+              <w:rPr>
+                <w:rFonts w:eastAsiaTheme="minorEastAsia"/>
+              </w:rPr>
+              <w:t>The investor holds the bond until its official maturity date</w:t>
+            </w:r>
+          </w:p>
+        </w:tc>
+        <w:tc>
+          <w:tcPr>
+            <w:tcW w:w="4508" w:type="dxa"/>
+          </w:tcPr>
+          <w:p>
+            <w:pPr>
+              <w:pStyle w:val="ListParagraph"/>
+              <w:numPr>
+                <w:ilvl w:val="0"/>
+                <w:numId w:val="47"/>
+              </w:numPr>
+              <w:rPr>
+                <w:rFonts w:eastAsiaTheme="minorEastAsia"/>
+              </w:rPr>
+            </w:pPr>
+            <w:r>
+              <w:rPr>
+                <w:rFonts w:eastAsiaTheme="minorEastAsia"/>
+              </w:rPr>
+              <w:t xml:space="preserve">Shorter holding period </w:t>
+            </w:r>
+            <w:r>
+              <w:rPr>
+                <w:rFonts w:eastAsiaTheme="minorEastAsia"/>
+              </w:rPr>
+              <w:t xml:space="preserve">and the penalty fee </w:t>
+            </w:r>
+          </w:p>
+        </w:tc>
+      </w:tr>
+    </w:tbl>
+    <w:p>
+      <w:pPr>
+        <w:rPr>
+          <w:rFonts w:eastAsiaTheme="minorEastAsia"/>
+        </w:rPr>
+      </w:pPr>
+    </w:p>
+    <w:p>
+      <w:pPr>
+        <w:rPr>
+          <w:rFonts w:eastAsiaTheme="minorEastAsia"/>
+        </w:rPr>
+      </w:pPr>
+      <w:r>
+        <w:rPr>
+          <w:rFonts w:eastAsiaTheme="minorEastAsia"/>
+        </w:rPr>
+        <w:t xml:space="preserve">Discount to the par value: if the bond trades at discount to par value, the YTC will be </w:t>
+      </w:r>
+      <m:oMath>
+        <m:r>
+          <w:rPr>
+            <w:rFonts w:ascii="Cambria Math" w:eastAsiaTheme="minorEastAsia" w:hAnsi="Cambria Math"/>
+          </w:rPr>
+          <m:t>≥</m:t>
+        </m:r>
+      </m:oMath>
+      <w:r>
+        <w:rPr>
+          <w:rFonts w:eastAsiaTheme="minorEastAsia"/>
+        </w:rPr>
+        <w:t xml:space="preserve"> YTM.</w:t>
+      </w:r>
+    </w:p>
+    <w:p>
+      <w:pPr>
+        <w:rPr>
+          <w:rFonts w:eastAsiaTheme="minorEastAsia"/>
+        </w:rPr>
+      </w:pPr>
+      <w:r>
+        <w:rPr>
+          <w:rFonts w:eastAsiaTheme="minorEastAsia"/>
+        </w:rPr>
+        <w:t xml:space="preserve">Premium to the par value: YTC will be </w:t>
+      </w:r>
+      <m:oMath>
+        <m:r>
+          <w:rPr>
+            <w:rFonts w:ascii="Cambria Math" w:eastAsiaTheme="minorEastAsia" w:hAnsi="Cambria Math"/>
+          </w:rPr>
+          <m:t>≤</m:t>
+        </m:r>
+      </m:oMath>
+      <w:r>
+        <w:rPr>
+          <w:rFonts w:eastAsiaTheme="minorEastAsia"/>
+        </w:rPr>
+        <w:t xml:space="preserve"> YTM</w:t>
+      </w:r>
+    </w:p>
+    <w:p>
+      <w:pPr>
+        <w:rPr>
+          <w:rFonts w:eastAsiaTheme="minorEastAsia"/>
+        </w:rPr>
+      </w:pPr>
+    </w:p>
+    <w:p>
+      <w:pPr>
+        <w:rPr>
+          <w:rFonts w:eastAsiaTheme="minorEastAsia"/>
+        </w:rPr>
+      </w:pPr>
+      <w:r>
+        <w:rPr>
+          <w:rFonts w:eastAsiaTheme="minorEastAsia"/>
+        </w:rPr>
+        <w:t>23/09/2026</w:t>
+      </w:r>
+    </w:p>
+    <w:p>
+      <w:pPr>
+        <w:rPr>
+          <w:rFonts w:eastAsiaTheme="minorEastAsia"/>
+        </w:rPr>
+      </w:pPr>
+    </w:p>
+    <w:p>
+      <w:pPr>
+        <w:rPr>
+          <w:rFonts w:eastAsiaTheme="minorEastAsia"/>
+        </w:rPr>
+      </w:pPr>
+      <w:r>
+        <w:rPr>
+          <w:rFonts w:eastAsiaTheme="minorEastAsia"/>
+        </w:rPr>
+        <w:t xml:space="preserve">Loan amortization </w:t>
+      </w:r>
+    </w:p>
+    <w:p>
+      <w:pPr>
+        <w:rPr>
+          <w:rFonts w:eastAsiaTheme="minorEastAsia"/>
+        </w:rPr>
+      </w:pPr>
+    </w:p>
+    <w:p>
+      <w:pPr>
+        <w:rPr>
+          <w:rFonts w:eastAsiaTheme="minorEastAsia"/>
+        </w:rPr>
+      </w:pPr>
+      <w:r>
+        <w:rPr>
+          <w:rFonts w:eastAsiaTheme="minorEastAsia"/>
+        </w:rPr>
+        <w:t xml:space="preserve">Amortization is the process of repaying  a loan over a time through equal instalments, each payment covers interest and </w:t>
+      </w:r>
+      <w:proofErr w:type="gramStart"/>
+      <w:r>
+        <w:rPr>
+          <w:rFonts w:eastAsiaTheme="minorEastAsia"/>
+        </w:rPr>
+        <w:t>principle</w:t>
+      </w:r>
+      <w:proofErr w:type="gramEnd"/>
+      <w:r>
+        <w:rPr>
+          <w:rFonts w:eastAsiaTheme="minorEastAsia"/>
+        </w:rPr>
+        <w:t>.</w:t>
+      </w:r>
+    </w:p>
+    <w:p>
+      <w:pPr>
+        <w:rPr>
+          <w:rFonts w:eastAsiaTheme="minorEastAsia"/>
+        </w:rPr>
+      </w:pPr>
+    </w:p>
+    <w:p>
+      <w:pPr>
+        <w:rPr>
+          <w:rFonts w:eastAsiaTheme="minorEastAsia"/>
+        </w:rPr>
+      </w:pPr>
+      <w:r>
+        <w:rPr>
+          <w:rFonts w:eastAsiaTheme="minorEastAsia"/>
+        </w:rPr>
+        <w:t xml:space="preserve">How amortisation works: </w:t>
+      </w:r>
+    </w:p>
+    <w:p>
+      <w:pPr>
+        <w:pStyle w:val="ListParagraph"/>
+        <w:numPr>
+          <w:ilvl w:val="0"/>
+          <w:numId w:val="49"/>
+        </w:numPr>
+        <w:rPr>
+          <w:rFonts w:eastAsiaTheme="minorEastAsia"/>
+        </w:rPr>
+      </w:pPr>
+      <w:r>
+        <w:rPr>
+          <w:rFonts w:eastAsiaTheme="minorEastAsia"/>
+        </w:rPr>
+        <w:t>Monthly payment is fixed</w:t>
+      </w:r>
+    </w:p>
+    <w:p>
+      <w:pPr>
+        <w:pStyle w:val="ListParagraph"/>
+        <w:numPr>
+          <w:ilvl w:val="0"/>
+          <w:numId w:val="49"/>
+        </w:numPr>
+        <w:rPr>
+          <w:rFonts w:eastAsiaTheme="minorEastAsia"/>
+        </w:rPr>
+      </w:pPr>
+      <w:r>
+        <w:rPr>
+          <w:rFonts w:eastAsiaTheme="minorEastAsia"/>
+        </w:rPr>
+        <w:t xml:space="preserve">Interest decreases over a period of time </w:t>
+      </w:r>
+    </w:p>
+    <w:p>
+      <w:pPr>
+        <w:pStyle w:val="ListParagraph"/>
+        <w:numPr>
+          <w:ilvl w:val="0"/>
+          <w:numId w:val="49"/>
+        </w:numPr>
+        <w:rPr>
+          <w:rFonts w:eastAsiaTheme="minorEastAsia"/>
+        </w:rPr>
+      </w:pPr>
+      <w:r>
+        <w:rPr>
+          <w:rFonts w:eastAsiaTheme="minorEastAsia"/>
+        </w:rPr>
+        <w:t xml:space="preserve">Principle payment increases </w:t>
+      </w:r>
+    </w:p>
+    <w:p>
+      <w:pPr>
+        <w:pStyle w:val="ListParagraph"/>
+        <w:numPr>
+          <w:ilvl w:val="0"/>
+          <w:numId w:val="49"/>
+        </w:numPr>
+        <w:rPr>
+          <w:rFonts w:eastAsiaTheme="minorEastAsia"/>
+        </w:rPr>
+      </w:pPr>
+      <w:r>
+        <w:rPr>
+          <w:rFonts w:eastAsiaTheme="minorEastAsia"/>
+        </w:rPr>
+        <w:t>Total debt decreases</w:t>
+      </w:r>
+    </w:p>
+    <w:p>
+      <w:pPr>
+        <w:pStyle w:val="ListParagraph"/>
+        <w:numPr>
+          <w:ilvl w:val="0"/>
+          <w:numId w:val="49"/>
+        </w:numPr>
+        <w:rPr>
+          <w:rFonts w:eastAsiaTheme="minorEastAsia"/>
+        </w:rPr>
+      </w:pPr>
+      <w:r>
+        <w:rPr>
+          <w:rFonts w:eastAsiaTheme="minorEastAsia"/>
+        </w:rPr>
+        <w:t>Fully paid (at the end term)</w:t>
+      </w:r>
+    </w:p>
+    <w:p>
+      <w:pPr>
+        <w:rPr>
+          <w:rFonts w:eastAsiaTheme="minorEastAsia"/>
+        </w:rPr>
+      </w:pPr>
+    </w:p>
+    <w:p>
+      <w:pPr>
+        <w:rPr>
+          <w:rFonts w:eastAsiaTheme="minorEastAsia"/>
+        </w:rPr>
+      </w:pPr>
+      <w:r>
+        <w:rPr>
+          <w:rFonts w:eastAsiaTheme="minorEastAsia"/>
+        </w:rPr>
+        <w:t>Types of amortisation loan:</w:t>
+      </w:r>
+    </w:p>
+    <w:p>
+      <w:pPr>
+        <w:pStyle w:val="ListParagraph"/>
+        <w:numPr>
+          <w:ilvl w:val="0"/>
+          <w:numId w:val="50"/>
+        </w:numPr>
+        <w:rPr>
+          <w:rFonts w:eastAsiaTheme="minorEastAsia"/>
+        </w:rPr>
+      </w:pPr>
+      <w:r>
+        <w:rPr>
+          <w:rFonts w:eastAsiaTheme="minorEastAsia"/>
+        </w:rPr>
+        <w:t>Fixed rate loans (constant rate)</w:t>
+      </w:r>
+    </w:p>
+    <w:p>
+      <w:pPr>
+        <w:pStyle w:val="ListParagraph"/>
+        <w:numPr>
+          <w:ilvl w:val="0"/>
+          <w:numId w:val="50"/>
+        </w:numPr>
+        <w:rPr>
+          <w:rFonts w:eastAsiaTheme="minorEastAsia"/>
+        </w:rPr>
+      </w:pPr>
+      <w:r>
+        <w:rPr>
+          <w:rFonts w:eastAsiaTheme="minorEastAsia"/>
+        </w:rPr>
+        <w:t xml:space="preserve">Variable rate loans (rate changes) </w:t>
+      </w:r>
+    </w:p>
+    <w:p>
+      <w:pPr>
+        <w:pStyle w:val="ListParagraph"/>
+        <w:numPr>
+          <w:ilvl w:val="0"/>
+          <w:numId w:val="50"/>
+        </w:numPr>
+        <w:rPr>
+          <w:rFonts w:eastAsiaTheme="minorEastAsia"/>
+        </w:rPr>
+      </w:pPr>
+      <w:r>
+        <w:rPr>
+          <w:rFonts w:eastAsiaTheme="minorEastAsia"/>
+        </w:rPr>
+        <w:t xml:space="preserve">Bullet loans (principle due at end) </w:t>
+      </w:r>
+    </w:p>
+    <w:p>
+      <w:pPr>
+        <w:pStyle w:val="ListParagraph"/>
+        <w:numPr>
+          <w:ilvl w:val="0"/>
+          <w:numId w:val="50"/>
+        </w:numPr>
+        <w:rPr>
+          <w:rFonts w:eastAsiaTheme="minorEastAsia"/>
+        </w:rPr>
+      </w:pPr>
+      <w:r>
+        <w:rPr>
+          <w:rFonts w:eastAsiaTheme="minorEastAsia"/>
+        </w:rPr>
+        <w:t xml:space="preserve">Negative amortisation (interest grows) </w:t>
+      </w:r>
+    </w:p>
+    <w:p>
+      <w:pPr>
+        <w:rPr>
+          <w:rFonts w:eastAsiaTheme="minorEastAsia"/>
+        </w:rPr>
+      </w:pPr>
+    </w:p>
+    <w:p>
+      <w:pPr>
+        <w:rPr>
+          <w:rFonts w:eastAsiaTheme="minorEastAsia"/>
+        </w:rPr>
+      </w:pPr>
+      <w:r>
+        <w:rPr>
+          <w:rFonts w:eastAsiaTheme="minorEastAsia"/>
+        </w:rPr>
+        <w:t>Importance of amortisation:</w:t>
+      </w:r>
+    </w:p>
+    <w:p>
+      <w:pPr>
+        <w:pStyle w:val="ListParagraph"/>
+        <w:numPr>
+          <w:ilvl w:val="0"/>
+          <w:numId w:val="51"/>
+        </w:numPr>
+        <w:rPr>
+          <w:rFonts w:eastAsiaTheme="minorEastAsia"/>
+        </w:rPr>
+      </w:pPr>
+      <w:r>
+        <w:rPr>
+          <w:rFonts w:eastAsiaTheme="minorEastAsia"/>
+        </w:rPr>
+        <w:t xml:space="preserve">Predictable payments </w:t>
+      </w:r>
+      <w:r>
+        <w:rPr>
+          <w:rFonts w:eastAsiaTheme="minorEastAsia"/>
+        </w:rPr>
+        <w:t xml:space="preserve">  </w:t>
+      </w:r>
+    </w:p>
+    <w:p>
+      <w:pPr>
+        <w:pStyle w:val="ListParagraph"/>
+        <w:numPr>
+          <w:ilvl w:val="0"/>
+          <w:numId w:val="51"/>
+        </w:numPr>
+        <w:rPr>
+          <w:rFonts w:eastAsiaTheme="minorEastAsia"/>
+        </w:rPr>
+      </w:pPr>
+      <w:r>
+        <w:rPr>
+          <w:rFonts w:eastAsiaTheme="minorEastAsia"/>
+        </w:rPr>
+        <w:t>Reduces financial burden</w:t>
+      </w:r>
+    </w:p>
+    <w:p>
+      <w:pPr>
+        <w:pStyle w:val="ListParagraph"/>
+        <w:numPr>
+          <w:ilvl w:val="0"/>
+          <w:numId w:val="51"/>
+        </w:numPr>
+        <w:rPr>
+          <w:rFonts w:eastAsiaTheme="minorEastAsia"/>
+        </w:rPr>
+      </w:pPr>
+      <w:r>
+        <w:rPr>
+          <w:rFonts w:eastAsiaTheme="minorEastAsia"/>
+        </w:rPr>
+        <w:t>Build credit score</w:t>
+      </w:r>
+    </w:p>
+    <w:p>
+      <w:pPr>
+        <w:pStyle w:val="ListParagraph"/>
+        <w:numPr>
+          <w:ilvl w:val="0"/>
+          <w:numId w:val="51"/>
+        </w:numPr>
+        <w:rPr>
+          <w:rFonts w:eastAsiaTheme="minorEastAsia"/>
+        </w:rPr>
+      </w:pPr>
+      <w:r>
+        <w:rPr>
+          <w:rFonts w:eastAsiaTheme="minorEastAsia"/>
+        </w:rPr>
+        <w:lastRenderedPageBreak/>
+        <w:t>Avoid debt accumulation</w:t>
+      </w:r>
+    </w:p>
+    <w:p>
+      <w:pPr>
+        <w:ind w:left="360"/>
+        <w:rPr>
+          <w:rFonts w:eastAsiaTheme="minorEastAsia"/>
+        </w:rPr>
+      </w:pPr>
+    </w:p>
     <w:sectPr>
       <w:pgSz w:w="11906" w:h="16838"/>
       <w:pgMar w:top="1440" w:right="1440" w:bottom="1440" w:left="1440" w:header="708" w:footer="708" w:gutter="0"/>
@@ -28201,6 +29184,92 @@
     </w:lvl>
   </w:abstractNum>
   <w:abstractNum w:abstractNumId="11" w15:restartNumberingAfterBreak="0">
+    <w:nsid w:val="21684AE6"/>
+    <w:multiLevelType w:val="hybridMultilevel"/>
+    <w:tmpl w:val="194CE090"/>
+    <w:lvl w:ilvl="0" w:tplc="4009001B">
+      <w:start w:val="1"/>
+      <w:numFmt w:val="lowerRoman"/>
+      <w:lvlText w:val="%1."/>
+      <w:lvlJc w:val="right"/>
+      <w:pPr>
+        <w:ind w:left="720" w:hanging="360"/>
+      </w:pPr>
+    </w:lvl>
+    <w:lvl w:ilvl="1" w:tplc="40090019" w:tentative="1">
+      <w:start w:val="1"/>
+      <w:numFmt w:val="lowerLetter"/>
+      <w:lvlText w:val="%2."/>
+      <w:lvlJc w:val="left"/>
+      <w:pPr>
+        <w:ind w:left="1440" w:hanging="360"/>
+      </w:pPr>
+    </w:lvl>
+    <w:lvl w:ilvl="2" w:tplc="4009001B" w:tentative="1">
+      <w:start w:val="1"/>
+      <w:numFmt w:val="lowerRoman"/>
+      <w:lvlText w:val="%3."/>
+      <w:lvlJc w:val="right"/>
+      <w:pPr>
+        <w:ind w:left="2160" w:hanging="180"/>
+      </w:pPr>
+    </w:lvl>
+    <w:lvl w:ilvl="3" w:tplc="4009000F" w:tentative="1">
+      <w:start w:val="1"/>
+      <w:numFmt w:val="decimal"/>
+      <w:lvlText w:val="%4."/>
+      <w:lvlJc w:val="left"/>
+      <w:pPr>
+        <w:ind w:left="2880" w:hanging="360"/>
+      </w:pPr>
+    </w:lvl>
+    <w:lvl w:ilvl="4" w:tplc="40090019" w:tentative="1">
+      <w:start w:val="1"/>
+      <w:numFmt w:val="lowerLetter"/>
+      <w:lvlText w:val="%5."/>
+      <w:lvlJc w:val="left"/>
+      <w:pPr>
+        <w:ind w:left="3600" w:hanging="360"/>
+      </w:pPr>
+    </w:lvl>
+    <w:lvl w:ilvl="5" w:tplc="4009001B" w:tentative="1">
+      <w:start w:val="1"/>
+      <w:numFmt w:val="lowerRoman"/>
+      <w:lvlText w:val="%6."/>
+      <w:lvlJc w:val="right"/>
+      <w:pPr>
+        <w:ind w:left="4320" w:hanging="180"/>
+      </w:pPr>
+    </w:lvl>
+    <w:lvl w:ilvl="6" w:tplc="4009000F" w:tentative="1">
+      <w:start w:val="1"/>
+      <w:numFmt w:val="decimal"/>
+      <w:lvlText w:val="%7."/>
+      <w:lvlJc w:val="left"/>
+      <w:pPr>
+        <w:ind w:left="5040" w:hanging="360"/>
+      </w:pPr>
+    </w:lvl>
+    <w:lvl w:ilvl="7" w:tplc="40090019" w:tentative="1">
+      <w:start w:val="1"/>
+      <w:numFmt w:val="lowerLetter"/>
+      <w:lvlText w:val="%8."/>
+      <w:lvlJc w:val="left"/>
+      <w:pPr>
+        <w:ind w:left="5760" w:hanging="360"/>
+      </w:pPr>
+    </w:lvl>
+    <w:lvl w:ilvl="8" w:tplc="4009001B" w:tentative="1">
+      <w:start w:val="1"/>
+      <w:numFmt w:val="lowerRoman"/>
+      <w:lvlText w:val="%9."/>
+      <w:lvlJc w:val="right"/>
+      <w:pPr>
+        <w:ind w:left="6480" w:hanging="180"/>
+      </w:pPr>
+    </w:lvl>
+  </w:abstractNum>
+  <w:abstractNum w:abstractNumId="12" w15:restartNumberingAfterBreak="0">
     <w:nsid w:val="25FE49C2"/>
     <w:multiLevelType w:val="multilevel"/>
     <w:tmpl w:val="B0183B58"/>
@@ -28349,7 +29418,7 @@
       </w:rPr>
     </w:lvl>
   </w:abstractNum>
-  <w:abstractNum w:abstractNumId="12" w15:restartNumberingAfterBreak="0">
+  <w:abstractNum w:abstractNumId="13" w15:restartNumberingAfterBreak="0">
     <w:nsid w:val="26F55085"/>
     <w:multiLevelType w:val="hybridMultilevel"/>
     <w:tmpl w:val="A37C6428"/>
@@ -28462,7 +29531,7 @@
       </w:rPr>
     </w:lvl>
   </w:abstractNum>
-  <w:abstractNum w:abstractNumId="13" w15:restartNumberingAfterBreak="0">
+  <w:abstractNum w:abstractNumId="14" w15:restartNumberingAfterBreak="0">
     <w:nsid w:val="270E03D6"/>
     <w:multiLevelType w:val="hybridMultilevel"/>
     <w:tmpl w:val="21482B92"/>
@@ -28548,7 +29617,7 @@
       </w:pPr>
     </w:lvl>
   </w:abstractNum>
-  <w:abstractNum w:abstractNumId="14" w15:restartNumberingAfterBreak="0">
+  <w:abstractNum w:abstractNumId="15" w15:restartNumberingAfterBreak="0">
     <w:nsid w:val="2B866818"/>
     <w:multiLevelType w:val="hybridMultilevel"/>
     <w:tmpl w:val="21482B92"/>
@@ -28634,7 +29703,7 @@
       </w:pPr>
     </w:lvl>
   </w:abstractNum>
-  <w:abstractNum w:abstractNumId="15" w15:restartNumberingAfterBreak="0">
+  <w:abstractNum w:abstractNumId="16" w15:restartNumberingAfterBreak="0">
     <w:nsid w:val="2E69236A"/>
     <w:multiLevelType w:val="hybridMultilevel"/>
     <w:tmpl w:val="5B2E57F4"/>
@@ -28720,7 +29789,7 @@
       </w:pPr>
     </w:lvl>
   </w:abstractNum>
-  <w:abstractNum w:abstractNumId="16" w15:restartNumberingAfterBreak="0">
+  <w:abstractNum w:abstractNumId="17" w15:restartNumberingAfterBreak="0">
     <w:nsid w:val="342643EF"/>
     <w:multiLevelType w:val="hybridMultilevel"/>
     <w:tmpl w:val="BFEAEC32"/>
@@ -28833,10 +29902,10 @@
       </w:rPr>
     </w:lvl>
   </w:abstractNum>
-  <w:abstractNum w:abstractNumId="17" w15:restartNumberingAfterBreak="0">
+  <w:abstractNum w:abstractNumId="18" w15:restartNumberingAfterBreak="0">
     <w:nsid w:val="347B20E2"/>
     <w:multiLevelType w:val="hybridMultilevel"/>
-    <w:tmpl w:val="561CF2F6"/>
+    <w:tmpl w:val="03C01A0E"/>
     <w:lvl w:ilvl="0" w:tplc="40090001">
       <w:start w:val="1"/>
       <w:numFmt w:val="bullet"/>
@@ -28946,7 +30015,7 @@
       </w:rPr>
     </w:lvl>
   </w:abstractNum>
-  <w:abstractNum w:abstractNumId="18" w15:restartNumberingAfterBreak="0">
+  <w:abstractNum w:abstractNumId="19" w15:restartNumberingAfterBreak="0">
     <w:nsid w:val="35D57A2E"/>
     <w:multiLevelType w:val="hybridMultilevel"/>
     <w:tmpl w:val="0FF6CBF2"/>
@@ -29035,7 +30104,7 @@
       </w:pPr>
     </w:lvl>
   </w:abstractNum>
-  <w:abstractNum w:abstractNumId="19" w15:restartNumberingAfterBreak="0">
+  <w:abstractNum w:abstractNumId="20" w15:restartNumberingAfterBreak="0">
     <w:nsid w:val="3FA677EF"/>
     <w:multiLevelType w:val="hybridMultilevel"/>
     <w:tmpl w:val="F144535C"/>
@@ -29121,7 +30190,7 @@
       </w:pPr>
     </w:lvl>
   </w:abstractNum>
-  <w:abstractNum w:abstractNumId="20" w15:restartNumberingAfterBreak="0">
+  <w:abstractNum w:abstractNumId="21" w15:restartNumberingAfterBreak="0">
     <w:nsid w:val="405244CD"/>
     <w:multiLevelType w:val="hybridMultilevel"/>
     <w:tmpl w:val="4F8E4916"/>
@@ -29207,7 +30276,7 @@
       </w:pPr>
     </w:lvl>
   </w:abstractNum>
-  <w:abstractNum w:abstractNumId="21" w15:restartNumberingAfterBreak="0">
+  <w:abstractNum w:abstractNumId="22" w15:restartNumberingAfterBreak="0">
     <w:nsid w:val="421F5061"/>
     <w:multiLevelType w:val="hybridMultilevel"/>
     <w:tmpl w:val="C55E3D5E"/>
@@ -29320,7 +30389,7 @@
       </w:rPr>
     </w:lvl>
   </w:abstractNum>
-  <w:abstractNum w:abstractNumId="22" w15:restartNumberingAfterBreak="0">
+  <w:abstractNum w:abstractNumId="23" w15:restartNumberingAfterBreak="0">
     <w:nsid w:val="470A7CAC"/>
     <w:multiLevelType w:val="hybridMultilevel"/>
     <w:tmpl w:val="41B04BBC"/>
@@ -29406,7 +30475,7 @@
       </w:pPr>
     </w:lvl>
   </w:abstractNum>
-  <w:abstractNum w:abstractNumId="23" w15:restartNumberingAfterBreak="0">
+  <w:abstractNum w:abstractNumId="24" w15:restartNumberingAfterBreak="0">
     <w:nsid w:val="471E0E82"/>
     <w:multiLevelType w:val="hybridMultilevel"/>
     <w:tmpl w:val="A0C2BED4"/>
@@ -29519,7 +30588,7 @@
       </w:rPr>
     </w:lvl>
   </w:abstractNum>
-  <w:abstractNum w:abstractNumId="24" w15:restartNumberingAfterBreak="0">
+  <w:abstractNum w:abstractNumId="25" w15:restartNumberingAfterBreak="0">
     <w:nsid w:val="4ACF29D6"/>
     <w:multiLevelType w:val="hybridMultilevel"/>
     <w:tmpl w:val="15BACEE8"/>
@@ -29605,7 +30674,7 @@
       </w:pPr>
     </w:lvl>
   </w:abstractNum>
-  <w:abstractNum w:abstractNumId="25" w15:restartNumberingAfterBreak="0">
+  <w:abstractNum w:abstractNumId="26" w15:restartNumberingAfterBreak="0">
     <w:nsid w:val="4C42378B"/>
     <w:multiLevelType w:val="multilevel"/>
     <w:tmpl w:val="158600B2"/>
@@ -29754,7 +30823,7 @@
       </w:rPr>
     </w:lvl>
   </w:abstractNum>
-  <w:abstractNum w:abstractNumId="26" w15:restartNumberingAfterBreak="0">
+  <w:abstractNum w:abstractNumId="27" w15:restartNumberingAfterBreak="0">
     <w:nsid w:val="4F286822"/>
     <w:multiLevelType w:val="hybridMultilevel"/>
     <w:tmpl w:val="5798F77C"/>
@@ -29840,7 +30909,7 @@
       </w:pPr>
     </w:lvl>
   </w:abstractNum>
-  <w:abstractNum w:abstractNumId="27" w15:restartNumberingAfterBreak="0">
+  <w:abstractNum w:abstractNumId="28" w15:restartNumberingAfterBreak="0">
     <w:nsid w:val="51600570"/>
     <w:multiLevelType w:val="hybridMultilevel"/>
     <w:tmpl w:val="7B98FFEE"/>
@@ -29926,7 +30995,7 @@
       </w:pPr>
     </w:lvl>
   </w:abstractNum>
-  <w:abstractNum w:abstractNumId="28" w15:restartNumberingAfterBreak="0">
+  <w:abstractNum w:abstractNumId="29" w15:restartNumberingAfterBreak="0">
     <w:nsid w:val="51EB6CAA"/>
     <w:multiLevelType w:val="hybridMultilevel"/>
     <w:tmpl w:val="AA3A1986"/>
@@ -30012,10 +31081,10 @@
       </w:pPr>
     </w:lvl>
   </w:abstractNum>
-  <w:abstractNum w:abstractNumId="29" w15:restartNumberingAfterBreak="0">
+  <w:abstractNum w:abstractNumId="30" w15:restartNumberingAfterBreak="0">
     <w:nsid w:val="54B02AAF"/>
     <w:multiLevelType w:val="hybridMultilevel"/>
-    <w:tmpl w:val="7C80B1EE"/>
+    <w:tmpl w:val="139A5414"/>
     <w:lvl w:ilvl="0" w:tplc="4009000F">
       <w:start w:val="1"/>
       <w:numFmt w:val="decimal"/>
@@ -30098,7 +31167,7 @@
       </w:pPr>
     </w:lvl>
   </w:abstractNum>
-  <w:abstractNum w:abstractNumId="30" w15:restartNumberingAfterBreak="0">
+  <w:abstractNum w:abstractNumId="31" w15:restartNumberingAfterBreak="0">
     <w:nsid w:val="579956AE"/>
     <w:multiLevelType w:val="hybridMultilevel"/>
     <w:tmpl w:val="152C998C"/>
@@ -30187,7 +31256,7 @@
       </w:pPr>
     </w:lvl>
   </w:abstractNum>
-  <w:abstractNum w:abstractNumId="31" w15:restartNumberingAfterBreak="0">
+  <w:abstractNum w:abstractNumId="32" w15:restartNumberingAfterBreak="0">
     <w:nsid w:val="57AA63E2"/>
     <w:multiLevelType w:val="hybridMultilevel"/>
     <w:tmpl w:val="4CD8648E"/>
@@ -30273,7 +31342,7 @@
       </w:pPr>
     </w:lvl>
   </w:abstractNum>
-  <w:abstractNum w:abstractNumId="32" w15:restartNumberingAfterBreak="0">
+  <w:abstractNum w:abstractNumId="33" w15:restartNumberingAfterBreak="0">
     <w:nsid w:val="5B0B6E70"/>
     <w:multiLevelType w:val="hybridMultilevel"/>
     <w:tmpl w:val="639E1D92"/>
@@ -30359,7 +31428,7 @@
       </w:pPr>
     </w:lvl>
   </w:abstractNum>
-  <w:abstractNum w:abstractNumId="33" w15:restartNumberingAfterBreak="0">
+  <w:abstractNum w:abstractNumId="34" w15:restartNumberingAfterBreak="0">
     <w:nsid w:val="5B5059D4"/>
     <w:multiLevelType w:val="hybridMultilevel"/>
     <w:tmpl w:val="4F5CD94C"/>
@@ -30445,7 +31514,93 @@
       </w:pPr>
     </w:lvl>
   </w:abstractNum>
-  <w:abstractNum w:abstractNumId="34" w15:restartNumberingAfterBreak="0">
+  <w:abstractNum w:abstractNumId="35" w15:restartNumberingAfterBreak="0">
+    <w:nsid w:val="5B801366"/>
+    <w:multiLevelType w:val="hybridMultilevel"/>
+    <w:tmpl w:val="E4343DA0"/>
+    <w:lvl w:ilvl="0" w:tplc="4009001B">
+      <w:start w:val="1"/>
+      <w:numFmt w:val="lowerRoman"/>
+      <w:lvlText w:val="%1."/>
+      <w:lvlJc w:val="right"/>
+      <w:pPr>
+        <w:ind w:left="720" w:hanging="360"/>
+      </w:pPr>
+    </w:lvl>
+    <w:lvl w:ilvl="1" w:tplc="40090019" w:tentative="1">
+      <w:start w:val="1"/>
+      <w:numFmt w:val="lowerLetter"/>
+      <w:lvlText w:val="%2."/>
+      <w:lvlJc w:val="left"/>
+      <w:pPr>
+        <w:ind w:left="1440" w:hanging="360"/>
+      </w:pPr>
+    </w:lvl>
+    <w:lvl w:ilvl="2" w:tplc="4009001B" w:tentative="1">
+      <w:start w:val="1"/>
+      <w:numFmt w:val="lowerRoman"/>
+      <w:lvlText w:val="%3."/>
+      <w:lvlJc w:val="right"/>
+      <w:pPr>
+        <w:ind w:left="2160" w:hanging="180"/>
+      </w:pPr>
+    </w:lvl>
+    <w:lvl w:ilvl="3" w:tplc="4009000F" w:tentative="1">
+      <w:start w:val="1"/>
+      <w:numFmt w:val="decimal"/>
+      <w:lvlText w:val="%4."/>
+      <w:lvlJc w:val="left"/>
+      <w:pPr>
+        <w:ind w:left="2880" w:hanging="360"/>
+      </w:pPr>
+    </w:lvl>
+    <w:lvl w:ilvl="4" w:tplc="40090019" w:tentative="1">
+      <w:start w:val="1"/>
+      <w:numFmt w:val="lowerLetter"/>
+      <w:lvlText w:val="%5."/>
+      <w:lvlJc w:val="left"/>
+      <w:pPr>
+        <w:ind w:left="3600" w:hanging="360"/>
+      </w:pPr>
+    </w:lvl>
+    <w:lvl w:ilvl="5" w:tplc="4009001B" w:tentative="1">
+      <w:start w:val="1"/>
+      <w:numFmt w:val="lowerRoman"/>
+      <w:lvlText w:val="%6."/>
+      <w:lvlJc w:val="right"/>
+      <w:pPr>
+        <w:ind w:left="4320" w:hanging="180"/>
+      </w:pPr>
+    </w:lvl>
+    <w:lvl w:ilvl="6" w:tplc="4009000F" w:tentative="1">
+      <w:start w:val="1"/>
+      <w:numFmt w:val="decimal"/>
+      <w:lvlText w:val="%7."/>
+      <w:lvlJc w:val="left"/>
+      <w:pPr>
+        <w:ind w:left="5040" w:hanging="360"/>
+      </w:pPr>
+    </w:lvl>
+    <w:lvl w:ilvl="7" w:tplc="40090019" w:tentative="1">
+      <w:start w:val="1"/>
+      <w:numFmt w:val="lowerLetter"/>
+      <w:lvlText w:val="%8."/>
+      <w:lvlJc w:val="left"/>
+      <w:pPr>
+        <w:ind w:left="5760" w:hanging="360"/>
+      </w:pPr>
+    </w:lvl>
+    <w:lvl w:ilvl="8" w:tplc="4009001B" w:tentative="1">
+      <w:start w:val="1"/>
+      <w:numFmt w:val="lowerRoman"/>
+      <w:lvlText w:val="%9."/>
+      <w:lvlJc w:val="right"/>
+      <w:pPr>
+        <w:ind w:left="6480" w:hanging="180"/>
+      </w:pPr>
+    </w:lvl>
+  </w:abstractNum>
+  <w:abstractNum w:abstractNumId="36" w15:restartNumberingAfterBreak="0">
     <w:nsid w:val="5CF97DC3"/>
     <w:multiLevelType w:val="hybridMultilevel"/>
     <w:tmpl w:val="5B2C3BD8"/>
@@ -30531,7 +31686,7 @@
       </w:pPr>
     </w:lvl>
   </w:abstractNum>
-  <w:abstractNum w:abstractNumId="35" w15:restartNumberingAfterBreak="0">
+  <w:abstractNum w:abstractNumId="37" w15:restartNumberingAfterBreak="0">
     <w:nsid w:val="5ECF72A1"/>
     <w:multiLevelType w:val="hybridMultilevel"/>
     <w:tmpl w:val="1CF4107C"/>
@@ -30617,7 +31772,7 @@
       </w:pPr>
     </w:lvl>
   </w:abstractNum>
-  <w:abstractNum w:abstractNumId="36" w15:restartNumberingAfterBreak="0">
+  <w:abstractNum w:abstractNumId="38" w15:restartNumberingAfterBreak="0">
     <w:nsid w:val="5FAD400A"/>
     <w:multiLevelType w:val="hybridMultilevel"/>
     <w:tmpl w:val="59F4717E"/>
@@ -30703,7 +31858,93 @@
       </w:pPr>
     </w:lvl>
   </w:abstractNum>
-  <w:abstractNum w:abstractNumId="37" w15:restartNumberingAfterBreak="0">
+  <w:abstractNum w:abstractNumId="39" w15:restartNumberingAfterBreak="0">
+    <w:nsid w:val="609F0227"/>
+    <w:multiLevelType w:val="hybridMultilevel"/>
+    <w:tmpl w:val="6E285D7A"/>
+    <w:lvl w:ilvl="0" w:tplc="4009001B">
+      <w:start w:val="1"/>
+      <w:numFmt w:val="lowerRoman"/>
+      <w:lvlText w:val="%1."/>
+      <w:lvlJc w:val="right"/>
+      <w:pPr>
+        <w:ind w:left="720" w:hanging="360"/>
+      </w:pPr>
+    </w:lvl>
+    <w:lvl w:ilvl="1" w:tplc="40090019" w:tentative="1">
+      <w:start w:val="1"/>
+      <w:numFmt w:val="lowerLetter"/>
+      <w:lvlText w:val="%2."/>
+      <w:lvlJc w:val="left"/>
+      <w:pPr>
+        <w:ind w:left="1440" w:hanging="360"/>
+      </w:pPr>
+    </w:lvl>
+    <w:lvl w:ilvl="2" w:tplc="4009001B" w:tentative="1">
+      <w:start w:val="1"/>
+      <w:numFmt w:val="lowerRoman"/>
+      <w:lvlText w:val="%3."/>
+      <w:lvlJc w:val="right"/>
+      <w:pPr>
+        <w:ind w:left="2160" w:hanging="180"/>
+      </w:pPr>
+    </w:lvl>
+    <w:lvl w:ilvl="3" w:tplc="4009000F" w:tentative="1">
+      <w:start w:val="1"/>
+      <w:numFmt w:val="decimal"/>
+      <w:lvlText w:val="%4."/>
+      <w:lvlJc w:val="left"/>
+      <w:pPr>
+        <w:ind w:left="2880" w:hanging="360"/>
+      </w:pPr>
+    </w:lvl>
+    <w:lvl w:ilvl="4" w:tplc="40090019" w:tentative="1">
+      <w:start w:val="1"/>
+      <w:numFmt w:val="lowerLetter"/>
+      <w:lvlText w:val="%5."/>
+      <w:lvlJc w:val="left"/>
+      <w:pPr>
+        <w:ind w:left="3600" w:hanging="360"/>
+      </w:pPr>
+    </w:lvl>
+    <w:lvl w:ilvl="5" w:tplc="4009001B" w:tentative="1">
+      <w:start w:val="1"/>
+      <w:numFmt w:val="lowerRoman"/>
+      <w:lvlText w:val="%6."/>
+      <w:lvlJc w:val="right"/>
+      <w:pPr>
+        <w:ind w:left="4320" w:hanging="180"/>
+      </w:pPr>
+    </w:lvl>
+    <w:lvl w:ilvl="6" w:tplc="4009000F" w:tentative="1">
+      <w:start w:val="1"/>
+      <w:numFmt w:val="decimal"/>
+      <w:lvlText w:val="%7."/>
+      <w:lvlJc w:val="left"/>
+      <w:pPr>
+        <w:ind w:left="5040" w:hanging="360"/>
+      </w:pPr>
+    </w:lvl>
+    <w:lvl w:ilvl="7" w:tplc="40090019" w:tentative="1">
+      <w:start w:val="1"/>
+      <w:numFmt w:val="lowerLetter"/>
+      <w:lvlText w:val="%8."/>
+      <w:lvlJc w:val="left"/>
+      <w:pPr>
+        <w:ind w:left="5760" w:hanging="360"/>
+      </w:pPr>
+    </w:lvl>
+    <w:lvl w:ilvl="8" w:tplc="4009001B" w:tentative="1">
+      <w:start w:val="1"/>
+      <w:numFmt w:val="lowerRoman"/>
+      <w:lvlText w:val="%9."/>
+      <w:lvlJc w:val="right"/>
+      <w:pPr>
+        <w:ind w:left="6480" w:hanging="180"/>
+      </w:pPr>
+    </w:lvl>
+  </w:abstractNum>
+  <w:abstractNum w:abstractNumId="40" w15:restartNumberingAfterBreak="0">
     <w:nsid w:val="630F0C4E"/>
     <w:multiLevelType w:val="hybridMultilevel"/>
     <w:tmpl w:val="5802DB30"/>
@@ -30795,7 +32036,7 @@
       </w:pPr>
     </w:lvl>
   </w:abstractNum>
-  <w:abstractNum w:abstractNumId="38" w15:restartNumberingAfterBreak="0">
+  <w:abstractNum w:abstractNumId="41" w15:restartNumberingAfterBreak="0">
     <w:nsid w:val="6A825466"/>
     <w:multiLevelType w:val="hybridMultilevel"/>
     <w:tmpl w:val="D4123C9C"/>
@@ -30881,7 +32122,7 @@
       </w:pPr>
     </w:lvl>
   </w:abstractNum>
-  <w:abstractNum w:abstractNumId="39" w15:restartNumberingAfterBreak="0">
+  <w:abstractNum w:abstractNumId="42" w15:restartNumberingAfterBreak="0">
     <w:nsid w:val="6D052436"/>
     <w:multiLevelType w:val="hybridMultilevel"/>
     <w:tmpl w:val="E2EE4616"/>
@@ -30994,7 +32235,7 @@
       </w:rPr>
     </w:lvl>
   </w:abstractNum>
-  <w:abstractNum w:abstractNumId="40" w15:restartNumberingAfterBreak="0">
+  <w:abstractNum w:abstractNumId="43" w15:restartNumberingAfterBreak="0">
     <w:nsid w:val="72C825B8"/>
     <w:multiLevelType w:val="multilevel"/>
     <w:tmpl w:val="8D6CDDBA"/>
@@ -31143,7 +32384,7 @@
       </w:rPr>
     </w:lvl>
   </w:abstractNum>
-  <w:abstractNum w:abstractNumId="41" w15:restartNumberingAfterBreak="0">
+  <w:abstractNum w:abstractNumId="44" w15:restartNumberingAfterBreak="0">
     <w:nsid w:val="72EA5DBF"/>
     <w:multiLevelType w:val="hybridMultilevel"/>
     <w:tmpl w:val="671AAB8E"/>
@@ -31229,7 +32470,7 @@
       </w:pPr>
     </w:lvl>
   </w:abstractNum>
-  <w:abstractNum w:abstractNumId="42" w15:restartNumberingAfterBreak="0">
+  <w:abstractNum w:abstractNumId="45" w15:restartNumberingAfterBreak="0">
     <w:nsid w:val="72F854A2"/>
     <w:multiLevelType w:val="hybridMultilevel"/>
     <w:tmpl w:val="349CAAFA"/>
@@ -31342,7 +32583,7 @@
       </w:rPr>
     </w:lvl>
   </w:abstractNum>
-  <w:abstractNum w:abstractNumId="43" w15:restartNumberingAfterBreak="0">
+  <w:abstractNum w:abstractNumId="46" w15:restartNumberingAfterBreak="0">
     <w:nsid w:val="768D4843"/>
     <w:multiLevelType w:val="hybridMultilevel"/>
     <w:tmpl w:val="F39A25A6"/>
@@ -31428,7 +32669,7 @@
       </w:pPr>
     </w:lvl>
   </w:abstractNum>
-  <w:abstractNum w:abstractNumId="44" w15:restartNumberingAfterBreak="0">
+  <w:abstractNum w:abstractNumId="47" w15:restartNumberingAfterBreak="0">
     <w:nsid w:val="787D215D"/>
     <w:multiLevelType w:val="hybridMultilevel"/>
     <w:tmpl w:val="6E66E1B4"/>
@@ -31517,7 +32758,7 @@
       </w:pPr>
     </w:lvl>
   </w:abstractNum>
-  <w:abstractNum w:abstractNumId="45" w15:restartNumberingAfterBreak="0">
+  <w:abstractNum w:abstractNumId="48" w15:restartNumberingAfterBreak="0">
     <w:nsid w:val="7AB25B5B"/>
     <w:multiLevelType w:val="hybridMultilevel"/>
     <w:tmpl w:val="E5A0EAA8"/>
@@ -31630,7 +32871,7 @@
       </w:rPr>
     </w:lvl>
   </w:abstractNum>
-  <w:abstractNum w:abstractNumId="46" w15:restartNumberingAfterBreak="0">
+  <w:abstractNum w:abstractNumId="49" w15:restartNumberingAfterBreak="0">
     <w:nsid w:val="7B8D34CF"/>
     <w:multiLevelType w:val="multilevel"/>
     <w:tmpl w:val="702834C8"/>
@@ -31779,7 +33020,7 @@
       </w:rPr>
     </w:lvl>
   </w:abstractNum>
-  <w:abstractNum w:abstractNumId="47" w15:restartNumberingAfterBreak="0">
+  <w:abstractNum w:abstractNumId="50" w15:restartNumberingAfterBreak="0">
     <w:nsid w:val="7F62291B"/>
     <w:multiLevelType w:val="hybridMultilevel"/>
     <w:tmpl w:val="B71640A2"/>
@@ -31869,55 +33110,55 @@
     <w:abstractNumId w:val="2"/>
   </w:num>
   <w:num w:numId="2" w16cid:durableId="288970933">
-    <w:abstractNumId w:val="35"/>
+    <w:abstractNumId w:val="37"/>
   </w:num>
   <w:num w:numId="3" w16cid:durableId="1934975148">
     <w:abstractNumId w:val="0"/>
   </w:num>
   <w:num w:numId="4" w16cid:durableId="284432453">
-    <w:abstractNumId w:val="11"/>
+    <w:abstractNumId w:val="12"/>
   </w:num>
   <w:num w:numId="5" w16cid:durableId="1475290958">
     <w:abstractNumId w:val="3"/>
   </w:num>
   <w:num w:numId="6" w16cid:durableId="674764127">
-    <w:abstractNumId w:val="46"/>
+    <w:abstractNumId w:val="49"/>
   </w:num>
   <w:num w:numId="7" w16cid:durableId="1366904678">
-    <w:abstractNumId w:val="21"/>
+    <w:abstractNumId w:val="22"/>
   </w:num>
   <w:num w:numId="8" w16cid:durableId="67462260">
-    <w:abstractNumId w:val="36"/>
+    <w:abstractNumId w:val="38"/>
   </w:num>
   <w:num w:numId="9" w16cid:durableId="504519595">
-    <w:abstractNumId w:val="32"/>
+    <w:abstractNumId w:val="33"/>
   </w:num>
   <w:num w:numId="10" w16cid:durableId="1046217917">
     <w:abstractNumId w:val="10"/>
   </w:num>
   <w:num w:numId="11" w16cid:durableId="1482194571">
-    <w:abstractNumId w:val="34"/>
+    <w:abstractNumId w:val="36"/>
   </w:num>
   <w:num w:numId="12" w16cid:durableId="1378116358">
-    <w:abstractNumId w:val="18"/>
+    <w:abstractNumId w:val="19"/>
   </w:num>
   <w:num w:numId="13" w16cid:durableId="1622763665">
-    <w:abstractNumId w:val="30"/>
+    <w:abstractNumId w:val="31"/>
   </w:num>
   <w:num w:numId="14" w16cid:durableId="1303314634">
-    <w:abstractNumId w:val="37"/>
+    <w:abstractNumId w:val="40"/>
   </w:num>
   <w:num w:numId="15" w16cid:durableId="9142093">
-    <w:abstractNumId w:val="41"/>
+    <w:abstractNumId w:val="44"/>
   </w:num>
   <w:num w:numId="16" w16cid:durableId="1458911845">
-    <w:abstractNumId w:val="15"/>
+    <w:abstractNumId w:val="16"/>
   </w:num>
   <w:num w:numId="17" w16cid:durableId="2118016731">
     <w:abstractNumId w:val="6"/>
   </w:num>
   <w:num w:numId="18" w16cid:durableId="2101440695">
-    <w:abstractNumId w:val="44"/>
+    <w:abstractNumId w:val="47"/>
   </w:num>
   <w:num w:numId="19" w16cid:durableId="109252585">
     <w:abstractNumId w:val="9"/>
@@ -31926,90 +33167,99 @@
     <w:abstractNumId w:val="8"/>
   </w:num>
   <w:num w:numId="21" w16cid:durableId="1115103356">
-    <w:abstractNumId w:val="33"/>
+    <w:abstractNumId w:val="34"/>
   </w:num>
   <w:num w:numId="22" w16cid:durableId="220681117">
-    <w:abstractNumId w:val="38"/>
+    <w:abstractNumId w:val="41"/>
   </w:num>
   <w:num w:numId="23" w16cid:durableId="1049376175">
-    <w:abstractNumId w:val="16"/>
+    <w:abstractNumId w:val="17"/>
   </w:num>
   <w:num w:numId="24" w16cid:durableId="723523505">
-    <w:abstractNumId w:val="14"/>
+    <w:abstractNumId w:val="15"/>
   </w:num>
   <w:num w:numId="25" w16cid:durableId="1595165128">
-    <w:abstractNumId w:val="13"/>
+    <w:abstractNumId w:val="14"/>
   </w:num>
   <w:num w:numId="26" w16cid:durableId="1168903458">
     <w:abstractNumId w:val="4"/>
   </w:num>
   <w:num w:numId="27" w16cid:durableId="611862714">
-    <w:abstractNumId w:val="19"/>
+    <w:abstractNumId w:val="20"/>
   </w:num>
   <w:num w:numId="28" w16cid:durableId="340668397">
-    <w:abstractNumId w:val="28"/>
+    <w:abstractNumId w:val="29"/>
   </w:num>
   <w:num w:numId="29" w16cid:durableId="87584769">
     <w:abstractNumId w:val="5"/>
   </w:num>
   <w:num w:numId="30" w16cid:durableId="1409889759">
-    <w:abstractNumId w:val="31"/>
+    <w:abstractNumId w:val="32"/>
   </w:num>
   <w:num w:numId="31" w16cid:durableId="400836092">
     <w:abstractNumId w:val="7"/>
   </w:num>
   <w:num w:numId="32" w16cid:durableId="1819607792">
+    <w:abstractNumId w:val="28"/>
+  </w:num>
+  <w:num w:numId="33" w16cid:durableId="1637417472">
+    <w:abstractNumId w:val="46"/>
+  </w:num>
+  <w:num w:numId="34" w16cid:durableId="871116235">
+    <w:abstractNumId w:val="45"/>
+  </w:num>
+  <w:num w:numId="35" w16cid:durableId="2009362747">
+    <w:abstractNumId w:val="24"/>
+  </w:num>
+  <w:num w:numId="36" w16cid:durableId="1833788539">
+    <w:abstractNumId w:val="50"/>
+  </w:num>
+  <w:num w:numId="37" w16cid:durableId="846090408">
+    <w:abstractNumId w:val="25"/>
+  </w:num>
+  <w:num w:numId="38" w16cid:durableId="307588129">
+    <w:abstractNumId w:val="26"/>
+  </w:num>
+  <w:num w:numId="39" w16cid:durableId="1618440895">
+    <w:abstractNumId w:val="23"/>
+  </w:num>
+  <w:num w:numId="40" w16cid:durableId="1307668086">
+    <w:abstractNumId w:val="48"/>
+  </w:num>
+  <w:num w:numId="41" w16cid:durableId="69272560">
     <w:abstractNumId w:val="27"/>
   </w:num>
-  <w:num w:numId="33" w16cid:durableId="1637417472">
-    <w:abstractNumId w:val="43"/>
-  </w:num>
-  <w:num w:numId="34" w16cid:durableId="871116235">
-    <w:abstractNumId w:val="42"/>
-  </w:num>
-  <w:num w:numId="35" w16cid:durableId="2009362747">
-    <w:abstractNumId w:val="23"/>
-  </w:num>
-  <w:num w:numId="36" w16cid:durableId="1833788539">
-    <w:abstractNumId w:val="47"/>
-  </w:num>
-  <w:num w:numId="37" w16cid:durableId="846090408">
-    <w:abstractNumId w:val="24"/>
-  </w:num>
-  <w:num w:numId="38" w16cid:durableId="307588129">
-    <w:abstractNumId w:val="25"/>
-  </w:num>
-  <w:num w:numId="39" w16cid:durableId="1618440895">
-    <w:abstractNumId w:val="22"/>
-  </w:num>
-  <w:num w:numId="40" w16cid:durableId="1307668086">
-    <w:abstractNumId w:val="45"/>
-  </w:num>
-  <w:num w:numId="41" w16cid:durableId="69272560">
-    <w:abstractNumId w:val="26"/>
-  </w:num>
   <w:num w:numId="42" w16cid:durableId="2137329642">
-    <w:abstractNumId w:val="12"/>
+    <w:abstractNumId w:val="13"/>
   </w:num>
   <w:num w:numId="43" w16cid:durableId="2038189983">
-    <w:abstractNumId w:val="29"/>
+    <w:abstractNumId w:val="30"/>
   </w:num>
   <w:num w:numId="44" w16cid:durableId="9188195">
     <w:abstractNumId w:val="1"/>
   </w:num>
   <w:num w:numId="45" w16cid:durableId="1834445961">
-    <w:abstractNumId w:val="40"/>
+    <w:abstractNumId w:val="43"/>
   </w:num>
   <w:num w:numId="46" w16cid:durableId="154272466">
+    <w:abstractNumId w:val="42"/>
+  </w:num>
+  <w:num w:numId="47" w16cid:durableId="873924712">
+    <w:abstractNumId w:val="18"/>
+  </w:num>
+  <w:num w:numId="48" w16cid:durableId="175578605">
+    <w:abstractNumId w:val="21"/>
+  </w:num>
+  <w:num w:numId="49" w16cid:durableId="1351837453">
+    <w:abstractNumId w:val="11"/>
+  </w:num>
+  <w:num w:numId="50" w16cid:durableId="1077093443">
     <w:abstractNumId w:val="39"/>
   </w:num>
-  <w:num w:numId="47" w16cid:durableId="873924712">
-    <w:abstractNumId w:val="17"/>
+  <w:num w:numId="51" w16cid:durableId="1712538440">
+    <w:abstractNumId w:val="35"/>
   </w:num>
-  <w:num w:numId="48" w16cid:durableId="175578605">
-    <w:abstractNumId w:val="20"/>
-  </w:num>
-  <w:numIdMacAtCleanup w:val="38"/>
+  <w:numIdMacAtCleanup w:val="51"/>
 </w:numbering>
 </file>
 
@@ -32616,6 +33866,7 @@
   <w:style w:type="character" w:default="1" w:styleId="DefaultParagraphFont">
     <w:name w:val="Default Paragraph Font"/>
     <w:uiPriority w:val="1"/>
+    <w:semiHidden/>
     <w:unhideWhenUsed/>
   </w:style>
   <w:style w:type="table" w:default="1" w:styleId="TableNormal">
@@ -32949,6 +34200,25 @@
       <w:color w:val="666666"/>
     </w:rPr>
   </w:style>
+  <w:style w:type="table" w:styleId="TableGrid">
+    <w:name w:val="Table Grid"/>
+    <w:basedOn w:val="TableNormal"/>
+    <w:uiPriority w:val="39"/>
+    <w:rsid w:val="0099213F"/>
+    <w:pPr>
+      <w:spacing w:after="0" w:line="240" w:lineRule="auto"/>
+    </w:pPr>
+    <w:tblPr>
+      <w:tblBorders>
+        <w:top w:val="single" w:sz="4" w:space="0" w:color="auto"/>
+        <w:left w:val="single" w:sz="4" w:space="0" w:color="auto"/>
+        <w:bottom w:val="single" w:sz="4" w:space="0" w:color="auto"/>
+        <w:right w:val="single" w:sz="4" w:space="0" w:color="auto"/>
+        <w:insideH w:val="single" w:sz="4" w:space="0" w:color="auto"/>
+        <w:insideV w:val="single" w:sz="4" w:space="0" w:color="auto"/>
+      </w:tblBorders>
+    </w:tblPr>
+  </w:style>
 </w:styles>
 </file>
 

</xml_diff>

<commit_message>
feat(fin-math): initiate Chapter 3, update formula reference sheet (Boxes 13-17), and sync docs (Lectures 22/09-13/10/2026)
</commit_message>
<xml_diff>
--- a/Financial Mathematics/notes.docx
+++ b/Financial Mathematics/notes.docx
@@ -27970,11 +27970,2680 @@
     </w:p>
     <w:p>
       <w:pPr>
-        <w:ind w:left="360"/>
-        <w:rPr>
-          <w:rFonts w:eastAsiaTheme="minorEastAsia"/>
-        </w:rPr>
-      </w:pPr>
+        <w:rPr>
+          <w:rFonts w:eastAsiaTheme="minorEastAsia"/>
+        </w:rPr>
+      </w:pPr>
+    </w:p>
+    <w:p>
+      <w:pPr>
+        <w:rPr>
+          <w:rFonts w:eastAsiaTheme="minorEastAsia"/>
+        </w:rPr>
+      </w:pPr>
+      <w:r>
+        <w:rPr>
+          <w:rFonts w:eastAsiaTheme="minorEastAsia"/>
+        </w:rPr>
+        <w:t>08/10/2026</w:t>
+      </w:r>
+    </w:p>
+    <w:p>
+      <w:pPr>
+        <w:rPr>
+          <w:rFonts w:eastAsiaTheme="minorEastAsia"/>
+        </w:rPr>
+      </w:pPr>
+      <w:r>
+        <w:rPr>
+          <w:rFonts w:eastAsiaTheme="minorEastAsia"/>
+        </w:rPr>
+        <w:t xml:space="preserve">Price </w:t>
+      </w:r>
+      <w:proofErr w:type="spellStart"/>
+      <w:r>
+        <w:rPr>
+          <w:rFonts w:eastAsiaTheme="minorEastAsia"/>
+        </w:rPr>
+        <w:t>earning</w:t>
+      </w:r>
+      <w:proofErr w:type="spellEnd"/>
+      <w:r>
+        <w:rPr>
+          <w:rFonts w:eastAsiaTheme="minorEastAsia"/>
+        </w:rPr>
+        <w:t xml:space="preserve"> ratio (P/E ratio)</w:t>
+      </w:r>
+    </w:p>
+    <w:p>
+      <w:pPr>
+        <w:rPr>
+          <w:rFonts w:eastAsiaTheme="minorEastAsia"/>
+        </w:rPr>
+      </w:pPr>
+      <w:r>
+        <w:rPr>
+          <w:rFonts w:eastAsiaTheme="minorEastAsia"/>
+        </w:rPr>
+        <w:t>Earning per share reflected by the market price</w:t>
+      </w:r>
+    </w:p>
+    <w:p>
+      <w:pPr>
+        <w:rPr>
+          <w:rFonts w:eastAsiaTheme="minorEastAsia"/>
+        </w:rPr>
+      </w:pPr>
+      <m:oMathPara>
+        <m:oMath>
+          <m:r>
+            <w:rPr>
+              <w:rFonts w:ascii="Cambria Math" w:eastAsiaTheme="minorEastAsia" w:hAnsi="Cambria Math"/>
+            </w:rPr>
+            <m:t xml:space="preserve">P/E ratio= </m:t>
+          </m:r>
+          <m:f>
+            <m:fPr>
+              <m:ctrlPr>
+                <w:rPr>
+                  <w:rFonts w:ascii="Cambria Math" w:eastAsiaTheme="minorEastAsia" w:hAnsi="Cambria Math"/>
+                  <w:i/>
+                </w:rPr>
+              </m:ctrlPr>
+            </m:fPr>
+            <m:num>
+              <m:r>
+                <w:rPr>
+                  <w:rFonts w:ascii="Cambria Math" w:eastAsiaTheme="minorEastAsia" w:hAnsi="Cambria Math"/>
+                </w:rPr>
+                <m:t>market price per equity share</m:t>
+              </m:r>
+            </m:num>
+            <m:den>
+              <m:r>
+                <w:rPr>
+                  <w:rFonts w:ascii="Cambria Math" w:eastAsiaTheme="minorEastAsia" w:hAnsi="Cambria Math"/>
+                </w:rPr>
+                <m:t>earnings per equity share</m:t>
+              </m:r>
+            </m:den>
+          </m:f>
+        </m:oMath>
+      </m:oMathPara>
+    </w:p>
+    <w:p>
+      <w:pPr>
+        <w:rPr>
+          <w:rFonts w:eastAsiaTheme="minorEastAsia"/>
+        </w:rPr>
+      </w:pPr>
+      <w:r>
+        <w:rPr>
+          <w:rFonts w:eastAsiaTheme="minorEastAsia"/>
+        </w:rPr>
+        <w:t>Uses: investor to decide to invest or not in a particular company</w:t>
+      </w:r>
+    </w:p>
+    <w:p>
+      <w:pPr>
+        <w:rPr>
+          <w:rFonts w:eastAsiaTheme="minorEastAsia"/>
+        </w:rPr>
+      </w:pPr>
+    </w:p>
+    <w:p>
+      <w:pPr>
+        <w:rPr>
+          <w:rFonts w:eastAsiaTheme="minorEastAsia"/>
+        </w:rPr>
+      </w:pPr>
+      <w:r>
+        <w:rPr>
+          <w:rFonts w:eastAsiaTheme="minorEastAsia"/>
+        </w:rPr>
+        <w:t>Earnings per share (EPS)</w:t>
+      </w:r>
+    </w:p>
+    <w:p>
+      <w:pPr>
+        <w:rPr>
+          <w:rFonts w:eastAsiaTheme="minorEastAsia"/>
+        </w:rPr>
+      </w:pPr>
+      <m:oMathPara>
+        <m:oMath>
+          <m:r>
+            <w:rPr>
+              <w:rFonts w:ascii="Cambria Math" w:eastAsiaTheme="minorEastAsia" w:hAnsi="Cambria Math"/>
+            </w:rPr>
+            <m:t xml:space="preserve">EPS = </m:t>
+          </m:r>
+          <m:f>
+            <m:fPr>
+              <m:ctrlPr>
+                <w:rPr>
+                  <w:rFonts w:ascii="Cambria Math" w:eastAsiaTheme="minorEastAsia" w:hAnsi="Cambria Math"/>
+                  <w:i/>
+                </w:rPr>
+              </m:ctrlPr>
+            </m:fPr>
+            <m:num>
+              <m:r>
+                <w:rPr>
+                  <w:rFonts w:ascii="Cambria Math" w:eastAsiaTheme="minorEastAsia" w:hAnsi="Cambria Math"/>
+                </w:rPr>
+                <m:t>net income</m:t>
+              </m:r>
+            </m:num>
+            <m:den>
+              <m:r>
+                <w:rPr>
+                  <w:rFonts w:ascii="Cambria Math" w:eastAsiaTheme="minorEastAsia" w:hAnsi="Cambria Math"/>
+                </w:rPr>
+                <m:t>total number of outstanding shares</m:t>
+              </m:r>
+            </m:den>
+          </m:f>
+        </m:oMath>
+      </m:oMathPara>
+    </w:p>
+    <w:p>
+      <w:pPr>
+        <w:rPr>
+          <w:rFonts w:eastAsiaTheme="minorEastAsia"/>
+        </w:rPr>
+      </w:pPr>
+    </w:p>
+    <w:p>
+      <w:pPr>
+        <w:rPr>
+          <w:rFonts w:eastAsiaTheme="minorEastAsia"/>
+        </w:rPr>
+      </w:pPr>
+      <m:oMathPara>
+        <m:oMath>
+          <m:r>
+            <w:rPr>
+              <w:rFonts w:ascii="Cambria Math" w:eastAsiaTheme="minorEastAsia" w:hAnsi="Cambria Math"/>
+            </w:rPr>
+            <m:t xml:space="preserve">EPS = </m:t>
+          </m:r>
+          <m:f>
+            <m:fPr>
+              <m:ctrlPr>
+                <w:rPr>
+                  <w:rFonts w:ascii="Cambria Math" w:eastAsiaTheme="minorEastAsia" w:hAnsi="Cambria Math"/>
+                  <w:i/>
+                </w:rPr>
+              </m:ctrlPr>
+            </m:fPr>
+            <m:num>
+              <m:r>
+                <w:rPr>
+                  <w:rFonts w:ascii="Cambria Math" w:eastAsiaTheme="minorEastAsia" w:hAnsi="Cambria Math"/>
+                </w:rPr>
+                <m:t>Net profit after tax and preference dividend</m:t>
+              </m:r>
+            </m:num>
+            <m:den>
+              <m:r>
+                <w:rPr>
+                  <w:rFonts w:ascii="Cambria Math" w:eastAsiaTheme="minorEastAsia" w:hAnsi="Cambria Math"/>
+                </w:rPr>
+                <m:t>No. of equity shares</m:t>
+              </m:r>
+            </m:den>
+          </m:f>
+        </m:oMath>
+      </m:oMathPara>
+    </w:p>
+    <w:p>
+      <w:pPr>
+        <w:rPr>
+          <w:rFonts w:eastAsiaTheme="minorEastAsia"/>
+        </w:rPr>
+      </w:pPr>
+      <w:r>
+        <w:rPr>
+          <w:rFonts w:eastAsiaTheme="minorEastAsia"/>
+        </w:rPr>
+        <w:t xml:space="preserve">Uses: EPS ratio highlights the overall success of the concern from owners POV </w:t>
+      </w:r>
+    </w:p>
+    <w:p>
+      <w:pPr>
+        <w:rPr>
+          <w:rFonts w:eastAsiaTheme="minorEastAsia"/>
+        </w:rPr>
+      </w:pPr>
+      <w:r>
+        <w:rPr>
+          <w:rFonts w:eastAsiaTheme="minorEastAsia"/>
+        </w:rPr>
+        <w:t>Q. calculate PE ratio, stock price Rs. 100 per share, EPS = 5</w:t>
+      </w:r>
+    </w:p>
+    <w:p>
+      <w:pPr>
+        <w:rPr>
+          <w:rFonts w:eastAsiaTheme="minorEastAsia"/>
+        </w:rPr>
+      </w:pPr>
+      <w:r>
+        <w:rPr>
+          <w:rFonts w:eastAsiaTheme="minorEastAsia"/>
+        </w:rPr>
+        <w:t xml:space="preserve">Sol: </w:t>
+      </w:r>
+    </w:p>
+    <w:p>
+      <w:pPr>
+        <w:rPr>
+          <w:rFonts w:eastAsiaTheme="minorEastAsia"/>
+        </w:rPr>
+      </w:pPr>
+      <w:r>
+        <w:rPr>
+          <w:rFonts w:eastAsiaTheme="minorEastAsia"/>
+        </w:rPr>
+        <w:t>100 / 5 = 20</w:t>
+      </w:r>
+    </w:p>
+    <w:p>
+      <w:pPr>
+        <w:rPr>
+          <w:rFonts w:eastAsiaTheme="minorEastAsia"/>
+        </w:rPr>
+      </w:pPr>
+      <w:r>
+        <w:rPr>
+          <w:rFonts w:eastAsiaTheme="minorEastAsia"/>
+        </w:rPr>
+        <w:t xml:space="preserve">PE = 20 </w:t>
+      </w:r>
+    </w:p>
+    <w:p>
+      <w:pPr>
+        <w:rPr>
+          <w:rFonts w:eastAsiaTheme="minorEastAsia"/>
+        </w:rPr>
+      </w:pPr>
+      <w:r>
+        <w:rPr>
+          <w:rFonts w:eastAsiaTheme="minorEastAsia"/>
+        </w:rPr>
+        <w:t xml:space="preserve">Conclusion, PE ratio is 20, it means investor pays 1 </w:t>
+      </w:r>
+      <w:proofErr w:type="spellStart"/>
+      <w:r>
+        <w:rPr>
+          <w:rFonts w:eastAsiaTheme="minorEastAsia"/>
+        </w:rPr>
+        <w:t>rs</w:t>
+      </w:r>
+      <w:proofErr w:type="spellEnd"/>
+      <w:r>
+        <w:rPr>
+          <w:rFonts w:eastAsiaTheme="minorEastAsia"/>
+        </w:rPr>
+        <w:t xml:space="preserve"> for every 20 </w:t>
+      </w:r>
+      <w:proofErr w:type="spellStart"/>
+      <w:r>
+        <w:rPr>
+          <w:rFonts w:eastAsiaTheme="minorEastAsia"/>
+        </w:rPr>
+        <w:t>rs</w:t>
+      </w:r>
+      <w:proofErr w:type="spellEnd"/>
+      <w:r>
+        <w:rPr>
+          <w:rFonts w:eastAsiaTheme="minorEastAsia"/>
+        </w:rPr>
+        <w:t xml:space="preserve"> </w:t>
+      </w:r>
+    </w:p>
+    <w:p>
+      <w:pPr>
+        <w:rPr>
+          <w:rFonts w:eastAsiaTheme="minorEastAsia"/>
+        </w:rPr>
+      </w:pPr>
+    </w:p>
+    <w:p>
+      <w:pPr>
+        <w:rPr>
+          <w:rFonts w:eastAsiaTheme="minorEastAsia"/>
+        </w:rPr>
+      </w:pPr>
+    </w:p>
+    <w:p>
+      <w:pPr>
+        <w:rPr>
+          <w:rFonts w:eastAsiaTheme="minorEastAsia"/>
+        </w:rPr>
+      </w:pPr>
+      <w:r>
+        <w:rPr>
+          <w:rFonts w:eastAsiaTheme="minorEastAsia"/>
+        </w:rPr>
+        <w:t>12/10/2026</w:t>
+      </w:r>
+    </w:p>
+    <w:p>
+      <w:pPr>
+        <w:rPr>
+          <w:rFonts w:eastAsiaTheme="minorEastAsia"/>
+        </w:rPr>
+      </w:pPr>
+    </w:p>
+    <w:p>
+      <w:pPr>
+        <w:rPr>
+          <w:rFonts w:eastAsiaTheme="minorEastAsia"/>
+        </w:rPr>
+      </w:pPr>
+      <w:r>
+        <w:rPr>
+          <w:rFonts w:eastAsiaTheme="minorEastAsia"/>
+        </w:rPr>
+        <w:t>UNIT 3</w:t>
+      </w:r>
+    </w:p>
+    <w:p>
+      <w:pPr>
+        <w:rPr>
+          <w:rFonts w:eastAsiaTheme="minorEastAsia"/>
+        </w:rPr>
+      </w:pPr>
+      <w:r>
+        <w:rPr>
+          <w:rFonts w:eastAsiaTheme="minorEastAsia"/>
+        </w:rPr>
+        <w:t>Ratio – quantitative relationship between two or more items</w:t>
+      </w:r>
+    </w:p>
+    <w:p>
+      <w:pPr>
+        <w:rPr>
+          <w:rFonts w:eastAsiaTheme="minorEastAsia"/>
+        </w:rPr>
+      </w:pPr>
+    </w:p>
+    <w:p>
+      <w:pPr>
+        <w:rPr>
+          <w:rFonts w:eastAsiaTheme="minorEastAsia"/>
+        </w:rPr>
+      </w:pPr>
+      <w:r>
+        <w:rPr>
+          <w:rFonts w:eastAsiaTheme="minorEastAsia"/>
+        </w:rPr>
+        <w:t>Purpose / advantages</w:t>
+      </w:r>
+    </w:p>
+    <w:p>
+      <w:pPr>
+        <w:pStyle w:val="ListParagraph"/>
+        <w:numPr>
+          <w:ilvl w:val="0"/>
+          <w:numId w:val="52"/>
+        </w:numPr>
+        <w:rPr>
+          <w:rFonts w:eastAsiaTheme="minorEastAsia"/>
+        </w:rPr>
+      </w:pPr>
+      <w:r>
+        <w:rPr>
+          <w:rFonts w:eastAsiaTheme="minorEastAsia"/>
+        </w:rPr>
+        <w:lastRenderedPageBreak/>
+        <w:t xml:space="preserve">Forecasting </w:t>
+      </w:r>
+    </w:p>
+    <w:p>
+      <w:pPr>
+        <w:pStyle w:val="ListParagraph"/>
+        <w:numPr>
+          <w:ilvl w:val="0"/>
+          <w:numId w:val="52"/>
+        </w:numPr>
+        <w:rPr>
+          <w:rFonts w:eastAsiaTheme="minorEastAsia"/>
+        </w:rPr>
+      </w:pPr>
+      <w:r>
+        <w:rPr>
+          <w:rFonts w:eastAsiaTheme="minorEastAsia"/>
+        </w:rPr>
+        <w:t>Managerial control</w:t>
+      </w:r>
+    </w:p>
+    <w:p>
+      <w:pPr>
+        <w:pStyle w:val="ListParagraph"/>
+        <w:numPr>
+          <w:ilvl w:val="0"/>
+          <w:numId w:val="52"/>
+        </w:numPr>
+        <w:rPr>
+          <w:rFonts w:eastAsiaTheme="minorEastAsia"/>
+        </w:rPr>
+      </w:pPr>
+      <w:r>
+        <w:rPr>
+          <w:rFonts w:eastAsiaTheme="minorEastAsia"/>
+        </w:rPr>
+        <w:t xml:space="preserve">Facilitates communication </w:t>
+      </w:r>
+    </w:p>
+    <w:p>
+      <w:pPr>
+        <w:pStyle w:val="ListParagraph"/>
+        <w:numPr>
+          <w:ilvl w:val="0"/>
+          <w:numId w:val="52"/>
+        </w:numPr>
+        <w:rPr>
+          <w:rFonts w:eastAsiaTheme="minorEastAsia"/>
+        </w:rPr>
+      </w:pPr>
+      <w:r>
+        <w:rPr>
+          <w:rFonts w:eastAsiaTheme="minorEastAsia"/>
+        </w:rPr>
+        <w:t>Measuring efficiency</w:t>
+      </w:r>
+    </w:p>
+    <w:p>
+      <w:pPr>
+        <w:pStyle w:val="ListParagraph"/>
+        <w:numPr>
+          <w:ilvl w:val="0"/>
+          <w:numId w:val="52"/>
+        </w:numPr>
+        <w:rPr>
+          <w:rFonts w:eastAsiaTheme="minorEastAsia"/>
+        </w:rPr>
+      </w:pPr>
+      <w:r>
+        <w:rPr>
+          <w:rFonts w:eastAsiaTheme="minorEastAsia"/>
+        </w:rPr>
+        <w:t>Facilitating investment decision</w:t>
+      </w:r>
+    </w:p>
+    <w:p>
+      <w:pPr>
+        <w:pStyle w:val="ListParagraph"/>
+        <w:numPr>
+          <w:ilvl w:val="0"/>
+          <w:numId w:val="52"/>
+        </w:numPr>
+        <w:rPr>
+          <w:rFonts w:eastAsiaTheme="minorEastAsia"/>
+        </w:rPr>
+      </w:pPr>
+      <w:r>
+        <w:rPr>
+          <w:rFonts w:eastAsiaTheme="minorEastAsia"/>
+        </w:rPr>
+        <w:t>Measuring financial solvency</w:t>
+      </w:r>
+    </w:p>
+    <w:p>
+      <w:pPr>
+        <w:pStyle w:val="ListParagraph"/>
+        <w:numPr>
+          <w:ilvl w:val="0"/>
+          <w:numId w:val="52"/>
+        </w:numPr>
+        <w:rPr>
+          <w:rFonts w:eastAsiaTheme="minorEastAsia"/>
+        </w:rPr>
+      </w:pPr>
+      <w:r>
+        <w:rPr>
+          <w:rFonts w:eastAsiaTheme="minorEastAsia"/>
+        </w:rPr>
+        <w:t xml:space="preserve">Inter firm comparison </w:t>
+      </w:r>
+    </w:p>
+    <w:p>
+      <w:pPr>
+        <w:rPr>
+          <w:rFonts w:eastAsiaTheme="minorEastAsia"/>
+        </w:rPr>
+      </w:pPr>
+    </w:p>
+    <w:p>
+      <w:pPr>
+        <w:rPr>
+          <w:rFonts w:eastAsiaTheme="minorEastAsia"/>
+        </w:rPr>
+      </w:pPr>
+      <w:r>
+        <w:rPr>
+          <w:rFonts w:eastAsiaTheme="minorEastAsia"/>
+        </w:rPr>
+        <w:t>Classification of ratios</w:t>
+      </w:r>
+    </w:p>
+    <w:p>
+      <w:pPr>
+        <w:rPr>
+          <w:rFonts w:eastAsiaTheme="minorEastAsia"/>
+        </w:rPr>
+      </w:pPr>
+      <w:r>
+        <w:rPr>
+          <w:noProof/>
+        </w:rPr>
+        <w:drawing>
+          <wp:inline distT="0" distB="0" distL="0" distR="0" wp14:anchorId="4A41948E" wp14:editId="0A47F195">
+            <wp:extent cx="5731510" cy="3766820"/>
+            <wp:effectExtent l="0" t="0" r="2540" b="5080"/>
+            <wp:docPr id="55649568" name="Picture 1"/>
+            <wp:cNvGraphicFramePr>
+              <a:graphicFrameLocks xmlns:a="http://schemas.openxmlformats.org/drawingml/2006/main" noChangeAspect="1"/>
+            </wp:cNvGraphicFramePr>
+            <a:graphic xmlns:a="http://schemas.openxmlformats.org/drawingml/2006/main">
+              <a:graphicData uri="http://schemas.openxmlformats.org/drawingml/2006/picture">
+                <pic:pic xmlns:pic="http://schemas.openxmlformats.org/drawingml/2006/picture">
+                  <pic:nvPicPr>
+                    <pic:cNvPr id="55649568" name=""/>
+                    <pic:cNvPicPr/>
+                  </pic:nvPicPr>
+                  <pic:blipFill>
+                    <a:blip r:embed="rId13"/>
+                    <a:stretch>
+                      <a:fillRect/>
+                    </a:stretch>
+                  </pic:blipFill>
+                  <pic:spPr>
+                    <a:xfrm>
+                      <a:off x="0" y="0"/>
+                      <a:ext cx="5731510" cy="3766820"/>
+                    </a:xfrm>
+                    <a:prstGeom prst="rect">
+                      <a:avLst/>
+                    </a:prstGeom>
+                  </pic:spPr>
+                </pic:pic>
+              </a:graphicData>
+            </a:graphic>
+          </wp:inline>
+        </w:drawing>
+      </w:r>
+    </w:p>
+    <w:p>
+      <w:pPr>
+        <w:rPr>
+          <w:rFonts w:eastAsiaTheme="minorEastAsia"/>
+        </w:rPr>
+      </w:pPr>
+    </w:p>
+    <w:p>
+      <w:pPr>
+        <w:rPr>
+          <w:rFonts w:eastAsiaTheme="minorEastAsia"/>
+        </w:rPr>
+      </w:pPr>
+      <w:r>
+        <w:rPr>
+          <w:rFonts w:eastAsiaTheme="minorEastAsia"/>
+        </w:rPr>
+        <w:t xml:space="preserve">Q. </w:t>
+      </w:r>
+    </w:p>
+    <w:p>
+      <w:pPr>
+        <w:rPr>
+          <w:rFonts w:eastAsiaTheme="minorEastAsia"/>
+        </w:rPr>
+      </w:pPr>
+      <w:r>
+        <w:rPr>
+          <w:rFonts w:eastAsiaTheme="minorEastAsia"/>
+          <w:noProof/>
+        </w:rPr>
+        <w:lastRenderedPageBreak/>
+        <w:drawing>
+          <wp:inline distT="0" distB="0" distL="0" distR="0" wp14:anchorId="271FEB94" wp14:editId="4A2E85C6">
+            <wp:extent cx="3794760" cy="5449824"/>
+            <wp:effectExtent l="0" t="8255" r="6985" b="6985"/>
+            <wp:docPr id="244317931" name="Picture 1"/>
+            <wp:cNvGraphicFramePr>
+              <a:graphicFrameLocks xmlns:a="http://schemas.openxmlformats.org/drawingml/2006/main" noChangeAspect="1"/>
+            </wp:cNvGraphicFramePr>
+            <a:graphic xmlns:a="http://schemas.openxmlformats.org/drawingml/2006/main">
+              <a:graphicData uri="http://schemas.openxmlformats.org/drawingml/2006/picture">
+                <pic:pic xmlns:pic="http://schemas.openxmlformats.org/drawingml/2006/picture">
+                  <pic:nvPicPr>
+                    <pic:cNvPr id="244317931" name=""/>
+                    <pic:cNvPicPr/>
+                  </pic:nvPicPr>
+                  <pic:blipFill>
+                    <a:blip r:embed="rId14"/>
+                    <a:stretch>
+                      <a:fillRect/>
+                    </a:stretch>
+                  </pic:blipFill>
+                  <pic:spPr>
+                    <a:xfrm rot="16200000">
+                      <a:off x="0" y="0"/>
+                      <a:ext cx="3794760" cy="5449824"/>
+                    </a:xfrm>
+                    <a:prstGeom prst="rect">
+                      <a:avLst/>
+                    </a:prstGeom>
+                  </pic:spPr>
+                </pic:pic>
+              </a:graphicData>
+            </a:graphic>
+          </wp:inline>
+        </w:drawing>
+      </w:r>
+    </w:p>
+    <w:p>
+      <w:pPr>
+        <w:rPr>
+          <w:rFonts w:eastAsiaTheme="minorEastAsia"/>
+        </w:rPr>
+      </w:pPr>
+    </w:p>
+    <w:p>
+      <w:pPr>
+        <w:rPr>
+          <w:rFonts w:eastAsiaTheme="minorEastAsia"/>
+        </w:rPr>
+      </w:pPr>
+      <w:r>
+        <w:rPr>
+          <w:rFonts w:eastAsiaTheme="minorEastAsia"/>
+          <w:noProof/>
+        </w:rPr>
+        <w:drawing>
+          <wp:inline distT="0" distB="0" distL="0" distR="0" wp14:anchorId="3E675FF0" wp14:editId="50FD7522">
+            <wp:extent cx="5731510" cy="3700780"/>
+            <wp:effectExtent l="0" t="0" r="2540" b="0"/>
+            <wp:docPr id="103652911" name="Picture 1"/>
+            <wp:cNvGraphicFramePr>
+              <a:graphicFrameLocks xmlns:a="http://schemas.openxmlformats.org/drawingml/2006/main" noChangeAspect="1"/>
+            </wp:cNvGraphicFramePr>
+            <a:graphic xmlns:a="http://schemas.openxmlformats.org/drawingml/2006/main">
+              <a:graphicData uri="http://schemas.openxmlformats.org/drawingml/2006/picture">
+                <pic:pic xmlns:pic="http://schemas.openxmlformats.org/drawingml/2006/picture">
+                  <pic:nvPicPr>
+                    <pic:cNvPr id="103652911" name=""/>
+                    <pic:cNvPicPr/>
+                  </pic:nvPicPr>
+                  <pic:blipFill>
+                    <a:blip r:embed="rId15"/>
+                    <a:stretch>
+                      <a:fillRect/>
+                    </a:stretch>
+                  </pic:blipFill>
+                  <pic:spPr>
+                    <a:xfrm>
+                      <a:off x="0" y="0"/>
+                      <a:ext cx="5731510" cy="3700780"/>
+                    </a:xfrm>
+                    <a:prstGeom prst="rect">
+                      <a:avLst/>
+                    </a:prstGeom>
+                  </pic:spPr>
+                </pic:pic>
+              </a:graphicData>
+            </a:graphic>
+          </wp:inline>
+        </w:drawing>
+      </w:r>
+    </w:p>
+    <w:p>
+      <w:pPr>
+        <w:rPr>
+          <w:rFonts w:eastAsiaTheme="minorEastAsia"/>
+        </w:rPr>
+      </w:pPr>
+      <w:r>
+        <w:rPr>
+          <w:rFonts w:eastAsiaTheme="minorEastAsia"/>
+        </w:rPr>
+        <w:t xml:space="preserve">Conclusion </w:t>
+      </w:r>
+    </w:p>
+    <w:p>
+      <w:pPr>
+        <w:pStyle w:val="ListParagraph"/>
+        <w:numPr>
+          <w:ilvl w:val="0"/>
+          <w:numId w:val="53"/>
+        </w:numPr>
+        <w:rPr>
+          <w:rFonts w:eastAsiaTheme="minorEastAsia"/>
+        </w:rPr>
+      </w:pPr>
+      <w:r>
+        <w:rPr>
+          <w:rFonts w:eastAsiaTheme="minorEastAsia"/>
+        </w:rPr>
+        <w:t xml:space="preserve">This ratio indicates relationship between sales and direct cost </w:t>
+      </w:r>
+    </w:p>
+    <w:p>
+      <w:pPr>
+        <w:pStyle w:val="ListParagraph"/>
+        <w:numPr>
+          <w:ilvl w:val="0"/>
+          <w:numId w:val="53"/>
+        </w:numPr>
+        <w:rPr>
+          <w:rFonts w:eastAsiaTheme="minorEastAsia"/>
+        </w:rPr>
+      </w:pPr>
+      <w:r>
+        <w:rPr>
+          <w:rFonts w:eastAsiaTheme="minorEastAsia"/>
+        </w:rPr>
+        <w:t xml:space="preserve">Relationship between gross profit and net sales </w:t>
+      </w:r>
+    </w:p>
+    <w:p>
+      <w:pPr>
+        <w:pStyle w:val="ListParagraph"/>
+        <w:numPr>
+          <w:ilvl w:val="0"/>
+          <w:numId w:val="53"/>
+        </w:numPr>
+        <w:rPr>
+          <w:rFonts w:eastAsiaTheme="minorEastAsia"/>
+        </w:rPr>
+      </w:pPr>
+      <w:r>
+        <w:rPr>
+          <w:rFonts w:eastAsiaTheme="minorEastAsia"/>
+        </w:rPr>
+        <w:lastRenderedPageBreak/>
+        <w:t xml:space="preserve">Operating profit ratio: shows operation efficiency </w:t>
+      </w:r>
+    </w:p>
+    <w:p>
+      <w:pPr>
+        <w:pStyle w:val="ListParagraph"/>
+        <w:numPr>
+          <w:ilvl w:val="0"/>
+          <w:numId w:val="53"/>
+        </w:numPr>
+        <w:rPr>
+          <w:rFonts w:eastAsiaTheme="minorEastAsia"/>
+        </w:rPr>
+      </w:pPr>
+      <w:r>
+        <w:rPr>
+          <w:rFonts w:eastAsiaTheme="minorEastAsia"/>
+        </w:rPr>
+        <w:t xml:space="preserve">Operating ratio: operating expenses and sales </w:t>
+      </w:r>
+    </w:p>
+    <w:p>
+      <w:pPr>
+        <w:rPr>
+          <w:rFonts w:eastAsiaTheme="minorEastAsia"/>
+        </w:rPr>
+      </w:pPr>
+    </w:p>
+    <w:p>
+      <w:pPr>
+        <w:rPr>
+          <w:rFonts w:eastAsiaTheme="minorEastAsia"/>
+        </w:rPr>
+      </w:pPr>
+      <w:r>
+        <w:rPr>
+          <w:rFonts w:eastAsiaTheme="minorEastAsia"/>
+        </w:rPr>
+        <w:t>13/10/2026</w:t>
+      </w:r>
+    </w:p>
+    <w:p>
+      <w:pPr>
+        <w:rPr>
+          <w:rFonts w:eastAsiaTheme="minorEastAsia"/>
+        </w:rPr>
+      </w:pPr>
+    </w:p>
+    <w:p>
+      <w:pPr>
+        <w:rPr>
+          <w:rFonts w:eastAsiaTheme="minorEastAsia"/>
+        </w:rPr>
+      </w:pPr>
+      <w:r>
+        <w:rPr>
+          <w:rFonts w:eastAsiaTheme="minorEastAsia"/>
+        </w:rPr>
+        <w:t>Turnover ratio (or) performance (or) activity ratios:</w:t>
+      </w:r>
+    </w:p>
+    <w:p>
+      <w:pPr>
+        <w:pStyle w:val="ListParagraph"/>
+        <w:numPr>
+          <w:ilvl w:val="0"/>
+          <w:numId w:val="54"/>
+        </w:numPr>
+        <w:rPr>
+          <w:rFonts w:eastAsiaTheme="minorEastAsia"/>
+        </w:rPr>
+      </w:pPr>
+      <w:r>
+        <w:rPr>
+          <w:rFonts w:eastAsiaTheme="minorEastAsia"/>
+        </w:rPr>
+        <w:t xml:space="preserve">Highlights the operational efficiency of the business concern operational efficiency </w:t>
+      </w:r>
+    </w:p>
+    <w:p>
+      <w:pPr>
+        <w:rPr>
+          <w:rFonts w:eastAsiaTheme="minorEastAsia"/>
+        </w:rPr>
+      </w:pPr>
+      <w:r>
+        <w:rPr>
+          <w:rFonts w:eastAsiaTheme="minorEastAsia"/>
+        </w:rPr>
+        <w:t>Operational efficiency:</w:t>
+      </w:r>
+    </w:p>
+    <w:p>
+      <w:pPr>
+        <w:rPr>
+          <w:rFonts w:eastAsiaTheme="minorEastAsia"/>
+        </w:rPr>
+      </w:pPr>
+      <m:oMathPara>
+        <m:oMath>
+          <m:r>
+            <w:rPr>
+              <w:rFonts w:ascii="Cambria Math" w:eastAsiaTheme="minorEastAsia" w:hAnsi="Cambria Math"/>
+            </w:rPr>
+            <m:t>of resources available to the concern</m:t>
+          </m:r>
+          <m:d>
+            <m:dPr>
+              <m:begChr m:val="{"/>
+              <m:endChr m:val=""/>
+              <m:ctrlPr>
+                <w:rPr>
+                  <w:rFonts w:ascii="Cambria Math" w:eastAsiaTheme="minorEastAsia" w:hAnsi="Cambria Math"/>
+                  <w:i/>
+                </w:rPr>
+              </m:ctrlPr>
+            </m:dPr>
+            <m:e>
+              <m:eqArr>
+                <m:eqArrPr>
+                  <m:ctrlPr>
+                    <w:rPr>
+                      <w:rFonts w:ascii="Cambria Math" w:eastAsiaTheme="minorEastAsia" w:hAnsi="Cambria Math"/>
+                      <w:i/>
+                    </w:rPr>
+                  </m:ctrlPr>
+                </m:eqArrPr>
+                <m:e>
+                  <m:r>
+                    <w:rPr>
+                      <w:rFonts w:ascii="Cambria Math" w:eastAsiaTheme="minorEastAsia" w:hAnsi="Cambria Math"/>
+                    </w:rPr>
+                    <m:t>effective</m:t>
+                  </m:r>
+                </m:e>
+                <m:e>
+                  <m:r>
+                    <w:rPr>
+                      <w:rFonts w:ascii="Cambria Math" w:eastAsiaTheme="minorEastAsia" w:hAnsi="Cambria Math"/>
+                    </w:rPr>
+                    <m:t>profitable</m:t>
+                  </m:r>
+                </m:e>
+                <m:e>
+                  <m:r>
+                    <w:rPr>
+                      <w:rFonts w:ascii="Cambria Math" w:eastAsiaTheme="minorEastAsia" w:hAnsi="Cambria Math"/>
+                    </w:rPr>
+                    <m:t>rational use</m:t>
+                  </m:r>
+                </m:e>
+              </m:eqArr>
+            </m:e>
+          </m:d>
+        </m:oMath>
+      </m:oMathPara>
+    </w:p>
+    <w:p>
+      <w:pPr>
+        <w:rPr>
+          <w:rFonts w:eastAsiaTheme="minorEastAsia"/>
+        </w:rPr>
+      </w:pPr>
+      <w:r>
+        <w:rPr>
+          <w:rFonts w:eastAsiaTheme="minorEastAsia"/>
+        </w:rPr>
+        <w:t>calculation:</w:t>
+      </w:r>
+    </w:p>
+    <w:p>
+      <w:pPr>
+        <w:pStyle w:val="ListParagraph"/>
+        <w:numPr>
+          <w:ilvl w:val="0"/>
+          <w:numId w:val="54"/>
+        </w:numPr>
+        <w:rPr>
+          <w:rFonts w:eastAsiaTheme="minorEastAsia"/>
+        </w:rPr>
+      </w:pPr>
+      <w:r>
+        <w:rPr>
+          <w:rFonts w:eastAsiaTheme="minorEastAsia"/>
+        </w:rPr>
+        <w:t>Reference to sales or cost of sales</w:t>
+      </w:r>
+    </w:p>
+    <w:p>
+      <w:pPr>
+        <w:pStyle w:val="ListParagraph"/>
+        <w:numPr>
+          <w:ilvl w:val="0"/>
+          <w:numId w:val="54"/>
+        </w:numPr>
+        <w:rPr>
+          <w:rFonts w:eastAsiaTheme="minorEastAsia"/>
+        </w:rPr>
+      </w:pPr>
+      <w:r>
+        <w:rPr>
+          <w:rFonts w:eastAsiaTheme="minorEastAsia"/>
+        </w:rPr>
+        <w:t>Expressed in number of times</w:t>
+      </w:r>
+    </w:p>
+    <w:p>
+      <w:pPr>
+        <w:pStyle w:val="ListParagraph"/>
+        <w:numPr>
+          <w:ilvl w:val="0"/>
+          <w:numId w:val="54"/>
+        </w:numPr>
+        <w:rPr>
+          <w:rFonts w:eastAsiaTheme="minorEastAsia"/>
+        </w:rPr>
+      </w:pPr>
+      <w:r>
+        <w:rPr>
+          <w:rFonts w:eastAsiaTheme="minorEastAsia"/>
+        </w:rPr>
+        <w:t>That is rate of turning over or rotation</w:t>
+      </w:r>
+    </w:p>
+    <w:p>
+      <w:pPr>
+        <w:rPr>
+          <w:rFonts w:eastAsiaTheme="minorEastAsia"/>
+        </w:rPr>
+      </w:pPr>
+      <w:r>
+        <w:rPr>
+          <w:rFonts w:eastAsiaTheme="minorEastAsia"/>
+        </w:rPr>
+        <w:t>Inventory turnover ratio / stock turnover:</w:t>
+      </w:r>
+    </w:p>
+    <w:p>
+      <w:pPr>
+        <w:pStyle w:val="ListParagraph"/>
+        <w:numPr>
+          <w:ilvl w:val="0"/>
+          <w:numId w:val="55"/>
+        </w:numPr>
+        <w:rPr>
+          <w:rFonts w:eastAsiaTheme="minorEastAsia"/>
+        </w:rPr>
+      </w:pPr>
+      <w:r>
+        <w:rPr>
+          <w:rFonts w:eastAsiaTheme="minorEastAsia"/>
+        </w:rPr>
+        <w:t xml:space="preserve">Ascertain the efficiency of inventory management in terms of capital investment </w:t>
+      </w:r>
+    </w:p>
+    <w:p>
+      <w:pPr>
+        <w:pStyle w:val="ListParagraph"/>
+        <w:numPr>
+          <w:ilvl w:val="0"/>
+          <w:numId w:val="55"/>
+        </w:numPr>
+        <w:rPr>
+          <w:rFonts w:eastAsiaTheme="minorEastAsia"/>
+        </w:rPr>
+      </w:pPr>
+      <w:r>
+        <w:rPr>
+          <w:rFonts w:eastAsiaTheme="minorEastAsia"/>
+        </w:rPr>
+        <w:t xml:space="preserve">Shows relationship between cost of goods sold and the amount of average inventory. </w:t>
+      </w:r>
+    </w:p>
+    <w:p>
+      <w:pPr>
+        <w:pStyle w:val="ListParagraph"/>
+        <w:numPr>
+          <w:ilvl w:val="0"/>
+          <w:numId w:val="55"/>
+        </w:numPr>
+        <w:rPr>
+          <w:rFonts w:eastAsiaTheme="minorEastAsia"/>
+        </w:rPr>
+      </w:pPr>
+      <w:r>
+        <w:rPr>
+          <w:rFonts w:eastAsiaTheme="minorEastAsia"/>
+        </w:rPr>
+        <w:t>Indicates the number of times the inventory is turned over during a particular period</w:t>
+      </w:r>
+    </w:p>
+    <w:p>
+      <w:pPr>
+        <w:rPr>
+          <w:rFonts w:eastAsiaTheme="minorEastAsia"/>
+        </w:rPr>
+      </w:pPr>
+      <w:r>
+        <w:rPr>
+          <w:rFonts w:eastAsiaTheme="minorEastAsia"/>
+        </w:rPr>
+        <w:t>Stock turnover period / inventory turnover period or stock velocity:</w:t>
+      </w:r>
+    </w:p>
+    <w:p>
+      <w:pPr>
+        <w:pStyle w:val="ListParagraph"/>
+        <w:numPr>
+          <w:ilvl w:val="0"/>
+          <w:numId w:val="56"/>
+        </w:numPr>
+        <w:rPr>
+          <w:rFonts w:eastAsiaTheme="minorEastAsia"/>
+        </w:rPr>
+      </w:pPr>
+      <w:r>
+        <w:rPr>
+          <w:rFonts w:eastAsiaTheme="minorEastAsia"/>
+        </w:rPr>
+        <w:t>Related to time</w:t>
+      </w:r>
+    </w:p>
+    <w:p>
+      <w:pPr>
+        <w:pStyle w:val="ListParagraph"/>
+        <w:numPr>
+          <w:ilvl w:val="0"/>
+          <w:numId w:val="56"/>
+        </w:numPr>
+        <w:rPr>
+          <w:rFonts w:eastAsiaTheme="minorEastAsia"/>
+        </w:rPr>
+      </w:pPr>
+      <w:r>
+        <w:rPr>
+          <w:rFonts w:eastAsiaTheme="minorEastAsia"/>
+        </w:rPr>
+        <w:t xml:space="preserve">Expressed in terms of days or months </w:t>
+      </w:r>
+    </w:p>
+    <w:p>
+      <w:pPr>
+        <w:rPr>
+          <w:rFonts w:eastAsiaTheme="minorEastAsia"/>
+        </w:rPr>
+      </w:pPr>
+    </w:p>
+    <w:p>
+      <w:pPr>
+        <w:rPr>
+          <w:rFonts w:eastAsiaTheme="minorEastAsia"/>
+        </w:rPr>
+      </w:pPr>
+      <w:proofErr w:type="gramStart"/>
+      <w:r>
+        <w:rPr>
+          <w:rFonts w:eastAsiaTheme="minorEastAsia"/>
+        </w:rPr>
+        <w:t>Debtors</w:t>
+      </w:r>
+      <w:proofErr w:type="gramEnd"/>
+      <w:r>
+        <w:rPr>
+          <w:rFonts w:eastAsiaTheme="minorEastAsia"/>
+        </w:rPr>
+        <w:t xml:space="preserve"> turnover / receivable turnover or </w:t>
+      </w:r>
+      <w:proofErr w:type="gramStart"/>
+      <w:r>
+        <w:rPr>
+          <w:rFonts w:eastAsiaTheme="minorEastAsia"/>
+        </w:rPr>
+        <w:t>debtors</w:t>
+      </w:r>
+      <w:proofErr w:type="gramEnd"/>
+      <w:r>
+        <w:rPr>
+          <w:rFonts w:eastAsiaTheme="minorEastAsia"/>
+        </w:rPr>
+        <w:t xml:space="preserve"> velocity:</w:t>
+      </w:r>
+    </w:p>
+    <w:p>
+      <w:pPr>
+        <w:pStyle w:val="ListParagraph"/>
+        <w:numPr>
+          <w:ilvl w:val="0"/>
+          <w:numId w:val="57"/>
+        </w:numPr>
+        <w:rPr>
+          <w:rFonts w:eastAsiaTheme="minorEastAsia"/>
+        </w:rPr>
+      </w:pPr>
+      <w:r>
+        <w:rPr>
+          <w:rFonts w:eastAsiaTheme="minorEastAsia"/>
+        </w:rPr>
+        <w:t xml:space="preserve">Measures the numbers of times the receivable </w:t>
+      </w:r>
+      <w:proofErr w:type="gramStart"/>
+      <w:r>
+        <w:rPr>
+          <w:rFonts w:eastAsiaTheme="minorEastAsia"/>
+        </w:rPr>
+        <w:t>are</w:t>
+      </w:r>
+      <w:proofErr w:type="gramEnd"/>
+      <w:r>
+        <w:rPr>
+          <w:rFonts w:eastAsiaTheme="minorEastAsia"/>
+        </w:rPr>
+        <w:t xml:space="preserve"> rotated in a year in terms of sales</w:t>
+      </w:r>
+    </w:p>
+    <w:p>
+      <w:pPr>
+        <w:pStyle w:val="ListParagraph"/>
+        <w:numPr>
+          <w:ilvl w:val="0"/>
+          <w:numId w:val="57"/>
+        </w:numPr>
+        <w:rPr>
+          <w:rFonts w:eastAsiaTheme="minorEastAsia"/>
+        </w:rPr>
+      </w:pPr>
+      <w:r>
+        <w:rPr>
+          <w:rFonts w:eastAsiaTheme="minorEastAsia"/>
+        </w:rPr>
+        <w:t>Determine the operational efficiency (and its credit policy)</w:t>
+      </w:r>
+    </w:p>
+    <w:p>
+      <w:pPr>
+        <w:pStyle w:val="ListParagraph"/>
+        <w:numPr>
+          <w:ilvl w:val="0"/>
+          <w:numId w:val="57"/>
+        </w:numPr>
+        <w:rPr>
+          <w:rFonts w:eastAsiaTheme="minorEastAsia"/>
+        </w:rPr>
+      </w:pPr>
+      <w:r>
+        <w:rPr>
+          <w:rFonts w:eastAsiaTheme="minorEastAsia"/>
+        </w:rPr>
+        <w:t xml:space="preserve">Relationship between receivables and sales </w:t>
+      </w:r>
+    </w:p>
+    <w:p>
+      <w:pPr>
+        <w:rPr>
+          <w:rFonts w:eastAsiaTheme="minorEastAsia"/>
+        </w:rPr>
+      </w:pPr>
+      <w:r>
+        <w:rPr>
+          <w:rFonts w:eastAsiaTheme="minorEastAsia"/>
+        </w:rPr>
+        <w:t>Credit turnover ratio or accounts payable turnover or creditors velocity:</w:t>
+      </w:r>
+    </w:p>
+    <w:p>
+      <w:pPr>
+        <w:pStyle w:val="ListParagraph"/>
+        <w:numPr>
+          <w:ilvl w:val="0"/>
+          <w:numId w:val="58"/>
+        </w:numPr>
+        <w:rPr>
+          <w:rFonts w:eastAsiaTheme="minorEastAsia"/>
+        </w:rPr>
+      </w:pPr>
+      <w:r>
+        <w:rPr>
+          <w:rFonts w:eastAsiaTheme="minorEastAsia"/>
+        </w:rPr>
+        <w:lastRenderedPageBreak/>
+        <w:t xml:space="preserve">Measures the number of times the </w:t>
+      </w:r>
+      <w:r>
+        <w:rPr>
+          <w:rFonts w:eastAsiaTheme="minorEastAsia"/>
+        </w:rPr>
+        <w:t>payable rotate in a year</w:t>
+      </w:r>
+    </w:p>
+    <w:p>
+      <w:pPr>
+        <w:pStyle w:val="ListParagraph"/>
+        <w:numPr>
+          <w:ilvl w:val="0"/>
+          <w:numId w:val="58"/>
+        </w:numPr>
+        <w:rPr>
+          <w:rFonts w:eastAsiaTheme="minorEastAsia"/>
+        </w:rPr>
+      </w:pPr>
+      <w:r>
+        <w:rPr>
+          <w:rFonts w:eastAsiaTheme="minorEastAsia"/>
+        </w:rPr>
+        <w:t>Indicates the relationship between net purchase for whole year and total payable</w:t>
+      </w:r>
+    </w:p>
+    <w:p>
+      <w:pPr>
+        <w:rPr>
+          <w:rFonts w:eastAsiaTheme="minorEastAsia"/>
+        </w:rPr>
+      </w:pPr>
+      <w:r>
+        <w:rPr>
+          <w:rFonts w:eastAsiaTheme="minorEastAsia"/>
+        </w:rPr>
+        <w:t>Working capital turnover ratio:</w:t>
+      </w:r>
+    </w:p>
+    <w:p>
+      <w:pPr>
+        <w:pStyle w:val="ListParagraph"/>
+        <w:numPr>
+          <w:ilvl w:val="0"/>
+          <w:numId w:val="59"/>
+        </w:numPr>
+        <w:rPr>
+          <w:rFonts w:eastAsiaTheme="minorEastAsia"/>
+        </w:rPr>
+      </w:pPr>
+      <w:r>
+        <w:rPr>
+          <w:rFonts w:eastAsiaTheme="minorEastAsia"/>
+        </w:rPr>
+        <w:t xml:space="preserve">Measures the effective utilisation of working capital </w:t>
+      </w:r>
+    </w:p>
+    <w:p>
+      <w:pPr>
+        <w:pStyle w:val="ListParagraph"/>
+        <w:numPr>
+          <w:ilvl w:val="0"/>
+          <w:numId w:val="59"/>
+        </w:numPr>
+        <w:rPr>
+          <w:rFonts w:eastAsiaTheme="minorEastAsia"/>
+        </w:rPr>
+      </w:pPr>
+      <w:r>
+        <w:rPr>
+          <w:rFonts w:eastAsiaTheme="minorEastAsia"/>
+        </w:rPr>
+        <w:t xml:space="preserve">Relationship between sales / cost of sales and working capital </w:t>
+      </w:r>
+    </w:p>
+    <w:p>
+      <w:pPr>
+        <w:rPr>
+          <w:rFonts w:eastAsiaTheme="minorEastAsia"/>
+        </w:rPr>
+      </w:pPr>
+      <w:r>
+        <w:rPr>
+          <w:rFonts w:eastAsiaTheme="minorEastAsia"/>
+        </w:rPr>
+        <w:t>Fixed assets turnover ratio:</w:t>
+      </w:r>
+    </w:p>
+    <w:p>
+      <w:pPr>
+        <w:pStyle w:val="ListParagraph"/>
+        <w:numPr>
+          <w:ilvl w:val="0"/>
+          <w:numId w:val="60"/>
+        </w:numPr>
+        <w:rPr>
+          <w:rFonts w:eastAsiaTheme="minorEastAsia"/>
+        </w:rPr>
+      </w:pPr>
+      <w:r>
+        <w:rPr>
+          <w:rFonts w:eastAsiaTheme="minorEastAsia"/>
+        </w:rPr>
+        <w:t xml:space="preserve">Effective utilisation of fixed assets and profitability of a business </w:t>
+      </w:r>
+      <w:r>
+        <w:rPr>
+          <w:rFonts w:eastAsiaTheme="minorEastAsia"/>
+        </w:rPr>
+        <w:t>concern</w:t>
+      </w:r>
+    </w:p>
+    <w:p>
+      <w:pPr>
+        <w:pStyle w:val="ListParagraph"/>
+        <w:numPr>
+          <w:ilvl w:val="0"/>
+          <w:numId w:val="60"/>
+        </w:numPr>
+        <w:rPr>
+          <w:rFonts w:eastAsiaTheme="minorEastAsia"/>
+        </w:rPr>
+      </w:pPr>
+      <w:r>
+        <w:rPr>
+          <w:rFonts w:eastAsiaTheme="minorEastAsia"/>
+        </w:rPr>
+        <w:t>Higher the ratio greater efficiency</w:t>
+      </w:r>
+    </w:p>
+    <w:p>
+      <w:pPr>
+        <w:pStyle w:val="ListParagraph"/>
+        <w:numPr>
+          <w:ilvl w:val="0"/>
+          <w:numId w:val="60"/>
+        </w:numPr>
+        <w:rPr>
+          <w:rFonts w:eastAsiaTheme="minorEastAsia"/>
+        </w:rPr>
+      </w:pPr>
+      <w:r>
+        <w:rPr>
+          <w:rFonts w:eastAsiaTheme="minorEastAsia"/>
+        </w:rPr>
+        <w:t>Lower the ratio lesser the efficiency</w:t>
+      </w:r>
+    </w:p>
+    <w:p>
+      <w:pPr>
+        <w:rPr>
+          <w:rFonts w:eastAsiaTheme="minorEastAsia"/>
+        </w:rPr>
+      </w:pPr>
+      <w:r>
+        <w:rPr>
+          <w:rFonts w:eastAsiaTheme="minorEastAsia"/>
+        </w:rPr>
+        <w:t>Capital turnover ratio:</w:t>
+      </w:r>
+    </w:p>
+    <w:p>
+      <w:pPr>
+        <w:pStyle w:val="ListParagraph"/>
+        <w:numPr>
+          <w:ilvl w:val="0"/>
+          <w:numId w:val="61"/>
+        </w:numPr>
+        <w:rPr>
+          <w:rFonts w:eastAsiaTheme="minorEastAsia"/>
+        </w:rPr>
+      </w:pPr>
+      <w:r>
+        <w:rPr>
+          <w:rFonts w:eastAsiaTheme="minorEastAsia"/>
+        </w:rPr>
+        <w:t xml:space="preserve">Calculated managerial efficiency </w:t>
+      </w:r>
+    </w:p>
+    <w:p>
+      <w:pPr>
+        <w:pStyle w:val="ListParagraph"/>
+        <w:numPr>
+          <w:ilvl w:val="0"/>
+          <w:numId w:val="61"/>
+        </w:numPr>
+        <w:rPr>
+          <w:rFonts w:eastAsiaTheme="minorEastAsia"/>
+        </w:rPr>
+      </w:pPr>
+      <w:r>
+        <w:rPr>
+          <w:rFonts w:eastAsiaTheme="minorEastAsia"/>
+        </w:rPr>
+        <w:t xml:space="preserve">Establishing the relationship between cost of sales or sales with capital </w:t>
+      </w:r>
+    </w:p>
+    <w:p>
+      <w:pPr>
+        <w:rPr>
+          <w:rFonts w:eastAsiaTheme="minorEastAsia"/>
+        </w:rPr>
+      </w:pPr>
+    </w:p>
+    <w:p>
+      <w:pPr>
+        <w:rPr>
+          <w:rFonts w:eastAsiaTheme="minorEastAsia"/>
+        </w:rPr>
+      </w:pPr>
+      <w:r>
+        <w:rPr>
+          <w:rFonts w:eastAsiaTheme="minorEastAsia"/>
+        </w:rPr>
+        <w:t xml:space="preserve">Q. calculate turnover ratios from the following figures </w:t>
+      </w:r>
+    </w:p>
+    <w:p>
+      <w:pPr>
+        <w:rPr>
+          <w:rFonts w:eastAsiaTheme="minorEastAsia"/>
+        </w:rPr>
+      </w:pPr>
+      <w:r>
+        <w:rPr>
+          <w:rFonts w:eastAsiaTheme="minorEastAsia"/>
+          <w:noProof/>
+        </w:rPr>
+        <w:drawing>
+          <wp:inline distT="0" distB="0" distL="0" distR="0" wp14:anchorId="3FBAB553" wp14:editId="298407D0">
+            <wp:extent cx="2962275" cy="3248025"/>
+            <wp:effectExtent l="0" t="0" r="0" b="9525"/>
+            <wp:docPr id="997216582" name="Picture 2"/>
+            <wp:cNvGraphicFramePr>
+              <a:graphicFrameLocks xmlns:a="http://schemas.openxmlformats.org/drawingml/2006/main" noChangeAspect="1"/>
+            </wp:cNvGraphicFramePr>
+            <a:graphic xmlns:a="http://schemas.openxmlformats.org/drawingml/2006/main">
+              <a:graphicData uri="http://schemas.openxmlformats.org/drawingml/2006/picture">
+                <pic:pic xmlns:pic="http://schemas.openxmlformats.org/drawingml/2006/picture">
+                  <pic:nvPicPr>
+                    <pic:cNvPr id="0" name="Picture 2"/>
+                    <pic:cNvPicPr>
+                      <a:picLocks noChangeAspect="1" noChangeArrowheads="1"/>
+                    </pic:cNvPicPr>
+                  </pic:nvPicPr>
+                  <pic:blipFill>
+                    <a:blip r:embed="rId16">
+                      <a:extLst>
+                        <a:ext uri="{28A0092B-C50C-407E-A947-70E740481C1C}">
+                          <a14:useLocalDpi xmlns:a14="http://schemas.microsoft.com/office/drawing/2010/main" val="0"/>
+                        </a:ext>
+                      </a:extLst>
+                    </a:blip>
+                    <a:srcRect/>
+                    <a:stretch>
+                      <a:fillRect/>
+                    </a:stretch>
+                  </pic:blipFill>
+                  <pic:spPr bwMode="auto">
+                    <a:xfrm>
+                      <a:off x="0" y="0"/>
+                      <a:ext cx="2962275" cy="3248025"/>
+                    </a:xfrm>
+                    <a:prstGeom prst="rect">
+                      <a:avLst/>
+                    </a:prstGeom>
+                    <a:noFill/>
+                    <a:ln>
+                      <a:noFill/>
+                    </a:ln>
+                  </pic:spPr>
+                </pic:pic>
+              </a:graphicData>
+            </a:graphic>
+          </wp:inline>
+        </w:drawing>
+      </w:r>
+    </w:p>
+    <w:p>
+      <w:pPr>
+        <w:rPr>
+          <w:rFonts w:eastAsiaTheme="minorEastAsia"/>
+        </w:rPr>
+      </w:pPr>
+      <w:r>
+        <w:rPr>
+          <w:rFonts w:eastAsiaTheme="minorEastAsia"/>
+        </w:rPr>
+        <w:t>Calculate the turnover ratio</w:t>
+      </w:r>
+      <w:r>
+        <w:rPr>
+          <w:rFonts w:eastAsiaTheme="minorEastAsia"/>
+        </w:rPr>
+        <w:t>, fixed asset turnover ratio</w:t>
+      </w:r>
+      <w:r>
+        <w:rPr>
+          <w:rFonts w:eastAsiaTheme="minorEastAsia"/>
+        </w:rPr>
+        <w:t>, debtor turnover ratio</w:t>
+      </w:r>
+    </w:p>
+    <w:p>
+      <w:pPr>
+        <w:rPr>
+          <w:rFonts w:eastAsiaTheme="minorEastAsia"/>
+        </w:rPr>
+      </w:pPr>
+      <w:r>
+        <w:rPr>
+          <w:rFonts w:eastAsiaTheme="minorEastAsia"/>
+        </w:rPr>
+        <w:t>Turnover ratio or activity ratio:</w:t>
+      </w:r>
+    </w:p>
+    <w:p>
+      <w:pPr>
+        <w:rPr>
+          <w:rFonts w:eastAsiaTheme="minorEastAsia"/>
+        </w:rPr>
+      </w:pPr>
+      <w:r>
+        <w:rPr>
+          <w:rFonts w:eastAsiaTheme="minorEastAsia"/>
+        </w:rPr>
+        <w:t xml:space="preserve">1. </w:t>
+      </w:r>
+      <m:oMath>
+        <m:r>
+          <w:rPr>
+            <w:rFonts w:ascii="Cambria Math" w:eastAsiaTheme="minorEastAsia" w:hAnsi="Cambria Math"/>
+          </w:rPr>
+          <m:t xml:space="preserve">stock turn ratio = </m:t>
+        </m:r>
+        <m:f>
+          <m:fPr>
+            <m:ctrlPr>
+              <w:rPr>
+                <w:rFonts w:ascii="Cambria Math" w:eastAsiaTheme="minorEastAsia" w:hAnsi="Cambria Math"/>
+                <w:i/>
+              </w:rPr>
+            </m:ctrlPr>
+          </m:fPr>
+          <m:num>
+            <m:r>
+              <w:rPr>
+                <w:rFonts w:ascii="Cambria Math" w:eastAsiaTheme="minorEastAsia" w:hAnsi="Cambria Math"/>
+              </w:rPr>
+              <m:t>cost of sales</m:t>
+            </m:r>
+          </m:num>
+          <m:den>
+            <m:r>
+              <w:rPr>
+                <w:rFonts w:ascii="Cambria Math" w:eastAsiaTheme="minorEastAsia" w:hAnsi="Cambria Math"/>
+              </w:rPr>
+              <m:t>net sales</m:t>
+            </m:r>
+          </m:den>
+        </m:f>
+      </m:oMath>
+    </w:p>
+    <w:p>
+      <w:pPr>
+        <w:rPr>
+          <w:rFonts w:eastAsiaTheme="minorEastAsia"/>
+        </w:rPr>
+      </w:pPr>
+      <w:r>
+        <w:rPr>
+          <w:rFonts w:eastAsiaTheme="minorEastAsia"/>
+        </w:rPr>
+        <w:t>Cost of sales = net sales – gross profit</w:t>
+      </w:r>
+    </w:p>
+    <w:p>
+      <w:pPr>
+        <w:rPr>
+          <w:rFonts w:eastAsiaTheme="minorEastAsia"/>
+        </w:rPr>
+      </w:pPr>
+      <w:r>
+        <w:rPr>
+          <w:rFonts w:eastAsiaTheme="minorEastAsia"/>
+        </w:rPr>
+        <w:lastRenderedPageBreak/>
+        <w:t>Net sales = sales – sales return = 500,000 – 20,000 = 480,000</w:t>
+      </w:r>
+    </w:p>
+    <w:p>
+      <w:pPr>
+        <w:rPr>
+          <w:rFonts w:eastAsiaTheme="minorEastAsia"/>
+        </w:rPr>
+      </w:pPr>
+      <w:r>
+        <w:rPr>
+          <w:rFonts w:eastAsiaTheme="minorEastAsia"/>
+        </w:rPr>
+        <w:t xml:space="preserve">Average stock = </w:t>
+      </w:r>
+      <m:oMath>
+        <m:f>
+          <m:fPr>
+            <m:ctrlPr>
+              <w:rPr>
+                <w:rFonts w:ascii="Cambria Math" w:eastAsiaTheme="minorEastAsia" w:hAnsi="Cambria Math"/>
+                <w:i/>
+              </w:rPr>
+            </m:ctrlPr>
+          </m:fPr>
+          <m:num>
+            <m:r>
+              <w:rPr>
+                <w:rFonts w:ascii="Cambria Math" w:eastAsiaTheme="minorEastAsia" w:hAnsi="Cambria Math"/>
+              </w:rPr>
+              <m:t>Opening stock + closing stock</m:t>
+            </m:r>
+          </m:num>
+          <m:den>
+            <m:r>
+              <w:rPr>
+                <w:rFonts w:ascii="Cambria Math" w:eastAsiaTheme="minorEastAsia" w:hAnsi="Cambria Math"/>
+              </w:rPr>
+              <m:t>2</m:t>
+            </m:r>
+          </m:den>
+        </m:f>
+        <m:r>
+          <w:rPr>
+            <w:rFonts w:ascii="Cambria Math" w:eastAsiaTheme="minorEastAsia" w:hAnsi="Cambria Math"/>
+          </w:rPr>
+          <m:t xml:space="preserve"> = </m:t>
+        </m:r>
+        <m:f>
+          <m:fPr>
+            <m:ctrlPr>
+              <w:rPr>
+                <w:rFonts w:ascii="Cambria Math" w:eastAsiaTheme="minorEastAsia" w:hAnsi="Cambria Math"/>
+                <w:i/>
+              </w:rPr>
+            </m:ctrlPr>
+          </m:fPr>
+          <m:num>
+            <m:r>
+              <w:rPr>
+                <w:rFonts w:ascii="Cambria Math" w:eastAsiaTheme="minorEastAsia" w:hAnsi="Cambria Math"/>
+              </w:rPr>
+              <m:t>50000+40000</m:t>
+            </m:r>
+          </m:num>
+          <m:den>
+            <m:r>
+              <w:rPr>
+                <w:rFonts w:ascii="Cambria Math" w:eastAsiaTheme="minorEastAsia" w:hAnsi="Cambria Math"/>
+              </w:rPr>
+              <m:t>2</m:t>
+            </m:r>
+          </m:den>
+        </m:f>
+        <m:r>
+          <w:rPr>
+            <w:rFonts w:ascii="Cambria Math" w:eastAsiaTheme="minorEastAsia" w:hAnsi="Cambria Math"/>
+          </w:rPr>
+          <m:t xml:space="preserve"> = 45000</m:t>
+        </m:r>
+      </m:oMath>
+    </w:p>
+    <w:p>
+      <w:pPr>
+        <w:rPr>
+          <w:rFonts w:eastAsiaTheme="minorEastAsia"/>
+        </w:rPr>
+      </w:pPr>
+      <w:r>
+        <w:rPr>
+          <w:rFonts w:eastAsiaTheme="minorEastAsia"/>
+        </w:rPr>
+        <w:t>Stock turnover ratio</w:t>
+      </w:r>
+      <w:r>
+        <w:rPr>
+          <w:rFonts w:eastAsiaTheme="minorEastAsia"/>
+        </w:rPr>
+        <w:t xml:space="preserve"> = </w:t>
+      </w:r>
+      <m:oMath>
+        <m:f>
+          <m:fPr>
+            <m:ctrlPr>
+              <w:rPr>
+                <w:rFonts w:ascii="Cambria Math" w:eastAsiaTheme="minorEastAsia" w:hAnsi="Cambria Math"/>
+                <w:i/>
+              </w:rPr>
+            </m:ctrlPr>
+          </m:fPr>
+          <m:num>
+            <m:r>
+              <w:rPr>
+                <w:rFonts w:ascii="Cambria Math" w:eastAsiaTheme="minorEastAsia" w:hAnsi="Cambria Math"/>
+              </w:rPr>
+              <m:t>380000</m:t>
+            </m:r>
+          </m:num>
+          <m:den>
+            <m:r>
+              <w:rPr>
+                <w:rFonts w:ascii="Cambria Math" w:eastAsiaTheme="minorEastAsia" w:hAnsi="Cambria Math"/>
+              </w:rPr>
+              <m:t>45000</m:t>
+            </m:r>
+          </m:den>
+        </m:f>
+        <m:r>
+          <w:rPr>
+            <w:rFonts w:ascii="Cambria Math" w:eastAsiaTheme="minorEastAsia" w:hAnsi="Cambria Math"/>
+          </w:rPr>
+          <m:t>=8.45 times</m:t>
+        </m:r>
+      </m:oMath>
+    </w:p>
+    <w:p>
+      <w:pPr>
+        <w:rPr>
+          <w:rFonts w:eastAsiaTheme="minorEastAsia"/>
+        </w:rPr>
+      </w:pPr>
+      <w:r>
+        <w:rPr>
+          <w:rFonts w:eastAsiaTheme="minorEastAsia"/>
+        </w:rPr>
+        <w:t>2. fixed asset turnover ratio:</w:t>
+      </w:r>
+    </w:p>
+    <w:p>
+      <w:pPr>
+        <w:rPr>
+          <w:rFonts w:eastAsiaTheme="minorEastAsia"/>
+        </w:rPr>
+      </w:pPr>
+      <m:oMathPara>
+        <m:oMath>
+          <m:r>
+            <w:rPr>
+              <w:rFonts w:ascii="Cambria Math" w:eastAsiaTheme="minorEastAsia" w:hAnsi="Cambria Math"/>
+            </w:rPr>
+            <m:t xml:space="preserve">= </m:t>
+          </m:r>
+          <m:f>
+            <m:fPr>
+              <m:ctrlPr>
+                <w:rPr>
+                  <w:rFonts w:ascii="Cambria Math" w:eastAsiaTheme="minorEastAsia" w:hAnsi="Cambria Math"/>
+                  <w:i/>
+                </w:rPr>
+              </m:ctrlPr>
+            </m:fPr>
+            <m:num>
+              <m:r>
+                <w:rPr>
+                  <w:rFonts w:ascii="Cambria Math" w:eastAsiaTheme="minorEastAsia" w:hAnsi="Cambria Math"/>
+                </w:rPr>
+                <m:t>cost of sales</m:t>
+              </m:r>
+            </m:num>
+            <m:den>
+              <m:r>
+                <w:rPr>
+                  <w:rFonts w:ascii="Cambria Math" w:eastAsiaTheme="minorEastAsia" w:hAnsi="Cambria Math"/>
+                </w:rPr>
+                <m:t>fixed assets</m:t>
+              </m:r>
+            </m:den>
+          </m:f>
+          <m:r>
+            <w:rPr>
+              <w:rFonts w:ascii="Cambria Math" w:eastAsiaTheme="minorEastAsia" w:hAnsi="Cambria Math"/>
+            </w:rPr>
+            <m:t xml:space="preserve"> or </m:t>
+          </m:r>
+          <m:f>
+            <m:fPr>
+              <m:ctrlPr>
+                <w:rPr>
+                  <w:rFonts w:ascii="Cambria Math" w:eastAsiaTheme="minorEastAsia" w:hAnsi="Cambria Math"/>
+                  <w:i/>
+                </w:rPr>
+              </m:ctrlPr>
+            </m:fPr>
+            <m:num>
+              <m:r>
+                <w:rPr>
+                  <w:rFonts w:ascii="Cambria Math" w:eastAsiaTheme="minorEastAsia" w:hAnsi="Cambria Math"/>
+                </w:rPr>
+                <m:t>net sales</m:t>
+              </m:r>
+            </m:num>
+            <m:den>
+              <m:r>
+                <w:rPr>
+                  <w:rFonts w:ascii="Cambria Math" w:eastAsiaTheme="minorEastAsia" w:hAnsi="Cambria Math"/>
+                </w:rPr>
+                <m:t>fixed assets</m:t>
+              </m:r>
+            </m:den>
+          </m:f>
+        </m:oMath>
+      </m:oMathPara>
+    </w:p>
+    <w:p>
+      <w:pPr>
+        <w:rPr>
+          <w:rFonts w:eastAsiaTheme="minorEastAsia"/>
+        </w:rPr>
+      </w:pPr>
+      <m:oMathPara>
+        <m:oMath>
+          <m:r>
+            <w:rPr>
+              <w:rFonts w:ascii="Cambria Math" w:eastAsiaTheme="minorEastAsia" w:hAnsi="Cambria Math"/>
+            </w:rPr>
+            <m:t xml:space="preserve">= </m:t>
+          </m:r>
+          <m:f>
+            <m:fPr>
+              <m:ctrlPr>
+                <w:rPr>
+                  <w:rFonts w:ascii="Cambria Math" w:eastAsiaTheme="minorEastAsia" w:hAnsi="Cambria Math"/>
+                  <w:i/>
+                </w:rPr>
+              </m:ctrlPr>
+            </m:fPr>
+            <m:num>
+              <m:r>
+                <w:rPr>
+                  <w:rFonts w:ascii="Cambria Math" w:eastAsiaTheme="minorEastAsia" w:hAnsi="Cambria Math"/>
+                </w:rPr>
+                <m:t>380000</m:t>
+              </m:r>
+            </m:num>
+            <m:den>
+              <m:r>
+                <w:rPr>
+                  <w:rFonts w:ascii="Cambria Math" w:eastAsiaTheme="minorEastAsia" w:hAnsi="Cambria Math"/>
+                </w:rPr>
+                <m:t>1000000</m:t>
+              </m:r>
+            </m:den>
+          </m:f>
+          <m:r>
+            <w:rPr>
+              <w:rFonts w:ascii="Cambria Math" w:eastAsiaTheme="minorEastAsia" w:hAnsi="Cambria Math"/>
+            </w:rPr>
+            <m:t>or</m:t>
+          </m:r>
+          <m:f>
+            <m:fPr>
+              <m:ctrlPr>
+                <w:rPr>
+                  <w:rFonts w:ascii="Cambria Math" w:eastAsiaTheme="minorEastAsia" w:hAnsi="Cambria Math"/>
+                  <w:i/>
+                </w:rPr>
+              </m:ctrlPr>
+            </m:fPr>
+            <m:num>
+              <m:r>
+                <w:rPr>
+                  <w:rFonts w:ascii="Cambria Math" w:eastAsiaTheme="minorEastAsia" w:hAnsi="Cambria Math"/>
+                </w:rPr>
+                <m:t>480000</m:t>
+              </m:r>
+            </m:num>
+            <m:den>
+              <m:r>
+                <w:rPr>
+                  <w:rFonts w:ascii="Cambria Math" w:eastAsiaTheme="minorEastAsia" w:hAnsi="Cambria Math"/>
+                </w:rPr>
+                <m:t>1000000</m:t>
+              </m:r>
+            </m:den>
+          </m:f>
+        </m:oMath>
+      </m:oMathPara>
+    </w:p>
+    <w:p>
+      <w:pPr>
+        <w:rPr>
+          <w:rFonts w:eastAsiaTheme="minorEastAsia"/>
+        </w:rPr>
+      </w:pPr>
+      <m:oMathPara>
+        <m:oMath>
+          <m:r>
+            <w:rPr>
+              <w:rFonts w:ascii="Cambria Math" w:eastAsiaTheme="minorEastAsia" w:hAnsi="Cambria Math"/>
+            </w:rPr>
+            <m:t>=3.38timesor0.48times</m:t>
+          </m:r>
+        </m:oMath>
+      </m:oMathPara>
+    </w:p>
+    <w:p>
+      <w:pPr>
+        <w:rPr>
+          <w:rFonts w:eastAsiaTheme="minorEastAsia"/>
+        </w:rPr>
+      </w:pPr>
+      <w:r>
+        <w:rPr>
+          <w:rFonts w:eastAsiaTheme="minorEastAsia"/>
+        </w:rPr>
+        <w:t>3. a) debtor’s turnover ratio:</w:t>
+      </w:r>
+    </w:p>
+    <w:p>
+      <w:pPr>
+        <w:rPr>
+          <w:rFonts w:eastAsiaTheme="minorEastAsia"/>
+        </w:rPr>
+      </w:pPr>
+      <m:oMath>
+        <m:f>
+          <m:fPr>
+            <m:ctrlPr>
+              <w:rPr>
+                <w:rFonts w:ascii="Cambria Math" w:eastAsiaTheme="minorEastAsia" w:hAnsi="Cambria Math"/>
+                <w:i/>
+              </w:rPr>
+            </m:ctrlPr>
+          </m:fPr>
+          <m:num>
+            <m:r>
+              <w:rPr>
+                <w:rFonts w:ascii="Cambria Math" w:eastAsiaTheme="minorEastAsia" w:hAnsi="Cambria Math"/>
+              </w:rPr>
+              <m:t>credit sales</m:t>
+            </m:r>
+          </m:num>
+          <m:den>
+            <m:r>
+              <w:rPr>
+                <w:rFonts w:ascii="Cambria Math" w:eastAsiaTheme="minorEastAsia" w:hAnsi="Cambria Math"/>
+              </w:rPr>
+              <m:t>average accounts receivable</m:t>
+            </m:r>
+          </m:den>
+        </m:f>
+        <m:r>
+          <w:rPr>
+            <w:rFonts w:ascii="Cambria Math" w:eastAsiaTheme="minorEastAsia" w:hAnsi="Cambria Math"/>
+          </w:rPr>
+          <m:t>=</m:t>
+        </m:r>
+        <m:f>
+          <m:fPr>
+            <m:ctrlPr>
+              <w:rPr>
+                <w:rFonts w:ascii="Cambria Math" w:eastAsiaTheme="minorEastAsia" w:hAnsi="Cambria Math"/>
+                <w:i/>
+              </w:rPr>
+            </m:ctrlPr>
+          </m:fPr>
+          <m:num>
+            <m:r>
+              <w:rPr>
+                <w:rFonts w:ascii="Cambria Math" w:eastAsiaTheme="minorEastAsia" w:hAnsi="Cambria Math"/>
+              </w:rPr>
+              <m:t>440000</m:t>
+            </m:r>
+          </m:num>
+          <m:den>
+            <m:r>
+              <w:rPr>
+                <w:rFonts w:ascii="Cambria Math" w:eastAsiaTheme="minorEastAsia" w:hAnsi="Cambria Math"/>
+              </w:rPr>
+              <m:t>100000</m:t>
+            </m:r>
+          </m:den>
+        </m:f>
+      </m:oMath>
+      <w:r>
+        <w:rPr>
+          <w:rFonts w:eastAsiaTheme="minorEastAsia"/>
+        </w:rPr>
+        <w:t xml:space="preserve"> = 4.4 times </w:t>
+      </w:r>
+    </w:p>
+    <w:p>
+      <w:pPr>
+        <w:rPr>
+          <w:rFonts w:eastAsiaTheme="minorEastAsia"/>
+        </w:rPr>
+      </w:pPr>
+      <w:r>
+        <w:rPr>
+          <w:rFonts w:eastAsiaTheme="minorEastAsia"/>
+        </w:rPr>
+        <w:t>Credit sales = total sales – cash sales – sales</w:t>
+      </w:r>
+    </w:p>
+    <w:p>
+      <w:pPr>
+        <w:rPr>
+          <w:rFonts w:eastAsiaTheme="minorEastAsia"/>
+        </w:rPr>
+      </w:pPr>
+      <w:r>
+        <w:rPr>
+          <w:rFonts w:eastAsiaTheme="minorEastAsia"/>
+        </w:rPr>
+        <w:t>= 500,000 – 40,000 – 20,000 = 440,000</w:t>
+      </w:r>
+    </w:p>
+    <w:p>
+      <w:pPr>
+        <w:rPr>
+          <w:rFonts w:eastAsiaTheme="minorEastAsia"/>
+        </w:rPr>
+      </w:pPr>
+      <w:r>
+        <w:rPr>
+          <w:rFonts w:eastAsiaTheme="minorEastAsia"/>
+        </w:rPr>
+        <w:t xml:space="preserve">Accounts receivable = debtors + bills </w:t>
+      </w:r>
+      <w:proofErr w:type="spellStart"/>
+      <w:r>
+        <w:rPr>
+          <w:rFonts w:eastAsiaTheme="minorEastAsia"/>
+        </w:rPr>
+        <w:t>receibles</w:t>
+      </w:r>
+      <w:proofErr w:type="spellEnd"/>
+      <w:r>
+        <w:rPr>
+          <w:rFonts w:eastAsiaTheme="minorEastAsia"/>
+        </w:rPr>
+        <w:t xml:space="preserve"> </w:t>
+      </w:r>
+    </w:p>
+    <w:p>
+      <w:pPr>
+        <w:rPr>
+          <w:rFonts w:eastAsiaTheme="minorEastAsia"/>
+        </w:rPr>
+      </w:pPr>
+      <w:r>
+        <w:rPr>
+          <w:rFonts w:eastAsiaTheme="minorEastAsia"/>
+        </w:rPr>
+        <w:t>= 80,000 + 20,000 = 100,000</w:t>
+      </w:r>
+    </w:p>
+    <w:p>
+      <w:pPr>
+        <w:rPr>
+          <w:rFonts w:eastAsiaTheme="minorEastAsia"/>
+        </w:rPr>
+      </w:pPr>
+      <w:r>
+        <w:rPr>
+          <w:rFonts w:eastAsiaTheme="minorEastAsia"/>
+        </w:rPr>
+        <w:t xml:space="preserve">3. b) debtors collection period </w:t>
+      </w:r>
+    </w:p>
+    <w:p>
+      <w:pPr>
+        <w:rPr>
+          <w:rFonts w:eastAsiaTheme="minorEastAsia"/>
+        </w:rPr>
+      </w:pPr>
+      <m:oMathPara>
+        <m:oMath>
+          <m:r>
+            <w:rPr>
+              <w:rFonts w:ascii="Cambria Math" w:eastAsiaTheme="minorEastAsia" w:hAnsi="Cambria Math"/>
+            </w:rPr>
+            <m:t xml:space="preserve">= </m:t>
+          </m:r>
+          <m:f>
+            <m:fPr>
+              <m:ctrlPr>
+                <w:rPr>
+                  <w:rFonts w:ascii="Cambria Math" w:eastAsiaTheme="minorEastAsia" w:hAnsi="Cambria Math"/>
+                  <w:i/>
+                </w:rPr>
+              </m:ctrlPr>
+            </m:fPr>
+            <m:num>
+              <m:r>
+                <w:rPr>
+                  <w:rFonts w:ascii="Cambria Math" w:eastAsiaTheme="minorEastAsia" w:hAnsi="Cambria Math"/>
+                </w:rPr>
+                <m:t>month in a year</m:t>
+              </m:r>
+            </m:num>
+            <m:den>
+              <m:r>
+                <w:rPr>
+                  <w:rFonts w:ascii="Cambria Math" w:eastAsiaTheme="minorEastAsia" w:hAnsi="Cambria Math"/>
+                </w:rPr>
+                <m:t>debtors turnover</m:t>
+              </m:r>
+            </m:den>
+          </m:f>
+          <m:r>
+            <w:rPr>
+              <w:rFonts w:ascii="Cambria Math" w:eastAsiaTheme="minorEastAsia" w:hAnsi="Cambria Math"/>
+            </w:rPr>
+            <m:t>=</m:t>
+          </m:r>
+          <m:f>
+            <m:fPr>
+              <m:ctrlPr>
+                <w:rPr>
+                  <w:rFonts w:ascii="Cambria Math" w:eastAsiaTheme="minorEastAsia" w:hAnsi="Cambria Math"/>
+                  <w:i/>
+                </w:rPr>
+              </m:ctrlPr>
+            </m:fPr>
+            <m:num>
+              <m:r>
+                <w:rPr>
+                  <w:rFonts w:ascii="Cambria Math" w:eastAsiaTheme="minorEastAsia" w:hAnsi="Cambria Math"/>
+                </w:rPr>
+                <m:t>12</m:t>
+              </m:r>
+            </m:num>
+            <m:den>
+              <m:r>
+                <w:rPr>
+                  <w:rFonts w:ascii="Cambria Math" w:eastAsiaTheme="minorEastAsia" w:hAnsi="Cambria Math"/>
+                </w:rPr>
+                <m:t>4.4</m:t>
+              </m:r>
+            </m:den>
+          </m:f>
+          <m:r>
+            <w:rPr>
+              <w:rFonts w:ascii="Cambria Math" w:eastAsiaTheme="minorEastAsia" w:hAnsi="Cambria Math"/>
+            </w:rPr>
+            <m:t>=2.73 months</m:t>
+          </m:r>
+        </m:oMath>
+      </m:oMathPara>
+    </w:p>
+    <w:p>
+      <w:pPr>
+        <w:jc w:val="center"/>
+        <w:rPr>
+          <w:rFonts w:eastAsiaTheme="minorEastAsia"/>
+        </w:rPr>
+      </w:pPr>
+      <w:r>
+        <w:rPr>
+          <w:rFonts w:eastAsiaTheme="minorEastAsia"/>
+        </w:rPr>
+        <w:t>OR</w:t>
+      </w:r>
+    </w:p>
+    <w:p>
+      <w:pPr>
+        <w:rPr>
+          <w:rFonts w:eastAsiaTheme="minorEastAsia"/>
+        </w:rPr>
+      </w:pPr>
+      <m:oMathPara>
+        <m:oMath>
+          <m:r>
+            <w:rPr>
+              <w:rFonts w:ascii="Cambria Math" w:eastAsiaTheme="minorEastAsia" w:hAnsi="Cambria Math"/>
+            </w:rPr>
+            <m:t xml:space="preserve">= </m:t>
+          </m:r>
+          <m:f>
+            <m:fPr>
+              <m:ctrlPr>
+                <w:rPr>
+                  <w:rFonts w:ascii="Cambria Math" w:eastAsiaTheme="minorEastAsia" w:hAnsi="Cambria Math"/>
+                  <w:i/>
+                </w:rPr>
+              </m:ctrlPr>
+            </m:fPr>
+            <m:num>
+              <m:r>
+                <w:rPr>
+                  <w:rFonts w:ascii="Cambria Math" w:eastAsiaTheme="minorEastAsia" w:hAnsi="Cambria Math"/>
+                </w:rPr>
+                <m:t>days in a year</m:t>
+              </m:r>
+            </m:num>
+            <m:den>
+              <m:r>
+                <w:rPr>
+                  <w:rFonts w:ascii="Cambria Math" w:eastAsiaTheme="minorEastAsia" w:hAnsi="Cambria Math"/>
+                </w:rPr>
+                <m:t>debtors turnover</m:t>
+              </m:r>
+            </m:den>
+          </m:f>
+          <m:r>
+            <w:rPr>
+              <w:rFonts w:ascii="Cambria Math" w:eastAsiaTheme="minorEastAsia" w:hAnsi="Cambria Math"/>
+            </w:rPr>
+            <m:t>=</m:t>
+          </m:r>
+          <m:f>
+            <m:fPr>
+              <m:ctrlPr>
+                <w:rPr>
+                  <w:rFonts w:ascii="Cambria Math" w:eastAsiaTheme="minorEastAsia" w:hAnsi="Cambria Math"/>
+                  <w:i/>
+                </w:rPr>
+              </m:ctrlPr>
+            </m:fPr>
+            <m:num>
+              <m:r>
+                <w:rPr>
+                  <w:rFonts w:ascii="Cambria Math" w:eastAsiaTheme="minorEastAsia" w:hAnsi="Cambria Math"/>
+                </w:rPr>
+                <m:t>365</m:t>
+              </m:r>
+            </m:num>
+            <m:den>
+              <m:r>
+                <w:rPr>
+                  <w:rFonts w:ascii="Cambria Math" w:eastAsiaTheme="minorEastAsia" w:hAnsi="Cambria Math"/>
+                </w:rPr>
+                <m:t>4.4</m:t>
+              </m:r>
+            </m:den>
+          </m:f>
+          <m:r>
+            <w:rPr>
+              <w:rFonts w:ascii="Cambria Math" w:eastAsiaTheme="minorEastAsia" w:hAnsi="Cambria Math"/>
+            </w:rPr>
+            <m:t>=83 days</m:t>
+          </m:r>
+        </m:oMath>
+      </m:oMathPara>
+    </w:p>
+    <w:p>
+      <w:pPr>
+        <w:rPr>
+          <w:rFonts w:eastAsiaTheme="minorEastAsia"/>
+        </w:rPr>
+      </w:pPr>
+      <w:r>
+        <w:rPr>
+          <w:rFonts w:eastAsiaTheme="minorEastAsia"/>
+        </w:rPr>
+        <w:t>4. a) accounts payable ratio / creditor turnover ratio:</w:t>
+      </w:r>
+    </w:p>
+    <w:p>
+      <w:pPr>
+        <w:rPr>
+          <w:rFonts w:eastAsiaTheme="minorEastAsia"/>
+        </w:rPr>
+      </w:pPr>
+      <m:oMathPara>
+        <m:oMath>
+          <m:r>
+            <w:rPr>
+              <w:rFonts w:ascii="Cambria Math" w:eastAsiaTheme="minorEastAsia" w:hAnsi="Cambria Math"/>
+            </w:rPr>
+            <m:t xml:space="preserve">= </m:t>
+          </m:r>
+          <m:f>
+            <m:fPr>
+              <m:ctrlPr>
+                <w:rPr>
+                  <w:rFonts w:ascii="Cambria Math" w:eastAsiaTheme="minorEastAsia" w:hAnsi="Cambria Math"/>
+                  <w:i/>
+                </w:rPr>
+              </m:ctrlPr>
+            </m:fPr>
+            <m:num>
+              <m:r>
+                <w:rPr>
+                  <w:rFonts w:ascii="Cambria Math" w:eastAsiaTheme="minorEastAsia" w:hAnsi="Cambria Math"/>
+                </w:rPr>
+                <m:t>credit purchase</m:t>
+              </m:r>
+            </m:num>
+            <m:den>
+              <m:r>
+                <w:rPr>
+                  <w:rFonts w:ascii="Cambria Math" w:eastAsiaTheme="minorEastAsia" w:hAnsi="Cambria Math"/>
+                </w:rPr>
+                <m:t>average accounts payable</m:t>
+              </m:r>
+            </m:den>
+          </m:f>
+          <m:r>
+            <w:rPr>
+              <w:rFonts w:ascii="Cambria Math" w:eastAsiaTheme="minorEastAsia" w:hAnsi="Cambria Math"/>
+            </w:rPr>
+            <m:t>=</m:t>
+          </m:r>
+          <m:f>
+            <m:fPr>
+              <m:ctrlPr>
+                <w:rPr>
+                  <w:rFonts w:ascii="Cambria Math" w:eastAsiaTheme="minorEastAsia" w:hAnsi="Cambria Math"/>
+                  <w:i/>
+                </w:rPr>
+              </m:ctrlPr>
+            </m:fPr>
+            <m:num>
+              <m:r>
+                <w:rPr>
+                  <w:rFonts w:ascii="Cambria Math" w:eastAsiaTheme="minorEastAsia" w:hAnsi="Cambria Math"/>
+                </w:rPr>
+                <m:t>240,000</m:t>
+              </m:r>
+            </m:num>
+            <m:den>
+              <m:r>
+                <w:rPr>
+                  <w:rFonts w:ascii="Cambria Math" w:eastAsiaTheme="minorEastAsia" w:hAnsi="Cambria Math"/>
+                </w:rPr>
+                <m:t>80,000</m:t>
+              </m:r>
+            </m:den>
+          </m:f>
+          <m:r>
+            <w:rPr>
+              <w:rFonts w:ascii="Cambria Math" w:eastAsiaTheme="minorEastAsia" w:hAnsi="Cambria Math"/>
+            </w:rPr>
+            <m:t>=3 times</m:t>
+          </m:r>
+        </m:oMath>
+      </m:oMathPara>
+    </w:p>
+    <w:p>
+      <w:pPr>
+        <w:rPr>
+          <w:rFonts w:eastAsiaTheme="minorEastAsia"/>
+        </w:rPr>
+      </w:pPr>
+      <w:r>
+        <w:rPr>
+          <w:rFonts w:eastAsiaTheme="minorEastAsia"/>
+        </w:rPr>
+        <w:t>Credit purchase = purchase – purchase returns – cash purchase</w:t>
+      </w:r>
+    </w:p>
+    <w:p>
+      <w:pPr>
+        <w:rPr>
+          <w:rFonts w:eastAsiaTheme="minorEastAsia"/>
+        </w:rPr>
+      </w:pPr>
+      <w:r>
+        <w:rPr>
+          <w:rFonts w:eastAsiaTheme="minorEastAsia"/>
+        </w:rPr>
+        <w:t>= 300,000 – 10,000 – 50,000 = 240,000</w:t>
+      </w:r>
+    </w:p>
+    <w:p>
+      <w:pPr>
+        <w:rPr>
+          <w:rFonts w:eastAsiaTheme="minorEastAsia"/>
+        </w:rPr>
+      </w:pPr>
+      <w:r>
+        <w:rPr>
+          <w:rFonts w:eastAsiaTheme="minorEastAsia"/>
+        </w:rPr>
+        <w:t>Average accounts payable = creditors + bills payable</w:t>
+      </w:r>
+    </w:p>
+    <w:p>
+      <w:pPr>
+        <w:rPr>
+          <w:rFonts w:eastAsiaTheme="minorEastAsia"/>
+        </w:rPr>
+      </w:pPr>
+      <w:r>
+        <w:rPr>
+          <w:rFonts w:eastAsiaTheme="minorEastAsia"/>
+        </w:rPr>
+        <w:t>= 60,000 + 20,000 = 80,000</w:t>
+      </w:r>
+    </w:p>
+    <w:p>
+      <w:pPr>
+        <w:rPr>
+          <w:rFonts w:eastAsiaTheme="minorEastAsia"/>
+        </w:rPr>
+      </w:pPr>
+      <w:r>
+        <w:rPr>
+          <w:rFonts w:eastAsiaTheme="minorEastAsia"/>
+        </w:rPr>
+        <w:t>4. b) credits collection period:</w:t>
+      </w:r>
+    </w:p>
+    <w:p>
+      <w:pPr>
+        <w:rPr>
+          <w:rFonts w:eastAsiaTheme="minorEastAsia"/>
+        </w:rPr>
+      </w:pPr>
+      <m:oMathPara>
+        <m:oMath>
+          <m:r>
+            <w:rPr>
+              <w:rFonts w:ascii="Cambria Math" w:eastAsiaTheme="minorEastAsia" w:hAnsi="Cambria Math"/>
+            </w:rPr>
+            <w:lastRenderedPageBreak/>
+            <m:t>=</m:t>
+          </m:r>
+          <m:f>
+            <m:fPr>
+              <m:ctrlPr>
+                <w:rPr>
+                  <w:rFonts w:ascii="Cambria Math" w:eastAsiaTheme="minorEastAsia" w:hAnsi="Cambria Math"/>
+                  <w:i/>
+                </w:rPr>
+              </m:ctrlPr>
+            </m:fPr>
+            <m:num>
+              <m:r>
+                <w:rPr>
+                  <w:rFonts w:ascii="Cambria Math" w:eastAsiaTheme="minorEastAsia" w:hAnsi="Cambria Math"/>
+                </w:rPr>
+                <m:t>months in a year</m:t>
+              </m:r>
+            </m:num>
+            <m:den>
+              <m:r>
+                <w:rPr>
+                  <w:rFonts w:ascii="Cambria Math" w:eastAsiaTheme="minorEastAsia" w:hAnsi="Cambria Math"/>
+                </w:rPr>
+                <m:t>CTR</m:t>
+              </m:r>
+            </m:den>
+          </m:f>
+          <m:r>
+            <w:rPr>
+              <w:rFonts w:ascii="Cambria Math" w:eastAsiaTheme="minorEastAsia" w:hAnsi="Cambria Math"/>
+            </w:rPr>
+            <m:t>=</m:t>
+          </m:r>
+          <m:f>
+            <m:fPr>
+              <m:ctrlPr>
+                <w:rPr>
+                  <w:rFonts w:ascii="Cambria Math" w:eastAsiaTheme="minorEastAsia" w:hAnsi="Cambria Math"/>
+                  <w:i/>
+                </w:rPr>
+              </m:ctrlPr>
+            </m:fPr>
+            <m:num>
+              <m:r>
+                <w:rPr>
+                  <w:rFonts w:ascii="Cambria Math" w:eastAsiaTheme="minorEastAsia" w:hAnsi="Cambria Math"/>
+                </w:rPr>
+                <m:t>12</m:t>
+              </m:r>
+            </m:num>
+            <m:den>
+              <m:r>
+                <w:rPr>
+                  <w:rFonts w:ascii="Cambria Math" w:eastAsiaTheme="minorEastAsia" w:hAnsi="Cambria Math"/>
+                </w:rPr>
+                <m:t>3</m:t>
+              </m:r>
+            </m:den>
+          </m:f>
+          <m:r>
+            <w:rPr>
+              <w:rFonts w:ascii="Cambria Math" w:eastAsiaTheme="minorEastAsia" w:hAnsi="Cambria Math"/>
+            </w:rPr>
+            <m:t>=4 times</m:t>
+          </m:r>
+        </m:oMath>
+      </m:oMathPara>
+    </w:p>
+    <w:p>
+      <w:pPr>
+        <w:rPr>
+          <w:rFonts w:eastAsiaTheme="minorEastAsia"/>
+        </w:rPr>
+      </w:pPr>
+      <m:oMathPara>
+        <m:oMath>
+          <m:r>
+            <w:rPr>
+              <w:rFonts w:ascii="Cambria Math" w:eastAsiaTheme="minorEastAsia" w:hAnsi="Cambria Math"/>
+            </w:rPr>
+            <m:t xml:space="preserve">= </m:t>
+          </m:r>
+          <m:f>
+            <m:fPr>
+              <m:ctrlPr>
+                <w:rPr>
+                  <w:rFonts w:ascii="Cambria Math" w:eastAsiaTheme="minorEastAsia" w:hAnsi="Cambria Math"/>
+                  <w:i/>
+                </w:rPr>
+              </m:ctrlPr>
+            </m:fPr>
+            <m:num>
+              <m:r>
+                <w:rPr>
+                  <w:rFonts w:ascii="Cambria Math" w:eastAsiaTheme="minorEastAsia" w:hAnsi="Cambria Math"/>
+                </w:rPr>
+                <m:t>days in a year</m:t>
+              </m:r>
+            </m:num>
+            <m:den>
+              <m:r>
+                <w:rPr>
+                  <w:rFonts w:ascii="Cambria Math" w:eastAsiaTheme="minorEastAsia" w:hAnsi="Cambria Math"/>
+                </w:rPr>
+                <m:t>CTR</m:t>
+              </m:r>
+            </m:den>
+          </m:f>
+          <m:r>
+            <w:rPr>
+              <w:rFonts w:ascii="Cambria Math" w:eastAsiaTheme="minorEastAsia" w:hAnsi="Cambria Math"/>
+            </w:rPr>
+            <m:t>=</m:t>
+          </m:r>
+          <m:f>
+            <m:fPr>
+              <m:ctrlPr>
+                <w:rPr>
+                  <w:rFonts w:ascii="Cambria Math" w:eastAsiaTheme="minorEastAsia" w:hAnsi="Cambria Math"/>
+                  <w:i/>
+                </w:rPr>
+              </m:ctrlPr>
+            </m:fPr>
+            <m:num>
+              <m:r>
+                <w:rPr>
+                  <w:rFonts w:ascii="Cambria Math" w:eastAsiaTheme="minorEastAsia" w:hAnsi="Cambria Math"/>
+                </w:rPr>
+                <m:t>365</m:t>
+              </m:r>
+            </m:num>
+            <m:den>
+              <m:r>
+                <w:rPr>
+                  <w:rFonts w:ascii="Cambria Math" w:eastAsiaTheme="minorEastAsia" w:hAnsi="Cambria Math"/>
+                </w:rPr>
+                <m:t>3</m:t>
+              </m:r>
+            </m:den>
+          </m:f>
+          <m:r>
+            <w:rPr>
+              <w:rFonts w:ascii="Cambria Math" w:eastAsiaTheme="minorEastAsia" w:hAnsi="Cambria Math"/>
+            </w:rPr>
+            <m:t>=122 days</m:t>
+          </m:r>
+        </m:oMath>
+      </m:oMathPara>
+    </w:p>
+    <w:p>
+      <w:pPr>
+        <w:rPr>
+          <w:rFonts w:eastAsiaTheme="minorEastAsia"/>
+        </w:rPr>
+      </w:pPr>
+    </w:p>
+    <w:p>
+      <w:pPr>
+        <w:rPr>
+          <w:rFonts w:eastAsiaTheme="minorEastAsia"/>
+        </w:rPr>
+      </w:pPr>
+    </w:p>
+    <w:p>
+      <w:pPr>
+        <w:rPr>
+          <w:rFonts w:eastAsiaTheme="minorEastAsia"/>
+        </w:rPr>
+      </w:pPr>
+    </w:p>
+    <w:p>
+      <w:pPr>
+        <w:rPr>
+          <w:rFonts w:eastAsiaTheme="minorEastAsia"/>
+        </w:rPr>
+      </w:pPr>
+      <w:r>
+        <w:rPr>
+          <w:rFonts w:eastAsiaTheme="minorEastAsia"/>
+        </w:rPr>
+        <w:tab/>
+      </w:r>
     </w:p>
     <w:sectPr>
       <w:pgSz w:w="11906" w:h="16838"/>
@@ -28608,6 +31277,318 @@
     </w:lvl>
   </w:abstractNum>
   <w:abstractNum w:abstractNumId="5" w15:restartNumberingAfterBreak="0">
+    <w:nsid w:val="09B52873"/>
+    <w:multiLevelType w:val="hybridMultilevel"/>
+    <w:tmpl w:val="EA96FEFC"/>
+    <w:lvl w:ilvl="0" w:tplc="4009001B">
+      <w:start w:val="1"/>
+      <w:numFmt w:val="lowerRoman"/>
+      <w:lvlText w:val="%1."/>
+      <w:lvlJc w:val="right"/>
+      <w:pPr>
+        <w:ind w:left="720" w:hanging="360"/>
+      </w:pPr>
+    </w:lvl>
+    <w:lvl w:ilvl="1" w:tplc="40090019" w:tentative="1">
+      <w:start w:val="1"/>
+      <w:numFmt w:val="lowerLetter"/>
+      <w:lvlText w:val="%2."/>
+      <w:lvlJc w:val="left"/>
+      <w:pPr>
+        <w:ind w:left="1440" w:hanging="360"/>
+      </w:pPr>
+    </w:lvl>
+    <w:lvl w:ilvl="2" w:tplc="4009001B" w:tentative="1">
+      <w:start w:val="1"/>
+      <w:numFmt w:val="lowerRoman"/>
+      <w:lvlText w:val="%3."/>
+      <w:lvlJc w:val="right"/>
+      <w:pPr>
+        <w:ind w:left="2160" w:hanging="180"/>
+      </w:pPr>
+    </w:lvl>
+    <w:lvl w:ilvl="3" w:tplc="4009000F" w:tentative="1">
+      <w:start w:val="1"/>
+      <w:numFmt w:val="decimal"/>
+      <w:lvlText w:val="%4."/>
+      <w:lvlJc w:val="left"/>
+      <w:pPr>
+        <w:ind w:left="2880" w:hanging="360"/>
+      </w:pPr>
+    </w:lvl>
+    <w:lvl w:ilvl="4" w:tplc="40090019" w:tentative="1">
+      <w:start w:val="1"/>
+      <w:numFmt w:val="lowerLetter"/>
+      <w:lvlText w:val="%5."/>
+      <w:lvlJc w:val="left"/>
+      <w:pPr>
+        <w:ind w:left="3600" w:hanging="360"/>
+      </w:pPr>
+    </w:lvl>
+    <w:lvl w:ilvl="5" w:tplc="4009001B" w:tentative="1">
+      <w:start w:val="1"/>
+      <w:numFmt w:val="lowerRoman"/>
+      <w:lvlText w:val="%6."/>
+      <w:lvlJc w:val="right"/>
+      <w:pPr>
+        <w:ind w:left="4320" w:hanging="180"/>
+      </w:pPr>
+    </w:lvl>
+    <w:lvl w:ilvl="6" w:tplc="4009000F" w:tentative="1">
+      <w:start w:val="1"/>
+      <w:numFmt w:val="decimal"/>
+      <w:lvlText w:val="%7."/>
+      <w:lvlJc w:val="left"/>
+      <w:pPr>
+        <w:ind w:left="5040" w:hanging="360"/>
+      </w:pPr>
+    </w:lvl>
+    <w:lvl w:ilvl="7" w:tplc="40090019" w:tentative="1">
+      <w:start w:val="1"/>
+      <w:numFmt w:val="lowerLetter"/>
+      <w:lvlText w:val="%8."/>
+      <w:lvlJc w:val="left"/>
+      <w:pPr>
+        <w:ind w:left="5760" w:hanging="360"/>
+      </w:pPr>
+    </w:lvl>
+    <w:lvl w:ilvl="8" w:tplc="4009001B" w:tentative="1">
+      <w:start w:val="1"/>
+      <w:numFmt w:val="lowerRoman"/>
+      <w:lvlText w:val="%9."/>
+      <w:lvlJc w:val="right"/>
+      <w:pPr>
+        <w:ind w:left="6480" w:hanging="180"/>
+      </w:pPr>
+    </w:lvl>
+  </w:abstractNum>
+  <w:abstractNum w:abstractNumId="6" w15:restartNumberingAfterBreak="0">
+    <w:nsid w:val="0AF163BA"/>
+    <w:multiLevelType w:val="hybridMultilevel"/>
+    <w:tmpl w:val="FF4A3DEE"/>
+    <w:lvl w:ilvl="0" w:tplc="40090001">
+      <w:start w:val="1"/>
+      <w:numFmt w:val="bullet"/>
+      <w:lvlText w:val=""/>
+      <w:lvlJc w:val="left"/>
+      <w:pPr>
+        <w:ind w:left="720" w:hanging="360"/>
+      </w:pPr>
+      <w:rPr>
+        <w:rFonts w:ascii="Symbol" w:hAnsi="Symbol" w:hint="default"/>
+      </w:rPr>
+    </w:lvl>
+    <w:lvl w:ilvl="1" w:tplc="40090003" w:tentative="1">
+      <w:start w:val="1"/>
+      <w:numFmt w:val="bullet"/>
+      <w:lvlText w:val="o"/>
+      <w:lvlJc w:val="left"/>
+      <w:pPr>
+        <w:ind w:left="1440" w:hanging="360"/>
+      </w:pPr>
+      <w:rPr>
+        <w:rFonts w:ascii="Courier New" w:hAnsi="Courier New" w:cs="Courier New" w:hint="default"/>
+      </w:rPr>
+    </w:lvl>
+    <w:lvl w:ilvl="2" w:tplc="40090005" w:tentative="1">
+      <w:start w:val="1"/>
+      <w:numFmt w:val="bullet"/>
+      <w:lvlText w:val=""/>
+      <w:lvlJc w:val="left"/>
+      <w:pPr>
+        <w:ind w:left="2160" w:hanging="360"/>
+      </w:pPr>
+      <w:rPr>
+        <w:rFonts w:ascii="Wingdings" w:hAnsi="Wingdings" w:hint="default"/>
+      </w:rPr>
+    </w:lvl>
+    <w:lvl w:ilvl="3" w:tplc="40090001" w:tentative="1">
+      <w:start w:val="1"/>
+      <w:numFmt w:val="bullet"/>
+      <w:lvlText w:val=""/>
+      <w:lvlJc w:val="left"/>
+      <w:pPr>
+        <w:ind w:left="2880" w:hanging="360"/>
+      </w:pPr>
+      <w:rPr>
+        <w:rFonts w:ascii="Symbol" w:hAnsi="Symbol" w:hint="default"/>
+      </w:rPr>
+    </w:lvl>
+    <w:lvl w:ilvl="4" w:tplc="40090003" w:tentative="1">
+      <w:start w:val="1"/>
+      <w:numFmt w:val="bullet"/>
+      <w:lvlText w:val="o"/>
+      <w:lvlJc w:val="left"/>
+      <w:pPr>
+        <w:ind w:left="3600" w:hanging="360"/>
+      </w:pPr>
+      <w:rPr>
+        <w:rFonts w:ascii="Courier New" w:hAnsi="Courier New" w:cs="Courier New" w:hint="default"/>
+      </w:rPr>
+    </w:lvl>
+    <w:lvl w:ilvl="5" w:tplc="40090005" w:tentative="1">
+      <w:start w:val="1"/>
+      <w:numFmt w:val="bullet"/>
+      <w:lvlText w:val=""/>
+      <w:lvlJc w:val="left"/>
+      <w:pPr>
+        <w:ind w:left="4320" w:hanging="360"/>
+      </w:pPr>
+      <w:rPr>
+        <w:rFonts w:ascii="Wingdings" w:hAnsi="Wingdings" w:hint="default"/>
+      </w:rPr>
+    </w:lvl>
+    <w:lvl w:ilvl="6" w:tplc="40090001" w:tentative="1">
+      <w:start w:val="1"/>
+      <w:numFmt w:val="bullet"/>
+      <w:lvlText w:val=""/>
+      <w:lvlJc w:val="left"/>
+      <w:pPr>
+        <w:ind w:left="5040" w:hanging="360"/>
+      </w:pPr>
+      <w:rPr>
+        <w:rFonts w:ascii="Symbol" w:hAnsi="Symbol" w:hint="default"/>
+      </w:rPr>
+    </w:lvl>
+    <w:lvl w:ilvl="7" w:tplc="40090003" w:tentative="1">
+      <w:start w:val="1"/>
+      <w:numFmt w:val="bullet"/>
+      <w:lvlText w:val="o"/>
+      <w:lvlJc w:val="left"/>
+      <w:pPr>
+        <w:ind w:left="5760" w:hanging="360"/>
+      </w:pPr>
+      <w:rPr>
+        <w:rFonts w:ascii="Courier New" w:hAnsi="Courier New" w:cs="Courier New" w:hint="default"/>
+      </w:rPr>
+    </w:lvl>
+    <w:lvl w:ilvl="8" w:tplc="40090005" w:tentative="1">
+      <w:start w:val="1"/>
+      <w:numFmt w:val="bullet"/>
+      <w:lvlText w:val=""/>
+      <w:lvlJc w:val="left"/>
+      <w:pPr>
+        <w:ind w:left="6480" w:hanging="360"/>
+      </w:pPr>
+      <w:rPr>
+        <w:rFonts w:ascii="Wingdings" w:hAnsi="Wingdings" w:hint="default"/>
+      </w:rPr>
+    </w:lvl>
+  </w:abstractNum>
+  <w:abstractNum w:abstractNumId="7" w15:restartNumberingAfterBreak="0">
+    <w:nsid w:val="0EB01C36"/>
+    <w:multiLevelType w:val="hybridMultilevel"/>
+    <w:tmpl w:val="08C27DCC"/>
+    <w:lvl w:ilvl="0" w:tplc="40090001">
+      <w:start w:val="1"/>
+      <w:numFmt w:val="bullet"/>
+      <w:lvlText w:val=""/>
+      <w:lvlJc w:val="left"/>
+      <w:pPr>
+        <w:ind w:left="720" w:hanging="360"/>
+      </w:pPr>
+      <w:rPr>
+        <w:rFonts w:ascii="Symbol" w:hAnsi="Symbol" w:hint="default"/>
+      </w:rPr>
+    </w:lvl>
+    <w:lvl w:ilvl="1" w:tplc="40090003" w:tentative="1">
+      <w:start w:val="1"/>
+      <w:numFmt w:val="bullet"/>
+      <w:lvlText w:val="o"/>
+      <w:lvlJc w:val="left"/>
+      <w:pPr>
+        <w:ind w:left="1440" w:hanging="360"/>
+      </w:pPr>
+      <w:rPr>
+        <w:rFonts w:ascii="Courier New" w:hAnsi="Courier New" w:cs="Courier New" w:hint="default"/>
+      </w:rPr>
+    </w:lvl>
+    <w:lvl w:ilvl="2" w:tplc="40090005" w:tentative="1">
+      <w:start w:val="1"/>
+      <w:numFmt w:val="bullet"/>
+      <w:lvlText w:val=""/>
+      <w:lvlJc w:val="left"/>
+      <w:pPr>
+        <w:ind w:left="2160" w:hanging="360"/>
+      </w:pPr>
+      <w:rPr>
+        <w:rFonts w:ascii="Wingdings" w:hAnsi="Wingdings" w:hint="default"/>
+      </w:rPr>
+    </w:lvl>
+    <w:lvl w:ilvl="3" w:tplc="40090001" w:tentative="1">
+      <w:start w:val="1"/>
+      <w:numFmt w:val="bullet"/>
+      <w:lvlText w:val=""/>
+      <w:lvlJc w:val="left"/>
+      <w:pPr>
+        <w:ind w:left="2880" w:hanging="360"/>
+      </w:pPr>
+      <w:rPr>
+        <w:rFonts w:ascii="Symbol" w:hAnsi="Symbol" w:hint="default"/>
+      </w:rPr>
+    </w:lvl>
+    <w:lvl w:ilvl="4" w:tplc="40090003" w:tentative="1">
+      <w:start w:val="1"/>
+      <w:numFmt w:val="bullet"/>
+      <w:lvlText w:val="o"/>
+      <w:lvlJc w:val="left"/>
+      <w:pPr>
+        <w:ind w:left="3600" w:hanging="360"/>
+      </w:pPr>
+      <w:rPr>
+        <w:rFonts w:ascii="Courier New" w:hAnsi="Courier New" w:cs="Courier New" w:hint="default"/>
+      </w:rPr>
+    </w:lvl>
+    <w:lvl w:ilvl="5" w:tplc="40090005" w:tentative="1">
+      <w:start w:val="1"/>
+      <w:numFmt w:val="bullet"/>
+      <w:lvlText w:val=""/>
+      <w:lvlJc w:val="left"/>
+      <w:pPr>
+        <w:ind w:left="4320" w:hanging="360"/>
+      </w:pPr>
+      <w:rPr>
+        <w:rFonts w:ascii="Wingdings" w:hAnsi="Wingdings" w:hint="default"/>
+      </w:rPr>
+    </w:lvl>
+    <w:lvl w:ilvl="6" w:tplc="40090001" w:tentative="1">
+      <w:start w:val="1"/>
+      <w:numFmt w:val="bullet"/>
+      <w:lvlText w:val=""/>
+      <w:lvlJc w:val="left"/>
+      <w:pPr>
+        <w:ind w:left="5040" w:hanging="360"/>
+      </w:pPr>
+      <w:rPr>
+        <w:rFonts w:ascii="Symbol" w:hAnsi="Symbol" w:hint="default"/>
+      </w:rPr>
+    </w:lvl>
+    <w:lvl w:ilvl="7" w:tplc="40090003" w:tentative="1">
+      <w:start w:val="1"/>
+      <w:numFmt w:val="bullet"/>
+      <w:lvlText w:val="o"/>
+      <w:lvlJc w:val="left"/>
+      <w:pPr>
+        <w:ind w:left="5760" w:hanging="360"/>
+      </w:pPr>
+      <w:rPr>
+        <w:rFonts w:ascii="Courier New" w:hAnsi="Courier New" w:cs="Courier New" w:hint="default"/>
+      </w:rPr>
+    </w:lvl>
+    <w:lvl w:ilvl="8" w:tplc="40090005" w:tentative="1">
+      <w:start w:val="1"/>
+      <w:numFmt w:val="bullet"/>
+      <w:lvlText w:val=""/>
+      <w:lvlJc w:val="left"/>
+      <w:pPr>
+        <w:ind w:left="6480" w:hanging="360"/>
+      </w:pPr>
+      <w:rPr>
+        <w:rFonts w:ascii="Wingdings" w:hAnsi="Wingdings" w:hint="default"/>
+      </w:rPr>
+    </w:lvl>
+  </w:abstractNum>
+  <w:abstractNum w:abstractNumId="8" w15:restartNumberingAfterBreak="0">
     <w:nsid w:val="16207B00"/>
     <w:multiLevelType w:val="hybridMultilevel"/>
     <w:tmpl w:val="F0849EE0"/>
@@ -28720,7 +31701,7 @@
       </w:rPr>
     </w:lvl>
   </w:abstractNum>
-  <w:abstractNum w:abstractNumId="6" w15:restartNumberingAfterBreak="0">
+  <w:abstractNum w:abstractNumId="9" w15:restartNumberingAfterBreak="0">
     <w:nsid w:val="16821C01"/>
     <w:multiLevelType w:val="hybridMultilevel"/>
     <w:tmpl w:val="74C2BB6A"/>
@@ -28806,7 +31787,7 @@
       </w:pPr>
     </w:lvl>
   </w:abstractNum>
-  <w:abstractNum w:abstractNumId="7" w15:restartNumberingAfterBreak="0">
+  <w:abstractNum w:abstractNumId="10" w15:restartNumberingAfterBreak="0">
     <w:nsid w:val="19131334"/>
     <w:multiLevelType w:val="hybridMultilevel"/>
     <w:tmpl w:val="DF904310"/>
@@ -28919,7 +31900,7 @@
       </w:rPr>
     </w:lvl>
   </w:abstractNum>
-  <w:abstractNum w:abstractNumId="8" w15:restartNumberingAfterBreak="0">
+  <w:abstractNum w:abstractNumId="11" w15:restartNumberingAfterBreak="0">
     <w:nsid w:val="1F552A06"/>
     <w:multiLevelType w:val="hybridMultilevel"/>
     <w:tmpl w:val="B5F29EA4"/>
@@ -29008,7 +31989,7 @@
       </w:pPr>
     </w:lvl>
   </w:abstractNum>
-  <w:abstractNum w:abstractNumId="9" w15:restartNumberingAfterBreak="0">
+  <w:abstractNum w:abstractNumId="12" w15:restartNumberingAfterBreak="0">
     <w:nsid w:val="1F6519B0"/>
     <w:multiLevelType w:val="hybridMultilevel"/>
     <w:tmpl w:val="C026FB9A"/>
@@ -29097,7 +32078,7 @@
       </w:pPr>
     </w:lvl>
   </w:abstractNum>
-  <w:abstractNum w:abstractNumId="10" w15:restartNumberingAfterBreak="0">
+  <w:abstractNum w:abstractNumId="13" w15:restartNumberingAfterBreak="0">
     <w:nsid w:val="1FF35255"/>
     <w:multiLevelType w:val="hybridMultilevel"/>
     <w:tmpl w:val="0F8E2182"/>
@@ -29183,7 +32164,7 @@
       </w:pPr>
     </w:lvl>
   </w:abstractNum>
-  <w:abstractNum w:abstractNumId="11" w15:restartNumberingAfterBreak="0">
+  <w:abstractNum w:abstractNumId="14" w15:restartNumberingAfterBreak="0">
     <w:nsid w:val="21684AE6"/>
     <w:multiLevelType w:val="hybridMultilevel"/>
     <w:tmpl w:val="194CE090"/>
@@ -29269,7 +32250,7 @@
       </w:pPr>
     </w:lvl>
   </w:abstractNum>
-  <w:abstractNum w:abstractNumId="12" w15:restartNumberingAfterBreak="0">
+  <w:abstractNum w:abstractNumId="15" w15:restartNumberingAfterBreak="0">
     <w:nsid w:val="25FE49C2"/>
     <w:multiLevelType w:val="multilevel"/>
     <w:tmpl w:val="B0183B58"/>
@@ -29418,7 +32399,93 @@
       </w:rPr>
     </w:lvl>
   </w:abstractNum>
-  <w:abstractNum w:abstractNumId="13" w15:restartNumberingAfterBreak="0">
+  <w:abstractNum w:abstractNumId="16" w15:restartNumberingAfterBreak="0">
+    <w:nsid w:val="2696017F"/>
+    <w:multiLevelType w:val="hybridMultilevel"/>
+    <w:tmpl w:val="320C7472"/>
+    <w:lvl w:ilvl="0" w:tplc="4009001B">
+      <w:start w:val="1"/>
+      <w:numFmt w:val="lowerRoman"/>
+      <w:lvlText w:val="%1."/>
+      <w:lvlJc w:val="right"/>
+      <w:pPr>
+        <w:ind w:left="720" w:hanging="360"/>
+      </w:pPr>
+    </w:lvl>
+    <w:lvl w:ilvl="1" w:tplc="40090019" w:tentative="1">
+      <w:start w:val="1"/>
+      <w:numFmt w:val="lowerLetter"/>
+      <w:lvlText w:val="%2."/>
+      <w:lvlJc w:val="left"/>
+      <w:pPr>
+        <w:ind w:left="1440" w:hanging="360"/>
+      </w:pPr>
+    </w:lvl>
+    <w:lvl w:ilvl="2" w:tplc="4009001B" w:tentative="1">
+      <w:start w:val="1"/>
+      <w:numFmt w:val="lowerRoman"/>
+      <w:lvlText w:val="%3."/>
+      <w:lvlJc w:val="right"/>
+      <w:pPr>
+        <w:ind w:left="2160" w:hanging="180"/>
+      </w:pPr>
+    </w:lvl>
+    <w:lvl w:ilvl="3" w:tplc="4009000F" w:tentative="1">
+      <w:start w:val="1"/>
+      <w:numFmt w:val="decimal"/>
+      <w:lvlText w:val="%4."/>
+      <w:lvlJc w:val="left"/>
+      <w:pPr>
+        <w:ind w:left="2880" w:hanging="360"/>
+      </w:pPr>
+    </w:lvl>
+    <w:lvl w:ilvl="4" w:tplc="40090019" w:tentative="1">
+      <w:start w:val="1"/>
+      <w:numFmt w:val="lowerLetter"/>
+      <w:lvlText w:val="%5."/>
+      <w:lvlJc w:val="left"/>
+      <w:pPr>
+        <w:ind w:left="3600" w:hanging="360"/>
+      </w:pPr>
+    </w:lvl>
+    <w:lvl w:ilvl="5" w:tplc="4009001B" w:tentative="1">
+      <w:start w:val="1"/>
+      <w:numFmt w:val="lowerRoman"/>
+      <w:lvlText w:val="%6."/>
+      <w:lvlJc w:val="right"/>
+      <w:pPr>
+        <w:ind w:left="4320" w:hanging="180"/>
+      </w:pPr>
+    </w:lvl>
+    <w:lvl w:ilvl="6" w:tplc="4009000F" w:tentative="1">
+      <w:start w:val="1"/>
+      <w:numFmt w:val="decimal"/>
+      <w:lvlText w:val="%7."/>
+      <w:lvlJc w:val="left"/>
+      <w:pPr>
+        <w:ind w:left="5040" w:hanging="360"/>
+      </w:pPr>
+    </w:lvl>
+    <w:lvl w:ilvl="7" w:tplc="40090019" w:tentative="1">
+      <w:start w:val="1"/>
+      <w:numFmt w:val="lowerLetter"/>
+      <w:lvlText w:val="%8."/>
+      <w:lvlJc w:val="left"/>
+      <w:pPr>
+        <w:ind w:left="5760" w:hanging="360"/>
+      </w:pPr>
+    </w:lvl>
+    <w:lvl w:ilvl="8" w:tplc="4009001B" w:tentative="1">
+      <w:start w:val="1"/>
+      <w:numFmt w:val="lowerRoman"/>
+      <w:lvlText w:val="%9."/>
+      <w:lvlJc w:val="right"/>
+      <w:pPr>
+        <w:ind w:left="6480" w:hanging="180"/>
+      </w:pPr>
+    </w:lvl>
+  </w:abstractNum>
+  <w:abstractNum w:abstractNumId="17" w15:restartNumberingAfterBreak="0">
     <w:nsid w:val="26F55085"/>
     <w:multiLevelType w:val="hybridMultilevel"/>
     <w:tmpl w:val="A37C6428"/>
@@ -29531,7 +32598,7 @@
       </w:rPr>
     </w:lvl>
   </w:abstractNum>
-  <w:abstractNum w:abstractNumId="14" w15:restartNumberingAfterBreak="0">
+  <w:abstractNum w:abstractNumId="18" w15:restartNumberingAfterBreak="0">
     <w:nsid w:val="270E03D6"/>
     <w:multiLevelType w:val="hybridMultilevel"/>
     <w:tmpl w:val="21482B92"/>
@@ -29617,7 +32684,7 @@
       </w:pPr>
     </w:lvl>
   </w:abstractNum>
-  <w:abstractNum w:abstractNumId="15" w15:restartNumberingAfterBreak="0">
+  <w:abstractNum w:abstractNumId="19" w15:restartNumberingAfterBreak="0">
     <w:nsid w:val="2B866818"/>
     <w:multiLevelType w:val="hybridMultilevel"/>
     <w:tmpl w:val="21482B92"/>
@@ -29703,7 +32770,7 @@
       </w:pPr>
     </w:lvl>
   </w:abstractNum>
-  <w:abstractNum w:abstractNumId="16" w15:restartNumberingAfterBreak="0">
+  <w:abstractNum w:abstractNumId="20" w15:restartNumberingAfterBreak="0">
     <w:nsid w:val="2E69236A"/>
     <w:multiLevelType w:val="hybridMultilevel"/>
     <w:tmpl w:val="5B2E57F4"/>
@@ -29789,7 +32856,7 @@
       </w:pPr>
     </w:lvl>
   </w:abstractNum>
-  <w:abstractNum w:abstractNumId="17" w15:restartNumberingAfterBreak="0">
+  <w:abstractNum w:abstractNumId="21" w15:restartNumberingAfterBreak="0">
     <w:nsid w:val="342643EF"/>
     <w:multiLevelType w:val="hybridMultilevel"/>
     <w:tmpl w:val="BFEAEC32"/>
@@ -29902,7 +32969,7 @@
       </w:rPr>
     </w:lvl>
   </w:abstractNum>
-  <w:abstractNum w:abstractNumId="18" w15:restartNumberingAfterBreak="0">
+  <w:abstractNum w:abstractNumId="22" w15:restartNumberingAfterBreak="0">
     <w:nsid w:val="347B20E2"/>
     <w:multiLevelType w:val="hybridMultilevel"/>
     <w:tmpl w:val="03C01A0E"/>
@@ -30015,7 +33082,7 @@
       </w:rPr>
     </w:lvl>
   </w:abstractNum>
-  <w:abstractNum w:abstractNumId="19" w15:restartNumberingAfterBreak="0">
+  <w:abstractNum w:abstractNumId="23" w15:restartNumberingAfterBreak="0">
     <w:nsid w:val="35D57A2E"/>
     <w:multiLevelType w:val="hybridMultilevel"/>
     <w:tmpl w:val="0FF6CBF2"/>
@@ -30104,7 +33171,7 @@
       </w:pPr>
     </w:lvl>
   </w:abstractNum>
-  <w:abstractNum w:abstractNumId="20" w15:restartNumberingAfterBreak="0">
+  <w:abstractNum w:abstractNumId="24" w15:restartNumberingAfterBreak="0">
     <w:nsid w:val="3FA677EF"/>
     <w:multiLevelType w:val="hybridMultilevel"/>
     <w:tmpl w:val="F144535C"/>
@@ -30190,7 +33257,7 @@
       </w:pPr>
     </w:lvl>
   </w:abstractNum>
-  <w:abstractNum w:abstractNumId="21" w15:restartNumberingAfterBreak="0">
+  <w:abstractNum w:abstractNumId="25" w15:restartNumberingAfterBreak="0">
     <w:nsid w:val="405244CD"/>
     <w:multiLevelType w:val="hybridMultilevel"/>
     <w:tmpl w:val="4F8E4916"/>
@@ -30276,7 +33343,7 @@
       </w:pPr>
     </w:lvl>
   </w:abstractNum>
-  <w:abstractNum w:abstractNumId="22" w15:restartNumberingAfterBreak="0">
+  <w:abstractNum w:abstractNumId="26" w15:restartNumberingAfterBreak="0">
     <w:nsid w:val="421F5061"/>
     <w:multiLevelType w:val="hybridMultilevel"/>
     <w:tmpl w:val="C55E3D5E"/>
@@ -30389,7 +33456,7 @@
       </w:rPr>
     </w:lvl>
   </w:abstractNum>
-  <w:abstractNum w:abstractNumId="23" w15:restartNumberingAfterBreak="0">
+  <w:abstractNum w:abstractNumId="27" w15:restartNumberingAfterBreak="0">
     <w:nsid w:val="470A7CAC"/>
     <w:multiLevelType w:val="hybridMultilevel"/>
     <w:tmpl w:val="41B04BBC"/>
@@ -30475,7 +33542,7 @@
       </w:pPr>
     </w:lvl>
   </w:abstractNum>
-  <w:abstractNum w:abstractNumId="24" w15:restartNumberingAfterBreak="0">
+  <w:abstractNum w:abstractNumId="28" w15:restartNumberingAfterBreak="0">
     <w:nsid w:val="471E0E82"/>
     <w:multiLevelType w:val="hybridMultilevel"/>
     <w:tmpl w:val="A0C2BED4"/>
@@ -30588,7 +33655,7 @@
       </w:rPr>
     </w:lvl>
   </w:abstractNum>
-  <w:abstractNum w:abstractNumId="25" w15:restartNumberingAfterBreak="0">
+  <w:abstractNum w:abstractNumId="29" w15:restartNumberingAfterBreak="0">
     <w:nsid w:val="4ACF29D6"/>
     <w:multiLevelType w:val="hybridMultilevel"/>
     <w:tmpl w:val="15BACEE8"/>
@@ -30674,7 +33741,7 @@
       </w:pPr>
     </w:lvl>
   </w:abstractNum>
-  <w:abstractNum w:abstractNumId="26" w15:restartNumberingAfterBreak="0">
+  <w:abstractNum w:abstractNumId="30" w15:restartNumberingAfterBreak="0">
     <w:nsid w:val="4C42378B"/>
     <w:multiLevelType w:val="multilevel"/>
     <w:tmpl w:val="158600B2"/>
@@ -30823,7 +33890,7 @@
       </w:rPr>
     </w:lvl>
   </w:abstractNum>
-  <w:abstractNum w:abstractNumId="27" w15:restartNumberingAfterBreak="0">
+  <w:abstractNum w:abstractNumId="31" w15:restartNumberingAfterBreak="0">
     <w:nsid w:val="4F286822"/>
     <w:multiLevelType w:val="hybridMultilevel"/>
     <w:tmpl w:val="5798F77C"/>
@@ -30909,7 +33976,7 @@
       </w:pPr>
     </w:lvl>
   </w:abstractNum>
-  <w:abstractNum w:abstractNumId="28" w15:restartNumberingAfterBreak="0">
+  <w:abstractNum w:abstractNumId="32" w15:restartNumberingAfterBreak="0">
     <w:nsid w:val="51600570"/>
     <w:multiLevelType w:val="hybridMultilevel"/>
     <w:tmpl w:val="7B98FFEE"/>
@@ -30995,7 +34062,7 @@
       </w:pPr>
     </w:lvl>
   </w:abstractNum>
-  <w:abstractNum w:abstractNumId="29" w15:restartNumberingAfterBreak="0">
+  <w:abstractNum w:abstractNumId="33" w15:restartNumberingAfterBreak="0">
     <w:nsid w:val="51EB6CAA"/>
     <w:multiLevelType w:val="hybridMultilevel"/>
     <w:tmpl w:val="AA3A1986"/>
@@ -31081,7 +34148,7 @@
       </w:pPr>
     </w:lvl>
   </w:abstractNum>
-  <w:abstractNum w:abstractNumId="30" w15:restartNumberingAfterBreak="0">
+  <w:abstractNum w:abstractNumId="34" w15:restartNumberingAfterBreak="0">
     <w:nsid w:val="54B02AAF"/>
     <w:multiLevelType w:val="hybridMultilevel"/>
     <w:tmpl w:val="139A5414"/>
@@ -31167,7 +34234,7 @@
       </w:pPr>
     </w:lvl>
   </w:abstractNum>
-  <w:abstractNum w:abstractNumId="31" w15:restartNumberingAfterBreak="0">
+  <w:abstractNum w:abstractNumId="35" w15:restartNumberingAfterBreak="0">
     <w:nsid w:val="579956AE"/>
     <w:multiLevelType w:val="hybridMultilevel"/>
     <w:tmpl w:val="152C998C"/>
@@ -31256,7 +34323,7 @@
       </w:pPr>
     </w:lvl>
   </w:abstractNum>
-  <w:abstractNum w:abstractNumId="32" w15:restartNumberingAfterBreak="0">
+  <w:abstractNum w:abstractNumId="36" w15:restartNumberingAfterBreak="0">
     <w:nsid w:val="57AA63E2"/>
     <w:multiLevelType w:val="hybridMultilevel"/>
     <w:tmpl w:val="4CD8648E"/>
@@ -31342,7 +34409,233 @@
       </w:pPr>
     </w:lvl>
   </w:abstractNum>
-  <w:abstractNum w:abstractNumId="33" w15:restartNumberingAfterBreak="0">
+  <w:abstractNum w:abstractNumId="37" w15:restartNumberingAfterBreak="0">
+    <w:nsid w:val="59E1596D"/>
+    <w:multiLevelType w:val="hybridMultilevel"/>
+    <w:tmpl w:val="F76483B0"/>
+    <w:lvl w:ilvl="0" w:tplc="40090001">
+      <w:start w:val="1"/>
+      <w:numFmt w:val="bullet"/>
+      <w:lvlText w:val=""/>
+      <w:lvlJc w:val="left"/>
+      <w:pPr>
+        <w:ind w:left="720" w:hanging="360"/>
+      </w:pPr>
+      <w:rPr>
+        <w:rFonts w:ascii="Symbol" w:hAnsi="Symbol" w:hint="default"/>
+      </w:rPr>
+    </w:lvl>
+    <w:lvl w:ilvl="1" w:tplc="40090003" w:tentative="1">
+      <w:start w:val="1"/>
+      <w:numFmt w:val="bullet"/>
+      <w:lvlText w:val="o"/>
+      <w:lvlJc w:val="left"/>
+      <w:pPr>
+        <w:ind w:left="1440" w:hanging="360"/>
+      </w:pPr>
+      <w:rPr>
+        <w:rFonts w:ascii="Courier New" w:hAnsi="Courier New" w:cs="Courier New" w:hint="default"/>
+      </w:rPr>
+    </w:lvl>
+    <w:lvl w:ilvl="2" w:tplc="40090005" w:tentative="1">
+      <w:start w:val="1"/>
+      <w:numFmt w:val="bullet"/>
+      <w:lvlText w:val=""/>
+      <w:lvlJc w:val="left"/>
+      <w:pPr>
+        <w:ind w:left="2160" w:hanging="360"/>
+      </w:pPr>
+      <w:rPr>
+        <w:rFonts w:ascii="Wingdings" w:hAnsi="Wingdings" w:hint="default"/>
+      </w:rPr>
+    </w:lvl>
+    <w:lvl w:ilvl="3" w:tplc="40090001" w:tentative="1">
+      <w:start w:val="1"/>
+      <w:numFmt w:val="bullet"/>
+      <w:lvlText w:val=""/>
+      <w:lvlJc w:val="left"/>
+      <w:pPr>
+        <w:ind w:left="2880" w:hanging="360"/>
+      </w:pPr>
+      <w:rPr>
+        <w:rFonts w:ascii="Symbol" w:hAnsi="Symbol" w:hint="default"/>
+      </w:rPr>
+    </w:lvl>
+    <w:lvl w:ilvl="4" w:tplc="40090003" w:tentative="1">
+      <w:start w:val="1"/>
+      <w:numFmt w:val="bullet"/>
+      <w:lvlText w:val="o"/>
+      <w:lvlJc w:val="left"/>
+      <w:pPr>
+        <w:ind w:left="3600" w:hanging="360"/>
+      </w:pPr>
+      <w:rPr>
+        <w:rFonts w:ascii="Courier New" w:hAnsi="Courier New" w:cs="Courier New" w:hint="default"/>
+      </w:rPr>
+    </w:lvl>
+    <w:lvl w:ilvl="5" w:tplc="40090005" w:tentative="1">
+      <w:start w:val="1"/>
+      <w:numFmt w:val="bullet"/>
+      <w:lvlText w:val=""/>
+      <w:lvlJc w:val="left"/>
+      <w:pPr>
+        <w:ind w:left="4320" w:hanging="360"/>
+      </w:pPr>
+      <w:rPr>
+        <w:rFonts w:ascii="Wingdings" w:hAnsi="Wingdings" w:hint="default"/>
+      </w:rPr>
+    </w:lvl>
+    <w:lvl w:ilvl="6" w:tplc="40090001" w:tentative="1">
+      <w:start w:val="1"/>
+      <w:numFmt w:val="bullet"/>
+      <w:lvlText w:val=""/>
+      <w:lvlJc w:val="left"/>
+      <w:pPr>
+        <w:ind w:left="5040" w:hanging="360"/>
+      </w:pPr>
+      <w:rPr>
+        <w:rFonts w:ascii="Symbol" w:hAnsi="Symbol" w:hint="default"/>
+      </w:rPr>
+    </w:lvl>
+    <w:lvl w:ilvl="7" w:tplc="40090003" w:tentative="1">
+      <w:start w:val="1"/>
+      <w:numFmt w:val="bullet"/>
+      <w:lvlText w:val="o"/>
+      <w:lvlJc w:val="left"/>
+      <w:pPr>
+        <w:ind w:left="5760" w:hanging="360"/>
+      </w:pPr>
+      <w:rPr>
+        <w:rFonts w:ascii="Courier New" w:hAnsi="Courier New" w:cs="Courier New" w:hint="default"/>
+      </w:rPr>
+    </w:lvl>
+    <w:lvl w:ilvl="8" w:tplc="40090005" w:tentative="1">
+      <w:start w:val="1"/>
+      <w:numFmt w:val="bullet"/>
+      <w:lvlText w:val=""/>
+      <w:lvlJc w:val="left"/>
+      <w:pPr>
+        <w:ind w:left="6480" w:hanging="360"/>
+      </w:pPr>
+      <w:rPr>
+        <w:rFonts w:ascii="Wingdings" w:hAnsi="Wingdings" w:hint="default"/>
+      </w:rPr>
+    </w:lvl>
+  </w:abstractNum>
+  <w:abstractNum w:abstractNumId="38" w15:restartNumberingAfterBreak="0">
+    <w:nsid w:val="5AB46253"/>
+    <w:multiLevelType w:val="hybridMultilevel"/>
+    <w:tmpl w:val="9290147A"/>
+    <w:lvl w:ilvl="0" w:tplc="40090001">
+      <w:start w:val="1"/>
+      <w:numFmt w:val="bullet"/>
+      <w:lvlText w:val=""/>
+      <w:lvlJc w:val="left"/>
+      <w:pPr>
+        <w:ind w:left="720" w:hanging="360"/>
+      </w:pPr>
+      <w:rPr>
+        <w:rFonts w:ascii="Symbol" w:hAnsi="Symbol" w:hint="default"/>
+      </w:rPr>
+    </w:lvl>
+    <w:lvl w:ilvl="1" w:tplc="40090003" w:tentative="1">
+      <w:start w:val="1"/>
+      <w:numFmt w:val="bullet"/>
+      <w:lvlText w:val="o"/>
+      <w:lvlJc w:val="left"/>
+      <w:pPr>
+        <w:ind w:left="1440" w:hanging="360"/>
+      </w:pPr>
+      <w:rPr>
+        <w:rFonts w:ascii="Courier New" w:hAnsi="Courier New" w:cs="Courier New" w:hint="default"/>
+      </w:rPr>
+    </w:lvl>
+    <w:lvl w:ilvl="2" w:tplc="40090005" w:tentative="1">
+      <w:start w:val="1"/>
+      <w:numFmt w:val="bullet"/>
+      <w:lvlText w:val=""/>
+      <w:lvlJc w:val="left"/>
+      <w:pPr>
+        <w:ind w:left="2160" w:hanging="360"/>
+      </w:pPr>
+      <w:rPr>
+        <w:rFonts w:ascii="Wingdings" w:hAnsi="Wingdings" w:hint="default"/>
+      </w:rPr>
+    </w:lvl>
+    <w:lvl w:ilvl="3" w:tplc="40090001" w:tentative="1">
+      <w:start w:val="1"/>
+      <w:numFmt w:val="bullet"/>
+      <w:lvlText w:val=""/>
+      <w:lvlJc w:val="left"/>
+      <w:pPr>
+        <w:ind w:left="2880" w:hanging="360"/>
+      </w:pPr>
+      <w:rPr>
+        <w:rFonts w:ascii="Symbol" w:hAnsi="Symbol" w:hint="default"/>
+      </w:rPr>
+    </w:lvl>
+    <w:lvl w:ilvl="4" w:tplc="40090003" w:tentative="1">
+      <w:start w:val="1"/>
+      <w:numFmt w:val="bullet"/>
+      <w:lvlText w:val="o"/>
+      <w:lvlJc w:val="left"/>
+      <w:pPr>
+        <w:ind w:left="3600" w:hanging="360"/>
+      </w:pPr>
+      <w:rPr>
+        <w:rFonts w:ascii="Courier New" w:hAnsi="Courier New" w:cs="Courier New" w:hint="default"/>
+      </w:rPr>
+    </w:lvl>
+    <w:lvl w:ilvl="5" w:tplc="40090005" w:tentative="1">
+      <w:start w:val="1"/>
+      <w:numFmt w:val="bullet"/>
+      <w:lvlText w:val=""/>
+      <w:lvlJc w:val="left"/>
+      <w:pPr>
+        <w:ind w:left="4320" w:hanging="360"/>
+      </w:pPr>
+      <w:rPr>
+        <w:rFonts w:ascii="Wingdings" w:hAnsi="Wingdings" w:hint="default"/>
+      </w:rPr>
+    </w:lvl>
+    <w:lvl w:ilvl="6" w:tplc="40090001" w:tentative="1">
+      <w:start w:val="1"/>
+      <w:numFmt w:val="bullet"/>
+      <w:lvlText w:val=""/>
+      <w:lvlJc w:val="left"/>
+      <w:pPr>
+        <w:ind w:left="5040" w:hanging="360"/>
+      </w:pPr>
+      <w:rPr>
+        <w:rFonts w:ascii="Symbol" w:hAnsi="Symbol" w:hint="default"/>
+      </w:rPr>
+    </w:lvl>
+    <w:lvl w:ilvl="7" w:tplc="40090003" w:tentative="1">
+      <w:start w:val="1"/>
+      <w:numFmt w:val="bullet"/>
+      <w:lvlText w:val="o"/>
+      <w:lvlJc w:val="left"/>
+      <w:pPr>
+        <w:ind w:left="5760" w:hanging="360"/>
+      </w:pPr>
+      <w:rPr>
+        <w:rFonts w:ascii="Courier New" w:hAnsi="Courier New" w:cs="Courier New" w:hint="default"/>
+      </w:rPr>
+    </w:lvl>
+    <w:lvl w:ilvl="8" w:tplc="40090005" w:tentative="1">
+      <w:start w:val="1"/>
+      <w:numFmt w:val="bullet"/>
+      <w:lvlText w:val=""/>
+      <w:lvlJc w:val="left"/>
+      <w:pPr>
+        <w:ind w:left="6480" w:hanging="360"/>
+      </w:pPr>
+      <w:rPr>
+        <w:rFonts w:ascii="Wingdings" w:hAnsi="Wingdings" w:hint="default"/>
+      </w:rPr>
+    </w:lvl>
+  </w:abstractNum>
+  <w:abstractNum w:abstractNumId="39" w15:restartNumberingAfterBreak="0">
     <w:nsid w:val="5B0B6E70"/>
     <w:multiLevelType w:val="hybridMultilevel"/>
     <w:tmpl w:val="639E1D92"/>
@@ -31428,7 +34721,7 @@
       </w:pPr>
     </w:lvl>
   </w:abstractNum>
-  <w:abstractNum w:abstractNumId="34" w15:restartNumberingAfterBreak="0">
+  <w:abstractNum w:abstractNumId="40" w15:restartNumberingAfterBreak="0">
     <w:nsid w:val="5B5059D4"/>
     <w:multiLevelType w:val="hybridMultilevel"/>
     <w:tmpl w:val="4F5CD94C"/>
@@ -31514,7 +34807,7 @@
       </w:pPr>
     </w:lvl>
   </w:abstractNum>
-  <w:abstractNum w:abstractNumId="35" w15:restartNumberingAfterBreak="0">
+  <w:abstractNum w:abstractNumId="41" w15:restartNumberingAfterBreak="0">
     <w:nsid w:val="5B801366"/>
     <w:multiLevelType w:val="hybridMultilevel"/>
     <w:tmpl w:val="E4343DA0"/>
@@ -31600,7 +34893,120 @@
       </w:pPr>
     </w:lvl>
   </w:abstractNum>
-  <w:abstractNum w:abstractNumId="36" w15:restartNumberingAfterBreak="0">
+  <w:abstractNum w:abstractNumId="42" w15:restartNumberingAfterBreak="0">
+    <w:nsid w:val="5C796728"/>
+    <w:multiLevelType w:val="hybridMultilevel"/>
+    <w:tmpl w:val="89A2AC62"/>
+    <w:lvl w:ilvl="0" w:tplc="40090001">
+      <w:start w:val="1"/>
+      <w:numFmt w:val="bullet"/>
+      <w:lvlText w:val=""/>
+      <w:lvlJc w:val="left"/>
+      <w:pPr>
+        <w:ind w:left="720" w:hanging="360"/>
+      </w:pPr>
+      <w:rPr>
+        <w:rFonts w:ascii="Symbol" w:hAnsi="Symbol" w:hint="default"/>
+      </w:rPr>
+    </w:lvl>
+    <w:lvl w:ilvl="1" w:tplc="40090003" w:tentative="1">
+      <w:start w:val="1"/>
+      <w:numFmt w:val="bullet"/>
+      <w:lvlText w:val="o"/>
+      <w:lvlJc w:val="left"/>
+      <w:pPr>
+        <w:ind w:left="1440" w:hanging="360"/>
+      </w:pPr>
+      <w:rPr>
+        <w:rFonts w:ascii="Courier New" w:hAnsi="Courier New" w:cs="Courier New" w:hint="default"/>
+      </w:rPr>
+    </w:lvl>
+    <w:lvl w:ilvl="2" w:tplc="40090005" w:tentative="1">
+      <w:start w:val="1"/>
+      <w:numFmt w:val="bullet"/>
+      <w:lvlText w:val=""/>
+      <w:lvlJc w:val="left"/>
+      <w:pPr>
+        <w:ind w:left="2160" w:hanging="360"/>
+      </w:pPr>
+      <w:rPr>
+        <w:rFonts w:ascii="Wingdings" w:hAnsi="Wingdings" w:hint="default"/>
+      </w:rPr>
+    </w:lvl>
+    <w:lvl w:ilvl="3" w:tplc="40090001" w:tentative="1">
+      <w:start w:val="1"/>
+      <w:numFmt w:val="bullet"/>
+      <w:lvlText w:val=""/>
+      <w:lvlJc w:val="left"/>
+      <w:pPr>
+        <w:ind w:left="2880" w:hanging="360"/>
+      </w:pPr>
+      <w:rPr>
+        <w:rFonts w:ascii="Symbol" w:hAnsi="Symbol" w:hint="default"/>
+      </w:rPr>
+    </w:lvl>
+    <w:lvl w:ilvl="4" w:tplc="40090003" w:tentative="1">
+      <w:start w:val="1"/>
+      <w:numFmt w:val="bullet"/>
+      <w:lvlText w:val="o"/>
+      <w:lvlJc w:val="left"/>
+      <w:pPr>
+        <w:ind w:left="3600" w:hanging="360"/>
+      </w:pPr>
+      <w:rPr>
+        <w:rFonts w:ascii="Courier New" w:hAnsi="Courier New" w:cs="Courier New" w:hint="default"/>
+      </w:rPr>
+    </w:lvl>
+    <w:lvl w:ilvl="5" w:tplc="40090005" w:tentative="1">
+      <w:start w:val="1"/>
+      <w:numFmt w:val="bullet"/>
+      <w:lvlText w:val=""/>
+      <w:lvlJc w:val="left"/>
+      <w:pPr>
+        <w:ind w:left="4320" w:hanging="360"/>
+      </w:pPr>
+      <w:rPr>
+        <w:rFonts w:ascii="Wingdings" w:hAnsi="Wingdings" w:hint="default"/>
+      </w:rPr>
+    </w:lvl>
+    <w:lvl w:ilvl="6" w:tplc="40090001" w:tentative="1">
+      <w:start w:val="1"/>
+      <w:numFmt w:val="bullet"/>
+      <w:lvlText w:val=""/>
+      <w:lvlJc w:val="left"/>
+      <w:pPr>
+        <w:ind w:left="5040" w:hanging="360"/>
+      </w:pPr>
+      <w:rPr>
+        <w:rFonts w:ascii="Symbol" w:hAnsi="Symbol" w:hint="default"/>
+      </w:rPr>
+    </w:lvl>
+    <w:lvl w:ilvl="7" w:tplc="40090003" w:tentative="1">
+      <w:start w:val="1"/>
+      <w:numFmt w:val="bullet"/>
+      <w:lvlText w:val="o"/>
+      <w:lvlJc w:val="left"/>
+      <w:pPr>
+        <w:ind w:left="5760" w:hanging="360"/>
+      </w:pPr>
+      <w:rPr>
+        <w:rFonts w:ascii="Courier New" w:hAnsi="Courier New" w:cs="Courier New" w:hint="default"/>
+      </w:rPr>
+    </w:lvl>
+    <w:lvl w:ilvl="8" w:tplc="40090005" w:tentative="1">
+      <w:start w:val="1"/>
+      <w:numFmt w:val="bullet"/>
+      <w:lvlText w:val=""/>
+      <w:lvlJc w:val="left"/>
+      <w:pPr>
+        <w:ind w:left="6480" w:hanging="360"/>
+      </w:pPr>
+      <w:rPr>
+        <w:rFonts w:ascii="Wingdings" w:hAnsi="Wingdings" w:hint="default"/>
+      </w:rPr>
+    </w:lvl>
+  </w:abstractNum>
+  <w:abstractNum w:abstractNumId="43" w15:restartNumberingAfterBreak="0">
     <w:nsid w:val="5CF97DC3"/>
     <w:multiLevelType w:val="hybridMultilevel"/>
     <w:tmpl w:val="5B2C3BD8"/>
@@ -31686,7 +35092,7 @@
       </w:pPr>
     </w:lvl>
   </w:abstractNum>
-  <w:abstractNum w:abstractNumId="37" w15:restartNumberingAfterBreak="0">
+  <w:abstractNum w:abstractNumId="44" w15:restartNumberingAfterBreak="0">
     <w:nsid w:val="5ECF72A1"/>
     <w:multiLevelType w:val="hybridMultilevel"/>
     <w:tmpl w:val="1CF4107C"/>
@@ -31772,7 +35178,7 @@
       </w:pPr>
     </w:lvl>
   </w:abstractNum>
-  <w:abstractNum w:abstractNumId="38" w15:restartNumberingAfterBreak="0">
+  <w:abstractNum w:abstractNumId="45" w15:restartNumberingAfterBreak="0">
     <w:nsid w:val="5FAD400A"/>
     <w:multiLevelType w:val="hybridMultilevel"/>
     <w:tmpl w:val="59F4717E"/>
@@ -31858,7 +35264,7 @@
       </w:pPr>
     </w:lvl>
   </w:abstractNum>
-  <w:abstractNum w:abstractNumId="39" w15:restartNumberingAfterBreak="0">
+  <w:abstractNum w:abstractNumId="46" w15:restartNumberingAfterBreak="0">
     <w:nsid w:val="609F0227"/>
     <w:multiLevelType w:val="hybridMultilevel"/>
     <w:tmpl w:val="6E285D7A"/>
@@ -31944,7 +35350,7 @@
       </w:pPr>
     </w:lvl>
   </w:abstractNum>
-  <w:abstractNum w:abstractNumId="40" w15:restartNumberingAfterBreak="0">
+  <w:abstractNum w:abstractNumId="47" w15:restartNumberingAfterBreak="0">
     <w:nsid w:val="630F0C4E"/>
     <w:multiLevelType w:val="hybridMultilevel"/>
     <w:tmpl w:val="5802DB30"/>
@@ -32036,7 +35442,120 @@
       </w:pPr>
     </w:lvl>
   </w:abstractNum>
-  <w:abstractNum w:abstractNumId="41" w15:restartNumberingAfterBreak="0">
+  <w:abstractNum w:abstractNumId="48" w15:restartNumberingAfterBreak="0">
+    <w:nsid w:val="63CB360A"/>
+    <w:multiLevelType w:val="hybridMultilevel"/>
+    <w:tmpl w:val="B128D1F8"/>
+    <w:lvl w:ilvl="0" w:tplc="40090001">
+      <w:start w:val="1"/>
+      <w:numFmt w:val="bullet"/>
+      <w:lvlText w:val=""/>
+      <w:lvlJc w:val="left"/>
+      <w:pPr>
+        <w:ind w:left="720" w:hanging="360"/>
+      </w:pPr>
+      <w:rPr>
+        <w:rFonts w:ascii="Symbol" w:hAnsi="Symbol" w:hint="default"/>
+      </w:rPr>
+    </w:lvl>
+    <w:lvl w:ilvl="1" w:tplc="40090003" w:tentative="1">
+      <w:start w:val="1"/>
+      <w:numFmt w:val="bullet"/>
+      <w:lvlText w:val="o"/>
+      <w:lvlJc w:val="left"/>
+      <w:pPr>
+        <w:ind w:left="1440" w:hanging="360"/>
+      </w:pPr>
+      <w:rPr>
+        <w:rFonts w:ascii="Courier New" w:hAnsi="Courier New" w:cs="Courier New" w:hint="default"/>
+      </w:rPr>
+    </w:lvl>
+    <w:lvl w:ilvl="2" w:tplc="40090005" w:tentative="1">
+      <w:start w:val="1"/>
+      <w:numFmt w:val="bullet"/>
+      <w:lvlText w:val=""/>
+      <w:lvlJc w:val="left"/>
+      <w:pPr>
+        <w:ind w:left="2160" w:hanging="360"/>
+      </w:pPr>
+      <w:rPr>
+        <w:rFonts w:ascii="Wingdings" w:hAnsi="Wingdings" w:hint="default"/>
+      </w:rPr>
+    </w:lvl>
+    <w:lvl w:ilvl="3" w:tplc="40090001" w:tentative="1">
+      <w:start w:val="1"/>
+      <w:numFmt w:val="bullet"/>
+      <w:lvlText w:val=""/>
+      <w:lvlJc w:val="left"/>
+      <w:pPr>
+        <w:ind w:left="2880" w:hanging="360"/>
+      </w:pPr>
+      <w:rPr>
+        <w:rFonts w:ascii="Symbol" w:hAnsi="Symbol" w:hint="default"/>
+      </w:rPr>
+    </w:lvl>
+    <w:lvl w:ilvl="4" w:tplc="40090003" w:tentative="1">
+      <w:start w:val="1"/>
+      <w:numFmt w:val="bullet"/>
+      <w:lvlText w:val="o"/>
+      <w:lvlJc w:val="left"/>
+      <w:pPr>
+        <w:ind w:left="3600" w:hanging="360"/>
+      </w:pPr>
+      <w:rPr>
+        <w:rFonts w:ascii="Courier New" w:hAnsi="Courier New" w:cs="Courier New" w:hint="default"/>
+      </w:rPr>
+    </w:lvl>
+    <w:lvl w:ilvl="5" w:tplc="40090005" w:tentative="1">
+      <w:start w:val="1"/>
+      <w:numFmt w:val="bullet"/>
+      <w:lvlText w:val=""/>
+      <w:lvlJc w:val="left"/>
+      <w:pPr>
+        <w:ind w:left="4320" w:hanging="360"/>
+      </w:pPr>
+      <w:rPr>
+        <w:rFonts w:ascii="Wingdings" w:hAnsi="Wingdings" w:hint="default"/>
+      </w:rPr>
+    </w:lvl>
+    <w:lvl w:ilvl="6" w:tplc="40090001" w:tentative="1">
+      <w:start w:val="1"/>
+      <w:numFmt w:val="bullet"/>
+      <w:lvlText w:val=""/>
+      <w:lvlJc w:val="left"/>
+      <w:pPr>
+        <w:ind w:left="5040" w:hanging="360"/>
+      </w:pPr>
+      <w:rPr>
+        <w:rFonts w:ascii="Symbol" w:hAnsi="Symbol" w:hint="default"/>
+      </w:rPr>
+    </w:lvl>
+    <w:lvl w:ilvl="7" w:tplc="40090003" w:tentative="1">
+      <w:start w:val="1"/>
+      <w:numFmt w:val="bullet"/>
+      <w:lvlText w:val="o"/>
+      <w:lvlJc w:val="left"/>
+      <w:pPr>
+        <w:ind w:left="5760" w:hanging="360"/>
+      </w:pPr>
+      <w:rPr>
+        <w:rFonts w:ascii="Courier New" w:hAnsi="Courier New" w:cs="Courier New" w:hint="default"/>
+      </w:rPr>
+    </w:lvl>
+    <w:lvl w:ilvl="8" w:tplc="40090005" w:tentative="1">
+      <w:start w:val="1"/>
+      <w:numFmt w:val="bullet"/>
+      <w:lvlText w:val=""/>
+      <w:lvlJc w:val="left"/>
+      <w:pPr>
+        <w:ind w:left="6480" w:hanging="360"/>
+      </w:pPr>
+      <w:rPr>
+        <w:rFonts w:ascii="Wingdings" w:hAnsi="Wingdings" w:hint="default"/>
+      </w:rPr>
+    </w:lvl>
+  </w:abstractNum>
+  <w:abstractNum w:abstractNumId="49" w15:restartNumberingAfterBreak="0">
     <w:nsid w:val="6A825466"/>
     <w:multiLevelType w:val="hybridMultilevel"/>
     <w:tmpl w:val="D4123C9C"/>
@@ -32122,7 +35641,7 @@
       </w:pPr>
     </w:lvl>
   </w:abstractNum>
-  <w:abstractNum w:abstractNumId="42" w15:restartNumberingAfterBreak="0">
+  <w:abstractNum w:abstractNumId="50" w15:restartNumberingAfterBreak="0">
     <w:nsid w:val="6D052436"/>
     <w:multiLevelType w:val="hybridMultilevel"/>
     <w:tmpl w:val="E2EE4616"/>
@@ -32235,7 +35754,7 @@
       </w:rPr>
     </w:lvl>
   </w:abstractNum>
-  <w:abstractNum w:abstractNumId="43" w15:restartNumberingAfterBreak="0">
+  <w:abstractNum w:abstractNumId="51" w15:restartNumberingAfterBreak="0">
     <w:nsid w:val="72C825B8"/>
     <w:multiLevelType w:val="multilevel"/>
     <w:tmpl w:val="8D6CDDBA"/>
@@ -32384,7 +35903,7 @@
       </w:rPr>
     </w:lvl>
   </w:abstractNum>
-  <w:abstractNum w:abstractNumId="44" w15:restartNumberingAfterBreak="0">
+  <w:abstractNum w:abstractNumId="52" w15:restartNumberingAfterBreak="0">
     <w:nsid w:val="72EA5DBF"/>
     <w:multiLevelType w:val="hybridMultilevel"/>
     <w:tmpl w:val="671AAB8E"/>
@@ -32470,7 +35989,7 @@
       </w:pPr>
     </w:lvl>
   </w:abstractNum>
-  <w:abstractNum w:abstractNumId="45" w15:restartNumberingAfterBreak="0">
+  <w:abstractNum w:abstractNumId="53" w15:restartNumberingAfterBreak="0">
     <w:nsid w:val="72F854A2"/>
     <w:multiLevelType w:val="hybridMultilevel"/>
     <w:tmpl w:val="349CAAFA"/>
@@ -32583,7 +36102,120 @@
       </w:rPr>
     </w:lvl>
   </w:abstractNum>
-  <w:abstractNum w:abstractNumId="46" w15:restartNumberingAfterBreak="0">
+  <w:abstractNum w:abstractNumId="54" w15:restartNumberingAfterBreak="0">
+    <w:nsid w:val="737D56E6"/>
+    <w:multiLevelType w:val="hybridMultilevel"/>
+    <w:tmpl w:val="0C9ABC18"/>
+    <w:lvl w:ilvl="0" w:tplc="40090001">
+      <w:start w:val="1"/>
+      <w:numFmt w:val="bullet"/>
+      <w:lvlText w:val=""/>
+      <w:lvlJc w:val="left"/>
+      <w:pPr>
+        <w:ind w:left="720" w:hanging="360"/>
+      </w:pPr>
+      <w:rPr>
+        <w:rFonts w:ascii="Symbol" w:hAnsi="Symbol" w:hint="default"/>
+      </w:rPr>
+    </w:lvl>
+    <w:lvl w:ilvl="1" w:tplc="40090003" w:tentative="1">
+      <w:start w:val="1"/>
+      <w:numFmt w:val="bullet"/>
+      <w:lvlText w:val="o"/>
+      <w:lvlJc w:val="left"/>
+      <w:pPr>
+        <w:ind w:left="1440" w:hanging="360"/>
+      </w:pPr>
+      <w:rPr>
+        <w:rFonts w:ascii="Courier New" w:hAnsi="Courier New" w:cs="Courier New" w:hint="default"/>
+      </w:rPr>
+    </w:lvl>
+    <w:lvl w:ilvl="2" w:tplc="40090005" w:tentative="1">
+      <w:start w:val="1"/>
+      <w:numFmt w:val="bullet"/>
+      <w:lvlText w:val=""/>
+      <w:lvlJc w:val="left"/>
+      <w:pPr>
+        <w:ind w:left="2160" w:hanging="360"/>
+      </w:pPr>
+      <w:rPr>
+        <w:rFonts w:ascii="Wingdings" w:hAnsi="Wingdings" w:hint="default"/>
+      </w:rPr>
+    </w:lvl>
+    <w:lvl w:ilvl="3" w:tplc="40090001" w:tentative="1">
+      <w:start w:val="1"/>
+      <w:numFmt w:val="bullet"/>
+      <w:lvlText w:val=""/>
+      <w:lvlJc w:val="left"/>
+      <w:pPr>
+        <w:ind w:left="2880" w:hanging="360"/>
+      </w:pPr>
+      <w:rPr>
+        <w:rFonts w:ascii="Symbol" w:hAnsi="Symbol" w:hint="default"/>
+      </w:rPr>
+    </w:lvl>
+    <w:lvl w:ilvl="4" w:tplc="40090003" w:tentative="1">
+      <w:start w:val="1"/>
+      <w:numFmt w:val="bullet"/>
+      <w:lvlText w:val="o"/>
+      <w:lvlJc w:val="left"/>
+      <w:pPr>
+        <w:ind w:left="3600" w:hanging="360"/>
+      </w:pPr>
+      <w:rPr>
+        <w:rFonts w:ascii="Courier New" w:hAnsi="Courier New" w:cs="Courier New" w:hint="default"/>
+      </w:rPr>
+    </w:lvl>
+    <w:lvl w:ilvl="5" w:tplc="40090005" w:tentative="1">
+      <w:start w:val="1"/>
+      <w:numFmt w:val="bullet"/>
+      <w:lvlText w:val=""/>
+      <w:lvlJc w:val="left"/>
+      <w:pPr>
+        <w:ind w:left="4320" w:hanging="360"/>
+      </w:pPr>
+      <w:rPr>
+        <w:rFonts w:ascii="Wingdings" w:hAnsi="Wingdings" w:hint="default"/>
+      </w:rPr>
+    </w:lvl>
+    <w:lvl w:ilvl="6" w:tplc="40090001" w:tentative="1">
+      <w:start w:val="1"/>
+      <w:numFmt w:val="bullet"/>
+      <w:lvlText w:val=""/>
+      <w:lvlJc w:val="left"/>
+      <w:pPr>
+        <w:ind w:left="5040" w:hanging="360"/>
+      </w:pPr>
+      <w:rPr>
+        <w:rFonts w:ascii="Symbol" w:hAnsi="Symbol" w:hint="default"/>
+      </w:rPr>
+    </w:lvl>
+    <w:lvl w:ilvl="7" w:tplc="40090003" w:tentative="1">
+      <w:start w:val="1"/>
+      <w:numFmt w:val="bullet"/>
+      <w:lvlText w:val="o"/>
+      <w:lvlJc w:val="left"/>
+      <w:pPr>
+        <w:ind w:left="5760" w:hanging="360"/>
+      </w:pPr>
+      <w:rPr>
+        <w:rFonts w:ascii="Courier New" w:hAnsi="Courier New" w:cs="Courier New" w:hint="default"/>
+      </w:rPr>
+    </w:lvl>
+    <w:lvl w:ilvl="8" w:tplc="40090005" w:tentative="1">
+      <w:start w:val="1"/>
+      <w:numFmt w:val="bullet"/>
+      <w:lvlText w:val=""/>
+      <w:lvlJc w:val="left"/>
+      <w:pPr>
+        <w:ind w:left="6480" w:hanging="360"/>
+      </w:pPr>
+      <w:rPr>
+        <w:rFonts w:ascii="Wingdings" w:hAnsi="Wingdings" w:hint="default"/>
+      </w:rPr>
+    </w:lvl>
+  </w:abstractNum>
+  <w:abstractNum w:abstractNumId="55" w15:restartNumberingAfterBreak="0">
     <w:nsid w:val="768D4843"/>
     <w:multiLevelType w:val="hybridMultilevel"/>
     <w:tmpl w:val="F39A25A6"/>
@@ -32669,7 +36301,7 @@
       </w:pPr>
     </w:lvl>
   </w:abstractNum>
-  <w:abstractNum w:abstractNumId="47" w15:restartNumberingAfterBreak="0">
+  <w:abstractNum w:abstractNumId="56" w15:restartNumberingAfterBreak="0">
     <w:nsid w:val="787D215D"/>
     <w:multiLevelType w:val="hybridMultilevel"/>
     <w:tmpl w:val="6E66E1B4"/>
@@ -32758,7 +36390,7 @@
       </w:pPr>
     </w:lvl>
   </w:abstractNum>
-  <w:abstractNum w:abstractNumId="48" w15:restartNumberingAfterBreak="0">
+  <w:abstractNum w:abstractNumId="57" w15:restartNumberingAfterBreak="0">
     <w:nsid w:val="7AB25B5B"/>
     <w:multiLevelType w:val="hybridMultilevel"/>
     <w:tmpl w:val="E5A0EAA8"/>
@@ -32871,7 +36503,120 @@
       </w:rPr>
     </w:lvl>
   </w:abstractNum>
-  <w:abstractNum w:abstractNumId="49" w15:restartNumberingAfterBreak="0">
+  <w:abstractNum w:abstractNumId="58" w15:restartNumberingAfterBreak="0">
+    <w:nsid w:val="7AD45E11"/>
+    <w:multiLevelType w:val="hybridMultilevel"/>
+    <w:tmpl w:val="E23468B6"/>
+    <w:lvl w:ilvl="0" w:tplc="40090001">
+      <w:start w:val="1"/>
+      <w:numFmt w:val="bullet"/>
+      <w:lvlText w:val=""/>
+      <w:lvlJc w:val="left"/>
+      <w:pPr>
+        <w:ind w:left="720" w:hanging="360"/>
+      </w:pPr>
+      <w:rPr>
+        <w:rFonts w:ascii="Symbol" w:hAnsi="Symbol" w:hint="default"/>
+      </w:rPr>
+    </w:lvl>
+    <w:lvl w:ilvl="1" w:tplc="40090003" w:tentative="1">
+      <w:start w:val="1"/>
+      <w:numFmt w:val="bullet"/>
+      <w:lvlText w:val="o"/>
+      <w:lvlJc w:val="left"/>
+      <w:pPr>
+        <w:ind w:left="1440" w:hanging="360"/>
+      </w:pPr>
+      <w:rPr>
+        <w:rFonts w:ascii="Courier New" w:hAnsi="Courier New" w:cs="Courier New" w:hint="default"/>
+      </w:rPr>
+    </w:lvl>
+    <w:lvl w:ilvl="2" w:tplc="40090005" w:tentative="1">
+      <w:start w:val="1"/>
+      <w:numFmt w:val="bullet"/>
+      <w:lvlText w:val=""/>
+      <w:lvlJc w:val="left"/>
+      <w:pPr>
+        <w:ind w:left="2160" w:hanging="360"/>
+      </w:pPr>
+      <w:rPr>
+        <w:rFonts w:ascii="Wingdings" w:hAnsi="Wingdings" w:hint="default"/>
+      </w:rPr>
+    </w:lvl>
+    <w:lvl w:ilvl="3" w:tplc="40090001" w:tentative="1">
+      <w:start w:val="1"/>
+      <w:numFmt w:val="bullet"/>
+      <w:lvlText w:val=""/>
+      <w:lvlJc w:val="left"/>
+      <w:pPr>
+        <w:ind w:left="2880" w:hanging="360"/>
+      </w:pPr>
+      <w:rPr>
+        <w:rFonts w:ascii="Symbol" w:hAnsi="Symbol" w:hint="default"/>
+      </w:rPr>
+    </w:lvl>
+    <w:lvl w:ilvl="4" w:tplc="40090003" w:tentative="1">
+      <w:start w:val="1"/>
+      <w:numFmt w:val="bullet"/>
+      <w:lvlText w:val="o"/>
+      <w:lvlJc w:val="left"/>
+      <w:pPr>
+        <w:ind w:left="3600" w:hanging="360"/>
+      </w:pPr>
+      <w:rPr>
+        <w:rFonts w:ascii="Courier New" w:hAnsi="Courier New" w:cs="Courier New" w:hint="default"/>
+      </w:rPr>
+    </w:lvl>
+    <w:lvl w:ilvl="5" w:tplc="40090005" w:tentative="1">
+      <w:start w:val="1"/>
+      <w:numFmt w:val="bullet"/>
+      <w:lvlText w:val=""/>
+      <w:lvlJc w:val="left"/>
+      <w:pPr>
+        <w:ind w:left="4320" w:hanging="360"/>
+      </w:pPr>
+      <w:rPr>
+        <w:rFonts w:ascii="Wingdings" w:hAnsi="Wingdings" w:hint="default"/>
+      </w:rPr>
+    </w:lvl>
+    <w:lvl w:ilvl="6" w:tplc="40090001" w:tentative="1">
+      <w:start w:val="1"/>
+      <w:numFmt w:val="bullet"/>
+      <w:lvlText w:val=""/>
+      <w:lvlJc w:val="left"/>
+      <w:pPr>
+        <w:ind w:left="5040" w:hanging="360"/>
+      </w:pPr>
+      <w:rPr>
+        <w:rFonts w:ascii="Symbol" w:hAnsi="Symbol" w:hint="default"/>
+      </w:rPr>
+    </w:lvl>
+    <w:lvl w:ilvl="7" w:tplc="40090003" w:tentative="1">
+      <w:start w:val="1"/>
+      <w:numFmt w:val="bullet"/>
+      <w:lvlText w:val="o"/>
+      <w:lvlJc w:val="left"/>
+      <w:pPr>
+        <w:ind w:left="5760" w:hanging="360"/>
+      </w:pPr>
+      <w:rPr>
+        <w:rFonts w:ascii="Courier New" w:hAnsi="Courier New" w:cs="Courier New" w:hint="default"/>
+      </w:rPr>
+    </w:lvl>
+    <w:lvl w:ilvl="8" w:tplc="40090005" w:tentative="1">
+      <w:start w:val="1"/>
+      <w:numFmt w:val="bullet"/>
+      <w:lvlText w:val=""/>
+      <w:lvlJc w:val="left"/>
+      <w:pPr>
+        <w:ind w:left="6480" w:hanging="360"/>
+      </w:pPr>
+      <w:rPr>
+        <w:rFonts w:ascii="Wingdings" w:hAnsi="Wingdings" w:hint="default"/>
+      </w:rPr>
+    </w:lvl>
+  </w:abstractNum>
+  <w:abstractNum w:abstractNumId="59" w15:restartNumberingAfterBreak="0">
     <w:nsid w:val="7B8D34CF"/>
     <w:multiLevelType w:val="multilevel"/>
     <w:tmpl w:val="702834C8"/>
@@ -33020,7 +36765,7 @@
       </w:rPr>
     </w:lvl>
   </w:abstractNum>
-  <w:abstractNum w:abstractNumId="50" w15:restartNumberingAfterBreak="0">
+  <w:abstractNum w:abstractNumId="60" w15:restartNumberingAfterBreak="0">
     <w:nsid w:val="7F62291B"/>
     <w:multiLevelType w:val="hybridMultilevel"/>
     <w:tmpl w:val="B71640A2"/>
@@ -33110,156 +36855,186 @@
     <w:abstractNumId w:val="2"/>
   </w:num>
   <w:num w:numId="2" w16cid:durableId="288970933">
-    <w:abstractNumId w:val="37"/>
+    <w:abstractNumId w:val="44"/>
   </w:num>
   <w:num w:numId="3" w16cid:durableId="1934975148">
     <w:abstractNumId w:val="0"/>
   </w:num>
   <w:num w:numId="4" w16cid:durableId="284432453">
-    <w:abstractNumId w:val="12"/>
+    <w:abstractNumId w:val="15"/>
   </w:num>
   <w:num w:numId="5" w16cid:durableId="1475290958">
     <w:abstractNumId w:val="3"/>
   </w:num>
   <w:num w:numId="6" w16cid:durableId="674764127">
+    <w:abstractNumId w:val="59"/>
+  </w:num>
+  <w:num w:numId="7" w16cid:durableId="1366904678">
+    <w:abstractNumId w:val="26"/>
+  </w:num>
+  <w:num w:numId="8" w16cid:durableId="67462260">
+    <w:abstractNumId w:val="45"/>
+  </w:num>
+  <w:num w:numId="9" w16cid:durableId="504519595">
+    <w:abstractNumId w:val="39"/>
+  </w:num>
+  <w:num w:numId="10" w16cid:durableId="1046217917">
+    <w:abstractNumId w:val="13"/>
+  </w:num>
+  <w:num w:numId="11" w16cid:durableId="1482194571">
+    <w:abstractNumId w:val="43"/>
+  </w:num>
+  <w:num w:numId="12" w16cid:durableId="1378116358">
+    <w:abstractNumId w:val="23"/>
+  </w:num>
+  <w:num w:numId="13" w16cid:durableId="1622763665">
+    <w:abstractNumId w:val="35"/>
+  </w:num>
+  <w:num w:numId="14" w16cid:durableId="1303314634">
+    <w:abstractNumId w:val="47"/>
+  </w:num>
+  <w:num w:numId="15" w16cid:durableId="9142093">
+    <w:abstractNumId w:val="52"/>
+  </w:num>
+  <w:num w:numId="16" w16cid:durableId="1458911845">
+    <w:abstractNumId w:val="20"/>
+  </w:num>
+  <w:num w:numId="17" w16cid:durableId="2118016731">
+    <w:abstractNumId w:val="9"/>
+  </w:num>
+  <w:num w:numId="18" w16cid:durableId="2101440695">
+    <w:abstractNumId w:val="56"/>
+  </w:num>
+  <w:num w:numId="19" w16cid:durableId="109252585">
+    <w:abstractNumId w:val="12"/>
+  </w:num>
+  <w:num w:numId="20" w16cid:durableId="472599006">
+    <w:abstractNumId w:val="11"/>
+  </w:num>
+  <w:num w:numId="21" w16cid:durableId="1115103356">
+    <w:abstractNumId w:val="40"/>
+  </w:num>
+  <w:num w:numId="22" w16cid:durableId="220681117">
     <w:abstractNumId w:val="49"/>
   </w:num>
-  <w:num w:numId="7" w16cid:durableId="1366904678">
-    <w:abstractNumId w:val="22"/>
+  <w:num w:numId="23" w16cid:durableId="1049376175">
+    <w:abstractNumId w:val="21"/>
   </w:num>
-  <w:num w:numId="8" w16cid:durableId="67462260">
-    <w:abstractNumId w:val="38"/>
-  </w:num>
-  <w:num w:numId="9" w16cid:durableId="504519595">
-    <w:abstractNumId w:val="33"/>
-  </w:num>
-  <w:num w:numId="10" w16cid:durableId="1046217917">
-    <w:abstractNumId w:val="10"/>
-  </w:num>
-  <w:num w:numId="11" w16cid:durableId="1482194571">
-    <w:abstractNumId w:val="36"/>
-  </w:num>
-  <w:num w:numId="12" w16cid:durableId="1378116358">
+  <w:num w:numId="24" w16cid:durableId="723523505">
     <w:abstractNumId w:val="19"/>
   </w:num>
-  <w:num w:numId="13" w16cid:durableId="1622763665">
-    <w:abstractNumId w:val="31"/>
-  </w:num>
-  <w:num w:numId="14" w16cid:durableId="1303314634">
-    <w:abstractNumId w:val="40"/>
-  </w:num>
-  <w:num w:numId="15" w16cid:durableId="9142093">
-    <w:abstractNumId w:val="44"/>
-  </w:num>
-  <w:num w:numId="16" w16cid:durableId="1458911845">
-    <w:abstractNumId w:val="16"/>
-  </w:num>
-  <w:num w:numId="17" w16cid:durableId="2118016731">
-    <w:abstractNumId w:val="6"/>
-  </w:num>
-  <w:num w:numId="18" w16cid:durableId="2101440695">
-    <w:abstractNumId w:val="47"/>
-  </w:num>
-  <w:num w:numId="19" w16cid:durableId="109252585">
-    <w:abstractNumId w:val="9"/>
-  </w:num>
-  <w:num w:numId="20" w16cid:durableId="472599006">
-    <w:abstractNumId w:val="8"/>
-  </w:num>
-  <w:num w:numId="21" w16cid:durableId="1115103356">
-    <w:abstractNumId w:val="34"/>
-  </w:num>
-  <w:num w:numId="22" w16cid:durableId="220681117">
-    <w:abstractNumId w:val="41"/>
-  </w:num>
-  <w:num w:numId="23" w16cid:durableId="1049376175">
-    <w:abstractNumId w:val="17"/>
-  </w:num>
-  <w:num w:numId="24" w16cid:durableId="723523505">
-    <w:abstractNumId w:val="15"/>
-  </w:num>
   <w:num w:numId="25" w16cid:durableId="1595165128">
-    <w:abstractNumId w:val="14"/>
+    <w:abstractNumId w:val="18"/>
   </w:num>
   <w:num w:numId="26" w16cid:durableId="1168903458">
     <w:abstractNumId w:val="4"/>
   </w:num>
   <w:num w:numId="27" w16cid:durableId="611862714">
-    <w:abstractNumId w:val="20"/>
+    <w:abstractNumId w:val="24"/>
   </w:num>
   <w:num w:numId="28" w16cid:durableId="340668397">
+    <w:abstractNumId w:val="33"/>
+  </w:num>
+  <w:num w:numId="29" w16cid:durableId="87584769">
+    <w:abstractNumId w:val="8"/>
+  </w:num>
+  <w:num w:numId="30" w16cid:durableId="1409889759">
+    <w:abstractNumId w:val="36"/>
+  </w:num>
+  <w:num w:numId="31" w16cid:durableId="400836092">
+    <w:abstractNumId w:val="10"/>
+  </w:num>
+  <w:num w:numId="32" w16cid:durableId="1819607792">
+    <w:abstractNumId w:val="32"/>
+  </w:num>
+  <w:num w:numId="33" w16cid:durableId="1637417472">
+    <w:abstractNumId w:val="55"/>
+  </w:num>
+  <w:num w:numId="34" w16cid:durableId="871116235">
+    <w:abstractNumId w:val="53"/>
+  </w:num>
+  <w:num w:numId="35" w16cid:durableId="2009362747">
+    <w:abstractNumId w:val="28"/>
+  </w:num>
+  <w:num w:numId="36" w16cid:durableId="1833788539">
+    <w:abstractNumId w:val="60"/>
+  </w:num>
+  <w:num w:numId="37" w16cid:durableId="846090408">
     <w:abstractNumId w:val="29"/>
   </w:num>
-  <w:num w:numId="29" w16cid:durableId="87584769">
-    <w:abstractNumId w:val="5"/>
-  </w:num>
-  <w:num w:numId="30" w16cid:durableId="1409889759">
-    <w:abstractNumId w:val="32"/>
-  </w:num>
-  <w:num w:numId="31" w16cid:durableId="400836092">
-    <w:abstractNumId w:val="7"/>
-  </w:num>
-  <w:num w:numId="32" w16cid:durableId="1819607792">
-    <w:abstractNumId w:val="28"/>
-  </w:num>
-  <w:num w:numId="33" w16cid:durableId="1637417472">
-    <w:abstractNumId w:val="46"/>
-  </w:num>
-  <w:num w:numId="34" w16cid:durableId="871116235">
-    <w:abstractNumId w:val="45"/>
-  </w:num>
-  <w:num w:numId="35" w16cid:durableId="2009362747">
-    <w:abstractNumId w:val="24"/>
-  </w:num>
-  <w:num w:numId="36" w16cid:durableId="1833788539">
-    <w:abstractNumId w:val="50"/>
-  </w:num>
-  <w:num w:numId="37" w16cid:durableId="846090408">
-    <w:abstractNumId w:val="25"/>
-  </w:num>
   <w:num w:numId="38" w16cid:durableId="307588129">
-    <w:abstractNumId w:val="26"/>
+    <w:abstractNumId w:val="30"/>
   </w:num>
   <w:num w:numId="39" w16cid:durableId="1618440895">
-    <w:abstractNumId w:val="23"/>
+    <w:abstractNumId w:val="27"/>
   </w:num>
   <w:num w:numId="40" w16cid:durableId="1307668086">
-    <w:abstractNumId w:val="48"/>
+    <w:abstractNumId w:val="57"/>
   </w:num>
   <w:num w:numId="41" w16cid:durableId="69272560">
-    <w:abstractNumId w:val="27"/>
+    <w:abstractNumId w:val="31"/>
   </w:num>
   <w:num w:numId="42" w16cid:durableId="2137329642">
-    <w:abstractNumId w:val="13"/>
+    <w:abstractNumId w:val="17"/>
   </w:num>
   <w:num w:numId="43" w16cid:durableId="2038189983">
-    <w:abstractNumId w:val="30"/>
+    <w:abstractNumId w:val="34"/>
   </w:num>
   <w:num w:numId="44" w16cid:durableId="9188195">
     <w:abstractNumId w:val="1"/>
   </w:num>
   <w:num w:numId="45" w16cid:durableId="1834445961">
-    <w:abstractNumId w:val="43"/>
+    <w:abstractNumId w:val="51"/>
   </w:num>
   <w:num w:numId="46" w16cid:durableId="154272466">
+    <w:abstractNumId w:val="50"/>
+  </w:num>
+  <w:num w:numId="47" w16cid:durableId="873924712">
+    <w:abstractNumId w:val="22"/>
+  </w:num>
+  <w:num w:numId="48" w16cid:durableId="175578605">
+    <w:abstractNumId w:val="25"/>
+  </w:num>
+  <w:num w:numId="49" w16cid:durableId="1351837453">
+    <w:abstractNumId w:val="14"/>
+  </w:num>
+  <w:num w:numId="50" w16cid:durableId="1077093443">
+    <w:abstractNumId w:val="46"/>
+  </w:num>
+  <w:num w:numId="51" w16cid:durableId="1712538440">
+    <w:abstractNumId w:val="41"/>
+  </w:num>
+  <w:num w:numId="52" w16cid:durableId="263608840">
+    <w:abstractNumId w:val="16"/>
+  </w:num>
+  <w:num w:numId="53" w16cid:durableId="775171151">
+    <w:abstractNumId w:val="5"/>
+  </w:num>
+  <w:num w:numId="54" w16cid:durableId="875194525">
+    <w:abstractNumId w:val="6"/>
+  </w:num>
+  <w:num w:numId="55" w16cid:durableId="1318146393">
+    <w:abstractNumId w:val="58"/>
+  </w:num>
+  <w:num w:numId="56" w16cid:durableId="238488064">
+    <w:abstractNumId w:val="37"/>
+  </w:num>
+  <w:num w:numId="57" w16cid:durableId="1697727751">
     <w:abstractNumId w:val="42"/>
   </w:num>
-  <w:num w:numId="47" w16cid:durableId="873924712">
-    <w:abstractNumId w:val="18"/>
+  <w:num w:numId="58" w16cid:durableId="888224253">
+    <w:abstractNumId w:val="38"/>
   </w:num>
-  <w:num w:numId="48" w16cid:durableId="175578605">
-    <w:abstractNumId w:val="21"/>
+  <w:num w:numId="59" w16cid:durableId="768544210">
+    <w:abstractNumId w:val="48"/>
   </w:num>
-  <w:num w:numId="49" w16cid:durableId="1351837453">
-    <w:abstractNumId w:val="11"/>
+  <w:num w:numId="60" w16cid:durableId="2133665249">
+    <w:abstractNumId w:val="54"/>
   </w:num>
-  <w:num w:numId="50" w16cid:durableId="1077093443">
-    <w:abstractNumId w:val="39"/>
+  <w:num w:numId="61" w16cid:durableId="1432625404">
+    <w:abstractNumId w:val="7"/>
   </w:num>
-  <w:num w:numId="51" w16cid:durableId="1712538440">
-    <w:abstractNumId w:val="35"/>
-  </w:num>
-  <w:numIdMacAtCleanup w:val="51"/>
+  <w:numIdMacAtCleanup w:val="61"/>
 </w:numbering>
 </file>
 

</xml_diff>

<commit_message>
feat(internship): complete 11-slide high-end Beamer deck for FinMetrics-PU defense with emerald/jade palette
</commit_message>
<xml_diff>
--- a/Financial Mathematics/notes.docx
+++ b/Financial Mathematics/notes.docx
@@ -30633,17 +30633,522 @@
       </w:pPr>
     </w:p>
     <w:p>
-      <w:pPr>
-        <w:rPr>
-          <w:rFonts w:eastAsiaTheme="minorEastAsia"/>
-        </w:rPr>
-      </w:pPr>
       <w:r>
         <w:rPr>
           <w:rFonts w:eastAsiaTheme="minorEastAsia"/>
         </w:rPr>
         <w:tab/>
       </w:r>
+      <w:r>
+        <w:t>15/10/2026</w:t>
+      </w:r>
+    </w:p>
+    <w:p>
+      <w:r>
+        <w:t xml:space="preserve">Q. </w:t>
+      </w:r>
+    </w:p>
+    <w:p>
+      <w:r>
+        <w:rPr>
+          <w:noProof/>
+        </w:rPr>
+        <w:drawing>
+          <wp:inline distT="0" distB="0" distL="0" distR="0" wp14:anchorId="6B4EF70E" wp14:editId="4F68C1EE">
+            <wp:extent cx="4197563" cy="5596751"/>
+            <wp:effectExtent l="5397" t="0" r="0" b="0"/>
+            <wp:docPr id="1379025043" name="Picture 2"/>
+            <wp:cNvGraphicFramePr>
+              <a:graphicFrameLocks xmlns:a="http://schemas.openxmlformats.org/drawingml/2006/main" noChangeAspect="1"/>
+            </wp:cNvGraphicFramePr>
+            <a:graphic xmlns:a="http://schemas.openxmlformats.org/drawingml/2006/main">
+              <a:graphicData uri="http://schemas.openxmlformats.org/drawingml/2006/picture">
+                <pic:pic xmlns:pic="http://schemas.openxmlformats.org/drawingml/2006/picture">
+                  <pic:nvPicPr>
+                    <pic:cNvPr id="0" name="Picture 6"/>
+                    <pic:cNvPicPr>
+                      <a:picLocks noChangeAspect="1" noChangeArrowheads="1"/>
+                    </pic:cNvPicPr>
+                  </pic:nvPicPr>
+                  <pic:blipFill>
+                    <a:blip r:embed="rId17">
+                      <a:extLst>
+                        <a:ext uri="{28A0092B-C50C-407E-A947-70E740481C1C}">
+                          <a14:useLocalDpi xmlns:a14="http://schemas.microsoft.com/office/drawing/2010/main" val="0"/>
+                        </a:ext>
+                      </a:extLst>
+                    </a:blip>
+                    <a:srcRect/>
+                    <a:stretch>
+                      <a:fillRect/>
+                    </a:stretch>
+                  </pic:blipFill>
+                  <pic:spPr bwMode="auto">
+                    <a:xfrm rot="16200000">
+                      <a:off x="0" y="0"/>
+                      <a:ext cx="4215679" cy="5620906"/>
+                    </a:xfrm>
+                    <a:prstGeom prst="rect">
+                      <a:avLst/>
+                    </a:prstGeom>
+                    <a:noFill/>
+                    <a:ln>
+                      <a:noFill/>
+                    </a:ln>
+                  </pic:spPr>
+                </pic:pic>
+              </a:graphicData>
+            </a:graphic>
+          </wp:inline>
+        </w:drawing>
+      </w:r>
+    </w:p>
+    <w:p/>
+    <w:p>
+      <w:r>
+        <w:t>Calculate: 1. Current ratio ; 2. Quick ratio ; 3. Cash position ratio</w:t>
+      </w:r>
+    </w:p>
+    <w:p/>
+    <w:p>
+      <w:r>
+        <w:t>Sol:</w:t>
+      </w:r>
+    </w:p>
+    <w:p>
+      <w:r>
+        <w:t xml:space="preserve">1. </w:t>
+      </w:r>
+    </w:p>
+    <w:p>
+      <w:pPr>
+        <w:rPr>
+          <w:rFonts w:eastAsiaTheme="minorEastAsia"/>
+        </w:rPr>
+      </w:pPr>
+      <m:oMathPara>
+        <m:oMath>
+          <m:r>
+            <w:rPr>
+              <w:rFonts w:ascii="Cambria Math" w:hAnsi="Cambria Math"/>
+            </w:rPr>
+            <m:t xml:space="preserve">current ratio = </m:t>
+          </m:r>
+          <m:f>
+            <m:fPr>
+              <m:ctrlPr>
+                <w:rPr>
+                  <w:rFonts w:ascii="Cambria Math" w:hAnsi="Cambria Math"/>
+                  <w:i/>
+                </w:rPr>
+              </m:ctrlPr>
+            </m:fPr>
+            <m:num>
+              <m:r>
+                <w:rPr>
+                  <w:rFonts w:ascii="Cambria Math" w:hAnsi="Cambria Math"/>
+                </w:rPr>
+                <m:t>current assets</m:t>
+              </m:r>
+            </m:num>
+            <m:den>
+              <m:r>
+                <w:rPr>
+                  <w:rFonts w:ascii="Cambria Math" w:hAnsi="Cambria Math"/>
+                </w:rPr>
+                <m:t>current liabilities</m:t>
+              </m:r>
+            </m:den>
+          </m:f>
+          <m:r>
+            <w:rPr>
+              <w:rFonts w:ascii="Cambria Math" w:hAnsi="Cambria Math"/>
+            </w:rPr>
+            <m:t xml:space="preserve"> = </m:t>
+          </m:r>
+          <m:f>
+            <m:fPr>
+              <m:ctrlPr>
+                <w:rPr>
+                  <w:rFonts w:ascii="Cambria Math" w:hAnsi="Cambria Math"/>
+                  <w:i/>
+                </w:rPr>
+              </m:ctrlPr>
+            </m:fPr>
+            <m:num>
+              <m:r>
+                <w:rPr>
+                  <w:rFonts w:ascii="Cambria Math" w:hAnsi="Cambria Math"/>
+                </w:rPr>
+                <m:t>50,00,000</m:t>
+              </m:r>
+            </m:num>
+            <m:den>
+              <m:r>
+                <w:rPr>
+                  <w:rFonts w:ascii="Cambria Math" w:hAnsi="Cambria Math"/>
+                </w:rPr>
+                <m:t>26,00,000</m:t>
+              </m:r>
+            </m:den>
+          </m:f>
+          <m:r>
+            <w:rPr>
+              <w:rFonts w:ascii="Cambria Math" w:hAnsi="Cambria Math"/>
+            </w:rPr>
+            <m:t>=1.92</m:t>
+          </m:r>
+        </m:oMath>
+      </m:oMathPara>
+    </w:p>
+    <w:p>
+      <w:pPr>
+        <w:rPr>
+          <w:rFonts w:eastAsiaTheme="minorEastAsia"/>
+        </w:rPr>
+      </w:pPr>
+      <w:r>
+        <w:rPr>
+          <w:rFonts w:eastAsiaTheme="minorEastAsia"/>
+        </w:rPr>
+        <w:lastRenderedPageBreak/>
+        <w:t>current assets = stock + debtors + cash at bank + bills receivable + prepaid expenses</w:t>
+      </w:r>
+    </w:p>
+    <w:p>
+      <w:pPr>
+        <w:rPr>
+          <w:rFonts w:eastAsiaTheme="minorEastAsia"/>
+        </w:rPr>
+      </w:pPr>
+      <w:r>
+        <w:rPr>
+          <w:rFonts w:eastAsiaTheme="minorEastAsia"/>
+        </w:rPr>
+        <w:t>current assets = 29,60,000 + 14,20,000 + 6,20,000 = 50,00,000</w:t>
+      </w:r>
+    </w:p>
+    <w:p>
+      <w:pPr>
+        <w:rPr>
+          <w:rFonts w:eastAsiaTheme="minorEastAsia"/>
+        </w:rPr>
+      </w:pPr>
+      <w:r>
+        <w:rPr>
+          <w:rFonts w:eastAsiaTheme="minorEastAsia"/>
+        </w:rPr>
+        <w:t>current liabilities = creditors + bills payable + over draft</w:t>
+      </w:r>
+    </w:p>
+    <w:p>
+      <w:pPr>
+        <w:rPr>
+          <w:rFonts w:eastAsiaTheme="minorEastAsia"/>
+        </w:rPr>
+      </w:pPr>
+      <w:r>
+        <w:rPr>
+          <w:rFonts w:eastAsiaTheme="minorEastAsia"/>
+        </w:rPr>
+        <w:t>current liabilities = 26,00,000</w:t>
+      </w:r>
+    </w:p>
+    <w:p>
+      <w:pPr>
+        <w:rPr>
+          <w:rFonts w:eastAsiaTheme="minorEastAsia"/>
+        </w:rPr>
+      </w:pPr>
+      <w:r>
+        <w:rPr>
+          <w:rFonts w:eastAsiaTheme="minorEastAsia"/>
+        </w:rPr>
+        <w:t>2. quick ratio or acid test ratio or liquid ratio</w:t>
+      </w:r>
+    </w:p>
+    <w:p>
+      <w:pPr>
+        <w:rPr>
+          <w:rFonts w:eastAsiaTheme="minorEastAsia"/>
+        </w:rPr>
+      </w:pPr>
+      <m:oMathPara>
+        <m:oMath>
+          <m:r>
+            <w:rPr>
+              <w:rFonts w:ascii="Cambria Math" w:eastAsiaTheme="minorEastAsia" w:hAnsi="Cambria Math"/>
+            </w:rPr>
+            <m:t xml:space="preserve">quick ratio = </m:t>
+          </m:r>
+          <m:f>
+            <m:fPr>
+              <m:ctrlPr>
+                <w:rPr>
+                  <w:rFonts w:ascii="Cambria Math" w:eastAsiaTheme="minorEastAsia" w:hAnsi="Cambria Math"/>
+                  <w:i/>
+                </w:rPr>
+              </m:ctrlPr>
+            </m:fPr>
+            <m:num>
+              <m:r>
+                <w:rPr>
+                  <w:rFonts w:ascii="Cambria Math" w:eastAsiaTheme="minorEastAsia" w:hAnsi="Cambria Math"/>
+                </w:rPr>
+                <m:t>quick assets</m:t>
+              </m:r>
+            </m:num>
+            <m:den>
+              <m:r>
+                <w:rPr>
+                  <w:rFonts w:ascii="Cambria Math" w:eastAsiaTheme="minorEastAsia" w:hAnsi="Cambria Math"/>
+                </w:rPr>
+                <m:t>current liabilites</m:t>
+              </m:r>
+            </m:den>
+          </m:f>
+          <m:r>
+            <w:rPr>
+              <w:rFonts w:ascii="Cambria Math" w:eastAsiaTheme="minorEastAsia" w:hAnsi="Cambria Math"/>
+            </w:rPr>
+            <m:t xml:space="preserve"> = </m:t>
+          </m:r>
+          <m:f>
+            <m:fPr>
+              <m:ctrlPr>
+                <w:rPr>
+                  <w:rFonts w:ascii="Cambria Math" w:eastAsiaTheme="minorEastAsia" w:hAnsi="Cambria Math"/>
+                  <w:i/>
+                </w:rPr>
+              </m:ctrlPr>
+            </m:fPr>
+            <m:num>
+              <m:r>
+                <w:rPr>
+                  <w:rFonts w:ascii="Cambria Math" w:eastAsiaTheme="minorEastAsia" w:hAnsi="Cambria Math"/>
+                </w:rPr>
+                <m:t>20,40,000</m:t>
+              </m:r>
+            </m:num>
+            <m:den>
+              <m:r>
+                <w:rPr>
+                  <w:rFonts w:ascii="Cambria Math" w:eastAsiaTheme="minorEastAsia" w:hAnsi="Cambria Math"/>
+                </w:rPr>
+                <m:t>26,00,000</m:t>
+              </m:r>
+            </m:den>
+          </m:f>
+          <m:r>
+            <w:rPr>
+              <w:rFonts w:ascii="Cambria Math" w:eastAsiaTheme="minorEastAsia" w:hAnsi="Cambria Math"/>
+            </w:rPr>
+            <m:t xml:space="preserve"> = 0.78</m:t>
+          </m:r>
+        </m:oMath>
+      </m:oMathPara>
+    </w:p>
+    <w:p>
+      <w:pPr>
+        <w:rPr>
+          <w:rFonts w:eastAsiaTheme="minorEastAsia"/>
+        </w:rPr>
+      </w:pPr>
+      <w:r>
+        <w:rPr>
+          <w:rFonts w:eastAsiaTheme="minorEastAsia"/>
+        </w:rPr>
+        <w:t>quick ratio = current assets – stock – prepaid expenses</w:t>
+      </w:r>
+    </w:p>
+    <w:p>
+      <w:pPr>
+        <w:rPr>
+          <w:rFonts w:eastAsiaTheme="minorEastAsia"/>
+        </w:rPr>
+      </w:pPr>
+      <w:r>
+        <w:rPr>
+          <w:rFonts w:eastAsiaTheme="minorEastAsia"/>
+        </w:rPr>
+        <w:t>quick assts = current assets – stock (or) debtors + cash at bank</w:t>
+      </w:r>
+    </w:p>
+    <w:p>
+      <w:pPr>
+        <w:rPr>
+          <w:rFonts w:eastAsiaTheme="minorEastAsia"/>
+        </w:rPr>
+      </w:pPr>
+      <w:r>
+        <w:rPr>
+          <w:rFonts w:eastAsiaTheme="minorEastAsia"/>
+        </w:rPr>
+        <w:t>quick assets = 50,00,000 – 29,60,000 = 20,40,000</w:t>
+      </w:r>
+    </w:p>
+    <w:p>
+      <w:pPr>
+        <w:rPr>
+          <w:rFonts w:eastAsiaTheme="minorEastAsia"/>
+        </w:rPr>
+      </w:pPr>
+      <w:r>
+        <w:rPr>
+          <w:rFonts w:eastAsiaTheme="minorEastAsia"/>
+        </w:rPr>
+        <w:t xml:space="preserve">or </w:t>
+      </w:r>
+    </w:p>
+    <w:p>
+      <w:pPr>
+        <w:rPr>
+          <w:rFonts w:eastAsiaTheme="minorEastAsia"/>
+        </w:rPr>
+      </w:pPr>
+      <w:r>
+        <w:rPr>
+          <w:rFonts w:eastAsiaTheme="minorEastAsia"/>
+        </w:rPr>
+        <w:t>quick assets = 14,20,000 + 6,20,000</w:t>
+      </w:r>
+    </w:p>
+    <w:p>
+      <w:pPr>
+        <w:rPr>
+          <w:rFonts w:eastAsiaTheme="minorEastAsia"/>
+        </w:rPr>
+      </w:pPr>
+      <w:r>
+        <w:rPr>
+          <w:rFonts w:eastAsiaTheme="minorEastAsia"/>
+        </w:rPr>
+        <w:t xml:space="preserve">conclusion the ideal liquid ratio </w:t>
+      </w:r>
+      <w:proofErr w:type="gramStart"/>
+      <w:r>
+        <w:rPr>
+          <w:rFonts w:eastAsiaTheme="minorEastAsia"/>
+        </w:rPr>
+        <w:t>are</w:t>
+      </w:r>
+      <w:proofErr w:type="gramEnd"/>
+      <w:r>
+        <w:rPr>
+          <w:rFonts w:eastAsiaTheme="minorEastAsia"/>
+        </w:rPr>
+        <w:t xml:space="preserve"> generally </w:t>
+      </w:r>
+      <w:proofErr w:type="spellStart"/>
+      <w:r>
+        <w:rPr>
+          <w:rFonts w:eastAsiaTheme="minorEastAsia"/>
+        </w:rPr>
+        <w:t>accecpted</w:t>
+      </w:r>
+      <w:proofErr w:type="spellEnd"/>
+      <w:r>
+        <w:rPr>
+          <w:rFonts w:eastAsiaTheme="minorEastAsia"/>
+        </w:rPr>
+        <w:t xml:space="preserve"> norm for liquid ratio is 1</w:t>
+      </w:r>
+    </w:p>
+    <w:p>
+      <w:pPr>
+        <w:rPr>
+          <w:rFonts w:eastAsiaTheme="minorEastAsia"/>
+        </w:rPr>
+      </w:pPr>
+    </w:p>
+    <w:p>
+      <w:pPr>
+        <w:rPr>
+          <w:rFonts w:eastAsiaTheme="minorEastAsia"/>
+        </w:rPr>
+      </w:pPr>
+      <w:r>
+        <w:rPr>
+          <w:rFonts w:eastAsiaTheme="minorEastAsia"/>
+        </w:rPr>
+        <w:t xml:space="preserve">3. cash position ratio </w:t>
+      </w:r>
+    </w:p>
+    <w:p>
+      <w:pPr>
+        <w:rPr>
+          <w:rFonts w:eastAsiaTheme="minorEastAsia"/>
+        </w:rPr>
+      </w:pPr>
+      <m:oMathPara>
+        <m:oMath>
+          <m:r>
+            <w:rPr>
+              <w:rFonts w:ascii="Cambria Math" w:eastAsiaTheme="minorEastAsia" w:hAnsi="Cambria Math"/>
+            </w:rPr>
+            <m:t xml:space="preserve">cash postion ratio = </m:t>
+          </m:r>
+          <m:f>
+            <m:fPr>
+              <m:ctrlPr>
+                <w:rPr>
+                  <w:rFonts w:ascii="Cambria Math" w:eastAsiaTheme="minorEastAsia" w:hAnsi="Cambria Math"/>
+                  <w:i/>
+                </w:rPr>
+              </m:ctrlPr>
+            </m:fPr>
+            <m:num>
+              <m:r>
+                <w:rPr>
+                  <w:rFonts w:ascii="Cambria Math" w:eastAsiaTheme="minorEastAsia" w:hAnsi="Cambria Math"/>
+                </w:rPr>
+                <m:t>cash and bank +marketable securities</m:t>
+              </m:r>
+            </m:num>
+            <m:den>
+              <m:r>
+                <w:rPr>
+                  <w:rFonts w:ascii="Cambria Math" w:eastAsiaTheme="minorEastAsia" w:hAnsi="Cambria Math"/>
+                </w:rPr>
+                <m:t>current liabilites</m:t>
+              </m:r>
+            </m:den>
+          </m:f>
+          <m:r>
+            <w:rPr>
+              <w:rFonts w:ascii="Cambria Math" w:eastAsiaTheme="minorEastAsia" w:hAnsi="Cambria Math"/>
+            </w:rPr>
+            <w:br/>
+          </m:r>
+        </m:oMath>
+      </m:oMathPara>
+      <w:r>
+        <w:rPr>
+          <w:rFonts w:eastAsiaTheme="minorEastAsia"/>
+        </w:rPr>
+        <w:t>an id</w:t>
+      </w:r>
+      <w:proofErr w:type="spellStart"/>
+      <w:r>
+        <w:rPr>
+          <w:rFonts w:eastAsiaTheme="minorEastAsia"/>
+        </w:rPr>
+        <w:t>eal</w:t>
+      </w:r>
+      <w:proofErr w:type="spellEnd"/>
+      <w:r>
+        <w:rPr>
+          <w:rFonts w:eastAsiaTheme="minorEastAsia"/>
+        </w:rPr>
+        <w:t xml:space="preserve"> cash position ratio is 0.75:1, the ratio is more regress measure of a firm liquidity position </w:t>
+      </w:r>
+    </w:p>
+    <w:p>
+      <w:pPr>
+        <w:rPr>
+          <w:rFonts w:eastAsiaTheme="minorEastAsia"/>
+        </w:rPr>
+      </w:pPr>
     </w:p>
     <w:sectPr>
       <w:pgSz w:w="11906" w:h="16838"/>

</xml_diff>